<commit_message>
comment, chưa kiểm tra API
</commit_message>
<xml_diff>
--- a/Hỗ trợ tìm kiếm nhà trọ.docx
+++ b/Hỗ trợ tìm kiếm nhà trọ.docx
@@ -8616,11 +8616,7 @@
           <w:tcPr>
             <w:tcW w:w="1276" w:type="dxa"/>
           </w:tcPr>
-          <w:p>
-            <w:r>
-              <w:t>rooms</w:t>
-            </w:r>
-          </w:p>
+          <w:p/>
         </w:tc>
         <w:tc>
           <w:tcPr>
@@ -10464,6 +10460,382 @@
               </w:rPr>
               <w:t>OK</w:t>
             </w:r>
+          </w:p>
+        </w:tc>
+        <w:tc>
+          <w:tcPr>
+            <w:tcW w:w="1985" w:type="dxa"/>
+          </w:tcPr>
+          <w:p/>
+        </w:tc>
+        <w:tc>
+          <w:tcPr>
+            <w:tcW w:w="1417" w:type="dxa"/>
+          </w:tcPr>
+          <w:p>
+            <w:pPr>
+              <w:rPr>
+                <w:b/>
+                <w:bCs/>
+                <w:color w:val="196B24" w:themeColor="accent3"/>
+              </w:rPr>
+            </w:pPr>
+          </w:p>
+        </w:tc>
+      </w:tr>
+      <w:tr>
+        <w:tc>
+          <w:tcPr>
+            <w:tcW w:w="1276" w:type="dxa"/>
+          </w:tcPr>
+          <w:p/>
+        </w:tc>
+        <w:tc>
+          <w:tcPr>
+            <w:tcW w:w="4395" w:type="dxa"/>
+          </w:tcPr>
+          <w:p/>
+        </w:tc>
+        <w:tc>
+          <w:tcPr>
+            <w:tcW w:w="1417" w:type="dxa"/>
+          </w:tcPr>
+          <w:p>
+            <w:pPr>
+              <w:rPr>
+                <w:b/>
+                <w:bCs/>
+              </w:rPr>
+            </w:pPr>
+          </w:p>
+        </w:tc>
+        <w:tc>
+          <w:tcPr>
+            <w:tcW w:w="1134" w:type="dxa"/>
+          </w:tcPr>
+          <w:p>
+            <w:pPr>
+              <w:rPr>
+                <w:b/>
+                <w:bCs/>
+                <w:color w:val="196B24" w:themeColor="accent3"/>
+              </w:rPr>
+            </w:pPr>
+          </w:p>
+        </w:tc>
+        <w:tc>
+          <w:tcPr>
+            <w:tcW w:w="1985" w:type="dxa"/>
+          </w:tcPr>
+          <w:p/>
+        </w:tc>
+        <w:tc>
+          <w:tcPr>
+            <w:tcW w:w="1417" w:type="dxa"/>
+          </w:tcPr>
+          <w:p>
+            <w:pPr>
+              <w:rPr>
+                <w:b/>
+                <w:bCs/>
+                <w:color w:val="196B24" w:themeColor="accent3"/>
+              </w:rPr>
+            </w:pPr>
+          </w:p>
+        </w:tc>
+      </w:tr>
+      <w:tr>
+        <w:tc>
+          <w:tcPr>
+            <w:tcW w:w="1276" w:type="dxa"/>
+            <w:shd w:val="clear" w:color="auto" w:fill="D9D9D9" w:themeFill="background1" w:themeFillShade="D9"/>
+          </w:tcPr>
+          <w:p/>
+        </w:tc>
+        <w:tc>
+          <w:tcPr>
+            <w:tcW w:w="4395" w:type="dxa"/>
+            <w:shd w:val="clear" w:color="auto" w:fill="D9D9D9" w:themeFill="background1" w:themeFillShade="D9"/>
+          </w:tcPr>
+          <w:p/>
+        </w:tc>
+        <w:tc>
+          <w:tcPr>
+            <w:tcW w:w="1417" w:type="dxa"/>
+            <w:shd w:val="clear" w:color="auto" w:fill="D9D9D9" w:themeFill="background1" w:themeFillShade="D9"/>
+          </w:tcPr>
+          <w:p>
+            <w:pPr>
+              <w:rPr>
+                <w:b/>
+                <w:bCs/>
+              </w:rPr>
+            </w:pPr>
+          </w:p>
+        </w:tc>
+        <w:tc>
+          <w:tcPr>
+            <w:tcW w:w="1134" w:type="dxa"/>
+            <w:shd w:val="clear" w:color="auto" w:fill="D9D9D9" w:themeFill="background1" w:themeFillShade="D9"/>
+          </w:tcPr>
+          <w:p>
+            <w:pPr>
+              <w:rPr>
+                <w:b/>
+                <w:bCs/>
+                <w:color w:val="196B24" w:themeColor="accent3"/>
+              </w:rPr>
+            </w:pPr>
+          </w:p>
+        </w:tc>
+        <w:tc>
+          <w:tcPr>
+            <w:tcW w:w="1985" w:type="dxa"/>
+            <w:shd w:val="clear" w:color="auto" w:fill="D9D9D9" w:themeFill="background1" w:themeFillShade="D9"/>
+          </w:tcPr>
+          <w:p/>
+        </w:tc>
+        <w:tc>
+          <w:tcPr>
+            <w:tcW w:w="1417" w:type="dxa"/>
+            <w:shd w:val="clear" w:color="auto" w:fill="D9D9D9" w:themeFill="background1" w:themeFillShade="D9"/>
+          </w:tcPr>
+          <w:p>
+            <w:pPr>
+              <w:rPr>
+                <w:b/>
+                <w:bCs/>
+                <w:color w:val="196B24" w:themeColor="accent3"/>
+              </w:rPr>
+            </w:pPr>
+          </w:p>
+        </w:tc>
+      </w:tr>
+      <w:tr>
+        <w:tc>
+          <w:tcPr>
+            <w:tcW w:w="1276" w:type="dxa"/>
+          </w:tcPr>
+          <w:p>
+            <w:r>
+              <w:t>Comment</w:t>
+            </w:r>
+          </w:p>
+        </w:tc>
+        <w:tc>
+          <w:tcPr>
+            <w:tcW w:w="4395" w:type="dxa"/>
+          </w:tcPr>
+          <w:p/>
+        </w:tc>
+        <w:tc>
+          <w:tcPr>
+            <w:tcW w:w="1417" w:type="dxa"/>
+          </w:tcPr>
+          <w:p>
+            <w:pPr>
+              <w:rPr>
+                <w:b/>
+                <w:bCs/>
+              </w:rPr>
+            </w:pPr>
+          </w:p>
+        </w:tc>
+        <w:tc>
+          <w:tcPr>
+            <w:tcW w:w="1134" w:type="dxa"/>
+          </w:tcPr>
+          <w:p>
+            <w:pPr>
+              <w:rPr>
+                <w:b/>
+                <w:bCs/>
+                <w:color w:val="196B24" w:themeColor="accent3"/>
+              </w:rPr>
+            </w:pPr>
+          </w:p>
+        </w:tc>
+        <w:tc>
+          <w:tcPr>
+            <w:tcW w:w="1985" w:type="dxa"/>
+          </w:tcPr>
+          <w:p/>
+        </w:tc>
+        <w:tc>
+          <w:tcPr>
+            <w:tcW w:w="1417" w:type="dxa"/>
+          </w:tcPr>
+          <w:p>
+            <w:pPr>
+              <w:rPr>
+                <w:b/>
+                <w:bCs/>
+                <w:color w:val="196B24" w:themeColor="accent3"/>
+              </w:rPr>
+            </w:pPr>
+          </w:p>
+        </w:tc>
+      </w:tr>
+      <w:tr>
+        <w:tc>
+          <w:tcPr>
+            <w:tcW w:w="1276" w:type="dxa"/>
+          </w:tcPr>
+          <w:p/>
+        </w:tc>
+        <w:tc>
+          <w:tcPr>
+            <w:tcW w:w="4395" w:type="dxa"/>
+          </w:tcPr>
+          <w:p/>
+        </w:tc>
+        <w:tc>
+          <w:tcPr>
+            <w:tcW w:w="1417" w:type="dxa"/>
+          </w:tcPr>
+          <w:p>
+            <w:pPr>
+              <w:rPr>
+                <w:b/>
+                <w:bCs/>
+              </w:rPr>
+            </w:pPr>
+          </w:p>
+        </w:tc>
+        <w:tc>
+          <w:tcPr>
+            <w:tcW w:w="1134" w:type="dxa"/>
+          </w:tcPr>
+          <w:p>
+            <w:pPr>
+              <w:rPr>
+                <w:b/>
+                <w:bCs/>
+                <w:color w:val="196B24" w:themeColor="accent3"/>
+              </w:rPr>
+            </w:pPr>
+          </w:p>
+        </w:tc>
+        <w:tc>
+          <w:tcPr>
+            <w:tcW w:w="1985" w:type="dxa"/>
+          </w:tcPr>
+          <w:p/>
+        </w:tc>
+        <w:tc>
+          <w:tcPr>
+            <w:tcW w:w="1417" w:type="dxa"/>
+          </w:tcPr>
+          <w:p>
+            <w:pPr>
+              <w:rPr>
+                <w:b/>
+                <w:bCs/>
+                <w:color w:val="196B24" w:themeColor="accent3"/>
+              </w:rPr>
+            </w:pPr>
+          </w:p>
+        </w:tc>
+      </w:tr>
+      <w:tr>
+        <w:tc>
+          <w:tcPr>
+            <w:tcW w:w="1276" w:type="dxa"/>
+          </w:tcPr>
+          <w:p/>
+        </w:tc>
+        <w:tc>
+          <w:tcPr>
+            <w:tcW w:w="4395" w:type="dxa"/>
+          </w:tcPr>
+          <w:p/>
+        </w:tc>
+        <w:tc>
+          <w:tcPr>
+            <w:tcW w:w="1417" w:type="dxa"/>
+          </w:tcPr>
+          <w:p>
+            <w:pPr>
+              <w:rPr>
+                <w:b/>
+                <w:bCs/>
+              </w:rPr>
+            </w:pPr>
+          </w:p>
+        </w:tc>
+        <w:tc>
+          <w:tcPr>
+            <w:tcW w:w="1134" w:type="dxa"/>
+          </w:tcPr>
+          <w:p>
+            <w:pPr>
+              <w:rPr>
+                <w:b/>
+                <w:bCs/>
+                <w:color w:val="196B24" w:themeColor="accent3"/>
+              </w:rPr>
+            </w:pPr>
+          </w:p>
+        </w:tc>
+        <w:tc>
+          <w:tcPr>
+            <w:tcW w:w="1985" w:type="dxa"/>
+          </w:tcPr>
+          <w:p/>
+        </w:tc>
+        <w:tc>
+          <w:tcPr>
+            <w:tcW w:w="1417" w:type="dxa"/>
+          </w:tcPr>
+          <w:p>
+            <w:pPr>
+              <w:rPr>
+                <w:b/>
+                <w:bCs/>
+                <w:color w:val="196B24" w:themeColor="accent3"/>
+              </w:rPr>
+            </w:pPr>
+          </w:p>
+        </w:tc>
+      </w:tr>
+      <w:tr>
+        <w:tc>
+          <w:tcPr>
+            <w:tcW w:w="1276" w:type="dxa"/>
+          </w:tcPr>
+          <w:p/>
+        </w:tc>
+        <w:tc>
+          <w:tcPr>
+            <w:tcW w:w="4395" w:type="dxa"/>
+          </w:tcPr>
+          <w:p/>
+        </w:tc>
+        <w:tc>
+          <w:tcPr>
+            <w:tcW w:w="1417" w:type="dxa"/>
+          </w:tcPr>
+          <w:p>
+            <w:pPr>
+              <w:rPr>
+                <w:b/>
+                <w:bCs/>
+              </w:rPr>
+            </w:pPr>
+          </w:p>
+        </w:tc>
+        <w:tc>
+          <w:tcPr>
+            <w:tcW w:w="1134" w:type="dxa"/>
+          </w:tcPr>
+          <w:p>
+            <w:pPr>
+              <w:rPr>
+                <w:b/>
+                <w:bCs/>
+                <w:color w:val="196B24" w:themeColor="accent3"/>
+              </w:rPr>
+            </w:pPr>
           </w:p>
         </w:tc>
         <w:tc>
@@ -16176,6 +16548,7 @@
   <w:style w:type="character" w:default="1" w:styleId="DefaultParagraphFont">
     <w:name w:val="Default Paragraph Font"/>
     <w:uiPriority w:val="1"/>
+    <w:semiHidden/>
     <w:unhideWhenUsed/>
   </w:style>
   <w:style w:type="table" w:default="1" w:styleId="TableNormal">

</xml_diff>

<commit_message>
duy, lỗi set_password khi lưu DB
</commit_message>
<xml_diff>
--- a/Hỗ trợ tìm kiếm nhà trọ.docx
+++ b/Hỗ trợ tìm kiếm nhà trọ.docx
@@ -9797,7 +9797,23 @@
           <w:tcPr>
             <w:tcW w:w="4395" w:type="dxa"/>
           </w:tcPr>
-          <w:p/>
+          <w:p>
+            <w:pPr>
+              <w:rPr>
+                <w:b/>
+                <w:bCs/>
+                <w:color w:val="FF0000"/>
+              </w:rPr>
+            </w:pPr>
+            <w:r>
+              <w:rPr>
+                <w:b/>
+                <w:bCs/>
+                <w:color w:val="FF0000"/>
+              </w:rPr>
+              <w:t>Lỗi chưa mã hóa mật khẩu khi lưu DB</w:t>
+            </w:r>
+          </w:p>
         </w:tc>
         <w:tc>
           <w:tcPr>
@@ -9824,6 +9840,14 @@
                 <w:color w:val="196B24" w:themeColor="accent3"/>
               </w:rPr>
             </w:pPr>
+            <w:r>
+              <w:rPr>
+                <w:b/>
+                <w:bCs/>
+                <w:color w:val="FF0000"/>
+              </w:rPr>
+              <w:t>ERROR</w:t>
+            </w:r>
           </w:p>
         </w:tc>
         <w:tc>
@@ -10626,7 +10650,11 @@
           <w:tcPr>
             <w:tcW w:w="4395" w:type="dxa"/>
           </w:tcPr>
-          <w:p/>
+          <w:p>
+            <w:r>
+              <w:t>{{127}}/comments/?post_id=d14891e28078498d9985b7b4e5eb17e3</w:t>
+            </w:r>
+          </w:p>
         </w:tc>
         <w:tc>
           <w:tcPr>
@@ -10639,6 +10667,13 @@
                 <w:bCs/>
               </w:rPr>
             </w:pPr>
+            <w:r>
+              <w:rPr>
+                <w:b/>
+                <w:bCs/>
+              </w:rPr>
+              <w:t>GET</w:t>
+            </w:r>
           </w:p>
         </w:tc>
         <w:tc>
@@ -10653,13 +10688,25 @@
                 <w:color w:val="196B24" w:themeColor="accent3"/>
               </w:rPr>
             </w:pPr>
+            <w:r>
+              <w:rPr>
+                <w:b/>
+                <w:bCs/>
+                <w:color w:val="196B24" w:themeColor="accent3"/>
+              </w:rPr>
+              <w:t>OK</w:t>
+            </w:r>
           </w:p>
         </w:tc>
         <w:tc>
           <w:tcPr>
             <w:tcW w:w="1985" w:type="dxa"/>
           </w:tcPr>
-          <w:p/>
+          <w:p>
+            <w:r>
+              <w:t>Lấy nội dung danh sách comment theo post_id (chỉ lấy cấp cha)</w:t>
+            </w:r>
+          </w:p>
         </w:tc>
         <w:tc>
           <w:tcPr>
@@ -16548,7 +16595,6 @@
   <w:style w:type="character" w:default="1" w:styleId="DefaultParagraphFont">
     <w:name w:val="Default Paragraph Font"/>
     <w:uiPriority w:val="1"/>
-    <w:semiHidden/>
     <w:unhideWhenUsed/>
   </w:style>
   <w:style w:type="table" w:default="1" w:styleId="TableNormal">

</xml_diff>

<commit_message>
thêm api comment và post
</commit_message>
<xml_diff>
--- a/Hỗ trợ tìm kiếm nhà trọ.docx
+++ b/Hỗ trợ tìm kiếm nhà trọ.docx
@@ -2691,6 +2691,11 @@
       </w:r>
     </w:p>
     <w:p>
+      <w:pPr>
+        <w:rPr>
+          <w:lang w:val="vi-VN"/>
+        </w:rPr>
+      </w:pPr>
       <w:r>
         <w:rPr>
           <w:b/>
@@ -2705,7 +2710,16 @@
         <w:t>theo dõi</w:t>
       </w:r>
       <w:r>
-        <w:t xml:space="preserve">), followed(FK → </w:t>
+        <w:t xml:space="preserve">), </w:t>
+      </w:r>
+      <w:r>
+        <w:rPr>
+          <w:lang w:val="vi-VN"/>
+        </w:rPr>
+        <w:t>following</w:t>
+      </w:r>
+      <w:r>
+        <w:t xml:space="preserve">(FK → </w:t>
       </w:r>
       <w:r>
         <w:t xml:space="preserve">được theo dõi </w:t>
@@ -5714,11 +5728,13 @@
           <w:numId w:val="30"/>
         </w:numPr>
         <w:rPr>
-          <w:lang w:val="vi-VN"/>
-        </w:rPr>
-      </w:pPr>
-      <w:r>
-        <w:rPr>
+          <w:color w:val="FF0000"/>
+          <w:lang w:val="vi-VN"/>
+        </w:rPr>
+      </w:pPr>
+      <w:r>
+        <w:rPr>
+          <w:color w:val="FF0000"/>
           <w:lang w:val="vi-VN"/>
         </w:rPr>
         <w:t>GET /posts/{post_id}/comments/ - Lấy danh sách bình luận trong bài đăng</w:t>
@@ -5731,11 +5747,13 @@
           <w:numId w:val="30"/>
         </w:numPr>
         <w:rPr>
-          <w:lang w:val="vi-VN"/>
-        </w:rPr>
-      </w:pPr>
-      <w:r>
-        <w:rPr>
+          <w:color w:val="FF0000"/>
+          <w:lang w:val="vi-VN"/>
+        </w:rPr>
+      </w:pPr>
+      <w:r>
+        <w:rPr>
+          <w:color w:val="FF0000"/>
           <w:lang w:val="vi-VN"/>
         </w:rPr>
         <w:t>POST /posts/{post_id}/comments/ - Bình luận vào bài đăng</w:t>
@@ -5748,11 +5766,13 @@
           <w:numId w:val="30"/>
         </w:numPr>
         <w:rPr>
-          <w:lang w:val="vi-VN"/>
-        </w:rPr>
-      </w:pPr>
-      <w:r>
-        <w:rPr>
+          <w:color w:val="FF0000"/>
+          <w:lang w:val="vi-VN"/>
+        </w:rPr>
+      </w:pPr>
+      <w:r>
+        <w:rPr>
+          <w:color w:val="FF0000"/>
           <w:lang w:val="vi-VN"/>
         </w:rPr>
         <w:t>DELETE /posts/{post_id}/comments/{comment_id}/ - Xóa bình luận</w:t>
@@ -5831,11 +5851,13 @@
           <w:numId w:val="31"/>
         </w:numPr>
         <w:rPr>
-          <w:lang w:val="vi-VN"/>
-        </w:rPr>
-      </w:pPr>
-      <w:r>
-        <w:rPr>
+          <w:color w:val="FF0000"/>
+          <w:lang w:val="vi-VN"/>
+        </w:rPr>
+      </w:pPr>
+      <w:r>
+        <w:rPr>
+          <w:color w:val="FF0000"/>
           <w:lang w:val="vi-VN"/>
         </w:rPr>
         <w:t>POST /comments/{comment_id}/like/ - Thích bình luận</w:t>
@@ -5848,11 +5870,13 @@
           <w:numId w:val="31"/>
         </w:numPr>
         <w:rPr>
-          <w:lang w:val="vi-VN"/>
-        </w:rPr>
-      </w:pPr>
-      <w:r>
-        <w:rPr>
+          <w:color w:val="FF0000"/>
+          <w:lang w:val="vi-VN"/>
+        </w:rPr>
+      </w:pPr>
+      <w:r>
+        <w:rPr>
+          <w:color w:val="FF0000"/>
           <w:lang w:val="vi-VN"/>
         </w:rPr>
         <w:t>DELETE /comments/{comment_id}/like/ - Bỏ thích bình luận</w:t>
@@ -6584,22 +6608,54 @@
       </w:r>
     </w:p>
     <w:p>
-      <w:r>
+      <w:pPr>
+        <w:rPr>
+          <w:color w:val="FF0000"/>
+        </w:rPr>
+      </w:pPr>
+      <w:r>
+        <w:rPr>
+          <w:color w:val="FF0000"/>
+        </w:rPr>
         <w:t>GET    /api/comments/?post_id={id}             # Lấy bình luận theo bài</w:t>
       </w:r>
     </w:p>
     <w:p>
-      <w:r>
+      <w:pPr>
+        <w:rPr>
+          <w:color w:val="FF0000"/>
+        </w:rPr>
+      </w:pPr>
+      <w:r>
+        <w:rPr>
+          <w:color w:val="FF0000"/>
+        </w:rPr>
         <w:t>POST   /api/comments/                          # Tạo bình luận</w:t>
       </w:r>
     </w:p>
     <w:p>
-      <w:r>
+      <w:pPr>
+        <w:rPr>
+          <w:color w:val="FF0000"/>
+        </w:rPr>
+      </w:pPr>
+      <w:r>
+        <w:rPr>
+          <w:color w:val="FF0000"/>
+        </w:rPr>
         <w:t>POST   /api/comments/{id}/like/                # Like bình luận</w:t>
       </w:r>
     </w:p>
     <w:p>
-      <w:r>
+      <w:pPr>
+        <w:rPr>
+          <w:color w:val="FF0000"/>
+        </w:rPr>
+      </w:pPr>
+      <w:r>
+        <w:rPr>
+          <w:color w:val="FF0000"/>
+        </w:rPr>
         <w:t>POST   /api/comments/{id}/reply/               # Trả lời bình luận</w:t>
       </w:r>
     </w:p>
@@ -6610,6 +6666,14 @@
           <w:bCs/>
         </w:rPr>
       </w:pPr>
+    </w:p>
+    <w:p>
+      <w:pPr>
+        <w:rPr>
+          <w:b/>
+          <w:bCs/>
+        </w:rPr>
+      </w:pPr>
       <w:r>
         <w:rPr>
           <w:b/>
@@ -6750,12 +6814,12 @@
           <w:b/>
           <w:bCs/>
         </w:rPr>
+        <w:lastRenderedPageBreak/>
         <w:t>Payments</w:t>
       </w:r>
     </w:p>
     <w:p>
       <w:r>
-        <w:lastRenderedPageBreak/>
         <w:t>POST   /api/payments/                          # Tạo giao dịch thanh toán</w:t>
       </w:r>
     </w:p>
@@ -7949,7 +8013,15 @@
             <w:tcW w:w="4395" w:type="dxa"/>
           </w:tcPr>
           <w:p>
-            <w:r>
+            <w:pPr>
+              <w:rPr>
+                <w:color w:val="FF0000"/>
+              </w:rPr>
+            </w:pPr>
+            <w:r>
+              <w:rPr>
+                <w:color w:val="FF0000"/>
+              </w:rPr>
               <w:t>http://127.0.0.1:8000/landlords/</w:t>
             </w:r>
           </w:p>
@@ -8100,7 +8172,15 @@
             <w:tcW w:w="4395" w:type="dxa"/>
           </w:tcPr>
           <w:p>
-            <w:r>
+            <w:pPr>
+              <w:rPr>
+                <w:color w:val="FF0000"/>
+              </w:rPr>
+            </w:pPr>
+            <w:r>
+              <w:rPr>
+                <w:color w:val="FF0000"/>
+              </w:rPr>
               <w:t>http://127.0.0.1:8000/motels/</w:t>
             </w:r>
           </w:p>
@@ -8214,8 +8294,28 @@
             <w:tcW w:w="4395" w:type="dxa"/>
           </w:tcPr>
           <w:p>
-            <w:r>
-              <w:t>http://127.0.0.1:8000/motels/2/</w:t>
+            <w:pPr>
+              <w:rPr>
+                <w:color w:val="FF0000"/>
+              </w:rPr>
+            </w:pPr>
+            <w:r>
+              <w:rPr>
+                <w:color w:val="FF0000"/>
+              </w:rPr>
+              <w:t>http://127.0.0.1:8000/motels/</w:t>
+            </w:r>
+            <w:r>
+              <w:rPr>
+                <w:color w:val="FF0000"/>
+              </w:rPr>
+              <w:t>8</w:t>
+            </w:r>
+            <w:r>
+              <w:rPr>
+                <w:color w:val="FF0000"/>
+              </w:rPr>
+              <w:t>/</w:t>
             </w:r>
           </w:p>
         </w:tc>
@@ -8298,8 +8398,16 @@
             <w:tcW w:w="4395" w:type="dxa"/>
           </w:tcPr>
           <w:p>
-            <w:r>
-              <w:t>http://127.0.0.1:8000/motels/Nha-Tro-Sinh-Vien-1/</w:t>
+            <w:pPr>
+              <w:rPr>
+                <w:color w:val="FF0000"/>
+              </w:rPr>
+            </w:pPr>
+            <w:r>
+              <w:rPr>
+                <w:color w:val="FF0000"/>
+              </w:rPr>
+              <w:t>http://127.0.0.1:8000/motels/nha-tro-tran-bich/</w:t>
             </w:r>
           </w:p>
         </w:tc>
@@ -8532,7 +8640,15 @@
             <w:tcW w:w="4395" w:type="dxa"/>
           </w:tcPr>
           <w:p>
-            <w:r>
+            <w:pPr>
+              <w:rPr>
+                <w:color w:val="FF0000"/>
+              </w:rPr>
+            </w:pPr>
+            <w:r>
+              <w:rPr>
+                <w:color w:val="FF0000"/>
+              </w:rPr>
               <w:t>http://127.0.0.1:8000/rooms/</w:t>
             </w:r>
           </w:p>
@@ -8624,7 +8740,22 @@
           </w:tcPr>
           <w:p>
             <w:r>
-              <w:t>http://127.0.0.1:8000/rooms/2/</w:t>
+              <w:rPr>
+                <w:color w:val="FF0000"/>
+              </w:rPr>
+              <w:t>http://127.0.0.1:8000/rooms/</w:t>
+            </w:r>
+            <w:r>
+              <w:rPr>
+                <w:color w:val="FF0000"/>
+              </w:rPr>
+              <w:t>5</w:t>
+            </w:r>
+            <w:r>
+              <w:rPr>
+                <w:color w:val="FF0000"/>
+              </w:rPr>
+              <w:t>/</w:t>
             </w:r>
           </w:p>
         </w:tc>
@@ -8714,8 +8845,16 @@
             <w:tcW w:w="4395" w:type="dxa"/>
           </w:tcPr>
           <w:p>
-            <w:r>
-              <w:t>http://127.0.0.1:8000/rooms/phong112/</w:t>
+            <w:pPr>
+              <w:rPr>
+                <w:color w:val="FF0000"/>
+              </w:rPr>
+            </w:pPr>
+            <w:r>
+              <w:rPr>
+                <w:color w:val="FF0000"/>
+              </w:rPr>
+              <w:t>http://127.0.0.1:8000/rooms/nha-tro-tran-bich-phong-01/</w:t>
             </w:r>
           </w:p>
         </w:tc>
@@ -8804,8 +8943,22 @@
             <w:tcW w:w="4395" w:type="dxa"/>
           </w:tcPr>
           <w:p>
-            <w:r>
-              <w:t>http://127.0.0.1:8000/rooms/?motel_id=2</w:t>
+            <w:pPr>
+              <w:rPr>
+                <w:color w:val="FF0000"/>
+              </w:rPr>
+            </w:pPr>
+            <w:r>
+              <w:rPr>
+                <w:color w:val="FF0000"/>
+              </w:rPr>
+              <w:t>http://127.0.0.1:8000/rooms/?motel_id=</w:t>
+            </w:r>
+            <w:r>
+              <w:rPr>
+                <w:color w:val="FF0000"/>
+              </w:rPr>
+              <w:t>8</w:t>
             </w:r>
           </w:p>
         </w:tc>
@@ -8889,7 +9042,10 @@
           </w:tcPr>
           <w:p>
             <w:r>
-              <w:t>http://127.0.0.1:8000/rooms/?motel_slug=nha-tro-sinh-vien-1</w:t>
+              <w:rPr>
+                <w:color w:val="FF0000"/>
+              </w:rPr>
+              <w:t>http://127.0.0.1:8000/rooms/?motel_slug=nha-tro-tran-bich</w:t>
             </w:r>
           </w:p>
         </w:tc>
@@ -8972,7 +9128,15 @@
             <w:tcW w:w="4395" w:type="dxa"/>
           </w:tcPr>
           <w:p>
-            <w:r>
+            <w:pPr>
+              <w:rPr>
+                <w:color w:val="FF0000"/>
+              </w:rPr>
+            </w:pPr>
+            <w:r>
+              <w:rPr>
+                <w:color w:val="FF0000"/>
+              </w:rPr>
               <w:t>http://127.0.0.1:8000/rooms/?q=phong</w:t>
             </w:r>
           </w:p>
@@ -9062,9 +9226,11 @@
             <w:tcW w:w="4395" w:type="dxa"/>
           </w:tcPr>
           <w:p>
-            <w:r>
-              <w:t>http://127.0.0.1:8000/rooms/phong112/</w:t>
-            </w:r>
+            <w:pPr>
+              <w:rPr>
+                <w:color w:val="FF0000"/>
+              </w:rPr>
+            </w:pPr>
           </w:p>
         </w:tc>
         <w:tc>
@@ -9131,8 +9297,16 @@
             <w:tcW w:w="4395" w:type="dxa"/>
           </w:tcPr>
           <w:p>
-            <w:r>
-              <w:t>http://127.0.0.1:8000/rooms/?q=phong&amp;motel_id=1</w:t>
+            <w:pPr>
+              <w:rPr>
+                <w:color w:val="FF0000"/>
+              </w:rPr>
+            </w:pPr>
+            <w:r>
+              <w:rPr>
+                <w:color w:val="FF0000"/>
+              </w:rPr>
+              <w:t>http://127.0.0.1:8000/rooms/?q=phong&amp;motel_id=8</w:t>
             </w:r>
           </w:p>
         </w:tc>
@@ -9805,14 +9979,6 @@
                 <w:color w:val="FF0000"/>
               </w:rPr>
             </w:pPr>
-            <w:r>
-              <w:rPr>
-                <w:b/>
-                <w:bCs/>
-                <w:color w:val="FF0000"/>
-              </w:rPr>
-              <w:t>Lỗi chưa mã hóa mật khẩu khi lưu DB</w:t>
-            </w:r>
           </w:p>
         </w:tc>
         <w:tc>
@@ -9840,14 +10006,6 @@
                 <w:color w:val="196B24" w:themeColor="accent3"/>
               </w:rPr>
             </w:pPr>
-            <w:r>
-              <w:rPr>
-                <w:b/>
-                <w:bCs/>
-                <w:color w:val="FF0000"/>
-              </w:rPr>
-              <w:t>ERROR</w:t>
-            </w:r>
           </w:p>
         </w:tc>
         <w:tc>
@@ -9942,6 +10100,7 @@
         <w:tc>
           <w:tcPr>
             <w:tcW w:w="1276" w:type="dxa"/>
+            <w:vMerge w:val="restart"/>
           </w:tcPr>
           <w:p>
             <w:r>
@@ -9954,7 +10113,15 @@
             <w:tcW w:w="4395" w:type="dxa"/>
           </w:tcPr>
           <w:p>
-            <w:r>
+            <w:pPr>
+              <w:rPr>
+                <w:color w:val="FF0000"/>
+              </w:rPr>
+            </w:pPr>
+            <w:r>
+              <w:rPr>
+                <w:color w:val="FF0000"/>
+              </w:rPr>
               <w:t>http://127.0.0.1:8000/tenants/</w:t>
             </w:r>
           </w:p>
@@ -10030,6 +10197,7 @@
         <w:tc>
           <w:tcPr>
             <w:tcW w:w="1276" w:type="dxa"/>
+            <w:vMerge/>
           </w:tcPr>
           <w:p/>
         </w:tc>
@@ -10038,8 +10206,16 @@
             <w:tcW w:w="4395" w:type="dxa"/>
           </w:tcPr>
           <w:p>
-            <w:r>
-              <w:t>http://127.0.0.1:8000/tenants/do-nhat-duy/</w:t>
+            <w:pPr>
+              <w:rPr>
+                <w:color w:val="FF0000"/>
+              </w:rPr>
+            </w:pPr>
+            <w:r>
+              <w:rPr>
+                <w:color w:val="FF0000"/>
+              </w:rPr>
+              <w:t>http://127.0.0.1:8000/tenants/le-thi-thuy/</w:t>
             </w:r>
           </w:p>
         </w:tc>
@@ -10115,6 +10291,7 @@
         <w:tc>
           <w:tcPr>
             <w:tcW w:w="1276" w:type="dxa"/>
+            <w:vMerge/>
           </w:tcPr>
           <w:p/>
         </w:tc>
@@ -10123,8 +10300,16 @@
             <w:tcW w:w="4395" w:type="dxa"/>
           </w:tcPr>
           <w:p>
-            <w:r>
-              <w:t>http://127.0.0.1:8000/tenants/?user_id=4/</w:t>
+            <w:pPr>
+              <w:rPr>
+                <w:color w:val="FF0000"/>
+              </w:rPr>
+            </w:pPr>
+            <w:r>
+              <w:rPr>
+                <w:color w:val="FF0000"/>
+              </w:rPr>
+              <w:t>http://127.0.0.1:8000/tenants/?user_id=27/</w:t>
             </w:r>
           </w:p>
         </w:tc>
@@ -10195,6 +10380,7 @@
         <w:tc>
           <w:tcPr>
             <w:tcW w:w="1276" w:type="dxa"/>
+            <w:vMerge/>
           </w:tcPr>
           <w:p/>
         </w:tc>
@@ -10203,11 +10389,16 @@
             <w:tcW w:w="4395" w:type="dxa"/>
           </w:tcPr>
           <w:p>
-            <w:r>
-              <w:t>http://127.0.0.1:8000/tenants/?q=</w:t>
-            </w:r>
-            <w:r>
-              <w:t>đỗ nhất duy</w:t>
+            <w:pPr>
+              <w:rPr>
+                <w:color w:val="FF0000"/>
+              </w:rPr>
+            </w:pPr>
+            <w:r>
+              <w:rPr>
+                <w:color w:val="FF0000"/>
+              </w:rPr>
+              <w:t>http://127.0.0.1:8000/tenants/?q= Lê Thị Thủy</w:t>
             </w:r>
           </w:p>
         </w:tc>
@@ -10278,6 +10469,7 @@
         <w:tc>
           <w:tcPr>
             <w:tcW w:w="1276" w:type="dxa"/>
+            <w:vMerge/>
           </w:tcPr>
           <w:p/>
         </w:tc>
@@ -10286,8 +10478,16 @@
             <w:tcW w:w="4395" w:type="dxa"/>
           </w:tcPr>
           <w:p>
-            <w:r>
-              <w:t>http://127.0.0.1:8000/tenants/?slug=do-nhat-duy</w:t>
+            <w:pPr>
+              <w:rPr>
+                <w:color w:val="FF0000"/>
+              </w:rPr>
+            </w:pPr>
+            <w:r>
+              <w:rPr>
+                <w:color w:val="FF0000"/>
+              </w:rPr>
+              <w:t>http://127.0.0.1:8000/tenants/?slug=le-thi-thu</w:t>
             </w:r>
           </w:p>
         </w:tc>
@@ -10439,7 +10639,15 @@
             <w:tcW w:w="4395" w:type="dxa"/>
           </w:tcPr>
           <w:p>
-            <w:r>
+            <w:pPr>
+              <w:rPr>
+                <w:color w:val="FF0000"/>
+              </w:rPr>
+            </w:pPr>
+            <w:r>
+              <w:rPr>
+                <w:color w:val="FF0000"/>
+              </w:rPr>
               <w:t>http://127.0.0.1:8000/landlords/</w:t>
             </w:r>
           </w:p>
@@ -10639,26 +10847,49 @@
         <w:tc>
           <w:tcPr>
             <w:tcW w:w="1276" w:type="dxa"/>
-          </w:tcPr>
-          <w:p>
-            <w:r>
-              <w:t>Comment</w:t>
+            <w:vMerge w:val="restart"/>
+            <w:shd w:val="clear" w:color="auto" w:fill="FFFFFF" w:themeFill="background1"/>
+          </w:tcPr>
+          <w:p>
+            <w:r>
+              <w:t>POST</w:t>
+            </w:r>
+          </w:p>
+          <w:p>
+            <w:r>
+              <w:t>Postman</w:t>
+            </w:r>
+          </w:p>
+          <w:p>
+            <w:r>
+              <w:t>Có chứng thực</w:t>
             </w:r>
           </w:p>
         </w:tc>
         <w:tc>
           <w:tcPr>
             <w:tcW w:w="4395" w:type="dxa"/>
-          </w:tcPr>
-          <w:p>
-            <w:r>
-              <w:t>{{127}}/comments/?post_id=d14891e28078498d9985b7b4e5eb17e3</w:t>
+            <w:shd w:val="clear" w:color="auto" w:fill="FFFFFF" w:themeFill="background1"/>
+          </w:tcPr>
+          <w:p>
+            <w:r>
+              <w:rPr>
+                <w:color w:val="FF0000"/>
+              </w:rPr>
+              <w:t>http://127.0.0.1:8000</w:t>
+            </w:r>
+            <w:r>
+              <w:rPr>
+                <w:color w:val="FF0000"/>
+              </w:rPr>
+              <w:t>/posts/</w:t>
             </w:r>
           </w:p>
         </w:tc>
         <w:tc>
           <w:tcPr>
             <w:tcW w:w="1417" w:type="dxa"/>
+            <w:shd w:val="clear" w:color="auto" w:fill="FFFFFF" w:themeFill="background1"/>
           </w:tcPr>
           <w:p>
             <w:pPr>
@@ -10679,6 +10910,7 @@
         <w:tc>
           <w:tcPr>
             <w:tcW w:w="1134" w:type="dxa"/>
+            <w:shd w:val="clear" w:color="auto" w:fill="FFFFFF" w:themeFill="background1"/>
           </w:tcPr>
           <w:p>
             <w:pPr>
@@ -10701,16 +10933,18 @@
         <w:tc>
           <w:tcPr>
             <w:tcW w:w="1985" w:type="dxa"/>
-          </w:tcPr>
-          <w:p>
-            <w:r>
-              <w:t>Lấy nội dung danh sách comment theo post_id (chỉ lấy cấp cha)</w:t>
+            <w:shd w:val="clear" w:color="auto" w:fill="FFFFFF" w:themeFill="background1"/>
+          </w:tcPr>
+          <w:p>
+            <w:r>
+              <w:t>Lấy danh sách các bài đăng</w:t>
             </w:r>
           </w:p>
         </w:tc>
         <w:tc>
           <w:tcPr>
             <w:tcW w:w="1417" w:type="dxa"/>
+            <w:shd w:val="clear" w:color="auto" w:fill="FFFFFF" w:themeFill="background1"/>
           </w:tcPr>
           <w:p>
             <w:pPr>
@@ -10727,31 +10961,61 @@
         <w:tc>
           <w:tcPr>
             <w:tcW w:w="1276" w:type="dxa"/>
+            <w:vMerge/>
+            <w:shd w:val="clear" w:color="auto" w:fill="FFFFFF" w:themeFill="background1"/>
           </w:tcPr>
           <w:p/>
         </w:tc>
         <w:tc>
           <w:tcPr>
             <w:tcW w:w="4395" w:type="dxa"/>
-          </w:tcPr>
-          <w:p/>
+            <w:shd w:val="clear" w:color="auto" w:fill="FFFFFF" w:themeFill="background1"/>
+          </w:tcPr>
+          <w:p>
+            <w:pPr>
+              <w:rPr>
+                <w:color w:val="FF0000"/>
+              </w:rPr>
+            </w:pPr>
+            <w:r>
+              <w:rPr>
+                <w:color w:val="FF0000"/>
+              </w:rPr>
+              <w:t>http://127.0.0.1:8000</w:t>
+            </w:r>
+            <w:r>
+              <w:rPr>
+                <w:color w:val="FF0000"/>
+              </w:rPr>
+              <w:t>/posts/</w:t>
+            </w:r>
+          </w:p>
         </w:tc>
         <w:tc>
           <w:tcPr>
             <w:tcW w:w="1417" w:type="dxa"/>
-          </w:tcPr>
-          <w:p>
-            <w:pPr>
-              <w:rPr>
-                <w:b/>
-                <w:bCs/>
-              </w:rPr>
-            </w:pPr>
+            <w:shd w:val="clear" w:color="auto" w:fill="FFFFFF" w:themeFill="background1"/>
+          </w:tcPr>
+          <w:p>
+            <w:pPr>
+              <w:rPr>
+                <w:b/>
+                <w:bCs/>
+              </w:rPr>
+            </w:pPr>
+            <w:r>
+              <w:rPr>
+                <w:b/>
+                <w:bCs/>
+              </w:rPr>
+              <w:t>POST</w:t>
+            </w:r>
           </w:p>
         </w:tc>
         <w:tc>
           <w:tcPr>
             <w:tcW w:w="1134" w:type="dxa"/>
+            <w:shd w:val="clear" w:color="auto" w:fill="FFFFFF" w:themeFill="background1"/>
           </w:tcPr>
           <w:p>
             <w:pPr>
@@ -10761,17 +11025,31 @@
                 <w:color w:val="196B24" w:themeColor="accent3"/>
               </w:rPr>
             </w:pPr>
+            <w:r>
+              <w:rPr>
+                <w:b/>
+                <w:bCs/>
+                <w:color w:val="196B24" w:themeColor="accent3"/>
+              </w:rPr>
+              <w:t>OK</w:t>
+            </w:r>
           </w:p>
         </w:tc>
         <w:tc>
           <w:tcPr>
             <w:tcW w:w="1985" w:type="dxa"/>
-          </w:tcPr>
-          <w:p/>
+            <w:shd w:val="clear" w:color="auto" w:fill="FFFFFF" w:themeFill="background1"/>
+          </w:tcPr>
+          <w:p>
+            <w:r>
+              <w:t>Tạo bài viết mới.</w:t>
+            </w:r>
+          </w:p>
         </w:tc>
         <w:tc>
           <w:tcPr>
             <w:tcW w:w="1417" w:type="dxa"/>
+            <w:shd w:val="clear" w:color="auto" w:fill="FFFFFF" w:themeFill="background1"/>
           </w:tcPr>
           <w:p>
             <w:pPr>
@@ -10788,31 +11066,55 @@
         <w:tc>
           <w:tcPr>
             <w:tcW w:w="1276" w:type="dxa"/>
+            <w:vMerge/>
+            <w:shd w:val="clear" w:color="auto" w:fill="FFFFFF" w:themeFill="background1"/>
           </w:tcPr>
           <w:p/>
         </w:tc>
         <w:tc>
           <w:tcPr>
             <w:tcW w:w="4395" w:type="dxa"/>
-          </w:tcPr>
-          <w:p/>
+            <w:shd w:val="clear" w:color="auto" w:fill="FFFFFF" w:themeFill="background1"/>
+          </w:tcPr>
+          <w:p>
+            <w:pPr>
+              <w:rPr>
+                <w:color w:val="FF0000"/>
+              </w:rPr>
+            </w:pPr>
+            <w:r>
+              <w:rPr>
+                <w:color w:val="FF0000"/>
+              </w:rPr>
+              <w:t>http://127.0.0.1:8000/posts/085f49a6-f150-42a1-a3ae-351cf4637731/</w:t>
+            </w:r>
+          </w:p>
         </w:tc>
         <w:tc>
           <w:tcPr>
             <w:tcW w:w="1417" w:type="dxa"/>
-          </w:tcPr>
-          <w:p>
-            <w:pPr>
-              <w:rPr>
-                <w:b/>
-                <w:bCs/>
-              </w:rPr>
-            </w:pPr>
+            <w:shd w:val="clear" w:color="auto" w:fill="FFFFFF" w:themeFill="background1"/>
+          </w:tcPr>
+          <w:p>
+            <w:pPr>
+              <w:rPr>
+                <w:b/>
+                <w:bCs/>
+              </w:rPr>
+            </w:pPr>
+            <w:r>
+              <w:rPr>
+                <w:b/>
+                <w:bCs/>
+              </w:rPr>
+              <w:t>GET</w:t>
+            </w:r>
           </w:p>
         </w:tc>
         <w:tc>
           <w:tcPr>
             <w:tcW w:w="1134" w:type="dxa"/>
+            <w:shd w:val="clear" w:color="auto" w:fill="FFFFFF" w:themeFill="background1"/>
           </w:tcPr>
           <w:p>
             <w:pPr>
@@ -10822,17 +11124,34 @@
                 <w:color w:val="196B24" w:themeColor="accent3"/>
               </w:rPr>
             </w:pPr>
+            <w:r>
+              <w:rPr>
+                <w:b/>
+                <w:bCs/>
+                <w:color w:val="196B24" w:themeColor="accent3"/>
+              </w:rPr>
+              <w:t>OK</w:t>
+            </w:r>
           </w:p>
         </w:tc>
         <w:tc>
           <w:tcPr>
             <w:tcW w:w="1985" w:type="dxa"/>
-          </w:tcPr>
-          <w:p/>
+            <w:shd w:val="clear" w:color="auto" w:fill="FFFFFF" w:themeFill="background1"/>
+          </w:tcPr>
+          <w:p>
+            <w:r>
+              <w:t>Lấy chi tiết một bài viết cụ thể theo id.</w:t>
+            </w:r>
+            <w:r>
+              <w:t xml:space="preserve"> (có thể lấy của người khác)</w:t>
+            </w:r>
+          </w:p>
         </w:tc>
         <w:tc>
           <w:tcPr>
             <w:tcW w:w="1417" w:type="dxa"/>
+            <w:shd w:val="clear" w:color="auto" w:fill="FFFFFF" w:themeFill="background1"/>
           </w:tcPr>
           <w:p>
             <w:pPr>
@@ -10849,31 +11168,55 @@
         <w:tc>
           <w:tcPr>
             <w:tcW w:w="1276" w:type="dxa"/>
+            <w:vMerge/>
+            <w:shd w:val="clear" w:color="auto" w:fill="FFFFFF" w:themeFill="background1"/>
           </w:tcPr>
           <w:p/>
         </w:tc>
         <w:tc>
           <w:tcPr>
             <w:tcW w:w="4395" w:type="dxa"/>
-          </w:tcPr>
-          <w:p/>
+            <w:shd w:val="clear" w:color="auto" w:fill="FFFFFF" w:themeFill="background1"/>
+          </w:tcPr>
+          <w:p>
+            <w:pPr>
+              <w:rPr>
+                <w:color w:val="FF0000"/>
+              </w:rPr>
+            </w:pPr>
+            <w:r>
+              <w:rPr>
+                <w:color w:val="FF0000"/>
+              </w:rPr>
+              <w:t>http://127.0.0.1:8000/posts/10d3ac30-9e52-4751-aae0-560c5b615f27/</w:t>
+            </w:r>
+          </w:p>
         </w:tc>
         <w:tc>
           <w:tcPr>
             <w:tcW w:w="1417" w:type="dxa"/>
-          </w:tcPr>
-          <w:p>
-            <w:pPr>
-              <w:rPr>
-                <w:b/>
-                <w:bCs/>
-              </w:rPr>
-            </w:pPr>
+            <w:shd w:val="clear" w:color="auto" w:fill="FFFFFF" w:themeFill="background1"/>
+          </w:tcPr>
+          <w:p>
+            <w:pPr>
+              <w:rPr>
+                <w:b/>
+                <w:bCs/>
+              </w:rPr>
+            </w:pPr>
+            <w:r>
+              <w:rPr>
+                <w:b/>
+                <w:bCs/>
+              </w:rPr>
+              <w:t>PATCH</w:t>
+            </w:r>
           </w:p>
         </w:tc>
         <w:tc>
           <w:tcPr>
             <w:tcW w:w="1134" w:type="dxa"/>
+            <w:shd w:val="clear" w:color="auto" w:fill="FFFFFF" w:themeFill="background1"/>
           </w:tcPr>
           <w:p>
             <w:pPr>
@@ -10883,17 +11226,34 @@
                 <w:color w:val="196B24" w:themeColor="accent3"/>
               </w:rPr>
             </w:pPr>
+            <w:r>
+              <w:rPr>
+                <w:b/>
+                <w:bCs/>
+                <w:color w:val="196B24" w:themeColor="accent3"/>
+              </w:rPr>
+              <w:t>OK</w:t>
+            </w:r>
           </w:p>
         </w:tc>
         <w:tc>
           <w:tcPr>
             <w:tcW w:w="1985" w:type="dxa"/>
-          </w:tcPr>
-          <w:p/>
+            <w:shd w:val="clear" w:color="auto" w:fill="FFFFFF" w:themeFill="background1"/>
+          </w:tcPr>
+          <w:p>
+            <w:r>
+              <w:t>Cập nhật một phần nội dung bài viết (id).</w:t>
+            </w:r>
+            <w:r>
+              <w:t xml:space="preserve"> (chỉ chủ bài viết mới cập nhập được)</w:t>
+            </w:r>
+          </w:p>
         </w:tc>
         <w:tc>
           <w:tcPr>
             <w:tcW w:w="1417" w:type="dxa"/>
+            <w:shd w:val="clear" w:color="auto" w:fill="FFFFFF" w:themeFill="background1"/>
           </w:tcPr>
           <w:p>
             <w:pPr>
@@ -10910,31 +11270,55 @@
         <w:tc>
           <w:tcPr>
             <w:tcW w:w="1276" w:type="dxa"/>
+            <w:vMerge/>
+            <w:shd w:val="clear" w:color="auto" w:fill="FFFFFF" w:themeFill="background1"/>
           </w:tcPr>
           <w:p/>
         </w:tc>
         <w:tc>
           <w:tcPr>
             <w:tcW w:w="4395" w:type="dxa"/>
-          </w:tcPr>
-          <w:p/>
+            <w:shd w:val="clear" w:color="auto" w:fill="FFFFFF" w:themeFill="background1"/>
+          </w:tcPr>
+          <w:p>
+            <w:pPr>
+              <w:rPr>
+                <w:color w:val="FF0000"/>
+              </w:rPr>
+            </w:pPr>
+            <w:r>
+              <w:rPr>
+                <w:color w:val="FF0000"/>
+              </w:rPr>
+              <w:t>http://127.0.0.1:8000/posts/10d3ac30-9e52-4751-aae0-560c5b615f27/</w:t>
+            </w:r>
+          </w:p>
         </w:tc>
         <w:tc>
           <w:tcPr>
             <w:tcW w:w="1417" w:type="dxa"/>
-          </w:tcPr>
-          <w:p>
-            <w:pPr>
-              <w:rPr>
-                <w:b/>
-                <w:bCs/>
-              </w:rPr>
-            </w:pPr>
+            <w:shd w:val="clear" w:color="auto" w:fill="FFFFFF" w:themeFill="background1"/>
+          </w:tcPr>
+          <w:p>
+            <w:pPr>
+              <w:rPr>
+                <w:b/>
+                <w:bCs/>
+              </w:rPr>
+            </w:pPr>
+            <w:r>
+              <w:rPr>
+                <w:b/>
+                <w:bCs/>
+              </w:rPr>
+              <w:t>PUT</w:t>
+            </w:r>
           </w:p>
         </w:tc>
         <w:tc>
           <w:tcPr>
             <w:tcW w:w="1134" w:type="dxa"/>
+            <w:shd w:val="clear" w:color="auto" w:fill="FFFFFF" w:themeFill="background1"/>
           </w:tcPr>
           <w:p>
             <w:pPr>
@@ -10944,17 +11328,31 @@
                 <w:color w:val="196B24" w:themeColor="accent3"/>
               </w:rPr>
             </w:pPr>
+            <w:r>
+              <w:rPr>
+                <w:b/>
+                <w:bCs/>
+                <w:color w:val="196B24" w:themeColor="accent3"/>
+              </w:rPr>
+              <w:t>OK</w:t>
+            </w:r>
           </w:p>
         </w:tc>
         <w:tc>
           <w:tcPr>
             <w:tcW w:w="1985" w:type="dxa"/>
-          </w:tcPr>
-          <w:p/>
+            <w:shd w:val="clear" w:color="auto" w:fill="FFFFFF" w:themeFill="background1"/>
+          </w:tcPr>
+          <w:p>
+            <w:r>
+              <w:t>Cập nhật toàn bộ nội dung bài viết (id). Gửi toàn bộ dữ liệu mới.</w:t>
+            </w:r>
+          </w:p>
         </w:tc>
         <w:tc>
           <w:tcPr>
             <w:tcW w:w="1417" w:type="dxa"/>
+            <w:shd w:val="clear" w:color="auto" w:fill="FFFFFF" w:themeFill="background1"/>
           </w:tcPr>
           <w:p>
             <w:pPr>
@@ -10971,31 +11369,154 @@
         <w:tc>
           <w:tcPr>
             <w:tcW w:w="1276" w:type="dxa"/>
+            <w:vMerge/>
+            <w:shd w:val="clear" w:color="auto" w:fill="FFFFFF" w:themeFill="background1"/>
           </w:tcPr>
           <w:p/>
         </w:tc>
         <w:tc>
           <w:tcPr>
             <w:tcW w:w="4395" w:type="dxa"/>
+            <w:shd w:val="clear" w:color="auto" w:fill="FFFFFF" w:themeFill="background1"/>
+          </w:tcPr>
+          <w:p>
+            <w:pPr>
+              <w:rPr>
+                <w:color w:val="FF0000"/>
+              </w:rPr>
+            </w:pPr>
+            <w:r>
+              <w:rPr>
+                <w:color w:val="FF0000"/>
+              </w:rPr>
+              <w:t>http://127.0.0.1:8000/posts/10d3ac30-9e52-4751-aae0-560c5b615f27/</w:t>
+            </w:r>
+          </w:p>
+        </w:tc>
+        <w:tc>
+          <w:tcPr>
+            <w:tcW w:w="1417" w:type="dxa"/>
+            <w:shd w:val="clear" w:color="auto" w:fill="FFFFFF" w:themeFill="background1"/>
+          </w:tcPr>
+          <w:p>
+            <w:pPr>
+              <w:rPr>
+                <w:b/>
+                <w:bCs/>
+              </w:rPr>
+            </w:pPr>
+            <w:r>
+              <w:rPr>
+                <w:b/>
+                <w:bCs/>
+              </w:rPr>
+              <w:t>DELETE</w:t>
+            </w:r>
+          </w:p>
+        </w:tc>
+        <w:tc>
+          <w:tcPr>
+            <w:tcW w:w="1134" w:type="dxa"/>
+            <w:shd w:val="clear" w:color="auto" w:fill="FFFFFF" w:themeFill="background1"/>
+          </w:tcPr>
+          <w:p>
+            <w:pPr>
+              <w:rPr>
+                <w:b/>
+                <w:bCs/>
+                <w:color w:val="196B24" w:themeColor="accent3"/>
+              </w:rPr>
+            </w:pPr>
+            <w:r>
+              <w:rPr>
+                <w:b/>
+                <w:bCs/>
+                <w:color w:val="196B24" w:themeColor="accent3"/>
+              </w:rPr>
+              <w:t>OK</w:t>
+            </w:r>
+          </w:p>
+        </w:tc>
+        <w:tc>
+          <w:tcPr>
+            <w:tcW w:w="1985" w:type="dxa"/>
+            <w:shd w:val="clear" w:color="auto" w:fill="FFFFFF" w:themeFill="background1"/>
+          </w:tcPr>
+          <w:p>
+            <w:r>
+              <w:t>Xóa bài viết theo id</w:t>
+            </w:r>
+          </w:p>
+        </w:tc>
+        <w:tc>
+          <w:tcPr>
+            <w:tcW w:w="1417" w:type="dxa"/>
+            <w:shd w:val="clear" w:color="auto" w:fill="FFFFFF" w:themeFill="background1"/>
+          </w:tcPr>
+          <w:p>
+            <w:pPr>
+              <w:rPr>
+                <w:b/>
+                <w:bCs/>
+                <w:color w:val="196B24" w:themeColor="accent3"/>
+              </w:rPr>
+            </w:pPr>
+          </w:p>
+        </w:tc>
+      </w:tr>
+      <w:tr>
+        <w:tc>
+          <w:tcPr>
+            <w:tcW w:w="1276" w:type="dxa"/>
+            <w:vMerge/>
+            <w:shd w:val="clear" w:color="auto" w:fill="FFFFFF" w:themeFill="background1"/>
           </w:tcPr>
           <w:p/>
         </w:tc>
         <w:tc>
           <w:tcPr>
+            <w:tcW w:w="4395" w:type="dxa"/>
+            <w:shd w:val="clear" w:color="auto" w:fill="FFFFFF" w:themeFill="background1"/>
+          </w:tcPr>
+          <w:p>
+            <w:pPr>
+              <w:rPr>
+                <w:color w:val="FF0000"/>
+              </w:rPr>
+            </w:pPr>
+            <w:r>
+              <w:rPr>
+                <w:color w:val="FF0000"/>
+              </w:rPr>
+              <w:t>http://127.0.0.1:8000/posts/085f49a6-f150-42a1-a3ae-351cf4637731/comments/</w:t>
+            </w:r>
+          </w:p>
+        </w:tc>
+        <w:tc>
+          <w:tcPr>
             <w:tcW w:w="1417" w:type="dxa"/>
-          </w:tcPr>
-          <w:p>
-            <w:pPr>
-              <w:rPr>
-                <w:b/>
-                <w:bCs/>
-              </w:rPr>
-            </w:pPr>
+            <w:shd w:val="clear" w:color="auto" w:fill="FFFFFF" w:themeFill="background1"/>
+          </w:tcPr>
+          <w:p>
+            <w:pPr>
+              <w:rPr>
+                <w:b/>
+                <w:bCs/>
+              </w:rPr>
+            </w:pPr>
+            <w:r>
+              <w:rPr>
+                <w:b/>
+                <w:bCs/>
+              </w:rPr>
+              <w:t>GET</w:t>
+            </w:r>
           </w:p>
         </w:tc>
         <w:tc>
           <w:tcPr>
             <w:tcW w:w="1134" w:type="dxa"/>
+            <w:shd w:val="clear" w:color="auto" w:fill="FFFFFF" w:themeFill="background1"/>
           </w:tcPr>
           <w:p>
             <w:pPr>
@@ -11010,8 +11531,890 @@
         <w:tc>
           <w:tcPr>
             <w:tcW w:w="1985" w:type="dxa"/>
+            <w:shd w:val="clear" w:color="auto" w:fill="FFFFFF" w:themeFill="background1"/>
+          </w:tcPr>
+          <w:tbl>
+            <w:tblPr>
+              <w:tblW w:w="0" w:type="auto"/>
+              <w:tblCellSpacing w:w="15" w:type="dxa"/>
+              <w:tblCellMar>
+                <w:top w:w="15" w:type="dxa"/>
+                <w:left w:w="15" w:type="dxa"/>
+                <w:bottom w:w="15" w:type="dxa"/>
+                <w:right w:w="15" w:type="dxa"/>
+              </w:tblCellMar>
+              <w:tblLook w:val="04A0" w:firstRow="1" w:lastRow="0" w:firstColumn="1" w:lastColumn="0" w:noHBand="0" w:noVBand="1"/>
+            </w:tblPr>
+            <w:tblGrid>
+              <w:gridCol w:w="110"/>
+            </w:tblGrid>
+            <w:tr>
+              <w:trPr>
+                <w:tblCellSpacing w:w="15" w:type="dxa"/>
+              </w:trPr>
+              <w:tc>
+                <w:tcPr>
+                  <w:tcW w:w="36" w:type="dxa"/>
+                  <w:vAlign w:val="center"/>
+                  <w:hideMark/>
+                </w:tcPr>
+                <w:p>
+                  <w:pPr>
+                    <w:spacing w:after="0" w:line="240" w:lineRule="auto"/>
+                    <w:rPr>
+                      <w:lang w:val="vi-VN"/>
+                    </w:rPr>
+                  </w:pPr>
+                </w:p>
+              </w:tc>
+            </w:tr>
+          </w:tbl>
+          <w:p>
+            <w:pPr>
+              <w:rPr>
+                <w:vanish/>
+                <w:lang w:val="vi-VN"/>
+              </w:rPr>
+            </w:pPr>
+          </w:p>
+          <w:p>
+            <w:r>
+              <w:t>Lấy danh sách bình luận của bài viết</w:t>
+            </w:r>
+          </w:p>
+        </w:tc>
+        <w:tc>
+          <w:tcPr>
+            <w:tcW w:w="1417" w:type="dxa"/>
+            <w:shd w:val="clear" w:color="auto" w:fill="FFFFFF" w:themeFill="background1"/>
+          </w:tcPr>
+          <w:p>
+            <w:pPr>
+              <w:rPr>
+                <w:b/>
+                <w:bCs/>
+                <w:color w:val="196B24" w:themeColor="accent3"/>
+              </w:rPr>
+            </w:pPr>
+          </w:p>
+        </w:tc>
+      </w:tr>
+      <w:tr>
+        <w:tc>
+          <w:tcPr>
+            <w:tcW w:w="1276" w:type="dxa"/>
+            <w:shd w:val="clear" w:color="auto" w:fill="D9D9D9" w:themeFill="background1" w:themeFillShade="D9"/>
           </w:tcPr>
           <w:p/>
+        </w:tc>
+        <w:tc>
+          <w:tcPr>
+            <w:tcW w:w="4395" w:type="dxa"/>
+            <w:shd w:val="clear" w:color="auto" w:fill="D9D9D9" w:themeFill="background1" w:themeFillShade="D9"/>
+          </w:tcPr>
+          <w:p/>
+        </w:tc>
+        <w:tc>
+          <w:tcPr>
+            <w:tcW w:w="1417" w:type="dxa"/>
+            <w:shd w:val="clear" w:color="auto" w:fill="D9D9D9" w:themeFill="background1" w:themeFillShade="D9"/>
+          </w:tcPr>
+          <w:p>
+            <w:pPr>
+              <w:rPr>
+                <w:b/>
+                <w:bCs/>
+              </w:rPr>
+            </w:pPr>
+          </w:p>
+        </w:tc>
+        <w:tc>
+          <w:tcPr>
+            <w:tcW w:w="1134" w:type="dxa"/>
+            <w:shd w:val="clear" w:color="auto" w:fill="D9D9D9" w:themeFill="background1" w:themeFillShade="D9"/>
+          </w:tcPr>
+          <w:p>
+            <w:pPr>
+              <w:rPr>
+                <w:b/>
+                <w:bCs/>
+                <w:color w:val="196B24" w:themeColor="accent3"/>
+              </w:rPr>
+            </w:pPr>
+          </w:p>
+        </w:tc>
+        <w:tc>
+          <w:tcPr>
+            <w:tcW w:w="1985" w:type="dxa"/>
+            <w:shd w:val="clear" w:color="auto" w:fill="D9D9D9" w:themeFill="background1" w:themeFillShade="D9"/>
+          </w:tcPr>
+          <w:p/>
+        </w:tc>
+        <w:tc>
+          <w:tcPr>
+            <w:tcW w:w="1417" w:type="dxa"/>
+            <w:shd w:val="clear" w:color="auto" w:fill="D9D9D9" w:themeFill="background1" w:themeFillShade="D9"/>
+          </w:tcPr>
+          <w:p>
+            <w:pPr>
+              <w:rPr>
+                <w:b/>
+                <w:bCs/>
+                <w:color w:val="196B24" w:themeColor="accent3"/>
+              </w:rPr>
+            </w:pPr>
+          </w:p>
+        </w:tc>
+      </w:tr>
+      <w:tr>
+        <w:tc>
+          <w:tcPr>
+            <w:tcW w:w="1276" w:type="dxa"/>
+          </w:tcPr>
+          <w:p>
+            <w:r>
+              <w:t>Comment</w:t>
+            </w:r>
+          </w:p>
+        </w:tc>
+        <w:tc>
+          <w:tcPr>
+            <w:tcW w:w="4395" w:type="dxa"/>
+          </w:tcPr>
+          <w:p>
+            <w:pPr>
+              <w:rPr>
+                <w:color w:val="FF0000"/>
+              </w:rPr>
+            </w:pPr>
+            <w:r>
+              <w:rPr>
+                <w:color w:val="FF0000"/>
+              </w:rPr>
+              <w:t>http://127.0.0.1:8000/comments/</w:t>
+            </w:r>
+          </w:p>
+        </w:tc>
+        <w:tc>
+          <w:tcPr>
+            <w:tcW w:w="1417" w:type="dxa"/>
+          </w:tcPr>
+          <w:p>
+            <w:pPr>
+              <w:rPr>
+                <w:b/>
+                <w:bCs/>
+              </w:rPr>
+            </w:pPr>
+            <w:r>
+              <w:rPr>
+                <w:b/>
+                <w:bCs/>
+              </w:rPr>
+              <w:t>GET</w:t>
+            </w:r>
+          </w:p>
+        </w:tc>
+        <w:tc>
+          <w:tcPr>
+            <w:tcW w:w="1134" w:type="dxa"/>
+          </w:tcPr>
+          <w:p>
+            <w:pPr>
+              <w:rPr>
+                <w:b/>
+                <w:bCs/>
+                <w:color w:val="196B24" w:themeColor="accent3"/>
+              </w:rPr>
+            </w:pPr>
+            <w:r>
+              <w:rPr>
+                <w:b/>
+                <w:bCs/>
+                <w:color w:val="196B24" w:themeColor="accent3"/>
+              </w:rPr>
+              <w:t>OK</w:t>
+            </w:r>
+          </w:p>
+        </w:tc>
+        <w:tc>
+          <w:tcPr>
+            <w:tcW w:w="1985" w:type="dxa"/>
+          </w:tcPr>
+          <w:p>
+            <w:r>
+              <w:t>Lấy tất cả bình luận.</w:t>
+            </w:r>
+            <w:r>
+              <w:t>(không cần xác thực)</w:t>
+            </w:r>
+          </w:p>
+        </w:tc>
+        <w:tc>
+          <w:tcPr>
+            <w:tcW w:w="1417" w:type="dxa"/>
+          </w:tcPr>
+          <w:p>
+            <w:pPr>
+              <w:rPr>
+                <w:b/>
+                <w:bCs/>
+                <w:color w:val="196B24" w:themeColor="accent3"/>
+              </w:rPr>
+            </w:pPr>
+          </w:p>
+        </w:tc>
+      </w:tr>
+      <w:tr>
+        <w:tc>
+          <w:tcPr>
+            <w:tcW w:w="1276" w:type="dxa"/>
+          </w:tcPr>
+          <w:p/>
+        </w:tc>
+        <w:tc>
+          <w:tcPr>
+            <w:tcW w:w="4395" w:type="dxa"/>
+          </w:tcPr>
+          <w:p>
+            <w:pPr>
+              <w:rPr>
+                <w:color w:val="FF0000"/>
+              </w:rPr>
+            </w:pPr>
+            <w:r>
+              <w:rPr>
+                <w:color w:val="FF0000"/>
+              </w:rPr>
+              <w:t>http://127.0.0.1:8000/comments/9/</w:t>
+            </w:r>
+          </w:p>
+        </w:tc>
+        <w:tc>
+          <w:tcPr>
+            <w:tcW w:w="1417" w:type="dxa"/>
+          </w:tcPr>
+          <w:p>
+            <w:pPr>
+              <w:rPr>
+                <w:b/>
+                <w:bCs/>
+              </w:rPr>
+            </w:pPr>
+            <w:r>
+              <w:rPr>
+                <w:b/>
+                <w:bCs/>
+              </w:rPr>
+              <w:t>PATCH</w:t>
+            </w:r>
+          </w:p>
+        </w:tc>
+        <w:tc>
+          <w:tcPr>
+            <w:tcW w:w="1134" w:type="dxa"/>
+          </w:tcPr>
+          <w:p>
+            <w:pPr>
+              <w:rPr>
+                <w:b/>
+                <w:bCs/>
+                <w:color w:val="196B24" w:themeColor="accent3"/>
+              </w:rPr>
+            </w:pPr>
+            <w:r>
+              <w:rPr>
+                <w:b/>
+                <w:bCs/>
+                <w:color w:val="196B24" w:themeColor="accent3"/>
+              </w:rPr>
+              <w:t>OK</w:t>
+            </w:r>
+          </w:p>
+        </w:tc>
+        <w:tc>
+          <w:tcPr>
+            <w:tcW w:w="1985" w:type="dxa"/>
+          </w:tcPr>
+          <w:p>
+            <w:r>
+              <w:t>Cập nhật một phần nội dung bình luận</w:t>
+            </w:r>
+          </w:p>
+        </w:tc>
+        <w:tc>
+          <w:tcPr>
+            <w:tcW w:w="1417" w:type="dxa"/>
+          </w:tcPr>
+          <w:p>
+            <w:pPr>
+              <w:rPr>
+                <w:b/>
+                <w:bCs/>
+                <w:color w:val="196B24" w:themeColor="accent3"/>
+              </w:rPr>
+            </w:pPr>
+          </w:p>
+        </w:tc>
+      </w:tr>
+      <w:tr>
+        <w:tc>
+          <w:tcPr>
+            <w:tcW w:w="1276" w:type="dxa"/>
+          </w:tcPr>
+          <w:p/>
+        </w:tc>
+        <w:tc>
+          <w:tcPr>
+            <w:tcW w:w="4395" w:type="dxa"/>
+          </w:tcPr>
+          <w:p>
+            <w:pPr>
+              <w:rPr>
+                <w:color w:val="FF0000"/>
+              </w:rPr>
+            </w:pPr>
+            <w:r>
+              <w:rPr>
+                <w:color w:val="FF0000"/>
+              </w:rPr>
+              <w:t>http://127.0.0.1:8000/comments/9/</w:t>
+            </w:r>
+          </w:p>
+        </w:tc>
+        <w:tc>
+          <w:tcPr>
+            <w:tcW w:w="1417" w:type="dxa"/>
+          </w:tcPr>
+          <w:p>
+            <w:pPr>
+              <w:rPr>
+                <w:b/>
+                <w:bCs/>
+              </w:rPr>
+            </w:pPr>
+            <w:r>
+              <w:rPr>
+                <w:b/>
+                <w:bCs/>
+              </w:rPr>
+              <w:t>DELETE</w:t>
+            </w:r>
+          </w:p>
+        </w:tc>
+        <w:tc>
+          <w:tcPr>
+            <w:tcW w:w="1134" w:type="dxa"/>
+          </w:tcPr>
+          <w:p>
+            <w:pPr>
+              <w:rPr>
+                <w:b/>
+                <w:bCs/>
+                <w:color w:val="196B24" w:themeColor="accent3"/>
+              </w:rPr>
+            </w:pPr>
+            <w:r>
+              <w:rPr>
+                <w:b/>
+                <w:bCs/>
+                <w:color w:val="196B24" w:themeColor="accent3"/>
+              </w:rPr>
+              <w:t>OK</w:t>
+            </w:r>
+          </w:p>
+        </w:tc>
+        <w:tc>
+          <w:tcPr>
+            <w:tcW w:w="1985" w:type="dxa"/>
+          </w:tcPr>
+          <w:p>
+            <w:r>
+              <w:t>Xóa bình luận theo</w:t>
+            </w:r>
+            <w:r>
+              <w:t xml:space="preserve"> id</w:t>
+            </w:r>
+          </w:p>
+        </w:tc>
+        <w:tc>
+          <w:tcPr>
+            <w:tcW w:w="1417" w:type="dxa"/>
+          </w:tcPr>
+          <w:p>
+            <w:pPr>
+              <w:rPr>
+                <w:b/>
+                <w:bCs/>
+                <w:color w:val="196B24" w:themeColor="accent3"/>
+              </w:rPr>
+            </w:pPr>
+          </w:p>
+        </w:tc>
+      </w:tr>
+      <w:tr>
+        <w:tc>
+          <w:tcPr>
+            <w:tcW w:w="1276" w:type="dxa"/>
+          </w:tcPr>
+          <w:p/>
+        </w:tc>
+        <w:tc>
+          <w:tcPr>
+            <w:tcW w:w="4395" w:type="dxa"/>
+          </w:tcPr>
+          <w:p>
+            <w:pPr>
+              <w:rPr>
+                <w:color w:val="FF0000"/>
+              </w:rPr>
+            </w:pPr>
+            <w:r>
+              <w:rPr>
+                <w:color w:val="FF0000"/>
+              </w:rPr>
+              <w:t>http://127.0.0.1:8000/comments/10/like/</w:t>
+            </w:r>
+          </w:p>
+        </w:tc>
+        <w:tc>
+          <w:tcPr>
+            <w:tcW w:w="1417" w:type="dxa"/>
+          </w:tcPr>
+          <w:p>
+            <w:pPr>
+              <w:rPr>
+                <w:b/>
+                <w:bCs/>
+              </w:rPr>
+            </w:pPr>
+            <w:r>
+              <w:rPr>
+                <w:b/>
+                <w:bCs/>
+              </w:rPr>
+              <w:t>POST</w:t>
+            </w:r>
+          </w:p>
+        </w:tc>
+        <w:tc>
+          <w:tcPr>
+            <w:tcW w:w="1134" w:type="dxa"/>
+          </w:tcPr>
+          <w:p>
+            <w:pPr>
+              <w:rPr>
+                <w:b/>
+                <w:bCs/>
+                <w:color w:val="196B24" w:themeColor="accent3"/>
+              </w:rPr>
+            </w:pPr>
+            <w:r>
+              <w:rPr>
+                <w:b/>
+                <w:bCs/>
+                <w:color w:val="196B24" w:themeColor="accent3"/>
+              </w:rPr>
+              <w:t>OK</w:t>
+            </w:r>
+          </w:p>
+        </w:tc>
+        <w:tc>
+          <w:tcPr>
+            <w:tcW w:w="1985" w:type="dxa"/>
+          </w:tcPr>
+          <w:p>
+            <w:r>
+              <w:t>Like (thích) bình luận theo</w:t>
+            </w:r>
+            <w:r>
+              <w:t xml:space="preserve"> id</w:t>
+            </w:r>
+            <w:r>
+              <w:br/>
+              <w:t>nhấn lần 2 là bỏ like</w:t>
+            </w:r>
+          </w:p>
+        </w:tc>
+        <w:tc>
+          <w:tcPr>
+            <w:tcW w:w="1417" w:type="dxa"/>
+          </w:tcPr>
+          <w:p>
+            <w:pPr>
+              <w:rPr>
+                <w:b/>
+                <w:bCs/>
+                <w:color w:val="196B24" w:themeColor="accent3"/>
+              </w:rPr>
+            </w:pPr>
+          </w:p>
+        </w:tc>
+      </w:tr>
+      <w:tr>
+        <w:tc>
+          <w:tcPr>
+            <w:tcW w:w="1276" w:type="dxa"/>
+          </w:tcPr>
+          <w:p/>
+        </w:tc>
+        <w:tc>
+          <w:tcPr>
+            <w:tcW w:w="4395" w:type="dxa"/>
+          </w:tcPr>
+          <w:p>
+            <w:pPr>
+              <w:rPr>
+                <w:color w:val="FF0000"/>
+              </w:rPr>
+            </w:pPr>
+            <w:r>
+              <w:rPr>
+                <w:color w:val="FF0000"/>
+              </w:rPr>
+              <w:t>http://127.0.0.1:8000/comments/10/reply/</w:t>
+            </w:r>
+          </w:p>
+        </w:tc>
+        <w:tc>
+          <w:tcPr>
+            <w:tcW w:w="1417" w:type="dxa"/>
+          </w:tcPr>
+          <w:p>
+            <w:pPr>
+              <w:rPr>
+                <w:b/>
+                <w:bCs/>
+              </w:rPr>
+            </w:pPr>
+            <w:r>
+              <w:rPr>
+                <w:b/>
+                <w:bCs/>
+              </w:rPr>
+              <w:t>POST</w:t>
+            </w:r>
+          </w:p>
+        </w:tc>
+        <w:tc>
+          <w:tcPr>
+            <w:tcW w:w="1134" w:type="dxa"/>
+          </w:tcPr>
+          <w:p>
+            <w:pPr>
+              <w:rPr>
+                <w:b/>
+                <w:bCs/>
+                <w:color w:val="196B24" w:themeColor="accent3"/>
+              </w:rPr>
+            </w:pPr>
+            <w:r>
+              <w:rPr>
+                <w:b/>
+                <w:bCs/>
+                <w:color w:val="196B24" w:themeColor="accent3"/>
+              </w:rPr>
+              <w:t>OK</w:t>
+            </w:r>
+          </w:p>
+        </w:tc>
+        <w:tc>
+          <w:tcPr>
+            <w:tcW w:w="1985" w:type="dxa"/>
+          </w:tcPr>
+          <w:p>
+            <w:r>
+              <w:t>Trả lời bình luận</w:t>
+            </w:r>
+            <w:r>
+              <w:t xml:space="preserve"> - </w:t>
+            </w:r>
+            <w:r>
+              <w:t>tạo bình luận mới có liên kết tới bình luận cha.</w:t>
+            </w:r>
+          </w:p>
+        </w:tc>
+        <w:tc>
+          <w:tcPr>
+            <w:tcW w:w="1417" w:type="dxa"/>
+          </w:tcPr>
+          <w:p>
+            <w:pPr>
+              <w:rPr>
+                <w:b/>
+                <w:bCs/>
+                <w:color w:val="196B24" w:themeColor="accent3"/>
+              </w:rPr>
+            </w:pPr>
+          </w:p>
+        </w:tc>
+      </w:tr>
+      <w:tr>
+        <w:tc>
+          <w:tcPr>
+            <w:tcW w:w="1276" w:type="dxa"/>
+          </w:tcPr>
+          <w:p/>
+        </w:tc>
+        <w:tc>
+          <w:tcPr>
+            <w:tcW w:w="4395" w:type="dxa"/>
+          </w:tcPr>
+          <w:p>
+            <w:pPr>
+              <w:rPr>
+                <w:color w:val="FF0000"/>
+              </w:rPr>
+            </w:pPr>
+            <w:r>
+              <w:rPr>
+                <w:color w:val="FF0000"/>
+              </w:rPr>
+              <w:t>http://127.0.0.1:8000/comments/</w:t>
+            </w:r>
+          </w:p>
+        </w:tc>
+        <w:tc>
+          <w:tcPr>
+            <w:tcW w:w="1417" w:type="dxa"/>
+          </w:tcPr>
+          <w:p>
+            <w:pPr>
+              <w:rPr>
+                <w:b/>
+                <w:bCs/>
+              </w:rPr>
+            </w:pPr>
+            <w:r>
+              <w:rPr>
+                <w:b/>
+                <w:bCs/>
+              </w:rPr>
+              <w:t>POST</w:t>
+            </w:r>
+          </w:p>
+        </w:tc>
+        <w:tc>
+          <w:tcPr>
+            <w:tcW w:w="1134" w:type="dxa"/>
+          </w:tcPr>
+          <w:p>
+            <w:pPr>
+              <w:rPr>
+                <w:b/>
+                <w:bCs/>
+                <w:color w:val="196B24" w:themeColor="accent3"/>
+              </w:rPr>
+            </w:pPr>
+            <w:r>
+              <w:rPr>
+                <w:b/>
+                <w:bCs/>
+                <w:color w:val="196B24" w:themeColor="accent3"/>
+              </w:rPr>
+              <w:t>OK</w:t>
+            </w:r>
+          </w:p>
+        </w:tc>
+        <w:tc>
+          <w:tcPr>
+            <w:tcW w:w="1985" w:type="dxa"/>
+          </w:tcPr>
+          <w:p>
+            <w:r>
+              <w:t>Tạo mới bình luận gốc</w:t>
+            </w:r>
+          </w:p>
+        </w:tc>
+        <w:tc>
+          <w:tcPr>
+            <w:tcW w:w="1417" w:type="dxa"/>
+          </w:tcPr>
+          <w:p>
+            <w:pPr>
+              <w:rPr>
+                <w:b/>
+                <w:bCs/>
+                <w:color w:val="196B24" w:themeColor="accent3"/>
+              </w:rPr>
+            </w:pPr>
+          </w:p>
+        </w:tc>
+      </w:tr>
+      <w:tr>
+        <w:tc>
+          <w:tcPr>
+            <w:tcW w:w="1276" w:type="dxa"/>
+          </w:tcPr>
+          <w:p/>
+        </w:tc>
+        <w:tc>
+          <w:tcPr>
+            <w:tcW w:w="4395" w:type="dxa"/>
+          </w:tcPr>
+          <w:p>
+            <w:pPr>
+              <w:rPr>
+                <w:color w:val="FF0000"/>
+              </w:rPr>
+            </w:pPr>
+            <w:r>
+              <w:rPr>
+                <w:color w:val="FF0000"/>
+              </w:rPr>
+              <w:t>http://127.0.0.1:8000/comments/20/</w:t>
+            </w:r>
+          </w:p>
+        </w:tc>
+        <w:tc>
+          <w:tcPr>
+            <w:tcW w:w="1417" w:type="dxa"/>
+          </w:tcPr>
+          <w:p>
+            <w:pPr>
+              <w:rPr>
+                <w:b/>
+                <w:bCs/>
+              </w:rPr>
+            </w:pPr>
+            <w:r>
+              <w:rPr>
+                <w:b/>
+                <w:bCs/>
+              </w:rPr>
+              <w:t>GET</w:t>
+            </w:r>
+          </w:p>
+        </w:tc>
+        <w:tc>
+          <w:tcPr>
+            <w:tcW w:w="1134" w:type="dxa"/>
+          </w:tcPr>
+          <w:p>
+            <w:pPr>
+              <w:rPr>
+                <w:b/>
+                <w:bCs/>
+                <w:color w:val="196B24" w:themeColor="accent3"/>
+              </w:rPr>
+            </w:pPr>
+            <w:r>
+              <w:rPr>
+                <w:b/>
+                <w:bCs/>
+                <w:color w:val="196B24" w:themeColor="accent3"/>
+              </w:rPr>
+              <w:t>OK</w:t>
+            </w:r>
+          </w:p>
+        </w:tc>
+        <w:tc>
+          <w:tcPr>
+            <w:tcW w:w="1985" w:type="dxa"/>
+          </w:tcPr>
+          <w:p>
+            <w:r>
+              <w:t>Chi tiết 1 bình luận</w:t>
+            </w:r>
+          </w:p>
+        </w:tc>
+        <w:tc>
+          <w:tcPr>
+            <w:tcW w:w="1417" w:type="dxa"/>
+          </w:tcPr>
+          <w:p>
+            <w:pPr>
+              <w:rPr>
+                <w:b/>
+                <w:bCs/>
+                <w:color w:val="196B24" w:themeColor="accent3"/>
+              </w:rPr>
+            </w:pPr>
+          </w:p>
+        </w:tc>
+      </w:tr>
+      <w:tr>
+        <w:tc>
+          <w:tcPr>
+            <w:tcW w:w="1276" w:type="dxa"/>
+          </w:tcPr>
+          <w:p/>
+        </w:tc>
+        <w:tc>
+          <w:tcPr>
+            <w:tcW w:w="4395" w:type="dxa"/>
+          </w:tcPr>
+          <w:p>
+            <w:pPr>
+              <w:rPr>
+                <w:color w:val="FF0000"/>
+              </w:rPr>
+            </w:pPr>
+            <w:r>
+              <w:rPr>
+                <w:color w:val="FF0000"/>
+              </w:rPr>
+              <w:t>http://127.0.0.1:8000/comments/10/replies/</w:t>
+            </w:r>
+          </w:p>
+        </w:tc>
+        <w:tc>
+          <w:tcPr>
+            <w:tcW w:w="1417" w:type="dxa"/>
+          </w:tcPr>
+          <w:p>
+            <w:pPr>
+              <w:rPr>
+                <w:b/>
+                <w:bCs/>
+              </w:rPr>
+            </w:pPr>
+            <w:r>
+              <w:rPr>
+                <w:b/>
+                <w:bCs/>
+              </w:rPr>
+              <w:t>GET</w:t>
+            </w:r>
+          </w:p>
+        </w:tc>
+        <w:tc>
+          <w:tcPr>
+            <w:tcW w:w="1134" w:type="dxa"/>
+          </w:tcPr>
+          <w:p>
+            <w:pPr>
+              <w:rPr>
+                <w:b/>
+                <w:bCs/>
+                <w:color w:val="196B24" w:themeColor="accent3"/>
+              </w:rPr>
+            </w:pPr>
+            <w:r>
+              <w:rPr>
+                <w:b/>
+                <w:bCs/>
+                <w:color w:val="196B24" w:themeColor="accent3"/>
+              </w:rPr>
+              <w:t>OK</w:t>
+            </w:r>
+          </w:p>
+        </w:tc>
+        <w:tc>
+          <w:tcPr>
+            <w:tcW w:w="1985" w:type="dxa"/>
+          </w:tcPr>
+          <w:p>
+            <w:r>
+              <w:t>Danh sách phản hồi</w:t>
+            </w:r>
+            <w:r>
+              <w:t xml:space="preserve"> 1</w:t>
+            </w:r>
+            <w:r>
+              <w:t xml:space="preserve"> bình luận</w:t>
+            </w:r>
+          </w:p>
         </w:tc>
         <w:tc>
           <w:tcPr>

</xml_diff>

<commit_message>
thêm api motelratings. tạo các file để thử public api bằng render.com
</commit_message>
<xml_diff>
--- a/Hỗ trợ tìm kiếm nhà trọ.docx
+++ b/Hỗ trợ tìm kiếm nhà trọ.docx
@@ -8507,7 +8507,19 @@
           <w:tcPr>
             <w:tcW w:w="4395" w:type="dxa"/>
           </w:tcPr>
-          <w:p/>
+          <w:p>
+            <w:pPr>
+              <w:rPr>
+                <w:color w:val="FF0000"/>
+              </w:rPr>
+            </w:pPr>
+            <w:r>
+              <w:rPr>
+                <w:color w:val="FF0000"/>
+              </w:rPr>
+              <w:t>http://127.0.0.1:8000/motels/ 7/like/</w:t>
+            </w:r>
+          </w:p>
         </w:tc>
         <w:tc>
           <w:tcPr>
@@ -11670,6 +11682,7 @@
         <w:tc>
           <w:tcPr>
             <w:tcW w:w="1276" w:type="dxa"/>
+            <w:vMerge w:val="restart"/>
           </w:tcPr>
           <w:p>
             <w:r>
@@ -11769,6 +11782,7 @@
         <w:tc>
           <w:tcPr>
             <w:tcW w:w="1276" w:type="dxa"/>
+            <w:vMerge/>
           </w:tcPr>
           <w:p/>
         </w:tc>
@@ -11861,6 +11875,7 @@
         <w:tc>
           <w:tcPr>
             <w:tcW w:w="1276" w:type="dxa"/>
+            <w:vMerge/>
           </w:tcPr>
           <w:p/>
         </w:tc>
@@ -11956,6 +11971,7 @@
         <w:tc>
           <w:tcPr>
             <w:tcW w:w="1276" w:type="dxa"/>
+            <w:vMerge/>
           </w:tcPr>
           <w:p/>
         </w:tc>
@@ -12055,6 +12071,7 @@
         <w:tc>
           <w:tcPr>
             <w:tcW w:w="1276" w:type="dxa"/>
+            <w:vMerge/>
           </w:tcPr>
           <w:p/>
         </w:tc>
@@ -12153,6 +12170,7 @@
         <w:tc>
           <w:tcPr>
             <w:tcW w:w="1276" w:type="dxa"/>
+            <w:vMerge/>
           </w:tcPr>
           <w:p/>
         </w:tc>
@@ -12245,6 +12263,7 @@
         <w:tc>
           <w:tcPr>
             <w:tcW w:w="1276" w:type="dxa"/>
+            <w:vMerge/>
           </w:tcPr>
           <w:p/>
         </w:tc>
@@ -12337,6 +12356,7 @@
         <w:tc>
           <w:tcPr>
             <w:tcW w:w="1276" w:type="dxa"/>
+            <w:vMerge/>
           </w:tcPr>
           <w:p/>
         </w:tc>
@@ -12415,6 +12435,954 @@
               <w:t xml:space="preserve"> bình luận</w:t>
             </w:r>
           </w:p>
+        </w:tc>
+        <w:tc>
+          <w:tcPr>
+            <w:tcW w:w="1417" w:type="dxa"/>
+          </w:tcPr>
+          <w:p>
+            <w:pPr>
+              <w:rPr>
+                <w:b/>
+                <w:bCs/>
+                <w:color w:val="196B24" w:themeColor="accent3"/>
+              </w:rPr>
+            </w:pPr>
+          </w:p>
+        </w:tc>
+      </w:tr>
+      <w:tr>
+        <w:tc>
+          <w:tcPr>
+            <w:tcW w:w="1276" w:type="dxa"/>
+            <w:shd w:val="clear" w:color="auto" w:fill="D9D9D9" w:themeFill="background1" w:themeFillShade="D9"/>
+          </w:tcPr>
+          <w:p/>
+        </w:tc>
+        <w:tc>
+          <w:tcPr>
+            <w:tcW w:w="4395" w:type="dxa"/>
+            <w:shd w:val="clear" w:color="auto" w:fill="D9D9D9" w:themeFill="background1" w:themeFillShade="D9"/>
+          </w:tcPr>
+          <w:p>
+            <w:pPr>
+              <w:rPr>
+                <w:color w:val="FF0000"/>
+              </w:rPr>
+            </w:pPr>
+          </w:p>
+        </w:tc>
+        <w:tc>
+          <w:tcPr>
+            <w:tcW w:w="1417" w:type="dxa"/>
+            <w:shd w:val="clear" w:color="auto" w:fill="D9D9D9" w:themeFill="background1" w:themeFillShade="D9"/>
+          </w:tcPr>
+          <w:p>
+            <w:pPr>
+              <w:rPr>
+                <w:b/>
+                <w:bCs/>
+              </w:rPr>
+            </w:pPr>
+          </w:p>
+        </w:tc>
+        <w:tc>
+          <w:tcPr>
+            <w:tcW w:w="1134" w:type="dxa"/>
+            <w:shd w:val="clear" w:color="auto" w:fill="D9D9D9" w:themeFill="background1" w:themeFillShade="D9"/>
+          </w:tcPr>
+          <w:p>
+            <w:pPr>
+              <w:rPr>
+                <w:b/>
+                <w:bCs/>
+                <w:color w:val="196B24" w:themeColor="accent3"/>
+              </w:rPr>
+            </w:pPr>
+          </w:p>
+        </w:tc>
+        <w:tc>
+          <w:tcPr>
+            <w:tcW w:w="1985" w:type="dxa"/>
+            <w:shd w:val="clear" w:color="auto" w:fill="D9D9D9" w:themeFill="background1" w:themeFillShade="D9"/>
+          </w:tcPr>
+          <w:p/>
+        </w:tc>
+        <w:tc>
+          <w:tcPr>
+            <w:tcW w:w="1417" w:type="dxa"/>
+            <w:shd w:val="clear" w:color="auto" w:fill="D9D9D9" w:themeFill="background1" w:themeFillShade="D9"/>
+          </w:tcPr>
+          <w:p>
+            <w:pPr>
+              <w:rPr>
+                <w:b/>
+                <w:bCs/>
+                <w:color w:val="196B24" w:themeColor="accent3"/>
+              </w:rPr>
+            </w:pPr>
+          </w:p>
+        </w:tc>
+      </w:tr>
+      <w:tr>
+        <w:tc>
+          <w:tcPr>
+            <w:tcW w:w="1276" w:type="dxa"/>
+          </w:tcPr>
+          <w:p>
+            <w:r>
+              <w:t>motelRatings</w:t>
+            </w:r>
+          </w:p>
+        </w:tc>
+        <w:tc>
+          <w:tcPr>
+            <w:tcW w:w="4395" w:type="dxa"/>
+          </w:tcPr>
+          <w:p>
+            <w:pPr>
+              <w:rPr>
+                <w:color w:val="FF0000"/>
+              </w:rPr>
+            </w:pPr>
+          </w:p>
+        </w:tc>
+        <w:tc>
+          <w:tcPr>
+            <w:tcW w:w="1417" w:type="dxa"/>
+          </w:tcPr>
+          <w:p>
+            <w:pPr>
+              <w:rPr>
+                <w:b/>
+                <w:bCs/>
+              </w:rPr>
+            </w:pPr>
+          </w:p>
+        </w:tc>
+        <w:tc>
+          <w:tcPr>
+            <w:tcW w:w="1134" w:type="dxa"/>
+          </w:tcPr>
+          <w:p>
+            <w:pPr>
+              <w:rPr>
+                <w:b/>
+                <w:bCs/>
+                <w:color w:val="196B24" w:themeColor="accent3"/>
+              </w:rPr>
+            </w:pPr>
+          </w:p>
+        </w:tc>
+        <w:tc>
+          <w:tcPr>
+            <w:tcW w:w="1985" w:type="dxa"/>
+          </w:tcPr>
+          <w:p/>
+        </w:tc>
+        <w:tc>
+          <w:tcPr>
+            <w:tcW w:w="1417" w:type="dxa"/>
+          </w:tcPr>
+          <w:p>
+            <w:pPr>
+              <w:rPr>
+                <w:b/>
+                <w:bCs/>
+                <w:color w:val="196B24" w:themeColor="accent3"/>
+              </w:rPr>
+            </w:pPr>
+          </w:p>
+        </w:tc>
+      </w:tr>
+      <w:tr>
+        <w:tc>
+          <w:tcPr>
+            <w:tcW w:w="1276" w:type="dxa"/>
+          </w:tcPr>
+          <w:p/>
+        </w:tc>
+        <w:tc>
+          <w:tcPr>
+            <w:tcW w:w="4395" w:type="dxa"/>
+          </w:tcPr>
+          <w:p>
+            <w:pPr>
+              <w:rPr>
+                <w:color w:val="FF0000"/>
+              </w:rPr>
+            </w:pPr>
+          </w:p>
+        </w:tc>
+        <w:tc>
+          <w:tcPr>
+            <w:tcW w:w="1417" w:type="dxa"/>
+          </w:tcPr>
+          <w:p>
+            <w:pPr>
+              <w:rPr>
+                <w:b/>
+                <w:bCs/>
+              </w:rPr>
+            </w:pPr>
+          </w:p>
+        </w:tc>
+        <w:tc>
+          <w:tcPr>
+            <w:tcW w:w="1134" w:type="dxa"/>
+          </w:tcPr>
+          <w:p>
+            <w:pPr>
+              <w:rPr>
+                <w:b/>
+                <w:bCs/>
+                <w:color w:val="196B24" w:themeColor="accent3"/>
+              </w:rPr>
+            </w:pPr>
+          </w:p>
+        </w:tc>
+        <w:tc>
+          <w:tcPr>
+            <w:tcW w:w="1985" w:type="dxa"/>
+          </w:tcPr>
+          <w:p/>
+        </w:tc>
+        <w:tc>
+          <w:tcPr>
+            <w:tcW w:w="1417" w:type="dxa"/>
+          </w:tcPr>
+          <w:p>
+            <w:pPr>
+              <w:rPr>
+                <w:b/>
+                <w:bCs/>
+                <w:color w:val="196B24" w:themeColor="accent3"/>
+              </w:rPr>
+            </w:pPr>
+          </w:p>
+        </w:tc>
+      </w:tr>
+      <w:tr>
+        <w:tc>
+          <w:tcPr>
+            <w:tcW w:w="1276" w:type="dxa"/>
+          </w:tcPr>
+          <w:p/>
+        </w:tc>
+        <w:tc>
+          <w:tcPr>
+            <w:tcW w:w="4395" w:type="dxa"/>
+          </w:tcPr>
+          <w:p>
+            <w:pPr>
+              <w:rPr>
+                <w:color w:val="FF0000"/>
+              </w:rPr>
+            </w:pPr>
+          </w:p>
+        </w:tc>
+        <w:tc>
+          <w:tcPr>
+            <w:tcW w:w="1417" w:type="dxa"/>
+          </w:tcPr>
+          <w:p>
+            <w:pPr>
+              <w:rPr>
+                <w:b/>
+                <w:bCs/>
+              </w:rPr>
+            </w:pPr>
+          </w:p>
+        </w:tc>
+        <w:tc>
+          <w:tcPr>
+            <w:tcW w:w="1134" w:type="dxa"/>
+          </w:tcPr>
+          <w:p>
+            <w:pPr>
+              <w:rPr>
+                <w:b/>
+                <w:bCs/>
+                <w:color w:val="196B24" w:themeColor="accent3"/>
+              </w:rPr>
+            </w:pPr>
+          </w:p>
+        </w:tc>
+        <w:tc>
+          <w:tcPr>
+            <w:tcW w:w="1985" w:type="dxa"/>
+          </w:tcPr>
+          <w:p/>
+        </w:tc>
+        <w:tc>
+          <w:tcPr>
+            <w:tcW w:w="1417" w:type="dxa"/>
+          </w:tcPr>
+          <w:p>
+            <w:pPr>
+              <w:rPr>
+                <w:b/>
+                <w:bCs/>
+                <w:color w:val="196B24" w:themeColor="accent3"/>
+              </w:rPr>
+            </w:pPr>
+          </w:p>
+        </w:tc>
+      </w:tr>
+      <w:tr>
+        <w:tc>
+          <w:tcPr>
+            <w:tcW w:w="1276" w:type="dxa"/>
+          </w:tcPr>
+          <w:p/>
+        </w:tc>
+        <w:tc>
+          <w:tcPr>
+            <w:tcW w:w="4395" w:type="dxa"/>
+          </w:tcPr>
+          <w:p>
+            <w:pPr>
+              <w:rPr>
+                <w:color w:val="FF0000"/>
+              </w:rPr>
+            </w:pPr>
+          </w:p>
+        </w:tc>
+        <w:tc>
+          <w:tcPr>
+            <w:tcW w:w="1417" w:type="dxa"/>
+          </w:tcPr>
+          <w:p>
+            <w:pPr>
+              <w:rPr>
+                <w:b/>
+                <w:bCs/>
+              </w:rPr>
+            </w:pPr>
+          </w:p>
+        </w:tc>
+        <w:tc>
+          <w:tcPr>
+            <w:tcW w:w="1134" w:type="dxa"/>
+          </w:tcPr>
+          <w:p>
+            <w:pPr>
+              <w:rPr>
+                <w:b/>
+                <w:bCs/>
+                <w:color w:val="196B24" w:themeColor="accent3"/>
+              </w:rPr>
+            </w:pPr>
+          </w:p>
+        </w:tc>
+        <w:tc>
+          <w:tcPr>
+            <w:tcW w:w="1985" w:type="dxa"/>
+          </w:tcPr>
+          <w:p/>
+        </w:tc>
+        <w:tc>
+          <w:tcPr>
+            <w:tcW w:w="1417" w:type="dxa"/>
+          </w:tcPr>
+          <w:p>
+            <w:pPr>
+              <w:rPr>
+                <w:b/>
+                <w:bCs/>
+                <w:color w:val="196B24" w:themeColor="accent3"/>
+              </w:rPr>
+            </w:pPr>
+          </w:p>
+        </w:tc>
+      </w:tr>
+      <w:tr>
+        <w:tc>
+          <w:tcPr>
+            <w:tcW w:w="1276" w:type="dxa"/>
+          </w:tcPr>
+          <w:p/>
+        </w:tc>
+        <w:tc>
+          <w:tcPr>
+            <w:tcW w:w="4395" w:type="dxa"/>
+          </w:tcPr>
+          <w:p>
+            <w:pPr>
+              <w:rPr>
+                <w:color w:val="FF0000"/>
+              </w:rPr>
+            </w:pPr>
+          </w:p>
+        </w:tc>
+        <w:tc>
+          <w:tcPr>
+            <w:tcW w:w="1417" w:type="dxa"/>
+          </w:tcPr>
+          <w:p>
+            <w:pPr>
+              <w:rPr>
+                <w:b/>
+                <w:bCs/>
+              </w:rPr>
+            </w:pPr>
+          </w:p>
+        </w:tc>
+        <w:tc>
+          <w:tcPr>
+            <w:tcW w:w="1134" w:type="dxa"/>
+          </w:tcPr>
+          <w:p>
+            <w:pPr>
+              <w:rPr>
+                <w:b/>
+                <w:bCs/>
+                <w:color w:val="196B24" w:themeColor="accent3"/>
+              </w:rPr>
+            </w:pPr>
+          </w:p>
+        </w:tc>
+        <w:tc>
+          <w:tcPr>
+            <w:tcW w:w="1985" w:type="dxa"/>
+          </w:tcPr>
+          <w:p/>
+        </w:tc>
+        <w:tc>
+          <w:tcPr>
+            <w:tcW w:w="1417" w:type="dxa"/>
+          </w:tcPr>
+          <w:p>
+            <w:pPr>
+              <w:rPr>
+                <w:b/>
+                <w:bCs/>
+                <w:color w:val="196B24" w:themeColor="accent3"/>
+              </w:rPr>
+            </w:pPr>
+          </w:p>
+        </w:tc>
+      </w:tr>
+      <w:tr>
+        <w:tc>
+          <w:tcPr>
+            <w:tcW w:w="1276" w:type="dxa"/>
+          </w:tcPr>
+          <w:p/>
+        </w:tc>
+        <w:tc>
+          <w:tcPr>
+            <w:tcW w:w="4395" w:type="dxa"/>
+          </w:tcPr>
+          <w:p>
+            <w:pPr>
+              <w:rPr>
+                <w:color w:val="FF0000"/>
+              </w:rPr>
+            </w:pPr>
+          </w:p>
+        </w:tc>
+        <w:tc>
+          <w:tcPr>
+            <w:tcW w:w="1417" w:type="dxa"/>
+          </w:tcPr>
+          <w:p>
+            <w:pPr>
+              <w:rPr>
+                <w:b/>
+                <w:bCs/>
+              </w:rPr>
+            </w:pPr>
+          </w:p>
+        </w:tc>
+        <w:tc>
+          <w:tcPr>
+            <w:tcW w:w="1134" w:type="dxa"/>
+          </w:tcPr>
+          <w:p>
+            <w:pPr>
+              <w:rPr>
+                <w:b/>
+                <w:bCs/>
+                <w:color w:val="196B24" w:themeColor="accent3"/>
+              </w:rPr>
+            </w:pPr>
+          </w:p>
+        </w:tc>
+        <w:tc>
+          <w:tcPr>
+            <w:tcW w:w="1985" w:type="dxa"/>
+          </w:tcPr>
+          <w:p/>
+        </w:tc>
+        <w:tc>
+          <w:tcPr>
+            <w:tcW w:w="1417" w:type="dxa"/>
+          </w:tcPr>
+          <w:p>
+            <w:pPr>
+              <w:rPr>
+                <w:b/>
+                <w:bCs/>
+                <w:color w:val="196B24" w:themeColor="accent3"/>
+              </w:rPr>
+            </w:pPr>
+          </w:p>
+        </w:tc>
+      </w:tr>
+      <w:tr>
+        <w:tc>
+          <w:tcPr>
+            <w:tcW w:w="1276" w:type="dxa"/>
+          </w:tcPr>
+          <w:p/>
+        </w:tc>
+        <w:tc>
+          <w:tcPr>
+            <w:tcW w:w="4395" w:type="dxa"/>
+          </w:tcPr>
+          <w:p>
+            <w:pPr>
+              <w:rPr>
+                <w:color w:val="FF0000"/>
+              </w:rPr>
+            </w:pPr>
+          </w:p>
+        </w:tc>
+        <w:tc>
+          <w:tcPr>
+            <w:tcW w:w="1417" w:type="dxa"/>
+          </w:tcPr>
+          <w:p>
+            <w:pPr>
+              <w:rPr>
+                <w:b/>
+                <w:bCs/>
+              </w:rPr>
+            </w:pPr>
+          </w:p>
+        </w:tc>
+        <w:tc>
+          <w:tcPr>
+            <w:tcW w:w="1134" w:type="dxa"/>
+          </w:tcPr>
+          <w:p>
+            <w:pPr>
+              <w:rPr>
+                <w:b/>
+                <w:bCs/>
+                <w:color w:val="196B24" w:themeColor="accent3"/>
+              </w:rPr>
+            </w:pPr>
+          </w:p>
+        </w:tc>
+        <w:tc>
+          <w:tcPr>
+            <w:tcW w:w="1985" w:type="dxa"/>
+          </w:tcPr>
+          <w:p/>
+        </w:tc>
+        <w:tc>
+          <w:tcPr>
+            <w:tcW w:w="1417" w:type="dxa"/>
+          </w:tcPr>
+          <w:p>
+            <w:pPr>
+              <w:rPr>
+                <w:b/>
+                <w:bCs/>
+                <w:color w:val="196B24" w:themeColor="accent3"/>
+              </w:rPr>
+            </w:pPr>
+          </w:p>
+        </w:tc>
+      </w:tr>
+      <w:tr>
+        <w:tc>
+          <w:tcPr>
+            <w:tcW w:w="1276" w:type="dxa"/>
+          </w:tcPr>
+          <w:p/>
+        </w:tc>
+        <w:tc>
+          <w:tcPr>
+            <w:tcW w:w="4395" w:type="dxa"/>
+          </w:tcPr>
+          <w:p>
+            <w:pPr>
+              <w:rPr>
+                <w:color w:val="FF0000"/>
+              </w:rPr>
+            </w:pPr>
+          </w:p>
+        </w:tc>
+        <w:tc>
+          <w:tcPr>
+            <w:tcW w:w="1417" w:type="dxa"/>
+          </w:tcPr>
+          <w:p>
+            <w:pPr>
+              <w:rPr>
+                <w:b/>
+                <w:bCs/>
+              </w:rPr>
+            </w:pPr>
+          </w:p>
+        </w:tc>
+        <w:tc>
+          <w:tcPr>
+            <w:tcW w:w="1134" w:type="dxa"/>
+          </w:tcPr>
+          <w:p>
+            <w:pPr>
+              <w:rPr>
+                <w:b/>
+                <w:bCs/>
+                <w:color w:val="196B24" w:themeColor="accent3"/>
+              </w:rPr>
+            </w:pPr>
+          </w:p>
+        </w:tc>
+        <w:tc>
+          <w:tcPr>
+            <w:tcW w:w="1985" w:type="dxa"/>
+          </w:tcPr>
+          <w:p/>
+        </w:tc>
+        <w:tc>
+          <w:tcPr>
+            <w:tcW w:w="1417" w:type="dxa"/>
+          </w:tcPr>
+          <w:p>
+            <w:pPr>
+              <w:rPr>
+                <w:b/>
+                <w:bCs/>
+                <w:color w:val="196B24" w:themeColor="accent3"/>
+              </w:rPr>
+            </w:pPr>
+          </w:p>
+        </w:tc>
+      </w:tr>
+      <w:tr>
+        <w:tc>
+          <w:tcPr>
+            <w:tcW w:w="1276" w:type="dxa"/>
+          </w:tcPr>
+          <w:p/>
+        </w:tc>
+        <w:tc>
+          <w:tcPr>
+            <w:tcW w:w="4395" w:type="dxa"/>
+          </w:tcPr>
+          <w:p>
+            <w:pPr>
+              <w:rPr>
+                <w:color w:val="FF0000"/>
+              </w:rPr>
+            </w:pPr>
+          </w:p>
+        </w:tc>
+        <w:tc>
+          <w:tcPr>
+            <w:tcW w:w="1417" w:type="dxa"/>
+          </w:tcPr>
+          <w:p>
+            <w:pPr>
+              <w:rPr>
+                <w:b/>
+                <w:bCs/>
+              </w:rPr>
+            </w:pPr>
+          </w:p>
+        </w:tc>
+        <w:tc>
+          <w:tcPr>
+            <w:tcW w:w="1134" w:type="dxa"/>
+          </w:tcPr>
+          <w:p>
+            <w:pPr>
+              <w:rPr>
+                <w:b/>
+                <w:bCs/>
+                <w:color w:val="196B24" w:themeColor="accent3"/>
+              </w:rPr>
+            </w:pPr>
+          </w:p>
+        </w:tc>
+        <w:tc>
+          <w:tcPr>
+            <w:tcW w:w="1985" w:type="dxa"/>
+          </w:tcPr>
+          <w:p/>
+        </w:tc>
+        <w:tc>
+          <w:tcPr>
+            <w:tcW w:w="1417" w:type="dxa"/>
+          </w:tcPr>
+          <w:p>
+            <w:pPr>
+              <w:rPr>
+                <w:b/>
+                <w:bCs/>
+                <w:color w:val="196B24" w:themeColor="accent3"/>
+              </w:rPr>
+            </w:pPr>
+          </w:p>
+        </w:tc>
+      </w:tr>
+      <w:tr>
+        <w:tc>
+          <w:tcPr>
+            <w:tcW w:w="1276" w:type="dxa"/>
+          </w:tcPr>
+          <w:p/>
+        </w:tc>
+        <w:tc>
+          <w:tcPr>
+            <w:tcW w:w="4395" w:type="dxa"/>
+          </w:tcPr>
+          <w:p>
+            <w:pPr>
+              <w:rPr>
+                <w:color w:val="FF0000"/>
+              </w:rPr>
+            </w:pPr>
+          </w:p>
+        </w:tc>
+        <w:tc>
+          <w:tcPr>
+            <w:tcW w:w="1417" w:type="dxa"/>
+          </w:tcPr>
+          <w:p>
+            <w:pPr>
+              <w:rPr>
+                <w:b/>
+                <w:bCs/>
+              </w:rPr>
+            </w:pPr>
+          </w:p>
+        </w:tc>
+        <w:tc>
+          <w:tcPr>
+            <w:tcW w:w="1134" w:type="dxa"/>
+          </w:tcPr>
+          <w:p>
+            <w:pPr>
+              <w:rPr>
+                <w:b/>
+                <w:bCs/>
+                <w:color w:val="196B24" w:themeColor="accent3"/>
+              </w:rPr>
+            </w:pPr>
+          </w:p>
+        </w:tc>
+        <w:tc>
+          <w:tcPr>
+            <w:tcW w:w="1985" w:type="dxa"/>
+          </w:tcPr>
+          <w:p/>
+        </w:tc>
+        <w:tc>
+          <w:tcPr>
+            <w:tcW w:w="1417" w:type="dxa"/>
+          </w:tcPr>
+          <w:p>
+            <w:pPr>
+              <w:rPr>
+                <w:b/>
+                <w:bCs/>
+                <w:color w:val="196B24" w:themeColor="accent3"/>
+              </w:rPr>
+            </w:pPr>
+          </w:p>
+        </w:tc>
+      </w:tr>
+      <w:tr>
+        <w:tc>
+          <w:tcPr>
+            <w:tcW w:w="1276" w:type="dxa"/>
+          </w:tcPr>
+          <w:p/>
+        </w:tc>
+        <w:tc>
+          <w:tcPr>
+            <w:tcW w:w="4395" w:type="dxa"/>
+          </w:tcPr>
+          <w:p>
+            <w:pPr>
+              <w:rPr>
+                <w:color w:val="FF0000"/>
+              </w:rPr>
+            </w:pPr>
+          </w:p>
+        </w:tc>
+        <w:tc>
+          <w:tcPr>
+            <w:tcW w:w="1417" w:type="dxa"/>
+          </w:tcPr>
+          <w:p>
+            <w:pPr>
+              <w:rPr>
+                <w:b/>
+                <w:bCs/>
+              </w:rPr>
+            </w:pPr>
+          </w:p>
+        </w:tc>
+        <w:tc>
+          <w:tcPr>
+            <w:tcW w:w="1134" w:type="dxa"/>
+          </w:tcPr>
+          <w:p>
+            <w:pPr>
+              <w:rPr>
+                <w:b/>
+                <w:bCs/>
+                <w:color w:val="196B24" w:themeColor="accent3"/>
+              </w:rPr>
+            </w:pPr>
+          </w:p>
+        </w:tc>
+        <w:tc>
+          <w:tcPr>
+            <w:tcW w:w="1985" w:type="dxa"/>
+          </w:tcPr>
+          <w:p/>
+        </w:tc>
+        <w:tc>
+          <w:tcPr>
+            <w:tcW w:w="1417" w:type="dxa"/>
+          </w:tcPr>
+          <w:p>
+            <w:pPr>
+              <w:rPr>
+                <w:b/>
+                <w:bCs/>
+                <w:color w:val="196B24" w:themeColor="accent3"/>
+              </w:rPr>
+            </w:pPr>
+          </w:p>
+        </w:tc>
+      </w:tr>
+      <w:tr>
+        <w:tc>
+          <w:tcPr>
+            <w:tcW w:w="1276" w:type="dxa"/>
+          </w:tcPr>
+          <w:p/>
+        </w:tc>
+        <w:tc>
+          <w:tcPr>
+            <w:tcW w:w="4395" w:type="dxa"/>
+          </w:tcPr>
+          <w:p>
+            <w:pPr>
+              <w:rPr>
+                <w:color w:val="FF0000"/>
+              </w:rPr>
+            </w:pPr>
+          </w:p>
+        </w:tc>
+        <w:tc>
+          <w:tcPr>
+            <w:tcW w:w="1417" w:type="dxa"/>
+          </w:tcPr>
+          <w:p>
+            <w:pPr>
+              <w:rPr>
+                <w:b/>
+                <w:bCs/>
+              </w:rPr>
+            </w:pPr>
+          </w:p>
+        </w:tc>
+        <w:tc>
+          <w:tcPr>
+            <w:tcW w:w="1134" w:type="dxa"/>
+          </w:tcPr>
+          <w:p>
+            <w:pPr>
+              <w:rPr>
+                <w:b/>
+                <w:bCs/>
+                <w:color w:val="196B24" w:themeColor="accent3"/>
+              </w:rPr>
+            </w:pPr>
+          </w:p>
+        </w:tc>
+        <w:tc>
+          <w:tcPr>
+            <w:tcW w:w="1985" w:type="dxa"/>
+          </w:tcPr>
+          <w:p/>
+        </w:tc>
+        <w:tc>
+          <w:tcPr>
+            <w:tcW w:w="1417" w:type="dxa"/>
+          </w:tcPr>
+          <w:p>
+            <w:pPr>
+              <w:rPr>
+                <w:b/>
+                <w:bCs/>
+                <w:color w:val="196B24" w:themeColor="accent3"/>
+              </w:rPr>
+            </w:pPr>
+          </w:p>
+        </w:tc>
+      </w:tr>
+      <w:tr>
+        <w:tc>
+          <w:tcPr>
+            <w:tcW w:w="1276" w:type="dxa"/>
+          </w:tcPr>
+          <w:p/>
+        </w:tc>
+        <w:tc>
+          <w:tcPr>
+            <w:tcW w:w="4395" w:type="dxa"/>
+          </w:tcPr>
+          <w:p>
+            <w:pPr>
+              <w:rPr>
+                <w:color w:val="FF0000"/>
+              </w:rPr>
+            </w:pPr>
+          </w:p>
+        </w:tc>
+        <w:tc>
+          <w:tcPr>
+            <w:tcW w:w="1417" w:type="dxa"/>
+          </w:tcPr>
+          <w:p>
+            <w:pPr>
+              <w:rPr>
+                <w:b/>
+                <w:bCs/>
+              </w:rPr>
+            </w:pPr>
+          </w:p>
+        </w:tc>
+        <w:tc>
+          <w:tcPr>
+            <w:tcW w:w="1134" w:type="dxa"/>
+          </w:tcPr>
+          <w:p>
+            <w:pPr>
+              <w:rPr>
+                <w:b/>
+                <w:bCs/>
+                <w:color w:val="196B24" w:themeColor="accent3"/>
+              </w:rPr>
+            </w:pPr>
+          </w:p>
+        </w:tc>
+        <w:tc>
+          <w:tcPr>
+            <w:tcW w:w="1985" w:type="dxa"/>
+          </w:tcPr>
+          <w:p/>
         </w:tc>
         <w:tc>
           <w:tcPr>

</xml_diff>

<commit_message>
tạo vnpay tạm thời
</commit_message>
<xml_diff>
--- a/Hỗ trợ tìm kiếm nhà trọ.docx
+++ b/Hỗ trợ tìm kiếm nhà trọ.docx
@@ -10864,7 +10864,10 @@
           </w:tcPr>
           <w:p>
             <w:r>
-              <w:t>POST</w:t>
+              <w:t>P</w:t>
+            </w:r>
+            <w:r>
+              <w:t>ost</w:t>
             </w:r>
           </w:p>
           <w:p>
@@ -12528,6 +12531,7 @@
         <w:tc>
           <w:tcPr>
             <w:tcW w:w="1276" w:type="dxa"/>
+            <w:vMerge w:val="restart"/>
           </w:tcPr>
           <w:p>
             <w:r>
@@ -12545,6 +12549,12 @@
                 <w:color w:val="FF0000"/>
               </w:rPr>
             </w:pPr>
+            <w:r>
+              <w:rPr>
+                <w:color w:val="FF0000"/>
+              </w:rPr>
+              <w:t>http://127.0.0.1:8000/motelRatings/</w:t>
+            </w:r>
           </w:p>
         </w:tc>
         <w:tc>
@@ -12558,6 +12568,13 @@
                 <w:bCs/>
               </w:rPr>
             </w:pPr>
+            <w:r>
+              <w:rPr>
+                <w:b/>
+                <w:bCs/>
+              </w:rPr>
+              <w:t>GET</w:t>
+            </w:r>
           </w:p>
         </w:tc>
         <w:tc>
@@ -12572,6 +12589,14 @@
                 <w:color w:val="196B24" w:themeColor="accent3"/>
               </w:rPr>
             </w:pPr>
+            <w:r>
+              <w:rPr>
+                <w:b/>
+                <w:bCs/>
+                <w:color w:val="196B24" w:themeColor="accent3"/>
+              </w:rPr>
+              <w:t>OK</w:t>
+            </w:r>
           </w:p>
         </w:tc>
         <w:tc>
@@ -12603,6 +12628,7 @@
         <w:tc>
           <w:tcPr>
             <w:tcW w:w="1276" w:type="dxa"/>
+            <w:vMerge/>
           </w:tcPr>
           <w:p/>
         </w:tc>
@@ -12616,6 +12642,12 @@
                 <w:color w:val="FF0000"/>
               </w:rPr>
             </w:pPr>
+            <w:r>
+              <w:rPr>
+                <w:color w:val="FF0000"/>
+              </w:rPr>
+              <w:t>http://127.0.0.1:8000/motelRatings/</w:t>
+            </w:r>
           </w:p>
         </w:tc>
         <w:tc>
@@ -12629,6 +12661,13 @@
                 <w:bCs/>
               </w:rPr>
             </w:pPr>
+            <w:r>
+              <w:rPr>
+                <w:b/>
+                <w:bCs/>
+              </w:rPr>
+              <w:t>POST</w:t>
+            </w:r>
           </w:p>
         </w:tc>
         <w:tc>
@@ -12643,6 +12682,14 @@
                 <w:color w:val="196B24" w:themeColor="accent3"/>
               </w:rPr>
             </w:pPr>
+            <w:r>
+              <w:rPr>
+                <w:b/>
+                <w:bCs/>
+                <w:color w:val="196B24" w:themeColor="accent3"/>
+              </w:rPr>
+              <w:t>OK</w:t>
+            </w:r>
           </w:p>
         </w:tc>
         <w:tc>
@@ -12674,6 +12721,7 @@
         <w:tc>
           <w:tcPr>
             <w:tcW w:w="1276" w:type="dxa"/>
+            <w:vMerge/>
           </w:tcPr>
           <w:p/>
         </w:tc>
@@ -12687,6 +12735,24 @@
                 <w:color w:val="FF0000"/>
               </w:rPr>
             </w:pPr>
+            <w:r>
+              <w:rPr>
+                <w:color w:val="FF0000"/>
+              </w:rPr>
+              <w:t>http://127.0.0.1:8000/motelRatings/</w:t>
+            </w:r>
+            <w:r>
+              <w:rPr>
+                <w:color w:val="FF0000"/>
+              </w:rPr>
+              <w:t>4</w:t>
+            </w:r>
+            <w:r>
+              <w:rPr>
+                <w:color w:val="FF0000"/>
+              </w:rPr>
+              <w:t>/</w:t>
+            </w:r>
           </w:p>
         </w:tc>
         <w:tc>
@@ -12700,6 +12766,13 @@
                 <w:bCs/>
               </w:rPr>
             </w:pPr>
+            <w:r>
+              <w:rPr>
+                <w:b/>
+                <w:bCs/>
+              </w:rPr>
+              <w:t>GET</w:t>
+            </w:r>
           </w:p>
         </w:tc>
         <w:tc>
@@ -12714,6 +12787,14 @@
                 <w:color w:val="196B24" w:themeColor="accent3"/>
               </w:rPr>
             </w:pPr>
+            <w:r>
+              <w:rPr>
+                <w:b/>
+                <w:bCs/>
+                <w:color w:val="196B24" w:themeColor="accent3"/>
+              </w:rPr>
+              <w:t>OK</w:t>
+            </w:r>
           </w:p>
         </w:tc>
         <w:tc>
@@ -12745,6 +12826,7 @@
         <w:tc>
           <w:tcPr>
             <w:tcW w:w="1276" w:type="dxa"/>
+            <w:vMerge/>
           </w:tcPr>
           <w:p/>
         </w:tc>
@@ -12758,6 +12840,24 @@
                 <w:color w:val="FF0000"/>
               </w:rPr>
             </w:pPr>
+            <w:r>
+              <w:rPr>
+                <w:color w:val="FF0000"/>
+              </w:rPr>
+              <w:t>http://127.0.0.1:8000/motelRatings/</w:t>
+            </w:r>
+            <w:r>
+              <w:rPr>
+                <w:color w:val="FF0000"/>
+              </w:rPr>
+              <w:t>4</w:t>
+            </w:r>
+            <w:r>
+              <w:rPr>
+                <w:color w:val="FF0000"/>
+              </w:rPr>
+              <w:t>/</w:t>
+            </w:r>
           </w:p>
         </w:tc>
         <w:tc>
@@ -12771,6 +12871,13 @@
                 <w:bCs/>
               </w:rPr>
             </w:pPr>
+            <w:r>
+              <w:rPr>
+                <w:b/>
+                <w:bCs/>
+              </w:rPr>
+              <w:t>PUT</w:t>
+            </w:r>
           </w:p>
         </w:tc>
         <w:tc>
@@ -12785,6 +12892,14 @@
                 <w:color w:val="196B24" w:themeColor="accent3"/>
               </w:rPr>
             </w:pPr>
+            <w:r>
+              <w:rPr>
+                <w:b/>
+                <w:bCs/>
+                <w:color w:val="196B24" w:themeColor="accent3"/>
+              </w:rPr>
+              <w:t>OK</w:t>
+            </w:r>
           </w:p>
         </w:tc>
         <w:tc>
@@ -12895,6 +13010,7 @@
         <w:tc>
           <w:tcPr>
             <w:tcW w:w="1276" w:type="dxa"/>
+            <w:vMerge/>
           </w:tcPr>
           <w:p/>
         </w:tc>
@@ -12908,6 +13024,24 @@
                 <w:color w:val="FF0000"/>
               </w:rPr>
             </w:pPr>
+            <w:r>
+              <w:rPr>
+                <w:color w:val="FF0000"/>
+              </w:rPr>
+              <w:t>http://127.0.0.1:8000/motelRatings/</w:t>
+            </w:r>
+            <w:r>
+              <w:rPr>
+                <w:color w:val="FF0000"/>
+              </w:rPr>
+              <w:t>4</w:t>
+            </w:r>
+            <w:r>
+              <w:rPr>
+                <w:color w:val="FF0000"/>
+              </w:rPr>
+              <w:t>/</w:t>
+            </w:r>
           </w:p>
         </w:tc>
         <w:tc>
@@ -12921,6 +13055,13 @@
                 <w:bCs/>
               </w:rPr>
             </w:pPr>
+            <w:r>
+              <w:rPr>
+                <w:b/>
+                <w:bCs/>
+              </w:rPr>
+              <w:t>DELETE</w:t>
+            </w:r>
           </w:p>
         </w:tc>
         <w:tc>
@@ -12935,6 +13076,14 @@
                 <w:color w:val="196B24" w:themeColor="accent3"/>
               </w:rPr>
             </w:pPr>
+            <w:r>
+              <w:rPr>
+                <w:b/>
+                <w:bCs/>
+                <w:color w:val="196B24" w:themeColor="accent3"/>
+              </w:rPr>
+              <w:t>OK</w:t>
+            </w:r>
           </w:p>
         </w:tc>
         <w:tc>
@@ -13048,12 +13197,14 @@
         <w:tc>
           <w:tcPr>
             <w:tcW w:w="1276" w:type="dxa"/>
+            <w:shd w:val="clear" w:color="auto" w:fill="D9D9D9" w:themeFill="background1" w:themeFillShade="D9"/>
           </w:tcPr>
           <w:p/>
         </w:tc>
         <w:tc>
           <w:tcPr>
             <w:tcW w:w="4395" w:type="dxa"/>
+            <w:shd w:val="clear" w:color="auto" w:fill="D9D9D9" w:themeFill="background1" w:themeFillShade="D9"/>
           </w:tcPr>
           <w:p>
             <w:pPr>
@@ -13066,6 +13217,7 @@
         <w:tc>
           <w:tcPr>
             <w:tcW w:w="1417" w:type="dxa"/>
+            <w:shd w:val="clear" w:color="auto" w:fill="D9D9D9" w:themeFill="background1" w:themeFillShade="D9"/>
           </w:tcPr>
           <w:p>
             <w:pPr>
@@ -13079,6 +13231,7 @@
         <w:tc>
           <w:tcPr>
             <w:tcW w:w="1134" w:type="dxa"/>
+            <w:shd w:val="clear" w:color="auto" w:fill="D9D9D9" w:themeFill="background1" w:themeFillShade="D9"/>
           </w:tcPr>
           <w:p>
             <w:pPr>
@@ -13093,12 +13246,14 @@
         <w:tc>
           <w:tcPr>
             <w:tcW w:w="1985" w:type="dxa"/>
+            <w:shd w:val="clear" w:color="auto" w:fill="D9D9D9" w:themeFill="background1" w:themeFillShade="D9"/>
           </w:tcPr>
           <w:p/>
         </w:tc>
         <w:tc>
           <w:tcPr>
             <w:tcW w:w="1417" w:type="dxa"/>
+            <w:shd w:val="clear" w:color="auto" w:fill="D9D9D9" w:themeFill="background1" w:themeFillShade="D9"/>
           </w:tcPr>
           <w:p>
             <w:pPr>

</xml_diff>

<commit_message>
thêm api tìm kiếm theo giá, vị trí
</commit_message>
<xml_diff>
--- a/Hỗ trợ tìm kiếm nhà trọ.docx
+++ b/Hỗ trợ tìm kiếm nhà trọ.docx
@@ -6923,11 +6923,6 @@
       </w:r>
     </w:p>
     <w:p>
-      <w:pPr>
-        <w:rPr>
-          <w:lang w:val="vi-VN"/>
-        </w:rPr>
-      </w:pPr>
       <w:r>
         <w:rPr>
           <w:b/>
@@ -6943,6 +6938,263 @@
         <w:t xml:space="preserve"> /api/tenants/{id}/: Lấy chi tiết thông tin người thuê trọ dựa trên id (hoặc slug nếu sử dụng slug).</w:t>
       </w:r>
     </w:p>
+    <w:p/>
+    <w:p>
+      <w:pPr>
+        <w:rPr>
+          <w:lang w:val="vi-VN"/>
+        </w:rPr>
+      </w:pPr>
+      <w:r>
+        <w:rPr>
+          <w:b/>
+          <w:bCs/>
+          <w:lang w:val="vi-VN"/>
+        </w:rPr>
+        <w:t>Các loại so sánh phổ biến</w:t>
+      </w:r>
+      <w:r>
+        <w:rPr>
+          <w:lang w:val="vi-VN"/>
+        </w:rPr>
+        <w:t>:</w:t>
+      </w:r>
+    </w:p>
+    <w:p>
+      <w:pPr>
+        <w:numPr>
+          <w:ilvl w:val="0"/>
+          <w:numId w:val="36"/>
+        </w:numPr>
+        <w:rPr>
+          <w:lang w:val="vi-VN"/>
+        </w:rPr>
+      </w:pPr>
+      <w:r>
+        <w:rPr>
+          <w:lang w:val="vi-VN"/>
+        </w:rPr>
+        <w:t>gte: greater than or equal (lớn hơn hoặc bằng)</w:t>
+      </w:r>
+    </w:p>
+    <w:p>
+      <w:pPr>
+        <w:numPr>
+          <w:ilvl w:val="0"/>
+          <w:numId w:val="37"/>
+        </w:numPr>
+        <w:rPr>
+          <w:lang w:val="vi-VN"/>
+        </w:rPr>
+      </w:pPr>
+      <w:r>
+        <w:rPr>
+          <w:lang w:val="vi-VN"/>
+        </w:rPr>
+        <w:t>lte: less than or equal (nhỏ hơn hoặc bằng)</w:t>
+      </w:r>
+    </w:p>
+    <w:p>
+      <w:pPr>
+        <w:numPr>
+          <w:ilvl w:val="0"/>
+          <w:numId w:val="38"/>
+        </w:numPr>
+        <w:rPr>
+          <w:lang w:val="vi-VN"/>
+        </w:rPr>
+      </w:pPr>
+      <w:r>
+        <w:rPr>
+          <w:lang w:val="vi-VN"/>
+        </w:rPr>
+        <w:t>gt: greater than (lớn hơn)</w:t>
+      </w:r>
+    </w:p>
+    <w:p>
+      <w:pPr>
+        <w:numPr>
+          <w:ilvl w:val="0"/>
+          <w:numId w:val="39"/>
+        </w:numPr>
+        <w:rPr>
+          <w:lang w:val="vi-VN"/>
+        </w:rPr>
+      </w:pPr>
+      <w:r>
+        <w:rPr>
+          <w:lang w:val="vi-VN"/>
+        </w:rPr>
+        <w:t>lt: less than (nhỏ hơn)</w:t>
+      </w:r>
+    </w:p>
+    <w:p>
+      <w:pPr>
+        <w:numPr>
+          <w:ilvl w:val="0"/>
+          <w:numId w:val="40"/>
+        </w:numPr>
+        <w:rPr>
+          <w:lang w:val="vi-VN"/>
+        </w:rPr>
+      </w:pPr>
+      <w:r>
+        <w:rPr>
+          <w:lang w:val="vi-VN"/>
+        </w:rPr>
+        <w:t>exact: bằng chính xác</w:t>
+      </w:r>
+    </w:p>
+    <w:p>
+      <w:pPr>
+        <w:numPr>
+          <w:ilvl w:val="0"/>
+          <w:numId w:val="41"/>
+        </w:numPr>
+        <w:rPr>
+          <w:lang w:val="vi-VN"/>
+        </w:rPr>
+      </w:pPr>
+      <w:r>
+        <w:rPr>
+          <w:lang w:val="vi-VN"/>
+        </w:rPr>
+        <w:t>icontains: chứa (không phân biệt hoa thường)</w:t>
+      </w:r>
+    </w:p>
+    <w:p>
+      <w:pPr>
+        <w:numPr>
+          <w:ilvl w:val="0"/>
+          <w:numId w:val="42"/>
+        </w:numPr>
+        <w:rPr>
+          <w:lang w:val="vi-VN"/>
+        </w:rPr>
+      </w:pPr>
+      <w:r>
+        <w:rPr>
+          <w:lang w:val="vi-VN"/>
+        </w:rPr>
+        <w:t>in: nằm trong danh sách</w:t>
+      </w:r>
+    </w:p>
+    <w:p>
+      <w:pPr>
+        <w:rPr>
+          <w:lang w:val="vi-VN"/>
+        </w:rPr>
+      </w:pPr>
+      <w:r>
+        <w:rPr>
+          <w:lang w:val="vi-VN"/>
+        </w:rPr>
+        <w:t>Các action mặc định của ViewSet:</w:t>
+      </w:r>
+    </w:p>
+    <w:p>
+      <w:pPr>
+        <w:numPr>
+          <w:ilvl w:val="0"/>
+          <w:numId w:val="43"/>
+        </w:numPr>
+        <w:rPr>
+          <w:lang w:val="vi-VN"/>
+        </w:rPr>
+      </w:pPr>
+      <w:r>
+        <w:rPr>
+          <w:lang w:val="vi-VN"/>
+        </w:rPr>
+        <w:t>list: GET /api/search/</w:t>
+      </w:r>
+    </w:p>
+    <w:p>
+      <w:pPr>
+        <w:numPr>
+          <w:ilvl w:val="0"/>
+          <w:numId w:val="44"/>
+        </w:numPr>
+        <w:rPr>
+          <w:lang w:val="vi-VN"/>
+        </w:rPr>
+      </w:pPr>
+      <w:r>
+        <w:rPr>
+          <w:lang w:val="vi-VN"/>
+        </w:rPr>
+        <w:t>create: POST /api/search/</w:t>
+      </w:r>
+    </w:p>
+    <w:p>
+      <w:pPr>
+        <w:numPr>
+          <w:ilvl w:val="0"/>
+          <w:numId w:val="45"/>
+        </w:numPr>
+        <w:rPr>
+          <w:lang w:val="vi-VN"/>
+        </w:rPr>
+      </w:pPr>
+      <w:r>
+        <w:rPr>
+          <w:lang w:val="vi-VN"/>
+        </w:rPr>
+        <w:t>retrieve: GET /api/search/{id}/</w:t>
+      </w:r>
+    </w:p>
+    <w:p>
+      <w:pPr>
+        <w:numPr>
+          <w:ilvl w:val="0"/>
+          <w:numId w:val="46"/>
+        </w:numPr>
+        <w:rPr>
+          <w:lang w:val="vi-VN"/>
+        </w:rPr>
+      </w:pPr>
+      <w:r>
+        <w:rPr>
+          <w:lang w:val="vi-VN"/>
+        </w:rPr>
+        <w:t>update: PUT /api/search/{id}/</w:t>
+      </w:r>
+    </w:p>
+    <w:p>
+      <w:pPr>
+        <w:numPr>
+          <w:ilvl w:val="0"/>
+          <w:numId w:val="47"/>
+        </w:numPr>
+        <w:rPr>
+          <w:lang w:val="vi-VN"/>
+        </w:rPr>
+      </w:pPr>
+      <w:r>
+        <w:rPr>
+          <w:lang w:val="vi-VN"/>
+        </w:rPr>
+        <w:t>partial_update: PATCH /api/search/{id}/</w:t>
+      </w:r>
+    </w:p>
+    <w:p>
+      <w:pPr>
+        <w:numPr>
+          <w:ilvl w:val="0"/>
+          <w:numId w:val="48"/>
+        </w:numPr>
+        <w:rPr>
+          <w:lang w:val="vi-VN"/>
+        </w:rPr>
+      </w:pPr>
+      <w:r>
+        <w:rPr>
+          <w:lang w:val="vi-VN"/>
+        </w:rPr>
+        <w:t>destroy: DELETE /api/search/{id}/</w:t>
+      </w:r>
+    </w:p>
+    <w:p/>
     <w:p/>
     <w:p/>
     <w:tbl>
@@ -7848,7 +8100,6 @@
           </w:tcPr>
           <w:p>
             <w:r>
-              <w:lastRenderedPageBreak/>
               <w:t>admins</w:t>
             </w:r>
           </w:p>
@@ -13770,6 +14021,155 @@
 <file path=word/numbering.xml><?xml version="1.0" encoding="utf-8"?>
 <w:numbering xmlns:wpc="http://schemas.microsoft.com/office/word/2010/wordprocessingCanvas" xmlns:cx="http://schemas.microsoft.com/office/drawing/2014/chartex" xmlns:cx1="http://schemas.microsoft.com/office/drawing/2015/9/8/chartex" xmlns:cx2="http://schemas.microsoft.com/office/drawing/2015/10/21/chartex" xmlns:cx3="http://schemas.microsoft.com/office/drawing/2016/5/9/chartex" xmlns:cx4="http://schemas.microsoft.com/office/drawing/2016/5/10/chartex" xmlns:cx5="http://schemas.microsoft.com/office/drawing/2016/5/11/chartex" xmlns:cx6="http://schemas.microsoft.com/office/drawing/2016/5/12/chartex" xmlns:cx7="http://schemas.microsoft.com/office/drawing/2016/5/13/chartex" xmlns:cx8="http://schemas.microsoft.com/office/drawing/2016/5/14/chartex" xmlns:mc="http://schemas.openxmlformats.org/markup-compatibility/2006" xmlns:aink="http://schemas.microsoft.com/office/drawing/2016/ink" xmlns:am3d="http://schemas.microsoft.com/office/drawing/2017/model3d" xmlns:o="urn:schemas-microsoft-com:office:office" xmlns:oel="http://schemas.microsoft.com/office/2019/extlst" xmlns:r="http://schemas.openxmlformats.org/officeDocument/2006/relationships" xmlns:m="http://schemas.openxmlformats.org/officeDocument/2006/math" xmlns:v="urn:schemas-microsoft-com:vml" xmlns:wp14="http://schemas.microsoft.com/office/word/2010/wordprocessingDrawing" xmlns:wp="http://schemas.openxmlformats.org/drawingml/2006/wordprocessingDrawing" xmlns:w10="urn:schemas-microsoft-com:office:word" xmlns:w="http://schemas.openxmlformats.org/wordprocessingml/2006/main" xmlns:w14="http://schemas.microsoft.com/office/word/2010/wordml" xmlns:w15="http://schemas.microsoft.com/office/word/2012/wordml" xmlns:w16cex="http://schemas.microsoft.com/office/word/2018/wordml/cex" xmlns:w16cid="http://schemas.microsoft.com/office/word/2016/wordml/cid" xmlns:w16="http://schemas.microsoft.com/office/word/2018/wordml" xmlns:w16du="http://schemas.microsoft.com/office/word/2023/wordml/word16du" xmlns:w16sdtdh="http://schemas.microsoft.com/office/word/2020/wordml/sdtdatahash" xmlns:w16sdtfl="http://schemas.microsoft.com/office/word/2024/wordml/sdtformatlock" xmlns:w16se="http://schemas.microsoft.com/office/word/2015/wordml/symex" xmlns:wpg="http://schemas.microsoft.com/office/word/2010/wordprocessingGroup" xmlns:wpi="http://schemas.microsoft.com/office/word/2010/wordprocessingInk" xmlns:wne="http://schemas.microsoft.com/office/word/2006/wordml" xmlns:wps="http://schemas.microsoft.com/office/word/2010/wordprocessingShape" mc:Ignorable="w14 w15 w16se w16cid w16 w16cex w16sdtdh w16sdtfl w16du wp14">
   <w:abstractNum w:abstractNumId="0" w15:restartNumberingAfterBreak="0">
+    <w:nsid w:val="02872A7B"/>
+    <w:multiLevelType w:val="multilevel"/>
+    <w:tmpl w:val="C6AC3D40"/>
+    <w:lvl w:ilvl="0">
+      <w:start w:val="1"/>
+      <w:numFmt w:val="bullet"/>
+      <w:lvlText w:val=""/>
+      <w:lvlJc w:val="left"/>
+      <w:pPr>
+        <w:tabs>
+          <w:tab w:val="num" w:pos="720"/>
+        </w:tabs>
+        <w:ind w:left="720" w:hanging="360"/>
+      </w:pPr>
+      <w:rPr>
+        <w:rFonts w:ascii="Symbol" w:hAnsi="Symbol" w:hint="default"/>
+        <w:sz w:val="20"/>
+      </w:rPr>
+    </w:lvl>
+    <w:lvl w:ilvl="1" w:tentative="1">
+      <w:start w:val="1"/>
+      <w:numFmt w:val="bullet"/>
+      <w:lvlText w:val="o"/>
+      <w:lvlJc w:val="left"/>
+      <w:pPr>
+        <w:tabs>
+          <w:tab w:val="num" w:pos="1440"/>
+        </w:tabs>
+        <w:ind w:left="1440" w:hanging="360"/>
+      </w:pPr>
+      <w:rPr>
+        <w:rFonts w:ascii="Courier New" w:hAnsi="Courier New" w:hint="default"/>
+        <w:sz w:val="20"/>
+      </w:rPr>
+    </w:lvl>
+    <w:lvl w:ilvl="2" w:tentative="1">
+      <w:start w:val="1"/>
+      <w:numFmt w:val="bullet"/>
+      <w:lvlText w:val=""/>
+      <w:lvlJc w:val="left"/>
+      <w:pPr>
+        <w:tabs>
+          <w:tab w:val="num" w:pos="2160"/>
+        </w:tabs>
+        <w:ind w:left="2160" w:hanging="360"/>
+      </w:pPr>
+      <w:rPr>
+        <w:rFonts w:ascii="Wingdings" w:hAnsi="Wingdings" w:hint="default"/>
+        <w:sz w:val="20"/>
+      </w:rPr>
+    </w:lvl>
+    <w:lvl w:ilvl="3" w:tentative="1">
+      <w:start w:val="1"/>
+      <w:numFmt w:val="bullet"/>
+      <w:lvlText w:val=""/>
+      <w:lvlJc w:val="left"/>
+      <w:pPr>
+        <w:tabs>
+          <w:tab w:val="num" w:pos="2880"/>
+        </w:tabs>
+        <w:ind w:left="2880" w:hanging="360"/>
+      </w:pPr>
+      <w:rPr>
+        <w:rFonts w:ascii="Wingdings" w:hAnsi="Wingdings" w:hint="default"/>
+        <w:sz w:val="20"/>
+      </w:rPr>
+    </w:lvl>
+    <w:lvl w:ilvl="4" w:tentative="1">
+      <w:start w:val="1"/>
+      <w:numFmt w:val="bullet"/>
+      <w:lvlText w:val=""/>
+      <w:lvlJc w:val="left"/>
+      <w:pPr>
+        <w:tabs>
+          <w:tab w:val="num" w:pos="3600"/>
+        </w:tabs>
+        <w:ind w:left="3600" w:hanging="360"/>
+      </w:pPr>
+      <w:rPr>
+        <w:rFonts w:ascii="Wingdings" w:hAnsi="Wingdings" w:hint="default"/>
+        <w:sz w:val="20"/>
+      </w:rPr>
+    </w:lvl>
+    <w:lvl w:ilvl="5" w:tentative="1">
+      <w:start w:val="1"/>
+      <w:numFmt w:val="bullet"/>
+      <w:lvlText w:val=""/>
+      <w:lvlJc w:val="left"/>
+      <w:pPr>
+        <w:tabs>
+          <w:tab w:val="num" w:pos="4320"/>
+        </w:tabs>
+        <w:ind w:left="4320" w:hanging="360"/>
+      </w:pPr>
+      <w:rPr>
+        <w:rFonts w:ascii="Wingdings" w:hAnsi="Wingdings" w:hint="default"/>
+        <w:sz w:val="20"/>
+      </w:rPr>
+    </w:lvl>
+    <w:lvl w:ilvl="6" w:tentative="1">
+      <w:start w:val="1"/>
+      <w:numFmt w:val="bullet"/>
+      <w:lvlText w:val=""/>
+      <w:lvlJc w:val="left"/>
+      <w:pPr>
+        <w:tabs>
+          <w:tab w:val="num" w:pos="5040"/>
+        </w:tabs>
+        <w:ind w:left="5040" w:hanging="360"/>
+      </w:pPr>
+      <w:rPr>
+        <w:rFonts w:ascii="Wingdings" w:hAnsi="Wingdings" w:hint="default"/>
+        <w:sz w:val="20"/>
+      </w:rPr>
+    </w:lvl>
+    <w:lvl w:ilvl="7" w:tentative="1">
+      <w:start w:val="1"/>
+      <w:numFmt w:val="bullet"/>
+      <w:lvlText w:val=""/>
+      <w:lvlJc w:val="left"/>
+      <w:pPr>
+        <w:tabs>
+          <w:tab w:val="num" w:pos="5760"/>
+        </w:tabs>
+        <w:ind w:left="5760" w:hanging="360"/>
+      </w:pPr>
+      <w:rPr>
+        <w:rFonts w:ascii="Wingdings" w:hAnsi="Wingdings" w:hint="default"/>
+        <w:sz w:val="20"/>
+      </w:rPr>
+    </w:lvl>
+    <w:lvl w:ilvl="8" w:tentative="1">
+      <w:start w:val="1"/>
+      <w:numFmt w:val="bullet"/>
+      <w:lvlText w:val=""/>
+      <w:lvlJc w:val="left"/>
+      <w:pPr>
+        <w:tabs>
+          <w:tab w:val="num" w:pos="6480"/>
+        </w:tabs>
+        <w:ind w:left="6480" w:hanging="360"/>
+      </w:pPr>
+      <w:rPr>
+        <w:rFonts w:ascii="Wingdings" w:hAnsi="Wingdings" w:hint="default"/>
+        <w:sz w:val="20"/>
+      </w:rPr>
+    </w:lvl>
+  </w:abstractNum>
+  <w:abstractNum w:abstractNumId="1" w15:restartNumberingAfterBreak="0">
     <w:nsid w:val="03864AD1"/>
     <w:multiLevelType w:val="multilevel"/>
     <w:tmpl w:val="1164A28C"/>
@@ -13882,7 +14282,7 @@
       </w:pPr>
     </w:lvl>
   </w:abstractNum>
-  <w:abstractNum w:abstractNumId="1" w15:restartNumberingAfterBreak="0">
+  <w:abstractNum w:abstractNumId="2" w15:restartNumberingAfterBreak="0">
     <w:nsid w:val="059E25B4"/>
     <w:multiLevelType w:val="multilevel"/>
     <w:tmpl w:val="5DF4CCDE"/>
@@ -14031,7 +14431,156 @@
       </w:rPr>
     </w:lvl>
   </w:abstractNum>
-  <w:abstractNum w:abstractNumId="2" w15:restartNumberingAfterBreak="0">
+  <w:abstractNum w:abstractNumId="3" w15:restartNumberingAfterBreak="0">
+    <w:nsid w:val="14A11A2C"/>
+    <w:multiLevelType w:val="multilevel"/>
+    <w:tmpl w:val="64360680"/>
+    <w:lvl w:ilvl="0">
+      <w:start w:val="1"/>
+      <w:numFmt w:val="bullet"/>
+      <w:lvlText w:val=""/>
+      <w:lvlJc w:val="left"/>
+      <w:pPr>
+        <w:tabs>
+          <w:tab w:val="num" w:pos="720"/>
+        </w:tabs>
+        <w:ind w:left="720" w:hanging="360"/>
+      </w:pPr>
+      <w:rPr>
+        <w:rFonts w:ascii="Symbol" w:hAnsi="Symbol" w:hint="default"/>
+        <w:sz w:val="20"/>
+      </w:rPr>
+    </w:lvl>
+    <w:lvl w:ilvl="1" w:tentative="1">
+      <w:start w:val="1"/>
+      <w:numFmt w:val="bullet"/>
+      <w:lvlText w:val="o"/>
+      <w:lvlJc w:val="left"/>
+      <w:pPr>
+        <w:tabs>
+          <w:tab w:val="num" w:pos="1440"/>
+        </w:tabs>
+        <w:ind w:left="1440" w:hanging="360"/>
+      </w:pPr>
+      <w:rPr>
+        <w:rFonts w:ascii="Courier New" w:hAnsi="Courier New" w:hint="default"/>
+        <w:sz w:val="20"/>
+      </w:rPr>
+    </w:lvl>
+    <w:lvl w:ilvl="2" w:tentative="1">
+      <w:start w:val="1"/>
+      <w:numFmt w:val="bullet"/>
+      <w:lvlText w:val=""/>
+      <w:lvlJc w:val="left"/>
+      <w:pPr>
+        <w:tabs>
+          <w:tab w:val="num" w:pos="2160"/>
+        </w:tabs>
+        <w:ind w:left="2160" w:hanging="360"/>
+      </w:pPr>
+      <w:rPr>
+        <w:rFonts w:ascii="Wingdings" w:hAnsi="Wingdings" w:hint="default"/>
+        <w:sz w:val="20"/>
+      </w:rPr>
+    </w:lvl>
+    <w:lvl w:ilvl="3" w:tentative="1">
+      <w:start w:val="1"/>
+      <w:numFmt w:val="bullet"/>
+      <w:lvlText w:val=""/>
+      <w:lvlJc w:val="left"/>
+      <w:pPr>
+        <w:tabs>
+          <w:tab w:val="num" w:pos="2880"/>
+        </w:tabs>
+        <w:ind w:left="2880" w:hanging="360"/>
+      </w:pPr>
+      <w:rPr>
+        <w:rFonts w:ascii="Wingdings" w:hAnsi="Wingdings" w:hint="default"/>
+        <w:sz w:val="20"/>
+      </w:rPr>
+    </w:lvl>
+    <w:lvl w:ilvl="4" w:tentative="1">
+      <w:start w:val="1"/>
+      <w:numFmt w:val="bullet"/>
+      <w:lvlText w:val=""/>
+      <w:lvlJc w:val="left"/>
+      <w:pPr>
+        <w:tabs>
+          <w:tab w:val="num" w:pos="3600"/>
+        </w:tabs>
+        <w:ind w:left="3600" w:hanging="360"/>
+      </w:pPr>
+      <w:rPr>
+        <w:rFonts w:ascii="Wingdings" w:hAnsi="Wingdings" w:hint="default"/>
+        <w:sz w:val="20"/>
+      </w:rPr>
+    </w:lvl>
+    <w:lvl w:ilvl="5" w:tentative="1">
+      <w:start w:val="1"/>
+      <w:numFmt w:val="bullet"/>
+      <w:lvlText w:val=""/>
+      <w:lvlJc w:val="left"/>
+      <w:pPr>
+        <w:tabs>
+          <w:tab w:val="num" w:pos="4320"/>
+        </w:tabs>
+        <w:ind w:left="4320" w:hanging="360"/>
+      </w:pPr>
+      <w:rPr>
+        <w:rFonts w:ascii="Wingdings" w:hAnsi="Wingdings" w:hint="default"/>
+        <w:sz w:val="20"/>
+      </w:rPr>
+    </w:lvl>
+    <w:lvl w:ilvl="6" w:tentative="1">
+      <w:start w:val="1"/>
+      <w:numFmt w:val="bullet"/>
+      <w:lvlText w:val=""/>
+      <w:lvlJc w:val="left"/>
+      <w:pPr>
+        <w:tabs>
+          <w:tab w:val="num" w:pos="5040"/>
+        </w:tabs>
+        <w:ind w:left="5040" w:hanging="360"/>
+      </w:pPr>
+      <w:rPr>
+        <w:rFonts w:ascii="Wingdings" w:hAnsi="Wingdings" w:hint="default"/>
+        <w:sz w:val="20"/>
+      </w:rPr>
+    </w:lvl>
+    <w:lvl w:ilvl="7" w:tentative="1">
+      <w:start w:val="1"/>
+      <w:numFmt w:val="bullet"/>
+      <w:lvlText w:val=""/>
+      <w:lvlJc w:val="left"/>
+      <w:pPr>
+        <w:tabs>
+          <w:tab w:val="num" w:pos="5760"/>
+        </w:tabs>
+        <w:ind w:left="5760" w:hanging="360"/>
+      </w:pPr>
+      <w:rPr>
+        <w:rFonts w:ascii="Wingdings" w:hAnsi="Wingdings" w:hint="default"/>
+        <w:sz w:val="20"/>
+      </w:rPr>
+    </w:lvl>
+    <w:lvl w:ilvl="8" w:tentative="1">
+      <w:start w:val="1"/>
+      <w:numFmt w:val="bullet"/>
+      <w:lvlText w:val=""/>
+      <w:lvlJc w:val="left"/>
+      <w:pPr>
+        <w:tabs>
+          <w:tab w:val="num" w:pos="6480"/>
+        </w:tabs>
+        <w:ind w:left="6480" w:hanging="360"/>
+      </w:pPr>
+      <w:rPr>
+        <w:rFonts w:ascii="Wingdings" w:hAnsi="Wingdings" w:hint="default"/>
+        <w:sz w:val="20"/>
+      </w:rPr>
+    </w:lvl>
+  </w:abstractNum>
+  <w:abstractNum w:abstractNumId="4" w15:restartNumberingAfterBreak="0">
     <w:nsid w:val="1A9339D6"/>
     <w:multiLevelType w:val="multilevel"/>
     <w:tmpl w:val="F55417EE"/>
@@ -14148,7 +14697,7 @@
       </w:pPr>
     </w:lvl>
   </w:abstractNum>
-  <w:abstractNum w:abstractNumId="3" w15:restartNumberingAfterBreak="0">
+  <w:abstractNum w:abstractNumId="5" w15:restartNumberingAfterBreak="0">
     <w:nsid w:val="1D631F1C"/>
     <w:multiLevelType w:val="multilevel"/>
     <w:tmpl w:val="54E43BBC"/>
@@ -14297,7 +14846,7 @@
       </w:rPr>
     </w:lvl>
   </w:abstractNum>
-  <w:abstractNum w:abstractNumId="4" w15:restartNumberingAfterBreak="0">
+  <w:abstractNum w:abstractNumId="6" w15:restartNumberingAfterBreak="0">
     <w:nsid w:val="1E6F322E"/>
     <w:multiLevelType w:val="multilevel"/>
     <w:tmpl w:val="A17238BA"/>
@@ -14446,7 +14995,418 @@
       </w:rPr>
     </w:lvl>
   </w:abstractNum>
-  <w:abstractNum w:abstractNumId="5" w15:restartNumberingAfterBreak="0">
+  <w:abstractNum w:abstractNumId="7" w15:restartNumberingAfterBreak="0">
+    <w:nsid w:val="210C0DEB"/>
+    <w:multiLevelType w:val="multilevel"/>
+    <w:tmpl w:val="5796A9F6"/>
+    <w:lvl w:ilvl="0">
+      <w:start w:val="1"/>
+      <w:numFmt w:val="bullet"/>
+      <w:lvlText w:val=""/>
+      <w:lvlJc w:val="left"/>
+      <w:pPr>
+        <w:tabs>
+          <w:tab w:val="num" w:pos="720"/>
+        </w:tabs>
+        <w:ind w:left="720" w:hanging="360"/>
+      </w:pPr>
+      <w:rPr>
+        <w:rFonts w:ascii="Symbol" w:hAnsi="Symbol" w:hint="default"/>
+        <w:sz w:val="20"/>
+      </w:rPr>
+    </w:lvl>
+    <w:lvl w:ilvl="1" w:tentative="1">
+      <w:start w:val="1"/>
+      <w:numFmt w:val="bullet"/>
+      <w:lvlText w:val="o"/>
+      <w:lvlJc w:val="left"/>
+      <w:pPr>
+        <w:tabs>
+          <w:tab w:val="num" w:pos="1440"/>
+        </w:tabs>
+        <w:ind w:left="1440" w:hanging="360"/>
+      </w:pPr>
+      <w:rPr>
+        <w:rFonts w:ascii="Courier New" w:hAnsi="Courier New" w:hint="default"/>
+        <w:sz w:val="20"/>
+      </w:rPr>
+    </w:lvl>
+    <w:lvl w:ilvl="2" w:tentative="1">
+      <w:start w:val="1"/>
+      <w:numFmt w:val="bullet"/>
+      <w:lvlText w:val=""/>
+      <w:lvlJc w:val="left"/>
+      <w:pPr>
+        <w:tabs>
+          <w:tab w:val="num" w:pos="2160"/>
+        </w:tabs>
+        <w:ind w:left="2160" w:hanging="360"/>
+      </w:pPr>
+      <w:rPr>
+        <w:rFonts w:ascii="Wingdings" w:hAnsi="Wingdings" w:hint="default"/>
+        <w:sz w:val="20"/>
+      </w:rPr>
+    </w:lvl>
+    <w:lvl w:ilvl="3" w:tentative="1">
+      <w:start w:val="1"/>
+      <w:numFmt w:val="bullet"/>
+      <w:lvlText w:val=""/>
+      <w:lvlJc w:val="left"/>
+      <w:pPr>
+        <w:tabs>
+          <w:tab w:val="num" w:pos="2880"/>
+        </w:tabs>
+        <w:ind w:left="2880" w:hanging="360"/>
+      </w:pPr>
+      <w:rPr>
+        <w:rFonts w:ascii="Wingdings" w:hAnsi="Wingdings" w:hint="default"/>
+        <w:sz w:val="20"/>
+      </w:rPr>
+    </w:lvl>
+    <w:lvl w:ilvl="4" w:tentative="1">
+      <w:start w:val="1"/>
+      <w:numFmt w:val="bullet"/>
+      <w:lvlText w:val=""/>
+      <w:lvlJc w:val="left"/>
+      <w:pPr>
+        <w:tabs>
+          <w:tab w:val="num" w:pos="3600"/>
+        </w:tabs>
+        <w:ind w:left="3600" w:hanging="360"/>
+      </w:pPr>
+      <w:rPr>
+        <w:rFonts w:ascii="Wingdings" w:hAnsi="Wingdings" w:hint="default"/>
+        <w:sz w:val="20"/>
+      </w:rPr>
+    </w:lvl>
+    <w:lvl w:ilvl="5" w:tentative="1">
+      <w:start w:val="1"/>
+      <w:numFmt w:val="bullet"/>
+      <w:lvlText w:val=""/>
+      <w:lvlJc w:val="left"/>
+      <w:pPr>
+        <w:tabs>
+          <w:tab w:val="num" w:pos="4320"/>
+        </w:tabs>
+        <w:ind w:left="4320" w:hanging="360"/>
+      </w:pPr>
+      <w:rPr>
+        <w:rFonts w:ascii="Wingdings" w:hAnsi="Wingdings" w:hint="default"/>
+        <w:sz w:val="20"/>
+      </w:rPr>
+    </w:lvl>
+    <w:lvl w:ilvl="6" w:tentative="1">
+      <w:start w:val="1"/>
+      <w:numFmt w:val="bullet"/>
+      <w:lvlText w:val=""/>
+      <w:lvlJc w:val="left"/>
+      <w:pPr>
+        <w:tabs>
+          <w:tab w:val="num" w:pos="5040"/>
+        </w:tabs>
+        <w:ind w:left="5040" w:hanging="360"/>
+      </w:pPr>
+      <w:rPr>
+        <w:rFonts w:ascii="Wingdings" w:hAnsi="Wingdings" w:hint="default"/>
+        <w:sz w:val="20"/>
+      </w:rPr>
+    </w:lvl>
+    <w:lvl w:ilvl="7" w:tentative="1">
+      <w:start w:val="1"/>
+      <w:numFmt w:val="bullet"/>
+      <w:lvlText w:val=""/>
+      <w:lvlJc w:val="left"/>
+      <w:pPr>
+        <w:tabs>
+          <w:tab w:val="num" w:pos="5760"/>
+        </w:tabs>
+        <w:ind w:left="5760" w:hanging="360"/>
+      </w:pPr>
+      <w:rPr>
+        <w:rFonts w:ascii="Wingdings" w:hAnsi="Wingdings" w:hint="default"/>
+        <w:sz w:val="20"/>
+      </w:rPr>
+    </w:lvl>
+    <w:lvl w:ilvl="8" w:tentative="1">
+      <w:start w:val="1"/>
+      <w:numFmt w:val="bullet"/>
+      <w:lvlText w:val=""/>
+      <w:lvlJc w:val="left"/>
+      <w:pPr>
+        <w:tabs>
+          <w:tab w:val="num" w:pos="6480"/>
+        </w:tabs>
+        <w:ind w:left="6480" w:hanging="360"/>
+      </w:pPr>
+      <w:rPr>
+        <w:rFonts w:ascii="Wingdings" w:hAnsi="Wingdings" w:hint="default"/>
+        <w:sz w:val="20"/>
+      </w:rPr>
+    </w:lvl>
+  </w:abstractNum>
+  <w:abstractNum w:abstractNumId="8" w15:restartNumberingAfterBreak="0">
+    <w:nsid w:val="224C7994"/>
+    <w:multiLevelType w:val="multilevel"/>
+    <w:tmpl w:val="D9B48D5C"/>
+    <w:lvl w:ilvl="0">
+      <w:start w:val="1"/>
+      <w:numFmt w:val="bullet"/>
+      <w:lvlText w:val=""/>
+      <w:lvlJc w:val="left"/>
+      <w:pPr>
+        <w:tabs>
+          <w:tab w:val="num" w:pos="720"/>
+        </w:tabs>
+        <w:ind w:left="720" w:hanging="360"/>
+      </w:pPr>
+      <w:rPr>
+        <w:rFonts w:ascii="Symbol" w:hAnsi="Symbol" w:hint="default"/>
+        <w:sz w:val="20"/>
+      </w:rPr>
+    </w:lvl>
+    <w:lvl w:ilvl="1" w:tentative="1">
+      <w:start w:val="1"/>
+      <w:numFmt w:val="bullet"/>
+      <w:lvlText w:val="o"/>
+      <w:lvlJc w:val="left"/>
+      <w:pPr>
+        <w:tabs>
+          <w:tab w:val="num" w:pos="1440"/>
+        </w:tabs>
+        <w:ind w:left="1440" w:hanging="360"/>
+      </w:pPr>
+      <w:rPr>
+        <w:rFonts w:ascii="Courier New" w:hAnsi="Courier New" w:hint="default"/>
+        <w:sz w:val="20"/>
+      </w:rPr>
+    </w:lvl>
+    <w:lvl w:ilvl="2" w:tentative="1">
+      <w:start w:val="1"/>
+      <w:numFmt w:val="bullet"/>
+      <w:lvlText w:val=""/>
+      <w:lvlJc w:val="left"/>
+      <w:pPr>
+        <w:tabs>
+          <w:tab w:val="num" w:pos="2160"/>
+        </w:tabs>
+        <w:ind w:left="2160" w:hanging="360"/>
+      </w:pPr>
+      <w:rPr>
+        <w:rFonts w:ascii="Wingdings" w:hAnsi="Wingdings" w:hint="default"/>
+        <w:sz w:val="20"/>
+      </w:rPr>
+    </w:lvl>
+    <w:lvl w:ilvl="3" w:tentative="1">
+      <w:start w:val="1"/>
+      <w:numFmt w:val="bullet"/>
+      <w:lvlText w:val=""/>
+      <w:lvlJc w:val="left"/>
+      <w:pPr>
+        <w:tabs>
+          <w:tab w:val="num" w:pos="2880"/>
+        </w:tabs>
+        <w:ind w:left="2880" w:hanging="360"/>
+      </w:pPr>
+      <w:rPr>
+        <w:rFonts w:ascii="Wingdings" w:hAnsi="Wingdings" w:hint="default"/>
+        <w:sz w:val="20"/>
+      </w:rPr>
+    </w:lvl>
+    <w:lvl w:ilvl="4" w:tentative="1">
+      <w:start w:val="1"/>
+      <w:numFmt w:val="bullet"/>
+      <w:lvlText w:val=""/>
+      <w:lvlJc w:val="left"/>
+      <w:pPr>
+        <w:tabs>
+          <w:tab w:val="num" w:pos="3600"/>
+        </w:tabs>
+        <w:ind w:left="3600" w:hanging="360"/>
+      </w:pPr>
+      <w:rPr>
+        <w:rFonts w:ascii="Wingdings" w:hAnsi="Wingdings" w:hint="default"/>
+        <w:sz w:val="20"/>
+      </w:rPr>
+    </w:lvl>
+    <w:lvl w:ilvl="5" w:tentative="1">
+      <w:start w:val="1"/>
+      <w:numFmt w:val="bullet"/>
+      <w:lvlText w:val=""/>
+      <w:lvlJc w:val="left"/>
+      <w:pPr>
+        <w:tabs>
+          <w:tab w:val="num" w:pos="4320"/>
+        </w:tabs>
+        <w:ind w:left="4320" w:hanging="360"/>
+      </w:pPr>
+      <w:rPr>
+        <w:rFonts w:ascii="Wingdings" w:hAnsi="Wingdings" w:hint="default"/>
+        <w:sz w:val="20"/>
+      </w:rPr>
+    </w:lvl>
+    <w:lvl w:ilvl="6" w:tentative="1">
+      <w:start w:val="1"/>
+      <w:numFmt w:val="bullet"/>
+      <w:lvlText w:val=""/>
+      <w:lvlJc w:val="left"/>
+      <w:pPr>
+        <w:tabs>
+          <w:tab w:val="num" w:pos="5040"/>
+        </w:tabs>
+        <w:ind w:left="5040" w:hanging="360"/>
+      </w:pPr>
+      <w:rPr>
+        <w:rFonts w:ascii="Wingdings" w:hAnsi="Wingdings" w:hint="default"/>
+        <w:sz w:val="20"/>
+      </w:rPr>
+    </w:lvl>
+    <w:lvl w:ilvl="7" w:tentative="1">
+      <w:start w:val="1"/>
+      <w:numFmt w:val="bullet"/>
+      <w:lvlText w:val=""/>
+      <w:lvlJc w:val="left"/>
+      <w:pPr>
+        <w:tabs>
+          <w:tab w:val="num" w:pos="5760"/>
+        </w:tabs>
+        <w:ind w:left="5760" w:hanging="360"/>
+      </w:pPr>
+      <w:rPr>
+        <w:rFonts w:ascii="Wingdings" w:hAnsi="Wingdings" w:hint="default"/>
+        <w:sz w:val="20"/>
+      </w:rPr>
+    </w:lvl>
+    <w:lvl w:ilvl="8" w:tentative="1">
+      <w:start w:val="1"/>
+      <w:numFmt w:val="bullet"/>
+      <w:lvlText w:val=""/>
+      <w:lvlJc w:val="left"/>
+      <w:pPr>
+        <w:tabs>
+          <w:tab w:val="num" w:pos="6480"/>
+        </w:tabs>
+        <w:ind w:left="6480" w:hanging="360"/>
+      </w:pPr>
+      <w:rPr>
+        <w:rFonts w:ascii="Wingdings" w:hAnsi="Wingdings" w:hint="default"/>
+        <w:sz w:val="20"/>
+      </w:rPr>
+    </w:lvl>
+  </w:abstractNum>
+  <w:abstractNum w:abstractNumId="9" w15:restartNumberingAfterBreak="0">
+    <w:nsid w:val="236A50A7"/>
+    <w:multiLevelType w:val="multilevel"/>
+    <w:tmpl w:val="A6C0C5C2"/>
+    <w:lvl w:ilvl="0">
+      <w:start w:val="1"/>
+      <w:numFmt w:val="decimal"/>
+      <w:lvlText w:val="%1."/>
+      <w:lvlJc w:val="left"/>
+      <w:pPr>
+        <w:tabs>
+          <w:tab w:val="num" w:pos="720"/>
+        </w:tabs>
+        <w:ind w:left="720" w:hanging="360"/>
+      </w:pPr>
+    </w:lvl>
+    <w:lvl w:ilvl="1" w:tentative="1">
+      <w:start w:val="1"/>
+      <w:numFmt w:val="decimal"/>
+      <w:lvlText w:val="%2."/>
+      <w:lvlJc w:val="left"/>
+      <w:pPr>
+        <w:tabs>
+          <w:tab w:val="num" w:pos="1440"/>
+        </w:tabs>
+        <w:ind w:left="1440" w:hanging="360"/>
+      </w:pPr>
+    </w:lvl>
+    <w:lvl w:ilvl="2" w:tentative="1">
+      <w:start w:val="1"/>
+      <w:numFmt w:val="decimal"/>
+      <w:lvlText w:val="%3."/>
+      <w:lvlJc w:val="left"/>
+      <w:pPr>
+        <w:tabs>
+          <w:tab w:val="num" w:pos="2160"/>
+        </w:tabs>
+        <w:ind w:left="2160" w:hanging="360"/>
+      </w:pPr>
+    </w:lvl>
+    <w:lvl w:ilvl="3" w:tentative="1">
+      <w:start w:val="1"/>
+      <w:numFmt w:val="decimal"/>
+      <w:lvlText w:val="%4."/>
+      <w:lvlJc w:val="left"/>
+      <w:pPr>
+        <w:tabs>
+          <w:tab w:val="num" w:pos="2880"/>
+        </w:tabs>
+        <w:ind w:left="2880" w:hanging="360"/>
+      </w:pPr>
+    </w:lvl>
+    <w:lvl w:ilvl="4" w:tentative="1">
+      <w:start w:val="1"/>
+      <w:numFmt w:val="decimal"/>
+      <w:lvlText w:val="%5."/>
+      <w:lvlJc w:val="left"/>
+      <w:pPr>
+        <w:tabs>
+          <w:tab w:val="num" w:pos="3600"/>
+        </w:tabs>
+        <w:ind w:left="3600" w:hanging="360"/>
+      </w:pPr>
+    </w:lvl>
+    <w:lvl w:ilvl="5" w:tentative="1">
+      <w:start w:val="1"/>
+      <w:numFmt w:val="decimal"/>
+      <w:lvlText w:val="%6."/>
+      <w:lvlJc w:val="left"/>
+      <w:pPr>
+        <w:tabs>
+          <w:tab w:val="num" w:pos="4320"/>
+        </w:tabs>
+        <w:ind w:left="4320" w:hanging="360"/>
+      </w:pPr>
+    </w:lvl>
+    <w:lvl w:ilvl="6" w:tentative="1">
+      <w:start w:val="1"/>
+      <w:numFmt w:val="decimal"/>
+      <w:lvlText w:val="%7."/>
+      <w:lvlJc w:val="left"/>
+      <w:pPr>
+        <w:tabs>
+          <w:tab w:val="num" w:pos="5040"/>
+        </w:tabs>
+        <w:ind w:left="5040" w:hanging="360"/>
+      </w:pPr>
+    </w:lvl>
+    <w:lvl w:ilvl="7" w:tentative="1">
+      <w:start w:val="1"/>
+      <w:numFmt w:val="decimal"/>
+      <w:lvlText w:val="%8."/>
+      <w:lvlJc w:val="left"/>
+      <w:pPr>
+        <w:tabs>
+          <w:tab w:val="num" w:pos="5760"/>
+        </w:tabs>
+        <w:ind w:left="5760" w:hanging="360"/>
+      </w:pPr>
+    </w:lvl>
+    <w:lvl w:ilvl="8" w:tentative="1">
+      <w:start w:val="1"/>
+      <w:numFmt w:val="decimal"/>
+      <w:lvlText w:val="%9."/>
+      <w:lvlJc w:val="left"/>
+      <w:pPr>
+        <w:tabs>
+          <w:tab w:val="num" w:pos="6480"/>
+        </w:tabs>
+        <w:ind w:left="6480" w:hanging="360"/>
+      </w:pPr>
+    </w:lvl>
+  </w:abstractNum>
+  <w:abstractNum w:abstractNumId="10" w15:restartNumberingAfterBreak="0">
     <w:nsid w:val="24285B9F"/>
     <w:multiLevelType w:val="multilevel"/>
     <w:tmpl w:val="3F82BB10"/>
@@ -14595,7 +15555,7 @@
       </w:rPr>
     </w:lvl>
   </w:abstractNum>
-  <w:abstractNum w:abstractNumId="6" w15:restartNumberingAfterBreak="0">
+  <w:abstractNum w:abstractNumId="11" w15:restartNumberingAfterBreak="0">
     <w:nsid w:val="257B234E"/>
     <w:multiLevelType w:val="multilevel"/>
     <w:tmpl w:val="52DC3E84"/>
@@ -14744,7 +15704,156 @@
       </w:rPr>
     </w:lvl>
   </w:abstractNum>
-  <w:abstractNum w:abstractNumId="7" w15:restartNumberingAfterBreak="0">
+  <w:abstractNum w:abstractNumId="12" w15:restartNumberingAfterBreak="0">
+    <w:nsid w:val="27425190"/>
+    <w:multiLevelType w:val="multilevel"/>
+    <w:tmpl w:val="89667DA6"/>
+    <w:lvl w:ilvl="0">
+      <w:start w:val="1"/>
+      <w:numFmt w:val="bullet"/>
+      <w:lvlText w:val=""/>
+      <w:lvlJc w:val="left"/>
+      <w:pPr>
+        <w:tabs>
+          <w:tab w:val="num" w:pos="720"/>
+        </w:tabs>
+        <w:ind w:left="720" w:hanging="360"/>
+      </w:pPr>
+      <w:rPr>
+        <w:rFonts w:ascii="Symbol" w:hAnsi="Symbol" w:hint="default"/>
+        <w:sz w:val="20"/>
+      </w:rPr>
+    </w:lvl>
+    <w:lvl w:ilvl="1" w:tentative="1">
+      <w:start w:val="1"/>
+      <w:numFmt w:val="bullet"/>
+      <w:lvlText w:val="o"/>
+      <w:lvlJc w:val="left"/>
+      <w:pPr>
+        <w:tabs>
+          <w:tab w:val="num" w:pos="1440"/>
+        </w:tabs>
+        <w:ind w:left="1440" w:hanging="360"/>
+      </w:pPr>
+      <w:rPr>
+        <w:rFonts w:ascii="Courier New" w:hAnsi="Courier New" w:hint="default"/>
+        <w:sz w:val="20"/>
+      </w:rPr>
+    </w:lvl>
+    <w:lvl w:ilvl="2" w:tentative="1">
+      <w:start w:val="1"/>
+      <w:numFmt w:val="bullet"/>
+      <w:lvlText w:val=""/>
+      <w:lvlJc w:val="left"/>
+      <w:pPr>
+        <w:tabs>
+          <w:tab w:val="num" w:pos="2160"/>
+        </w:tabs>
+        <w:ind w:left="2160" w:hanging="360"/>
+      </w:pPr>
+      <w:rPr>
+        <w:rFonts w:ascii="Wingdings" w:hAnsi="Wingdings" w:hint="default"/>
+        <w:sz w:val="20"/>
+      </w:rPr>
+    </w:lvl>
+    <w:lvl w:ilvl="3" w:tentative="1">
+      <w:start w:val="1"/>
+      <w:numFmt w:val="bullet"/>
+      <w:lvlText w:val=""/>
+      <w:lvlJc w:val="left"/>
+      <w:pPr>
+        <w:tabs>
+          <w:tab w:val="num" w:pos="2880"/>
+        </w:tabs>
+        <w:ind w:left="2880" w:hanging="360"/>
+      </w:pPr>
+      <w:rPr>
+        <w:rFonts w:ascii="Wingdings" w:hAnsi="Wingdings" w:hint="default"/>
+        <w:sz w:val="20"/>
+      </w:rPr>
+    </w:lvl>
+    <w:lvl w:ilvl="4" w:tentative="1">
+      <w:start w:val="1"/>
+      <w:numFmt w:val="bullet"/>
+      <w:lvlText w:val=""/>
+      <w:lvlJc w:val="left"/>
+      <w:pPr>
+        <w:tabs>
+          <w:tab w:val="num" w:pos="3600"/>
+        </w:tabs>
+        <w:ind w:left="3600" w:hanging="360"/>
+      </w:pPr>
+      <w:rPr>
+        <w:rFonts w:ascii="Wingdings" w:hAnsi="Wingdings" w:hint="default"/>
+        <w:sz w:val="20"/>
+      </w:rPr>
+    </w:lvl>
+    <w:lvl w:ilvl="5" w:tentative="1">
+      <w:start w:val="1"/>
+      <w:numFmt w:val="bullet"/>
+      <w:lvlText w:val=""/>
+      <w:lvlJc w:val="left"/>
+      <w:pPr>
+        <w:tabs>
+          <w:tab w:val="num" w:pos="4320"/>
+        </w:tabs>
+        <w:ind w:left="4320" w:hanging="360"/>
+      </w:pPr>
+      <w:rPr>
+        <w:rFonts w:ascii="Wingdings" w:hAnsi="Wingdings" w:hint="default"/>
+        <w:sz w:val="20"/>
+      </w:rPr>
+    </w:lvl>
+    <w:lvl w:ilvl="6" w:tentative="1">
+      <w:start w:val="1"/>
+      <w:numFmt w:val="bullet"/>
+      <w:lvlText w:val=""/>
+      <w:lvlJc w:val="left"/>
+      <w:pPr>
+        <w:tabs>
+          <w:tab w:val="num" w:pos="5040"/>
+        </w:tabs>
+        <w:ind w:left="5040" w:hanging="360"/>
+      </w:pPr>
+      <w:rPr>
+        <w:rFonts w:ascii="Wingdings" w:hAnsi="Wingdings" w:hint="default"/>
+        <w:sz w:val="20"/>
+      </w:rPr>
+    </w:lvl>
+    <w:lvl w:ilvl="7" w:tentative="1">
+      <w:start w:val="1"/>
+      <w:numFmt w:val="bullet"/>
+      <w:lvlText w:val=""/>
+      <w:lvlJc w:val="left"/>
+      <w:pPr>
+        <w:tabs>
+          <w:tab w:val="num" w:pos="5760"/>
+        </w:tabs>
+        <w:ind w:left="5760" w:hanging="360"/>
+      </w:pPr>
+      <w:rPr>
+        <w:rFonts w:ascii="Wingdings" w:hAnsi="Wingdings" w:hint="default"/>
+        <w:sz w:val="20"/>
+      </w:rPr>
+    </w:lvl>
+    <w:lvl w:ilvl="8" w:tentative="1">
+      <w:start w:val="1"/>
+      <w:numFmt w:val="bullet"/>
+      <w:lvlText w:val=""/>
+      <w:lvlJc w:val="left"/>
+      <w:pPr>
+        <w:tabs>
+          <w:tab w:val="num" w:pos="6480"/>
+        </w:tabs>
+        <w:ind w:left="6480" w:hanging="360"/>
+      </w:pPr>
+      <w:rPr>
+        <w:rFonts w:ascii="Wingdings" w:hAnsi="Wingdings" w:hint="default"/>
+        <w:sz w:val="20"/>
+      </w:rPr>
+    </w:lvl>
+  </w:abstractNum>
+  <w:abstractNum w:abstractNumId="13" w15:restartNumberingAfterBreak="0">
     <w:nsid w:val="27B86F7E"/>
     <w:multiLevelType w:val="multilevel"/>
     <w:tmpl w:val="27A2EE98"/>
@@ -14861,7 +15970,156 @@
       </w:pPr>
     </w:lvl>
   </w:abstractNum>
-  <w:abstractNum w:abstractNumId="8" w15:restartNumberingAfterBreak="0">
+  <w:abstractNum w:abstractNumId="14" w15:restartNumberingAfterBreak="0">
+    <w:nsid w:val="29C52B19"/>
+    <w:multiLevelType w:val="multilevel"/>
+    <w:tmpl w:val="25B8590A"/>
+    <w:lvl w:ilvl="0">
+      <w:start w:val="1"/>
+      <w:numFmt w:val="bullet"/>
+      <w:lvlText w:val=""/>
+      <w:lvlJc w:val="left"/>
+      <w:pPr>
+        <w:tabs>
+          <w:tab w:val="num" w:pos="720"/>
+        </w:tabs>
+        <w:ind w:left="720" w:hanging="360"/>
+      </w:pPr>
+      <w:rPr>
+        <w:rFonts w:ascii="Symbol" w:hAnsi="Symbol" w:hint="default"/>
+        <w:sz w:val="20"/>
+      </w:rPr>
+    </w:lvl>
+    <w:lvl w:ilvl="1" w:tentative="1">
+      <w:start w:val="1"/>
+      <w:numFmt w:val="bullet"/>
+      <w:lvlText w:val="o"/>
+      <w:lvlJc w:val="left"/>
+      <w:pPr>
+        <w:tabs>
+          <w:tab w:val="num" w:pos="1440"/>
+        </w:tabs>
+        <w:ind w:left="1440" w:hanging="360"/>
+      </w:pPr>
+      <w:rPr>
+        <w:rFonts w:ascii="Courier New" w:hAnsi="Courier New" w:hint="default"/>
+        <w:sz w:val="20"/>
+      </w:rPr>
+    </w:lvl>
+    <w:lvl w:ilvl="2" w:tentative="1">
+      <w:start w:val="1"/>
+      <w:numFmt w:val="bullet"/>
+      <w:lvlText w:val=""/>
+      <w:lvlJc w:val="left"/>
+      <w:pPr>
+        <w:tabs>
+          <w:tab w:val="num" w:pos="2160"/>
+        </w:tabs>
+        <w:ind w:left="2160" w:hanging="360"/>
+      </w:pPr>
+      <w:rPr>
+        <w:rFonts w:ascii="Wingdings" w:hAnsi="Wingdings" w:hint="default"/>
+        <w:sz w:val="20"/>
+      </w:rPr>
+    </w:lvl>
+    <w:lvl w:ilvl="3" w:tentative="1">
+      <w:start w:val="1"/>
+      <w:numFmt w:val="bullet"/>
+      <w:lvlText w:val=""/>
+      <w:lvlJc w:val="left"/>
+      <w:pPr>
+        <w:tabs>
+          <w:tab w:val="num" w:pos="2880"/>
+        </w:tabs>
+        <w:ind w:left="2880" w:hanging="360"/>
+      </w:pPr>
+      <w:rPr>
+        <w:rFonts w:ascii="Wingdings" w:hAnsi="Wingdings" w:hint="default"/>
+        <w:sz w:val="20"/>
+      </w:rPr>
+    </w:lvl>
+    <w:lvl w:ilvl="4" w:tentative="1">
+      <w:start w:val="1"/>
+      <w:numFmt w:val="bullet"/>
+      <w:lvlText w:val=""/>
+      <w:lvlJc w:val="left"/>
+      <w:pPr>
+        <w:tabs>
+          <w:tab w:val="num" w:pos="3600"/>
+        </w:tabs>
+        <w:ind w:left="3600" w:hanging="360"/>
+      </w:pPr>
+      <w:rPr>
+        <w:rFonts w:ascii="Wingdings" w:hAnsi="Wingdings" w:hint="default"/>
+        <w:sz w:val="20"/>
+      </w:rPr>
+    </w:lvl>
+    <w:lvl w:ilvl="5" w:tentative="1">
+      <w:start w:val="1"/>
+      <w:numFmt w:val="bullet"/>
+      <w:lvlText w:val=""/>
+      <w:lvlJc w:val="left"/>
+      <w:pPr>
+        <w:tabs>
+          <w:tab w:val="num" w:pos="4320"/>
+        </w:tabs>
+        <w:ind w:left="4320" w:hanging="360"/>
+      </w:pPr>
+      <w:rPr>
+        <w:rFonts w:ascii="Wingdings" w:hAnsi="Wingdings" w:hint="default"/>
+        <w:sz w:val="20"/>
+      </w:rPr>
+    </w:lvl>
+    <w:lvl w:ilvl="6" w:tentative="1">
+      <w:start w:val="1"/>
+      <w:numFmt w:val="bullet"/>
+      <w:lvlText w:val=""/>
+      <w:lvlJc w:val="left"/>
+      <w:pPr>
+        <w:tabs>
+          <w:tab w:val="num" w:pos="5040"/>
+        </w:tabs>
+        <w:ind w:left="5040" w:hanging="360"/>
+      </w:pPr>
+      <w:rPr>
+        <w:rFonts w:ascii="Wingdings" w:hAnsi="Wingdings" w:hint="default"/>
+        <w:sz w:val="20"/>
+      </w:rPr>
+    </w:lvl>
+    <w:lvl w:ilvl="7" w:tentative="1">
+      <w:start w:val="1"/>
+      <w:numFmt w:val="bullet"/>
+      <w:lvlText w:val=""/>
+      <w:lvlJc w:val="left"/>
+      <w:pPr>
+        <w:tabs>
+          <w:tab w:val="num" w:pos="5760"/>
+        </w:tabs>
+        <w:ind w:left="5760" w:hanging="360"/>
+      </w:pPr>
+      <w:rPr>
+        <w:rFonts w:ascii="Wingdings" w:hAnsi="Wingdings" w:hint="default"/>
+        <w:sz w:val="20"/>
+      </w:rPr>
+    </w:lvl>
+    <w:lvl w:ilvl="8" w:tentative="1">
+      <w:start w:val="1"/>
+      <w:numFmt w:val="bullet"/>
+      <w:lvlText w:val=""/>
+      <w:lvlJc w:val="left"/>
+      <w:pPr>
+        <w:tabs>
+          <w:tab w:val="num" w:pos="6480"/>
+        </w:tabs>
+        <w:ind w:left="6480" w:hanging="360"/>
+      </w:pPr>
+      <w:rPr>
+        <w:rFonts w:ascii="Wingdings" w:hAnsi="Wingdings" w:hint="default"/>
+        <w:sz w:val="20"/>
+      </w:rPr>
+    </w:lvl>
+  </w:abstractNum>
+  <w:abstractNum w:abstractNumId="15" w15:restartNumberingAfterBreak="0">
     <w:nsid w:val="2A7A507B"/>
     <w:multiLevelType w:val="multilevel"/>
     <w:tmpl w:val="89D079FC"/>
@@ -14974,7 +16232,7 @@
       </w:pPr>
     </w:lvl>
   </w:abstractNum>
-  <w:abstractNum w:abstractNumId="9" w15:restartNumberingAfterBreak="0">
+  <w:abstractNum w:abstractNumId="16" w15:restartNumberingAfterBreak="0">
     <w:nsid w:val="2E3B58A1"/>
     <w:multiLevelType w:val="multilevel"/>
     <w:tmpl w:val="E5825582"/>
@@ -15123,7 +16381,7 @@
       </w:rPr>
     </w:lvl>
   </w:abstractNum>
-  <w:abstractNum w:abstractNumId="10" w15:restartNumberingAfterBreak="0">
+  <w:abstractNum w:abstractNumId="17" w15:restartNumberingAfterBreak="0">
     <w:nsid w:val="315D0792"/>
     <w:multiLevelType w:val="multilevel"/>
     <w:tmpl w:val="34842BE8"/>
@@ -15272,7 +16530,7 @@
       </w:rPr>
     </w:lvl>
   </w:abstractNum>
-  <w:abstractNum w:abstractNumId="11" w15:restartNumberingAfterBreak="0">
+  <w:abstractNum w:abstractNumId="18" w15:restartNumberingAfterBreak="0">
     <w:nsid w:val="31960251"/>
     <w:multiLevelType w:val="multilevel"/>
     <w:tmpl w:val="3BBE35DE"/>
@@ -15421,7 +16679,7 @@
       </w:rPr>
     </w:lvl>
   </w:abstractNum>
-  <w:abstractNum w:abstractNumId="12" w15:restartNumberingAfterBreak="0">
+  <w:abstractNum w:abstractNumId="19" w15:restartNumberingAfterBreak="0">
     <w:nsid w:val="333E7CEE"/>
     <w:multiLevelType w:val="multilevel"/>
     <w:tmpl w:val="1CF08974"/>
@@ -15570,7 +16828,7 @@
       </w:rPr>
     </w:lvl>
   </w:abstractNum>
-  <w:abstractNum w:abstractNumId="13" w15:restartNumberingAfterBreak="0">
+  <w:abstractNum w:abstractNumId="20" w15:restartNumberingAfterBreak="0">
     <w:nsid w:val="38A71D43"/>
     <w:multiLevelType w:val="multilevel"/>
     <w:tmpl w:val="A4027148"/>
@@ -15719,7 +16977,7 @@
       </w:rPr>
     </w:lvl>
   </w:abstractNum>
-  <w:abstractNum w:abstractNumId="14" w15:restartNumberingAfterBreak="0">
+  <w:abstractNum w:abstractNumId="21" w15:restartNumberingAfterBreak="0">
     <w:nsid w:val="39BC2B69"/>
     <w:multiLevelType w:val="multilevel"/>
     <w:tmpl w:val="4D9E0D26"/>
@@ -15832,7 +17090,7 @@
       </w:pPr>
     </w:lvl>
   </w:abstractNum>
-  <w:abstractNum w:abstractNumId="15" w15:restartNumberingAfterBreak="0">
+  <w:abstractNum w:abstractNumId="22" w15:restartNumberingAfterBreak="0">
     <w:nsid w:val="3ADE0553"/>
     <w:multiLevelType w:val="multilevel"/>
     <w:tmpl w:val="CE2CE51C"/>
@@ -15981,7 +17239,7 @@
       </w:rPr>
     </w:lvl>
   </w:abstractNum>
-  <w:abstractNum w:abstractNumId="16" w15:restartNumberingAfterBreak="0">
+  <w:abstractNum w:abstractNumId="23" w15:restartNumberingAfterBreak="0">
     <w:nsid w:val="426157A1"/>
     <w:multiLevelType w:val="multilevel"/>
     <w:tmpl w:val="0AFE178C"/>
@@ -16130,7 +17388,156 @@
       </w:rPr>
     </w:lvl>
   </w:abstractNum>
-  <w:abstractNum w:abstractNumId="17" w15:restartNumberingAfterBreak="0">
+  <w:abstractNum w:abstractNumId="24" w15:restartNumberingAfterBreak="0">
+    <w:nsid w:val="44582F11"/>
+    <w:multiLevelType w:val="multilevel"/>
+    <w:tmpl w:val="CD9C521E"/>
+    <w:lvl w:ilvl="0">
+      <w:start w:val="1"/>
+      <w:numFmt w:val="bullet"/>
+      <w:lvlText w:val=""/>
+      <w:lvlJc w:val="left"/>
+      <w:pPr>
+        <w:tabs>
+          <w:tab w:val="num" w:pos="720"/>
+        </w:tabs>
+        <w:ind w:left="720" w:hanging="360"/>
+      </w:pPr>
+      <w:rPr>
+        <w:rFonts w:ascii="Symbol" w:hAnsi="Symbol" w:hint="default"/>
+        <w:sz w:val="20"/>
+      </w:rPr>
+    </w:lvl>
+    <w:lvl w:ilvl="1" w:tentative="1">
+      <w:start w:val="1"/>
+      <w:numFmt w:val="bullet"/>
+      <w:lvlText w:val="o"/>
+      <w:lvlJc w:val="left"/>
+      <w:pPr>
+        <w:tabs>
+          <w:tab w:val="num" w:pos="1440"/>
+        </w:tabs>
+        <w:ind w:left="1440" w:hanging="360"/>
+      </w:pPr>
+      <w:rPr>
+        <w:rFonts w:ascii="Courier New" w:hAnsi="Courier New" w:hint="default"/>
+        <w:sz w:val="20"/>
+      </w:rPr>
+    </w:lvl>
+    <w:lvl w:ilvl="2" w:tentative="1">
+      <w:start w:val="1"/>
+      <w:numFmt w:val="bullet"/>
+      <w:lvlText w:val=""/>
+      <w:lvlJc w:val="left"/>
+      <w:pPr>
+        <w:tabs>
+          <w:tab w:val="num" w:pos="2160"/>
+        </w:tabs>
+        <w:ind w:left="2160" w:hanging="360"/>
+      </w:pPr>
+      <w:rPr>
+        <w:rFonts w:ascii="Wingdings" w:hAnsi="Wingdings" w:hint="default"/>
+        <w:sz w:val="20"/>
+      </w:rPr>
+    </w:lvl>
+    <w:lvl w:ilvl="3" w:tentative="1">
+      <w:start w:val="1"/>
+      <w:numFmt w:val="bullet"/>
+      <w:lvlText w:val=""/>
+      <w:lvlJc w:val="left"/>
+      <w:pPr>
+        <w:tabs>
+          <w:tab w:val="num" w:pos="2880"/>
+        </w:tabs>
+        <w:ind w:left="2880" w:hanging="360"/>
+      </w:pPr>
+      <w:rPr>
+        <w:rFonts w:ascii="Wingdings" w:hAnsi="Wingdings" w:hint="default"/>
+        <w:sz w:val="20"/>
+      </w:rPr>
+    </w:lvl>
+    <w:lvl w:ilvl="4" w:tentative="1">
+      <w:start w:val="1"/>
+      <w:numFmt w:val="bullet"/>
+      <w:lvlText w:val=""/>
+      <w:lvlJc w:val="left"/>
+      <w:pPr>
+        <w:tabs>
+          <w:tab w:val="num" w:pos="3600"/>
+        </w:tabs>
+        <w:ind w:left="3600" w:hanging="360"/>
+      </w:pPr>
+      <w:rPr>
+        <w:rFonts w:ascii="Wingdings" w:hAnsi="Wingdings" w:hint="default"/>
+        <w:sz w:val="20"/>
+      </w:rPr>
+    </w:lvl>
+    <w:lvl w:ilvl="5" w:tentative="1">
+      <w:start w:val="1"/>
+      <w:numFmt w:val="bullet"/>
+      <w:lvlText w:val=""/>
+      <w:lvlJc w:val="left"/>
+      <w:pPr>
+        <w:tabs>
+          <w:tab w:val="num" w:pos="4320"/>
+        </w:tabs>
+        <w:ind w:left="4320" w:hanging="360"/>
+      </w:pPr>
+      <w:rPr>
+        <w:rFonts w:ascii="Wingdings" w:hAnsi="Wingdings" w:hint="default"/>
+        <w:sz w:val="20"/>
+      </w:rPr>
+    </w:lvl>
+    <w:lvl w:ilvl="6" w:tentative="1">
+      <w:start w:val="1"/>
+      <w:numFmt w:val="bullet"/>
+      <w:lvlText w:val=""/>
+      <w:lvlJc w:val="left"/>
+      <w:pPr>
+        <w:tabs>
+          <w:tab w:val="num" w:pos="5040"/>
+        </w:tabs>
+        <w:ind w:left="5040" w:hanging="360"/>
+      </w:pPr>
+      <w:rPr>
+        <w:rFonts w:ascii="Wingdings" w:hAnsi="Wingdings" w:hint="default"/>
+        <w:sz w:val="20"/>
+      </w:rPr>
+    </w:lvl>
+    <w:lvl w:ilvl="7" w:tentative="1">
+      <w:start w:val="1"/>
+      <w:numFmt w:val="bullet"/>
+      <w:lvlText w:val=""/>
+      <w:lvlJc w:val="left"/>
+      <w:pPr>
+        <w:tabs>
+          <w:tab w:val="num" w:pos="5760"/>
+        </w:tabs>
+        <w:ind w:left="5760" w:hanging="360"/>
+      </w:pPr>
+      <w:rPr>
+        <w:rFonts w:ascii="Wingdings" w:hAnsi="Wingdings" w:hint="default"/>
+        <w:sz w:val="20"/>
+      </w:rPr>
+    </w:lvl>
+    <w:lvl w:ilvl="8" w:tentative="1">
+      <w:start w:val="1"/>
+      <w:numFmt w:val="bullet"/>
+      <w:lvlText w:val=""/>
+      <w:lvlJc w:val="left"/>
+      <w:pPr>
+        <w:tabs>
+          <w:tab w:val="num" w:pos="6480"/>
+        </w:tabs>
+        <w:ind w:left="6480" w:hanging="360"/>
+      </w:pPr>
+      <w:rPr>
+        <w:rFonts w:ascii="Wingdings" w:hAnsi="Wingdings" w:hint="default"/>
+        <w:sz w:val="20"/>
+      </w:rPr>
+    </w:lvl>
+  </w:abstractNum>
+  <w:abstractNum w:abstractNumId="25" w15:restartNumberingAfterBreak="0">
     <w:nsid w:val="49120304"/>
     <w:multiLevelType w:val="multilevel"/>
     <w:tmpl w:val="AE3E2DA0"/>
@@ -16279,7 +17686,7 @@
       </w:rPr>
     </w:lvl>
   </w:abstractNum>
-  <w:abstractNum w:abstractNumId="18" w15:restartNumberingAfterBreak="0">
+  <w:abstractNum w:abstractNumId="26" w15:restartNumberingAfterBreak="0">
     <w:nsid w:val="49504BF4"/>
     <w:multiLevelType w:val="multilevel"/>
     <w:tmpl w:val="43D805E4"/>
@@ -16428,7 +17835,156 @@
       </w:rPr>
     </w:lvl>
   </w:abstractNum>
-  <w:abstractNum w:abstractNumId="19" w15:restartNumberingAfterBreak="0">
+  <w:abstractNum w:abstractNumId="27" w15:restartNumberingAfterBreak="0">
+    <w:nsid w:val="4B4E2C45"/>
+    <w:multiLevelType w:val="multilevel"/>
+    <w:tmpl w:val="21A64E52"/>
+    <w:lvl w:ilvl="0">
+      <w:start w:val="1"/>
+      <w:numFmt w:val="bullet"/>
+      <w:lvlText w:val=""/>
+      <w:lvlJc w:val="left"/>
+      <w:pPr>
+        <w:tabs>
+          <w:tab w:val="num" w:pos="720"/>
+        </w:tabs>
+        <w:ind w:left="720" w:hanging="360"/>
+      </w:pPr>
+      <w:rPr>
+        <w:rFonts w:ascii="Symbol" w:hAnsi="Symbol" w:hint="default"/>
+        <w:sz w:val="20"/>
+      </w:rPr>
+    </w:lvl>
+    <w:lvl w:ilvl="1" w:tentative="1">
+      <w:start w:val="1"/>
+      <w:numFmt w:val="bullet"/>
+      <w:lvlText w:val="o"/>
+      <w:lvlJc w:val="left"/>
+      <w:pPr>
+        <w:tabs>
+          <w:tab w:val="num" w:pos="1440"/>
+        </w:tabs>
+        <w:ind w:left="1440" w:hanging="360"/>
+      </w:pPr>
+      <w:rPr>
+        <w:rFonts w:ascii="Courier New" w:hAnsi="Courier New" w:hint="default"/>
+        <w:sz w:val="20"/>
+      </w:rPr>
+    </w:lvl>
+    <w:lvl w:ilvl="2" w:tentative="1">
+      <w:start w:val="1"/>
+      <w:numFmt w:val="bullet"/>
+      <w:lvlText w:val=""/>
+      <w:lvlJc w:val="left"/>
+      <w:pPr>
+        <w:tabs>
+          <w:tab w:val="num" w:pos="2160"/>
+        </w:tabs>
+        <w:ind w:left="2160" w:hanging="360"/>
+      </w:pPr>
+      <w:rPr>
+        <w:rFonts w:ascii="Wingdings" w:hAnsi="Wingdings" w:hint="default"/>
+        <w:sz w:val="20"/>
+      </w:rPr>
+    </w:lvl>
+    <w:lvl w:ilvl="3" w:tentative="1">
+      <w:start w:val="1"/>
+      <w:numFmt w:val="bullet"/>
+      <w:lvlText w:val=""/>
+      <w:lvlJc w:val="left"/>
+      <w:pPr>
+        <w:tabs>
+          <w:tab w:val="num" w:pos="2880"/>
+        </w:tabs>
+        <w:ind w:left="2880" w:hanging="360"/>
+      </w:pPr>
+      <w:rPr>
+        <w:rFonts w:ascii="Wingdings" w:hAnsi="Wingdings" w:hint="default"/>
+        <w:sz w:val="20"/>
+      </w:rPr>
+    </w:lvl>
+    <w:lvl w:ilvl="4" w:tentative="1">
+      <w:start w:val="1"/>
+      <w:numFmt w:val="bullet"/>
+      <w:lvlText w:val=""/>
+      <w:lvlJc w:val="left"/>
+      <w:pPr>
+        <w:tabs>
+          <w:tab w:val="num" w:pos="3600"/>
+        </w:tabs>
+        <w:ind w:left="3600" w:hanging="360"/>
+      </w:pPr>
+      <w:rPr>
+        <w:rFonts w:ascii="Wingdings" w:hAnsi="Wingdings" w:hint="default"/>
+        <w:sz w:val="20"/>
+      </w:rPr>
+    </w:lvl>
+    <w:lvl w:ilvl="5" w:tentative="1">
+      <w:start w:val="1"/>
+      <w:numFmt w:val="bullet"/>
+      <w:lvlText w:val=""/>
+      <w:lvlJc w:val="left"/>
+      <w:pPr>
+        <w:tabs>
+          <w:tab w:val="num" w:pos="4320"/>
+        </w:tabs>
+        <w:ind w:left="4320" w:hanging="360"/>
+      </w:pPr>
+      <w:rPr>
+        <w:rFonts w:ascii="Wingdings" w:hAnsi="Wingdings" w:hint="default"/>
+        <w:sz w:val="20"/>
+      </w:rPr>
+    </w:lvl>
+    <w:lvl w:ilvl="6" w:tentative="1">
+      <w:start w:val="1"/>
+      <w:numFmt w:val="bullet"/>
+      <w:lvlText w:val=""/>
+      <w:lvlJc w:val="left"/>
+      <w:pPr>
+        <w:tabs>
+          <w:tab w:val="num" w:pos="5040"/>
+        </w:tabs>
+        <w:ind w:left="5040" w:hanging="360"/>
+      </w:pPr>
+      <w:rPr>
+        <w:rFonts w:ascii="Wingdings" w:hAnsi="Wingdings" w:hint="default"/>
+        <w:sz w:val="20"/>
+      </w:rPr>
+    </w:lvl>
+    <w:lvl w:ilvl="7" w:tentative="1">
+      <w:start w:val="1"/>
+      <w:numFmt w:val="bullet"/>
+      <w:lvlText w:val=""/>
+      <w:lvlJc w:val="left"/>
+      <w:pPr>
+        <w:tabs>
+          <w:tab w:val="num" w:pos="5760"/>
+        </w:tabs>
+        <w:ind w:left="5760" w:hanging="360"/>
+      </w:pPr>
+      <w:rPr>
+        <w:rFonts w:ascii="Wingdings" w:hAnsi="Wingdings" w:hint="default"/>
+        <w:sz w:val="20"/>
+      </w:rPr>
+    </w:lvl>
+    <w:lvl w:ilvl="8" w:tentative="1">
+      <w:start w:val="1"/>
+      <w:numFmt w:val="bullet"/>
+      <w:lvlText w:val=""/>
+      <w:lvlJc w:val="left"/>
+      <w:pPr>
+        <w:tabs>
+          <w:tab w:val="num" w:pos="6480"/>
+        </w:tabs>
+        <w:ind w:left="6480" w:hanging="360"/>
+      </w:pPr>
+      <w:rPr>
+        <w:rFonts w:ascii="Wingdings" w:hAnsi="Wingdings" w:hint="default"/>
+        <w:sz w:val="20"/>
+      </w:rPr>
+    </w:lvl>
+  </w:abstractNum>
+  <w:abstractNum w:abstractNumId="28" w15:restartNumberingAfterBreak="0">
     <w:nsid w:val="4D864EEB"/>
     <w:multiLevelType w:val="multilevel"/>
     <w:tmpl w:val="A3D48B8C"/>
@@ -16541,7 +18097,7 @@
       </w:pPr>
     </w:lvl>
   </w:abstractNum>
-  <w:abstractNum w:abstractNumId="20" w15:restartNumberingAfterBreak="0">
+  <w:abstractNum w:abstractNumId="29" w15:restartNumberingAfterBreak="0">
     <w:nsid w:val="519E6B28"/>
     <w:multiLevelType w:val="multilevel"/>
     <w:tmpl w:val="33C2E510"/>
@@ -16690,7 +18246,7 @@
       </w:rPr>
     </w:lvl>
   </w:abstractNum>
-  <w:abstractNum w:abstractNumId="21" w15:restartNumberingAfterBreak="0">
+  <w:abstractNum w:abstractNumId="30" w15:restartNumberingAfterBreak="0">
     <w:nsid w:val="51CE0441"/>
     <w:multiLevelType w:val="multilevel"/>
     <w:tmpl w:val="B3207BC6"/>
@@ -16839,7 +18395,454 @@
       </w:rPr>
     </w:lvl>
   </w:abstractNum>
-  <w:abstractNum w:abstractNumId="22" w15:restartNumberingAfterBreak="0">
+  <w:abstractNum w:abstractNumId="31" w15:restartNumberingAfterBreak="0">
+    <w:nsid w:val="52294793"/>
+    <w:multiLevelType w:val="multilevel"/>
+    <w:tmpl w:val="100886D8"/>
+    <w:lvl w:ilvl="0">
+      <w:start w:val="1"/>
+      <w:numFmt w:val="bullet"/>
+      <w:lvlText w:val=""/>
+      <w:lvlJc w:val="left"/>
+      <w:pPr>
+        <w:tabs>
+          <w:tab w:val="num" w:pos="720"/>
+        </w:tabs>
+        <w:ind w:left="720" w:hanging="360"/>
+      </w:pPr>
+      <w:rPr>
+        <w:rFonts w:ascii="Symbol" w:hAnsi="Symbol" w:hint="default"/>
+        <w:sz w:val="20"/>
+      </w:rPr>
+    </w:lvl>
+    <w:lvl w:ilvl="1" w:tentative="1">
+      <w:start w:val="1"/>
+      <w:numFmt w:val="bullet"/>
+      <w:lvlText w:val="o"/>
+      <w:lvlJc w:val="left"/>
+      <w:pPr>
+        <w:tabs>
+          <w:tab w:val="num" w:pos="1440"/>
+        </w:tabs>
+        <w:ind w:left="1440" w:hanging="360"/>
+      </w:pPr>
+      <w:rPr>
+        <w:rFonts w:ascii="Courier New" w:hAnsi="Courier New" w:hint="default"/>
+        <w:sz w:val="20"/>
+      </w:rPr>
+    </w:lvl>
+    <w:lvl w:ilvl="2" w:tentative="1">
+      <w:start w:val="1"/>
+      <w:numFmt w:val="bullet"/>
+      <w:lvlText w:val=""/>
+      <w:lvlJc w:val="left"/>
+      <w:pPr>
+        <w:tabs>
+          <w:tab w:val="num" w:pos="2160"/>
+        </w:tabs>
+        <w:ind w:left="2160" w:hanging="360"/>
+      </w:pPr>
+      <w:rPr>
+        <w:rFonts w:ascii="Wingdings" w:hAnsi="Wingdings" w:hint="default"/>
+        <w:sz w:val="20"/>
+      </w:rPr>
+    </w:lvl>
+    <w:lvl w:ilvl="3" w:tentative="1">
+      <w:start w:val="1"/>
+      <w:numFmt w:val="bullet"/>
+      <w:lvlText w:val=""/>
+      <w:lvlJc w:val="left"/>
+      <w:pPr>
+        <w:tabs>
+          <w:tab w:val="num" w:pos="2880"/>
+        </w:tabs>
+        <w:ind w:left="2880" w:hanging="360"/>
+      </w:pPr>
+      <w:rPr>
+        <w:rFonts w:ascii="Wingdings" w:hAnsi="Wingdings" w:hint="default"/>
+        <w:sz w:val="20"/>
+      </w:rPr>
+    </w:lvl>
+    <w:lvl w:ilvl="4" w:tentative="1">
+      <w:start w:val="1"/>
+      <w:numFmt w:val="bullet"/>
+      <w:lvlText w:val=""/>
+      <w:lvlJc w:val="left"/>
+      <w:pPr>
+        <w:tabs>
+          <w:tab w:val="num" w:pos="3600"/>
+        </w:tabs>
+        <w:ind w:left="3600" w:hanging="360"/>
+      </w:pPr>
+      <w:rPr>
+        <w:rFonts w:ascii="Wingdings" w:hAnsi="Wingdings" w:hint="default"/>
+        <w:sz w:val="20"/>
+      </w:rPr>
+    </w:lvl>
+    <w:lvl w:ilvl="5" w:tentative="1">
+      <w:start w:val="1"/>
+      <w:numFmt w:val="bullet"/>
+      <w:lvlText w:val=""/>
+      <w:lvlJc w:val="left"/>
+      <w:pPr>
+        <w:tabs>
+          <w:tab w:val="num" w:pos="4320"/>
+        </w:tabs>
+        <w:ind w:left="4320" w:hanging="360"/>
+      </w:pPr>
+      <w:rPr>
+        <w:rFonts w:ascii="Wingdings" w:hAnsi="Wingdings" w:hint="default"/>
+        <w:sz w:val="20"/>
+      </w:rPr>
+    </w:lvl>
+    <w:lvl w:ilvl="6" w:tentative="1">
+      <w:start w:val="1"/>
+      <w:numFmt w:val="bullet"/>
+      <w:lvlText w:val=""/>
+      <w:lvlJc w:val="left"/>
+      <w:pPr>
+        <w:tabs>
+          <w:tab w:val="num" w:pos="5040"/>
+        </w:tabs>
+        <w:ind w:left="5040" w:hanging="360"/>
+      </w:pPr>
+      <w:rPr>
+        <w:rFonts w:ascii="Wingdings" w:hAnsi="Wingdings" w:hint="default"/>
+        <w:sz w:val="20"/>
+      </w:rPr>
+    </w:lvl>
+    <w:lvl w:ilvl="7" w:tentative="1">
+      <w:start w:val="1"/>
+      <w:numFmt w:val="bullet"/>
+      <w:lvlText w:val=""/>
+      <w:lvlJc w:val="left"/>
+      <w:pPr>
+        <w:tabs>
+          <w:tab w:val="num" w:pos="5760"/>
+        </w:tabs>
+        <w:ind w:left="5760" w:hanging="360"/>
+      </w:pPr>
+      <w:rPr>
+        <w:rFonts w:ascii="Wingdings" w:hAnsi="Wingdings" w:hint="default"/>
+        <w:sz w:val="20"/>
+      </w:rPr>
+    </w:lvl>
+    <w:lvl w:ilvl="8" w:tentative="1">
+      <w:start w:val="1"/>
+      <w:numFmt w:val="bullet"/>
+      <w:lvlText w:val=""/>
+      <w:lvlJc w:val="left"/>
+      <w:pPr>
+        <w:tabs>
+          <w:tab w:val="num" w:pos="6480"/>
+        </w:tabs>
+        <w:ind w:left="6480" w:hanging="360"/>
+      </w:pPr>
+      <w:rPr>
+        <w:rFonts w:ascii="Wingdings" w:hAnsi="Wingdings" w:hint="default"/>
+        <w:sz w:val="20"/>
+      </w:rPr>
+    </w:lvl>
+  </w:abstractNum>
+  <w:abstractNum w:abstractNumId="32" w15:restartNumberingAfterBreak="0">
+    <w:nsid w:val="56CD34BA"/>
+    <w:multiLevelType w:val="multilevel"/>
+    <w:tmpl w:val="08ECC7D2"/>
+    <w:lvl w:ilvl="0">
+      <w:start w:val="1"/>
+      <w:numFmt w:val="bullet"/>
+      <w:lvlText w:val=""/>
+      <w:lvlJc w:val="left"/>
+      <w:pPr>
+        <w:tabs>
+          <w:tab w:val="num" w:pos="720"/>
+        </w:tabs>
+        <w:ind w:left="720" w:hanging="360"/>
+      </w:pPr>
+      <w:rPr>
+        <w:rFonts w:ascii="Symbol" w:hAnsi="Symbol" w:hint="default"/>
+        <w:sz w:val="20"/>
+      </w:rPr>
+    </w:lvl>
+    <w:lvl w:ilvl="1" w:tentative="1">
+      <w:start w:val="1"/>
+      <w:numFmt w:val="bullet"/>
+      <w:lvlText w:val="o"/>
+      <w:lvlJc w:val="left"/>
+      <w:pPr>
+        <w:tabs>
+          <w:tab w:val="num" w:pos="1440"/>
+        </w:tabs>
+        <w:ind w:left="1440" w:hanging="360"/>
+      </w:pPr>
+      <w:rPr>
+        <w:rFonts w:ascii="Courier New" w:hAnsi="Courier New" w:hint="default"/>
+        <w:sz w:val="20"/>
+      </w:rPr>
+    </w:lvl>
+    <w:lvl w:ilvl="2" w:tentative="1">
+      <w:start w:val="1"/>
+      <w:numFmt w:val="bullet"/>
+      <w:lvlText w:val=""/>
+      <w:lvlJc w:val="left"/>
+      <w:pPr>
+        <w:tabs>
+          <w:tab w:val="num" w:pos="2160"/>
+        </w:tabs>
+        <w:ind w:left="2160" w:hanging="360"/>
+      </w:pPr>
+      <w:rPr>
+        <w:rFonts w:ascii="Wingdings" w:hAnsi="Wingdings" w:hint="default"/>
+        <w:sz w:val="20"/>
+      </w:rPr>
+    </w:lvl>
+    <w:lvl w:ilvl="3" w:tentative="1">
+      <w:start w:val="1"/>
+      <w:numFmt w:val="bullet"/>
+      <w:lvlText w:val=""/>
+      <w:lvlJc w:val="left"/>
+      <w:pPr>
+        <w:tabs>
+          <w:tab w:val="num" w:pos="2880"/>
+        </w:tabs>
+        <w:ind w:left="2880" w:hanging="360"/>
+      </w:pPr>
+      <w:rPr>
+        <w:rFonts w:ascii="Wingdings" w:hAnsi="Wingdings" w:hint="default"/>
+        <w:sz w:val="20"/>
+      </w:rPr>
+    </w:lvl>
+    <w:lvl w:ilvl="4" w:tentative="1">
+      <w:start w:val="1"/>
+      <w:numFmt w:val="bullet"/>
+      <w:lvlText w:val=""/>
+      <w:lvlJc w:val="left"/>
+      <w:pPr>
+        <w:tabs>
+          <w:tab w:val="num" w:pos="3600"/>
+        </w:tabs>
+        <w:ind w:left="3600" w:hanging="360"/>
+      </w:pPr>
+      <w:rPr>
+        <w:rFonts w:ascii="Wingdings" w:hAnsi="Wingdings" w:hint="default"/>
+        <w:sz w:val="20"/>
+      </w:rPr>
+    </w:lvl>
+    <w:lvl w:ilvl="5" w:tentative="1">
+      <w:start w:val="1"/>
+      <w:numFmt w:val="bullet"/>
+      <w:lvlText w:val=""/>
+      <w:lvlJc w:val="left"/>
+      <w:pPr>
+        <w:tabs>
+          <w:tab w:val="num" w:pos="4320"/>
+        </w:tabs>
+        <w:ind w:left="4320" w:hanging="360"/>
+      </w:pPr>
+      <w:rPr>
+        <w:rFonts w:ascii="Wingdings" w:hAnsi="Wingdings" w:hint="default"/>
+        <w:sz w:val="20"/>
+      </w:rPr>
+    </w:lvl>
+    <w:lvl w:ilvl="6" w:tentative="1">
+      <w:start w:val="1"/>
+      <w:numFmt w:val="bullet"/>
+      <w:lvlText w:val=""/>
+      <w:lvlJc w:val="left"/>
+      <w:pPr>
+        <w:tabs>
+          <w:tab w:val="num" w:pos="5040"/>
+        </w:tabs>
+        <w:ind w:left="5040" w:hanging="360"/>
+      </w:pPr>
+      <w:rPr>
+        <w:rFonts w:ascii="Wingdings" w:hAnsi="Wingdings" w:hint="default"/>
+        <w:sz w:val="20"/>
+      </w:rPr>
+    </w:lvl>
+    <w:lvl w:ilvl="7" w:tentative="1">
+      <w:start w:val="1"/>
+      <w:numFmt w:val="bullet"/>
+      <w:lvlText w:val=""/>
+      <w:lvlJc w:val="left"/>
+      <w:pPr>
+        <w:tabs>
+          <w:tab w:val="num" w:pos="5760"/>
+        </w:tabs>
+        <w:ind w:left="5760" w:hanging="360"/>
+      </w:pPr>
+      <w:rPr>
+        <w:rFonts w:ascii="Wingdings" w:hAnsi="Wingdings" w:hint="default"/>
+        <w:sz w:val="20"/>
+      </w:rPr>
+    </w:lvl>
+    <w:lvl w:ilvl="8" w:tentative="1">
+      <w:start w:val="1"/>
+      <w:numFmt w:val="bullet"/>
+      <w:lvlText w:val=""/>
+      <w:lvlJc w:val="left"/>
+      <w:pPr>
+        <w:tabs>
+          <w:tab w:val="num" w:pos="6480"/>
+        </w:tabs>
+        <w:ind w:left="6480" w:hanging="360"/>
+      </w:pPr>
+      <w:rPr>
+        <w:rFonts w:ascii="Wingdings" w:hAnsi="Wingdings" w:hint="default"/>
+        <w:sz w:val="20"/>
+      </w:rPr>
+    </w:lvl>
+  </w:abstractNum>
+  <w:abstractNum w:abstractNumId="33" w15:restartNumberingAfterBreak="0">
+    <w:nsid w:val="585D3B9C"/>
+    <w:multiLevelType w:val="multilevel"/>
+    <w:tmpl w:val="3FEA5846"/>
+    <w:lvl w:ilvl="0">
+      <w:start w:val="1"/>
+      <w:numFmt w:val="bullet"/>
+      <w:lvlText w:val=""/>
+      <w:lvlJc w:val="left"/>
+      <w:pPr>
+        <w:tabs>
+          <w:tab w:val="num" w:pos="720"/>
+        </w:tabs>
+        <w:ind w:left="720" w:hanging="360"/>
+      </w:pPr>
+      <w:rPr>
+        <w:rFonts w:ascii="Symbol" w:hAnsi="Symbol" w:hint="default"/>
+        <w:sz w:val="20"/>
+      </w:rPr>
+    </w:lvl>
+    <w:lvl w:ilvl="1" w:tentative="1">
+      <w:start w:val="1"/>
+      <w:numFmt w:val="bullet"/>
+      <w:lvlText w:val="o"/>
+      <w:lvlJc w:val="left"/>
+      <w:pPr>
+        <w:tabs>
+          <w:tab w:val="num" w:pos="1440"/>
+        </w:tabs>
+        <w:ind w:left="1440" w:hanging="360"/>
+      </w:pPr>
+      <w:rPr>
+        <w:rFonts w:ascii="Courier New" w:hAnsi="Courier New" w:hint="default"/>
+        <w:sz w:val="20"/>
+      </w:rPr>
+    </w:lvl>
+    <w:lvl w:ilvl="2" w:tentative="1">
+      <w:start w:val="1"/>
+      <w:numFmt w:val="bullet"/>
+      <w:lvlText w:val=""/>
+      <w:lvlJc w:val="left"/>
+      <w:pPr>
+        <w:tabs>
+          <w:tab w:val="num" w:pos="2160"/>
+        </w:tabs>
+        <w:ind w:left="2160" w:hanging="360"/>
+      </w:pPr>
+      <w:rPr>
+        <w:rFonts w:ascii="Wingdings" w:hAnsi="Wingdings" w:hint="default"/>
+        <w:sz w:val="20"/>
+      </w:rPr>
+    </w:lvl>
+    <w:lvl w:ilvl="3" w:tentative="1">
+      <w:start w:val="1"/>
+      <w:numFmt w:val="bullet"/>
+      <w:lvlText w:val=""/>
+      <w:lvlJc w:val="left"/>
+      <w:pPr>
+        <w:tabs>
+          <w:tab w:val="num" w:pos="2880"/>
+        </w:tabs>
+        <w:ind w:left="2880" w:hanging="360"/>
+      </w:pPr>
+      <w:rPr>
+        <w:rFonts w:ascii="Wingdings" w:hAnsi="Wingdings" w:hint="default"/>
+        <w:sz w:val="20"/>
+      </w:rPr>
+    </w:lvl>
+    <w:lvl w:ilvl="4" w:tentative="1">
+      <w:start w:val="1"/>
+      <w:numFmt w:val="bullet"/>
+      <w:lvlText w:val=""/>
+      <w:lvlJc w:val="left"/>
+      <w:pPr>
+        <w:tabs>
+          <w:tab w:val="num" w:pos="3600"/>
+        </w:tabs>
+        <w:ind w:left="3600" w:hanging="360"/>
+      </w:pPr>
+      <w:rPr>
+        <w:rFonts w:ascii="Wingdings" w:hAnsi="Wingdings" w:hint="default"/>
+        <w:sz w:val="20"/>
+      </w:rPr>
+    </w:lvl>
+    <w:lvl w:ilvl="5" w:tentative="1">
+      <w:start w:val="1"/>
+      <w:numFmt w:val="bullet"/>
+      <w:lvlText w:val=""/>
+      <w:lvlJc w:val="left"/>
+      <w:pPr>
+        <w:tabs>
+          <w:tab w:val="num" w:pos="4320"/>
+        </w:tabs>
+        <w:ind w:left="4320" w:hanging="360"/>
+      </w:pPr>
+      <w:rPr>
+        <w:rFonts w:ascii="Wingdings" w:hAnsi="Wingdings" w:hint="default"/>
+        <w:sz w:val="20"/>
+      </w:rPr>
+    </w:lvl>
+    <w:lvl w:ilvl="6" w:tentative="1">
+      <w:start w:val="1"/>
+      <w:numFmt w:val="bullet"/>
+      <w:lvlText w:val=""/>
+      <w:lvlJc w:val="left"/>
+      <w:pPr>
+        <w:tabs>
+          <w:tab w:val="num" w:pos="5040"/>
+        </w:tabs>
+        <w:ind w:left="5040" w:hanging="360"/>
+      </w:pPr>
+      <w:rPr>
+        <w:rFonts w:ascii="Wingdings" w:hAnsi="Wingdings" w:hint="default"/>
+        <w:sz w:val="20"/>
+      </w:rPr>
+    </w:lvl>
+    <w:lvl w:ilvl="7" w:tentative="1">
+      <w:start w:val="1"/>
+      <w:numFmt w:val="bullet"/>
+      <w:lvlText w:val=""/>
+      <w:lvlJc w:val="left"/>
+      <w:pPr>
+        <w:tabs>
+          <w:tab w:val="num" w:pos="5760"/>
+        </w:tabs>
+        <w:ind w:left="5760" w:hanging="360"/>
+      </w:pPr>
+      <w:rPr>
+        <w:rFonts w:ascii="Wingdings" w:hAnsi="Wingdings" w:hint="default"/>
+        <w:sz w:val="20"/>
+      </w:rPr>
+    </w:lvl>
+    <w:lvl w:ilvl="8" w:tentative="1">
+      <w:start w:val="1"/>
+      <w:numFmt w:val="bullet"/>
+      <w:lvlText w:val=""/>
+      <w:lvlJc w:val="left"/>
+      <w:pPr>
+        <w:tabs>
+          <w:tab w:val="num" w:pos="6480"/>
+        </w:tabs>
+        <w:ind w:left="6480" w:hanging="360"/>
+      </w:pPr>
+      <w:rPr>
+        <w:rFonts w:ascii="Wingdings" w:hAnsi="Wingdings" w:hint="default"/>
+        <w:sz w:val="20"/>
+      </w:rPr>
+    </w:lvl>
+  </w:abstractNum>
+  <w:abstractNum w:abstractNumId="34" w15:restartNumberingAfterBreak="0">
     <w:nsid w:val="5A10694E"/>
     <w:multiLevelType w:val="multilevel"/>
     <w:tmpl w:val="47528338"/>
@@ -16988,7 +18991,7 @@
       </w:rPr>
     </w:lvl>
   </w:abstractNum>
-  <w:abstractNum w:abstractNumId="23" w15:restartNumberingAfterBreak="0">
+  <w:abstractNum w:abstractNumId="35" w15:restartNumberingAfterBreak="0">
     <w:nsid w:val="5C556379"/>
     <w:multiLevelType w:val="multilevel"/>
     <w:tmpl w:val="D8888F96"/>
@@ -17137,7 +19140,7 @@
       </w:rPr>
     </w:lvl>
   </w:abstractNum>
-  <w:abstractNum w:abstractNumId="24" w15:restartNumberingAfterBreak="0">
+  <w:abstractNum w:abstractNumId="36" w15:restartNumberingAfterBreak="0">
     <w:nsid w:val="5F0F0A43"/>
     <w:multiLevelType w:val="multilevel"/>
     <w:tmpl w:val="A95E0E08"/>
@@ -17286,7 +19289,7 @@
       </w:rPr>
     </w:lvl>
   </w:abstractNum>
-  <w:abstractNum w:abstractNumId="25" w15:restartNumberingAfterBreak="0">
+  <w:abstractNum w:abstractNumId="37" w15:restartNumberingAfterBreak="0">
     <w:nsid w:val="614263B2"/>
     <w:multiLevelType w:val="multilevel"/>
     <w:tmpl w:val="CC068D9E"/>
@@ -17435,7 +19438,7 @@
       </w:rPr>
     </w:lvl>
   </w:abstractNum>
-  <w:abstractNum w:abstractNumId="26" w15:restartNumberingAfterBreak="0">
+  <w:abstractNum w:abstractNumId="38" w15:restartNumberingAfterBreak="0">
     <w:nsid w:val="643B6929"/>
     <w:multiLevelType w:val="multilevel"/>
     <w:tmpl w:val="37EE301A"/>
@@ -17584,7 +19587,7 @@
       </w:rPr>
     </w:lvl>
   </w:abstractNum>
-  <w:abstractNum w:abstractNumId="27" w15:restartNumberingAfterBreak="0">
+  <w:abstractNum w:abstractNumId="39" w15:restartNumberingAfterBreak="0">
     <w:nsid w:val="68A96746"/>
     <w:multiLevelType w:val="multilevel"/>
     <w:tmpl w:val="7D9AF65C"/>
@@ -17733,7 +19736,7 @@
       </w:rPr>
     </w:lvl>
   </w:abstractNum>
-  <w:abstractNum w:abstractNumId="28" w15:restartNumberingAfterBreak="0">
+  <w:abstractNum w:abstractNumId="40" w15:restartNumberingAfterBreak="0">
     <w:nsid w:val="6A213DF5"/>
     <w:multiLevelType w:val="multilevel"/>
     <w:tmpl w:val="39CA4FFC"/>
@@ -17882,7 +19885,7 @@
       </w:rPr>
     </w:lvl>
   </w:abstractNum>
-  <w:abstractNum w:abstractNumId="29" w15:restartNumberingAfterBreak="0">
+  <w:abstractNum w:abstractNumId="41" w15:restartNumberingAfterBreak="0">
     <w:nsid w:val="6C63615A"/>
     <w:multiLevelType w:val="multilevel"/>
     <w:tmpl w:val="071E5C84"/>
@@ -17999,7 +20002,156 @@
       </w:pPr>
     </w:lvl>
   </w:abstractNum>
-  <w:abstractNum w:abstractNumId="30" w15:restartNumberingAfterBreak="0">
+  <w:abstractNum w:abstractNumId="42" w15:restartNumberingAfterBreak="0">
+    <w:nsid w:val="6FFF650F"/>
+    <w:multiLevelType w:val="multilevel"/>
+    <w:tmpl w:val="8CBE0116"/>
+    <w:lvl w:ilvl="0">
+      <w:start w:val="1"/>
+      <w:numFmt w:val="bullet"/>
+      <w:lvlText w:val=""/>
+      <w:lvlJc w:val="left"/>
+      <w:pPr>
+        <w:tabs>
+          <w:tab w:val="num" w:pos="720"/>
+        </w:tabs>
+        <w:ind w:left="720" w:hanging="360"/>
+      </w:pPr>
+      <w:rPr>
+        <w:rFonts w:ascii="Symbol" w:hAnsi="Symbol" w:hint="default"/>
+        <w:sz w:val="20"/>
+      </w:rPr>
+    </w:lvl>
+    <w:lvl w:ilvl="1" w:tentative="1">
+      <w:start w:val="1"/>
+      <w:numFmt w:val="bullet"/>
+      <w:lvlText w:val="o"/>
+      <w:lvlJc w:val="left"/>
+      <w:pPr>
+        <w:tabs>
+          <w:tab w:val="num" w:pos="1440"/>
+        </w:tabs>
+        <w:ind w:left="1440" w:hanging="360"/>
+      </w:pPr>
+      <w:rPr>
+        <w:rFonts w:ascii="Courier New" w:hAnsi="Courier New" w:hint="default"/>
+        <w:sz w:val="20"/>
+      </w:rPr>
+    </w:lvl>
+    <w:lvl w:ilvl="2" w:tentative="1">
+      <w:start w:val="1"/>
+      <w:numFmt w:val="bullet"/>
+      <w:lvlText w:val=""/>
+      <w:lvlJc w:val="left"/>
+      <w:pPr>
+        <w:tabs>
+          <w:tab w:val="num" w:pos="2160"/>
+        </w:tabs>
+        <w:ind w:left="2160" w:hanging="360"/>
+      </w:pPr>
+      <w:rPr>
+        <w:rFonts w:ascii="Wingdings" w:hAnsi="Wingdings" w:hint="default"/>
+        <w:sz w:val="20"/>
+      </w:rPr>
+    </w:lvl>
+    <w:lvl w:ilvl="3" w:tentative="1">
+      <w:start w:val="1"/>
+      <w:numFmt w:val="bullet"/>
+      <w:lvlText w:val=""/>
+      <w:lvlJc w:val="left"/>
+      <w:pPr>
+        <w:tabs>
+          <w:tab w:val="num" w:pos="2880"/>
+        </w:tabs>
+        <w:ind w:left="2880" w:hanging="360"/>
+      </w:pPr>
+      <w:rPr>
+        <w:rFonts w:ascii="Wingdings" w:hAnsi="Wingdings" w:hint="default"/>
+        <w:sz w:val="20"/>
+      </w:rPr>
+    </w:lvl>
+    <w:lvl w:ilvl="4" w:tentative="1">
+      <w:start w:val="1"/>
+      <w:numFmt w:val="bullet"/>
+      <w:lvlText w:val=""/>
+      <w:lvlJc w:val="left"/>
+      <w:pPr>
+        <w:tabs>
+          <w:tab w:val="num" w:pos="3600"/>
+        </w:tabs>
+        <w:ind w:left="3600" w:hanging="360"/>
+      </w:pPr>
+      <w:rPr>
+        <w:rFonts w:ascii="Wingdings" w:hAnsi="Wingdings" w:hint="default"/>
+        <w:sz w:val="20"/>
+      </w:rPr>
+    </w:lvl>
+    <w:lvl w:ilvl="5" w:tentative="1">
+      <w:start w:val="1"/>
+      <w:numFmt w:val="bullet"/>
+      <w:lvlText w:val=""/>
+      <w:lvlJc w:val="left"/>
+      <w:pPr>
+        <w:tabs>
+          <w:tab w:val="num" w:pos="4320"/>
+        </w:tabs>
+        <w:ind w:left="4320" w:hanging="360"/>
+      </w:pPr>
+      <w:rPr>
+        <w:rFonts w:ascii="Wingdings" w:hAnsi="Wingdings" w:hint="default"/>
+        <w:sz w:val="20"/>
+      </w:rPr>
+    </w:lvl>
+    <w:lvl w:ilvl="6" w:tentative="1">
+      <w:start w:val="1"/>
+      <w:numFmt w:val="bullet"/>
+      <w:lvlText w:val=""/>
+      <w:lvlJc w:val="left"/>
+      <w:pPr>
+        <w:tabs>
+          <w:tab w:val="num" w:pos="5040"/>
+        </w:tabs>
+        <w:ind w:left="5040" w:hanging="360"/>
+      </w:pPr>
+      <w:rPr>
+        <w:rFonts w:ascii="Wingdings" w:hAnsi="Wingdings" w:hint="default"/>
+        <w:sz w:val="20"/>
+      </w:rPr>
+    </w:lvl>
+    <w:lvl w:ilvl="7" w:tentative="1">
+      <w:start w:val="1"/>
+      <w:numFmt w:val="bullet"/>
+      <w:lvlText w:val=""/>
+      <w:lvlJc w:val="left"/>
+      <w:pPr>
+        <w:tabs>
+          <w:tab w:val="num" w:pos="5760"/>
+        </w:tabs>
+        <w:ind w:left="5760" w:hanging="360"/>
+      </w:pPr>
+      <w:rPr>
+        <w:rFonts w:ascii="Wingdings" w:hAnsi="Wingdings" w:hint="default"/>
+        <w:sz w:val="20"/>
+      </w:rPr>
+    </w:lvl>
+    <w:lvl w:ilvl="8" w:tentative="1">
+      <w:start w:val="1"/>
+      <w:numFmt w:val="bullet"/>
+      <w:lvlText w:val=""/>
+      <w:lvlJc w:val="left"/>
+      <w:pPr>
+        <w:tabs>
+          <w:tab w:val="num" w:pos="6480"/>
+        </w:tabs>
+        <w:ind w:left="6480" w:hanging="360"/>
+      </w:pPr>
+      <w:rPr>
+        <w:rFonts w:ascii="Wingdings" w:hAnsi="Wingdings" w:hint="default"/>
+        <w:sz w:val="20"/>
+      </w:rPr>
+    </w:lvl>
+  </w:abstractNum>
+  <w:abstractNum w:abstractNumId="43" w15:restartNumberingAfterBreak="0">
     <w:nsid w:val="70E26B79"/>
     <w:multiLevelType w:val="multilevel"/>
     <w:tmpl w:val="829646CE"/>
@@ -18148,7 +20300,7 @@
       </w:rPr>
     </w:lvl>
   </w:abstractNum>
-  <w:abstractNum w:abstractNumId="31" w15:restartNumberingAfterBreak="0">
+  <w:abstractNum w:abstractNumId="44" w15:restartNumberingAfterBreak="0">
     <w:nsid w:val="79F62E41"/>
     <w:multiLevelType w:val="multilevel"/>
     <w:tmpl w:val="7402E77E"/>
@@ -18297,7 +20449,7 @@
       </w:rPr>
     </w:lvl>
   </w:abstractNum>
-  <w:abstractNum w:abstractNumId="32" w15:restartNumberingAfterBreak="0">
+  <w:abstractNum w:abstractNumId="45" w15:restartNumberingAfterBreak="0">
     <w:nsid w:val="7CA5220C"/>
     <w:multiLevelType w:val="multilevel"/>
     <w:tmpl w:val="C84EE0D4"/>
@@ -18446,7 +20598,7 @@
       </w:rPr>
     </w:lvl>
   </w:abstractNum>
-  <w:abstractNum w:abstractNumId="33" w15:restartNumberingAfterBreak="0">
+  <w:abstractNum w:abstractNumId="46" w15:restartNumberingAfterBreak="0">
     <w:nsid w:val="7F41473D"/>
     <w:multiLevelType w:val="multilevel"/>
     <w:tmpl w:val="6AE42CB8"/>
@@ -18595,107 +20747,301 @@
       </w:rPr>
     </w:lvl>
   </w:abstractNum>
+  <w:abstractNum w:abstractNumId="47" w15:restartNumberingAfterBreak="0">
+    <w:nsid w:val="7FF812B2"/>
+    <w:multiLevelType w:val="multilevel"/>
+    <w:tmpl w:val="CE2874E0"/>
+    <w:lvl w:ilvl="0">
+      <w:start w:val="1"/>
+      <w:numFmt w:val="bullet"/>
+      <w:lvlText w:val=""/>
+      <w:lvlJc w:val="left"/>
+      <w:pPr>
+        <w:tabs>
+          <w:tab w:val="num" w:pos="720"/>
+        </w:tabs>
+        <w:ind w:left="720" w:hanging="360"/>
+      </w:pPr>
+      <w:rPr>
+        <w:rFonts w:ascii="Symbol" w:hAnsi="Symbol" w:hint="default"/>
+        <w:sz w:val="20"/>
+      </w:rPr>
+    </w:lvl>
+    <w:lvl w:ilvl="1" w:tentative="1">
+      <w:start w:val="1"/>
+      <w:numFmt w:val="bullet"/>
+      <w:lvlText w:val="o"/>
+      <w:lvlJc w:val="left"/>
+      <w:pPr>
+        <w:tabs>
+          <w:tab w:val="num" w:pos="1440"/>
+        </w:tabs>
+        <w:ind w:left="1440" w:hanging="360"/>
+      </w:pPr>
+      <w:rPr>
+        <w:rFonts w:ascii="Courier New" w:hAnsi="Courier New" w:hint="default"/>
+        <w:sz w:val="20"/>
+      </w:rPr>
+    </w:lvl>
+    <w:lvl w:ilvl="2" w:tentative="1">
+      <w:start w:val="1"/>
+      <w:numFmt w:val="bullet"/>
+      <w:lvlText w:val=""/>
+      <w:lvlJc w:val="left"/>
+      <w:pPr>
+        <w:tabs>
+          <w:tab w:val="num" w:pos="2160"/>
+        </w:tabs>
+        <w:ind w:left="2160" w:hanging="360"/>
+      </w:pPr>
+      <w:rPr>
+        <w:rFonts w:ascii="Wingdings" w:hAnsi="Wingdings" w:hint="default"/>
+        <w:sz w:val="20"/>
+      </w:rPr>
+    </w:lvl>
+    <w:lvl w:ilvl="3" w:tentative="1">
+      <w:start w:val="1"/>
+      <w:numFmt w:val="bullet"/>
+      <w:lvlText w:val=""/>
+      <w:lvlJc w:val="left"/>
+      <w:pPr>
+        <w:tabs>
+          <w:tab w:val="num" w:pos="2880"/>
+        </w:tabs>
+        <w:ind w:left="2880" w:hanging="360"/>
+      </w:pPr>
+      <w:rPr>
+        <w:rFonts w:ascii="Wingdings" w:hAnsi="Wingdings" w:hint="default"/>
+        <w:sz w:val="20"/>
+      </w:rPr>
+    </w:lvl>
+    <w:lvl w:ilvl="4" w:tentative="1">
+      <w:start w:val="1"/>
+      <w:numFmt w:val="bullet"/>
+      <w:lvlText w:val=""/>
+      <w:lvlJc w:val="left"/>
+      <w:pPr>
+        <w:tabs>
+          <w:tab w:val="num" w:pos="3600"/>
+        </w:tabs>
+        <w:ind w:left="3600" w:hanging="360"/>
+      </w:pPr>
+      <w:rPr>
+        <w:rFonts w:ascii="Wingdings" w:hAnsi="Wingdings" w:hint="default"/>
+        <w:sz w:val="20"/>
+      </w:rPr>
+    </w:lvl>
+    <w:lvl w:ilvl="5" w:tentative="1">
+      <w:start w:val="1"/>
+      <w:numFmt w:val="bullet"/>
+      <w:lvlText w:val=""/>
+      <w:lvlJc w:val="left"/>
+      <w:pPr>
+        <w:tabs>
+          <w:tab w:val="num" w:pos="4320"/>
+        </w:tabs>
+        <w:ind w:left="4320" w:hanging="360"/>
+      </w:pPr>
+      <w:rPr>
+        <w:rFonts w:ascii="Wingdings" w:hAnsi="Wingdings" w:hint="default"/>
+        <w:sz w:val="20"/>
+      </w:rPr>
+    </w:lvl>
+    <w:lvl w:ilvl="6" w:tentative="1">
+      <w:start w:val="1"/>
+      <w:numFmt w:val="bullet"/>
+      <w:lvlText w:val=""/>
+      <w:lvlJc w:val="left"/>
+      <w:pPr>
+        <w:tabs>
+          <w:tab w:val="num" w:pos="5040"/>
+        </w:tabs>
+        <w:ind w:left="5040" w:hanging="360"/>
+      </w:pPr>
+      <w:rPr>
+        <w:rFonts w:ascii="Wingdings" w:hAnsi="Wingdings" w:hint="default"/>
+        <w:sz w:val="20"/>
+      </w:rPr>
+    </w:lvl>
+    <w:lvl w:ilvl="7" w:tentative="1">
+      <w:start w:val="1"/>
+      <w:numFmt w:val="bullet"/>
+      <w:lvlText w:val=""/>
+      <w:lvlJc w:val="left"/>
+      <w:pPr>
+        <w:tabs>
+          <w:tab w:val="num" w:pos="5760"/>
+        </w:tabs>
+        <w:ind w:left="5760" w:hanging="360"/>
+      </w:pPr>
+      <w:rPr>
+        <w:rFonts w:ascii="Wingdings" w:hAnsi="Wingdings" w:hint="default"/>
+        <w:sz w:val="20"/>
+      </w:rPr>
+    </w:lvl>
+    <w:lvl w:ilvl="8" w:tentative="1">
+      <w:start w:val="1"/>
+      <w:numFmt w:val="bullet"/>
+      <w:lvlText w:val=""/>
+      <w:lvlJc w:val="left"/>
+      <w:pPr>
+        <w:tabs>
+          <w:tab w:val="num" w:pos="6480"/>
+        </w:tabs>
+        <w:ind w:left="6480" w:hanging="360"/>
+      </w:pPr>
+      <w:rPr>
+        <w:rFonts w:ascii="Wingdings" w:hAnsi="Wingdings" w:hint="default"/>
+        <w:sz w:val="20"/>
+      </w:rPr>
+    </w:lvl>
+  </w:abstractNum>
   <w:num w:numId="1" w16cid:durableId="950236401">
+    <w:abstractNumId w:val="20"/>
+  </w:num>
+  <w:num w:numId="2" w16cid:durableId="1933052972">
+    <w:abstractNumId w:val="10"/>
+  </w:num>
+  <w:num w:numId="3" w16cid:durableId="1864316679">
+    <w:abstractNumId w:val="16"/>
+  </w:num>
+  <w:num w:numId="4" w16cid:durableId="1012797702">
+    <w:abstractNumId w:val="26"/>
+  </w:num>
+  <w:num w:numId="5" w16cid:durableId="1809200636">
+    <w:abstractNumId w:val="23"/>
+  </w:num>
+  <w:num w:numId="6" w16cid:durableId="2138404647">
+    <w:abstractNumId w:val="18"/>
+  </w:num>
+  <w:num w:numId="7" w16cid:durableId="523902865">
+    <w:abstractNumId w:val="1"/>
+  </w:num>
+  <w:num w:numId="8" w16cid:durableId="603003491">
+    <w:abstractNumId w:val="15"/>
+  </w:num>
+  <w:num w:numId="9" w16cid:durableId="1464615536">
+    <w:abstractNumId w:val="41"/>
+  </w:num>
+  <w:num w:numId="10" w16cid:durableId="264188578">
+    <w:abstractNumId w:val="28"/>
+  </w:num>
+  <w:num w:numId="11" w16cid:durableId="1434518831">
+    <w:abstractNumId w:val="21"/>
+  </w:num>
+  <w:num w:numId="12" w16cid:durableId="759570784">
+    <w:abstractNumId w:val="4"/>
+  </w:num>
+  <w:num w:numId="13" w16cid:durableId="1525359339">
+    <w:abstractNumId w:val="43"/>
+  </w:num>
+  <w:num w:numId="14" w16cid:durableId="1521695699">
+    <w:abstractNumId w:val="25"/>
+  </w:num>
+  <w:num w:numId="15" w16cid:durableId="1603536752">
+    <w:abstractNumId w:val="17"/>
+  </w:num>
+  <w:num w:numId="16" w16cid:durableId="1755199678">
     <w:abstractNumId w:val="13"/>
   </w:num>
-  <w:num w:numId="2" w16cid:durableId="1933052972">
+  <w:num w:numId="17" w16cid:durableId="2061854961">
+    <w:abstractNumId w:val="46"/>
+  </w:num>
+  <w:num w:numId="18" w16cid:durableId="281888876">
+    <w:abstractNumId w:val="22"/>
+  </w:num>
+  <w:num w:numId="19" w16cid:durableId="1480265532">
+    <w:abstractNumId w:val="11"/>
+  </w:num>
+  <w:num w:numId="20" w16cid:durableId="1746146023">
+    <w:abstractNumId w:val="19"/>
+  </w:num>
+  <w:num w:numId="21" w16cid:durableId="1804304291">
+    <w:abstractNumId w:val="30"/>
+  </w:num>
+  <w:num w:numId="22" w16cid:durableId="1740443327">
+    <w:abstractNumId w:val="35"/>
+  </w:num>
+  <w:num w:numId="23" w16cid:durableId="1696348909">
+    <w:abstractNumId w:val="38"/>
+  </w:num>
+  <w:num w:numId="24" w16cid:durableId="1514104921">
+    <w:abstractNumId w:val="39"/>
+  </w:num>
+  <w:num w:numId="25" w16cid:durableId="694886512">
+    <w:abstractNumId w:val="29"/>
+  </w:num>
+  <w:num w:numId="26" w16cid:durableId="2032299765">
     <w:abstractNumId w:val="5"/>
   </w:num>
-  <w:num w:numId="3" w16cid:durableId="1864316679">
+  <w:num w:numId="27" w16cid:durableId="661280563">
+    <w:abstractNumId w:val="44"/>
+  </w:num>
+  <w:num w:numId="28" w16cid:durableId="1412390900">
+    <w:abstractNumId w:val="45"/>
+  </w:num>
+  <w:num w:numId="29" w16cid:durableId="1758287790">
+    <w:abstractNumId w:val="40"/>
+  </w:num>
+  <w:num w:numId="30" w16cid:durableId="1814519110">
+    <w:abstractNumId w:val="2"/>
+  </w:num>
+  <w:num w:numId="31" w16cid:durableId="1088186543">
+    <w:abstractNumId w:val="6"/>
+  </w:num>
+  <w:num w:numId="32" w16cid:durableId="1363746713">
+    <w:abstractNumId w:val="36"/>
+  </w:num>
+  <w:num w:numId="33" w16cid:durableId="853114637">
+    <w:abstractNumId w:val="34"/>
+  </w:num>
+  <w:num w:numId="34" w16cid:durableId="596408166">
+    <w:abstractNumId w:val="37"/>
+  </w:num>
+  <w:num w:numId="35" w16cid:durableId="268467951">
     <w:abstractNumId w:val="9"/>
+    <w:lvlOverride w:ilvl="0">
+      <w:startOverride w:val="2"/>
+    </w:lvlOverride>
   </w:num>
-  <w:num w:numId="4" w16cid:durableId="1012797702">
-    <w:abstractNumId w:val="18"/>
+  <w:num w:numId="36" w16cid:durableId="924220588">
+    <w:abstractNumId w:val="8"/>
   </w:num>
-  <w:num w:numId="5" w16cid:durableId="1809200636">
-    <w:abstractNumId w:val="16"/>
+  <w:num w:numId="37" w16cid:durableId="1755281141">
+    <w:abstractNumId w:val="12"/>
   </w:num>
-  <w:num w:numId="6" w16cid:durableId="2138404647">
-    <w:abstractNumId w:val="11"/>
+  <w:num w:numId="38" w16cid:durableId="150677011">
+    <w:abstractNumId w:val="33"/>
   </w:num>
-  <w:num w:numId="7" w16cid:durableId="523902865">
+  <w:num w:numId="39" w16cid:durableId="2021857526">
+    <w:abstractNumId w:val="42"/>
+  </w:num>
+  <w:num w:numId="40" w16cid:durableId="1101343040">
+    <w:abstractNumId w:val="31"/>
+  </w:num>
+  <w:num w:numId="41" w16cid:durableId="417099129">
+    <w:abstractNumId w:val="14"/>
+  </w:num>
+  <w:num w:numId="42" w16cid:durableId="635140828">
+    <w:abstractNumId w:val="47"/>
+  </w:num>
+  <w:num w:numId="43" w16cid:durableId="949632052">
+    <w:abstractNumId w:val="32"/>
+  </w:num>
+  <w:num w:numId="44" w16cid:durableId="1507358169">
+    <w:abstractNumId w:val="24"/>
+  </w:num>
+  <w:num w:numId="45" w16cid:durableId="2079983729">
+    <w:abstractNumId w:val="27"/>
+  </w:num>
+  <w:num w:numId="46" w16cid:durableId="645862398">
     <w:abstractNumId w:val="0"/>
   </w:num>
-  <w:num w:numId="8" w16cid:durableId="603003491">
-    <w:abstractNumId w:val="8"/>
-  </w:num>
-  <w:num w:numId="9" w16cid:durableId="1464615536">
-    <w:abstractNumId w:val="29"/>
-  </w:num>
-  <w:num w:numId="10" w16cid:durableId="264188578">
-    <w:abstractNumId w:val="19"/>
-  </w:num>
-  <w:num w:numId="11" w16cid:durableId="1434518831">
-    <w:abstractNumId w:val="14"/>
-  </w:num>
-  <w:num w:numId="12" w16cid:durableId="759570784">
-    <w:abstractNumId w:val="2"/>
-  </w:num>
-  <w:num w:numId="13" w16cid:durableId="1525359339">
-    <w:abstractNumId w:val="30"/>
-  </w:num>
-  <w:num w:numId="14" w16cid:durableId="1521695699">
-    <w:abstractNumId w:val="17"/>
-  </w:num>
-  <w:num w:numId="15" w16cid:durableId="1603536752">
-    <w:abstractNumId w:val="10"/>
-  </w:num>
-  <w:num w:numId="16" w16cid:durableId="1755199678">
+  <w:num w:numId="47" w16cid:durableId="1841848309">
     <w:abstractNumId w:val="7"/>
   </w:num>
-  <w:num w:numId="17" w16cid:durableId="2061854961">
-    <w:abstractNumId w:val="33"/>
-  </w:num>
-  <w:num w:numId="18" w16cid:durableId="281888876">
-    <w:abstractNumId w:val="15"/>
-  </w:num>
-  <w:num w:numId="19" w16cid:durableId="1480265532">
-    <w:abstractNumId w:val="6"/>
-  </w:num>
-  <w:num w:numId="20" w16cid:durableId="1746146023">
-    <w:abstractNumId w:val="12"/>
-  </w:num>
-  <w:num w:numId="21" w16cid:durableId="1804304291">
-    <w:abstractNumId w:val="21"/>
-  </w:num>
-  <w:num w:numId="22" w16cid:durableId="1740443327">
-    <w:abstractNumId w:val="23"/>
-  </w:num>
-  <w:num w:numId="23" w16cid:durableId="1696348909">
-    <w:abstractNumId w:val="26"/>
-  </w:num>
-  <w:num w:numId="24" w16cid:durableId="1514104921">
-    <w:abstractNumId w:val="27"/>
-  </w:num>
-  <w:num w:numId="25" w16cid:durableId="694886512">
-    <w:abstractNumId w:val="20"/>
-  </w:num>
-  <w:num w:numId="26" w16cid:durableId="2032299765">
+  <w:num w:numId="48" w16cid:durableId="1497071204">
     <w:abstractNumId w:val="3"/>
-  </w:num>
-  <w:num w:numId="27" w16cid:durableId="661280563">
-    <w:abstractNumId w:val="31"/>
-  </w:num>
-  <w:num w:numId="28" w16cid:durableId="1412390900">
-    <w:abstractNumId w:val="32"/>
-  </w:num>
-  <w:num w:numId="29" w16cid:durableId="1758287790">
-    <w:abstractNumId w:val="28"/>
-  </w:num>
-  <w:num w:numId="30" w16cid:durableId="1814519110">
-    <w:abstractNumId w:val="1"/>
-  </w:num>
-  <w:num w:numId="31" w16cid:durableId="1088186543">
-    <w:abstractNumId w:val="4"/>
-  </w:num>
-  <w:num w:numId="32" w16cid:durableId="1363746713">
-    <w:abstractNumId w:val="24"/>
-  </w:num>
-  <w:num w:numId="33" w16cid:durableId="853114637">
-    <w:abstractNumId w:val="22"/>
-  </w:num>
-  <w:num w:numId="34" w16cid:durableId="596408166">
-    <w:abstractNumId w:val="25"/>
   </w:num>
 </w:numbering>
 </file>

</xml_diff>

<commit_message>
thêm api search-history (chưa xong), Search motel
</commit_message>
<xml_diff>
--- a/Hỗ trợ tìm kiếm nhà trọ.docx
+++ b/Hỗ trợ tìm kiếm nhà trọ.docx
@@ -3417,7 +3417,7 @@
                     <pic:cNvPicPr/>
                   </pic:nvPicPr>
                   <pic:blipFill>
-                    <a:blip r:embed="rId5"/>
+                    <a:blip r:embed="rId6"/>
                     <a:stretch>
                       <a:fillRect/>
                     </a:stretch>
@@ -4466,7 +4466,7 @@
             <w:r>
               <w:t xml:space="preserve">Còn hiện thị </w:t>
             </w:r>
-            <w:hyperlink r:id="rId6" w:history="1">
+            <w:hyperlink r:id="rId7" w:history="1">
               <w:r>
                 <w:rPr>
                   <w:rStyle w:val="Hyperlink"/>
@@ -7769,7 +7769,7 @@
           <w:color w:val="00B050"/>
         </w:rPr>
       </w:pPr>
-      <w:hyperlink r:id="rId7" w:history="1">
+      <w:hyperlink r:id="rId8" w:history="1">
         <w:r>
           <w:rPr>
             <w:rStyle w:val="Hyperlink"/>
@@ -13521,8 +13521,13 @@
         <w:tc>
           <w:tcPr>
             <w:tcW w:w="1276" w:type="dxa"/>
-          </w:tcPr>
-          <w:p/>
+            <w:vMerge w:val="restart"/>
+          </w:tcPr>
+          <w:p>
+            <w:r>
+              <w:t>VNPAY</w:t>
+            </w:r>
+          </w:p>
         </w:tc>
         <w:tc>
           <w:tcPr>
@@ -13534,6 +13539,12 @@
                 <w:color w:val="FF0000"/>
               </w:rPr>
             </w:pPr>
+            <w:r>
+              <w:rPr>
+                <w:color w:val="ED0000"/>
+              </w:rPr>
+              <w:t>https://4a9f-2001-ee0-54f6-8f10-11a6-ab5d-bef3-c139.ngrok-free.app/vnpay/create/</w:t>
+            </w:r>
           </w:p>
         </w:tc>
         <w:tc>
@@ -13547,6 +13558,13 @@
                 <w:bCs/>
               </w:rPr>
             </w:pPr>
+            <w:r>
+              <w:rPr>
+                <w:b/>
+                <w:bCs/>
+              </w:rPr>
+              <w:t>POST</w:t>
+            </w:r>
           </w:p>
         </w:tc>
         <w:tc>
@@ -13561,12 +13579,68 @@
                 <w:color w:val="196B24" w:themeColor="accent3"/>
               </w:rPr>
             </w:pPr>
+            <w:r>
+              <w:rPr>
+                <w:b/>
+                <w:bCs/>
+                <w:color w:val="196B24" w:themeColor="accent3"/>
+              </w:rPr>
+              <w:t>OK</w:t>
+            </w:r>
           </w:p>
         </w:tc>
         <w:tc>
           <w:tcPr>
             <w:tcW w:w="1985" w:type="dxa"/>
           </w:tcPr>
+          <w:p>
+            <w:pPr>
+              <w:rPr>
+                <w:sz w:val="16"/>
+                <w:szCs w:val="16"/>
+                <w:lang w:val="vi-VN"/>
+              </w:rPr>
+            </w:pPr>
+            <w:r>
+              <w:rPr>
+                <w:sz w:val="16"/>
+                <w:szCs w:val="16"/>
+              </w:rPr>
+              <w:t xml:space="preserve">User gửi thông tin trả tiền: </w:t>
+            </w:r>
+            <w:r>
+              <w:rPr>
+                <w:sz w:val="16"/>
+                <w:szCs w:val="16"/>
+              </w:rPr>
+              <w:br/>
+            </w:r>
+            <w:r>
+              <w:rPr>
+                <w:sz w:val="16"/>
+                <w:szCs w:val="16"/>
+                <w:lang w:val="vi-VN"/>
+              </w:rPr>
+              <w:t>{    "order_id": "54334",</w:t>
+            </w:r>
+          </w:p>
+          <w:p>
+            <w:pPr>
+              <w:rPr>
+                <w:sz w:val="16"/>
+                <w:szCs w:val="16"/>
+                <w:lang w:val="vi-VN"/>
+              </w:rPr>
+            </w:pPr>
+            <w:r>
+              <w:rPr>
+                <w:sz w:val="16"/>
+                <w:szCs w:val="16"/>
+                <w:lang w:val="vi-VN"/>
+              </w:rPr>
+              <w:t>     "amount": 100000   }</w:t>
+            </w:r>
+          </w:p>
           <w:p/>
         </w:tc>
         <w:tc>
@@ -13588,6 +13662,7 @@
         <w:tc>
           <w:tcPr>
             <w:tcW w:w="1276" w:type="dxa"/>
+            <w:vMerge/>
           </w:tcPr>
           <w:p/>
         </w:tc>
@@ -13601,6 +13676,12 @@
                 <w:color w:val="FF0000"/>
               </w:rPr>
             </w:pPr>
+            <w:r>
+              <w:rPr>
+                <w:color w:val="FF0000"/>
+              </w:rPr>
+              <w:t>https://4a9f-2001-ee0-54f6-8f10-11a6-ab5d-bef3-c139.ngrok-free.app/vnpay/return/</w:t>
+            </w:r>
           </w:p>
         </w:tc>
         <w:tc>
@@ -13614,6 +13695,13 @@
                 <w:bCs/>
               </w:rPr>
             </w:pPr>
+            <w:r>
+              <w:rPr>
+                <w:b/>
+                <w:bCs/>
+              </w:rPr>
+              <w:t>GET</w:t>
+            </w:r>
           </w:p>
         </w:tc>
         <w:tc>
@@ -13628,13 +13716,35 @@
                 <w:color w:val="196B24" w:themeColor="accent3"/>
               </w:rPr>
             </w:pPr>
+            <w:r>
+              <w:rPr>
+                <w:b/>
+                <w:bCs/>
+                <w:color w:val="196B24" w:themeColor="accent3"/>
+              </w:rPr>
+              <w:t>OK</w:t>
+            </w:r>
           </w:p>
         </w:tc>
         <w:tc>
           <w:tcPr>
             <w:tcW w:w="1985" w:type="dxa"/>
           </w:tcPr>
-          <w:p/>
+          <w:p>
+            <w:pPr>
+              <w:rPr>
+                <w:sz w:val="16"/>
+                <w:szCs w:val="16"/>
+              </w:rPr>
+            </w:pPr>
+            <w:r>
+              <w:rPr>
+                <w:sz w:val="16"/>
+                <w:szCs w:val="16"/>
+              </w:rPr>
+              <w:t>Khi nhập thẻ, và nhấn thanh toán thành công, bên vnpay sẽ gửi thông tin báo thành công</w:t>
+            </w:r>
+          </w:p>
         </w:tc>
         <w:tc>
           <w:tcPr>
@@ -13655,12 +13765,14 @@
         <w:tc>
           <w:tcPr>
             <w:tcW w:w="1276" w:type="dxa"/>
+            <w:shd w:val="clear" w:color="auto" w:fill="D9D9D9" w:themeFill="background1" w:themeFillShade="D9"/>
           </w:tcPr>
           <w:p/>
         </w:tc>
         <w:tc>
           <w:tcPr>
             <w:tcW w:w="4395" w:type="dxa"/>
+            <w:shd w:val="clear" w:color="auto" w:fill="D9D9D9" w:themeFill="background1" w:themeFillShade="D9"/>
           </w:tcPr>
           <w:p>
             <w:pPr>
@@ -13673,6 +13785,7 @@
         <w:tc>
           <w:tcPr>
             <w:tcW w:w="1417" w:type="dxa"/>
+            <w:shd w:val="clear" w:color="auto" w:fill="D9D9D9" w:themeFill="background1" w:themeFillShade="D9"/>
           </w:tcPr>
           <w:p>
             <w:pPr>
@@ -13686,6 +13799,7 @@
         <w:tc>
           <w:tcPr>
             <w:tcW w:w="1134" w:type="dxa"/>
+            <w:shd w:val="clear" w:color="auto" w:fill="D9D9D9" w:themeFill="background1" w:themeFillShade="D9"/>
           </w:tcPr>
           <w:p>
             <w:pPr>
@@ -13700,12 +13814,14 @@
         <w:tc>
           <w:tcPr>
             <w:tcW w:w="1985" w:type="dxa"/>
+            <w:shd w:val="clear" w:color="auto" w:fill="D9D9D9" w:themeFill="background1" w:themeFillShade="D9"/>
           </w:tcPr>
           <w:p/>
         </w:tc>
         <w:tc>
           <w:tcPr>
             <w:tcW w:w="1417" w:type="dxa"/>
+            <w:shd w:val="clear" w:color="auto" w:fill="D9D9D9" w:themeFill="background1" w:themeFillShade="D9"/>
           </w:tcPr>
           <w:p>
             <w:pPr>
@@ -13722,8 +13838,13 @@
         <w:tc>
           <w:tcPr>
             <w:tcW w:w="1276" w:type="dxa"/>
-          </w:tcPr>
-          <w:p/>
+            <w:vMerge w:val="restart"/>
+          </w:tcPr>
+          <w:p>
+            <w:r>
+              <w:t>Search motel</w:t>
+            </w:r>
+          </w:p>
         </w:tc>
         <w:tc>
           <w:tcPr>
@@ -13733,8 +13854,18 @@
             <w:pPr>
               <w:rPr>
                 <w:color w:val="FF0000"/>
-              </w:rPr>
-            </w:pPr>
+                <w:sz w:val="16"/>
+                <w:szCs w:val="16"/>
+              </w:rPr>
+            </w:pPr>
+            <w:r>
+              <w:rPr>
+                <w:color w:val="FF0000"/>
+                <w:sz w:val="16"/>
+                <w:szCs w:val="16"/>
+              </w:rPr>
+              <w:t>http://127.0.0.1:8000/searchs/?q=phòng&amp;district=Quận 1&amp;city=TP. Hồ Chí Minh&amp;min_price&gt;1000000&amp;max_price&lt;5000000&amp;max_people=2&amp;is_verified=false</w:t>
+            </w:r>
           </w:p>
         </w:tc>
         <w:tc>
@@ -13748,6 +13879,13 @@
                 <w:bCs/>
               </w:rPr>
             </w:pPr>
+            <w:r>
+              <w:rPr>
+                <w:b/>
+                <w:bCs/>
+              </w:rPr>
+              <w:t>GET</w:t>
+            </w:r>
           </w:p>
         </w:tc>
         <w:tc>
@@ -13762,13 +13900,25 @@
                 <w:color w:val="196B24" w:themeColor="accent3"/>
               </w:rPr>
             </w:pPr>
+            <w:r>
+              <w:rPr>
+                <w:b/>
+                <w:bCs/>
+                <w:color w:val="196B24" w:themeColor="accent3"/>
+              </w:rPr>
+              <w:t>OK</w:t>
+            </w:r>
           </w:p>
         </w:tc>
         <w:tc>
           <w:tcPr>
             <w:tcW w:w="1985" w:type="dxa"/>
           </w:tcPr>
-          <w:p/>
+          <w:p>
+            <w:r>
+              <w:t>Lọc danh sách các motel theo điều kiện</w:t>
+            </w:r>
+          </w:p>
         </w:tc>
         <w:tc>
           <w:tcPr>
@@ -13789,6 +13939,7 @@
         <w:tc>
           <w:tcPr>
             <w:tcW w:w="1276" w:type="dxa"/>
+            <w:vMerge/>
           </w:tcPr>
           <w:p/>
         </w:tc>
@@ -13802,6 +13953,12 @@
                 <w:color w:val="FF0000"/>
               </w:rPr>
             </w:pPr>
+            <w:r>
+              <w:rPr>
+                <w:color w:val="FF0000"/>
+              </w:rPr>
+              <w:t>http://127.0.0.1:8000/searchs/nearby/?latitude=10.762622&amp;longitude=106.660172</w:t>
+            </w:r>
           </w:p>
         </w:tc>
         <w:tc>
@@ -13815,6 +13972,13 @@
                 <w:bCs/>
               </w:rPr>
             </w:pPr>
+            <w:r>
+              <w:rPr>
+                <w:b/>
+                <w:bCs/>
+              </w:rPr>
+              <w:t>GET</w:t>
+            </w:r>
           </w:p>
         </w:tc>
         <w:tc>
@@ -13829,6 +13993,14 @@
                 <w:color w:val="196B24" w:themeColor="accent3"/>
               </w:rPr>
             </w:pPr>
+            <w:r>
+              <w:rPr>
+                <w:b/>
+                <w:bCs/>
+                <w:color w:val="196B24" w:themeColor="accent3"/>
+              </w:rPr>
+              <w:t>OK</w:t>
+            </w:r>
           </w:p>
         </w:tc>
         <w:tc>
@@ -13856,6 +14028,7 @@
         <w:tc>
           <w:tcPr>
             <w:tcW w:w="1276" w:type="dxa"/>
+            <w:vMerge/>
           </w:tcPr>
           <w:p/>
         </w:tc>
@@ -13923,12 +14096,14 @@
         <w:tc>
           <w:tcPr>
             <w:tcW w:w="1276" w:type="dxa"/>
+            <w:shd w:val="clear" w:color="auto" w:fill="D9D9D9" w:themeFill="background1" w:themeFillShade="D9"/>
           </w:tcPr>
           <w:p/>
         </w:tc>
         <w:tc>
           <w:tcPr>
             <w:tcW w:w="4395" w:type="dxa"/>
+            <w:shd w:val="clear" w:color="auto" w:fill="D9D9D9" w:themeFill="background1" w:themeFillShade="D9"/>
           </w:tcPr>
           <w:p>
             <w:pPr>
@@ -13941,6 +14116,7 @@
         <w:tc>
           <w:tcPr>
             <w:tcW w:w="1417" w:type="dxa"/>
+            <w:shd w:val="clear" w:color="auto" w:fill="D9D9D9" w:themeFill="background1" w:themeFillShade="D9"/>
           </w:tcPr>
           <w:p>
             <w:pPr>
@@ -13954,6 +14130,7 @@
         <w:tc>
           <w:tcPr>
             <w:tcW w:w="1134" w:type="dxa"/>
+            <w:shd w:val="clear" w:color="auto" w:fill="D9D9D9" w:themeFill="background1" w:themeFillShade="D9"/>
           </w:tcPr>
           <w:p>
             <w:pPr>
@@ -13968,8 +14145,106 @@
         <w:tc>
           <w:tcPr>
             <w:tcW w:w="1985" w:type="dxa"/>
+            <w:shd w:val="clear" w:color="auto" w:fill="D9D9D9" w:themeFill="background1" w:themeFillShade="D9"/>
           </w:tcPr>
           <w:p/>
+        </w:tc>
+        <w:tc>
+          <w:tcPr>
+            <w:tcW w:w="1417" w:type="dxa"/>
+            <w:shd w:val="clear" w:color="auto" w:fill="D9D9D9" w:themeFill="background1" w:themeFillShade="D9"/>
+          </w:tcPr>
+          <w:p>
+            <w:pPr>
+              <w:rPr>
+                <w:b/>
+                <w:bCs/>
+                <w:color w:val="196B24" w:themeColor="accent3"/>
+              </w:rPr>
+            </w:pPr>
+          </w:p>
+        </w:tc>
+      </w:tr>
+      <w:tr>
+        <w:tc>
+          <w:tcPr>
+            <w:tcW w:w="1276" w:type="dxa"/>
+          </w:tcPr>
+          <w:p>
+            <w:r>
+              <w:t>search-history</w:t>
+            </w:r>
+          </w:p>
+        </w:tc>
+        <w:tc>
+          <w:tcPr>
+            <w:tcW w:w="4395" w:type="dxa"/>
+          </w:tcPr>
+          <w:p>
+            <w:pPr>
+              <w:rPr>
+                <w:color w:val="FF0000"/>
+              </w:rPr>
+            </w:pPr>
+            <w:r>
+              <w:rPr>
+                <w:color w:val="FF0000"/>
+              </w:rPr>
+              <w:t>http://127.0.0.1:8000/search-history/</w:t>
+            </w:r>
+          </w:p>
+        </w:tc>
+        <w:tc>
+          <w:tcPr>
+            <w:tcW w:w="1417" w:type="dxa"/>
+          </w:tcPr>
+          <w:p>
+            <w:pPr>
+              <w:rPr>
+                <w:b/>
+                <w:bCs/>
+              </w:rPr>
+            </w:pPr>
+            <w:r>
+              <w:rPr>
+                <w:b/>
+                <w:bCs/>
+              </w:rPr>
+              <w:t>GET</w:t>
+            </w:r>
+          </w:p>
+        </w:tc>
+        <w:tc>
+          <w:tcPr>
+            <w:tcW w:w="1134" w:type="dxa"/>
+          </w:tcPr>
+          <w:p>
+            <w:pPr>
+              <w:rPr>
+                <w:b/>
+                <w:bCs/>
+                <w:color w:val="196B24" w:themeColor="accent3"/>
+              </w:rPr>
+            </w:pPr>
+            <w:r>
+              <w:rPr>
+                <w:b/>
+                <w:bCs/>
+                <w:color w:val="196B24" w:themeColor="accent3"/>
+              </w:rPr>
+              <w:t>OK</w:t>
+            </w:r>
+          </w:p>
+        </w:tc>
+        <w:tc>
+          <w:tcPr>
+            <w:tcW w:w="1985" w:type="dxa"/>
+          </w:tcPr>
+          <w:p>
+            <w:r>
+              <w:t>Lấy tất cả các lịch sử tìm kiếm của search-history</w:t>
+            </w:r>
+          </w:p>
         </w:tc>
         <w:tc>
           <w:tcPr>
@@ -22347,4 +22622,16 @@
     </a:ext>
   </a:extLst>
 </a:theme>
+</file>
+
+<file path=customXml/item1.xml><?xml version="1.0" encoding="utf-8"?>
+<b:Sources xmlns:b="http://schemas.openxmlformats.org/officeDocument/2006/bibliography" xmlns="http://schemas.openxmlformats.org/officeDocument/2006/bibliography" SelectedStyle="\APASixthEditionOfficeOnline.xsl" StyleName="APA" Version="6"/>
+</file>
+
+<file path=customXml/itemProps1.xml><?xml version="1.0" encoding="utf-8"?>
+<ds:datastoreItem xmlns:ds="http://schemas.openxmlformats.org/officeDocument/2006/customXml" ds:itemID="{E152A132-A2DC-4B0D-885D-FBCE57081C88}">
+  <ds:schemaRefs>
+    <ds:schemaRef ds:uri="http://schemas.openxmlformats.org/officeDocument/2006/bibliography"/>
+  </ds:schemaRefs>
+</ds:datastoreItem>
 </file>
</xml_diff>

<commit_message>
taoj api cho NotificationViewSet
</commit_message>
<xml_diff>
--- a/Hỗ trợ tìm kiếm nhà trọ.docx
+++ b/Hỗ trợ tìm kiếm nhà trọ.docx
@@ -14245,6 +14245,1254 @@
               <w:t>Lấy tất cả các lịch sử tìm kiếm của search-history</w:t>
             </w:r>
           </w:p>
+        </w:tc>
+        <w:tc>
+          <w:tcPr>
+            <w:tcW w:w="1417" w:type="dxa"/>
+          </w:tcPr>
+          <w:p>
+            <w:pPr>
+              <w:rPr>
+                <w:b/>
+                <w:bCs/>
+                <w:color w:val="196B24" w:themeColor="accent3"/>
+              </w:rPr>
+            </w:pPr>
+          </w:p>
+        </w:tc>
+      </w:tr>
+      <w:tr>
+        <w:tc>
+          <w:tcPr>
+            <w:tcW w:w="1276" w:type="dxa"/>
+          </w:tcPr>
+          <w:p>
+            <w:r>
+              <w:t>Còn nữa mà tạm chưa kiểm tra</w:t>
+            </w:r>
+          </w:p>
+        </w:tc>
+        <w:tc>
+          <w:tcPr>
+            <w:tcW w:w="4395" w:type="dxa"/>
+          </w:tcPr>
+          <w:p>
+            <w:r>
+              <w:t>http://127.0.0.1:8000/search-history/</w:t>
+            </w:r>
+          </w:p>
+        </w:tc>
+        <w:tc>
+          <w:tcPr>
+            <w:tcW w:w="1417" w:type="dxa"/>
+          </w:tcPr>
+          <w:p>
+            <w:pPr>
+              <w:rPr>
+                <w:b/>
+                <w:bCs/>
+              </w:rPr>
+            </w:pPr>
+            <w:r>
+              <w:rPr>
+                <w:b/>
+                <w:bCs/>
+              </w:rPr>
+              <w:t>POST</w:t>
+            </w:r>
+          </w:p>
+        </w:tc>
+        <w:tc>
+          <w:tcPr>
+            <w:tcW w:w="1134" w:type="dxa"/>
+          </w:tcPr>
+          <w:p>
+            <w:pPr>
+              <w:rPr>
+                <w:b/>
+                <w:bCs/>
+                <w:color w:val="196B24" w:themeColor="accent3"/>
+              </w:rPr>
+            </w:pPr>
+            <w:r>
+              <w:rPr>
+                <w:b/>
+                <w:bCs/>
+                <w:color w:val="196B24" w:themeColor="accent3"/>
+              </w:rPr>
+              <w:t>Pending</w:t>
+            </w:r>
+          </w:p>
+        </w:tc>
+        <w:tc>
+          <w:tcPr>
+            <w:tcW w:w="1985" w:type="dxa"/>
+          </w:tcPr>
+          <w:p>
+            <w:r>
+              <w:t>Tạo mới một bản ghi lịch sử tìm kiếm.</w:t>
+            </w:r>
+          </w:p>
+        </w:tc>
+        <w:tc>
+          <w:tcPr>
+            <w:tcW w:w="1417" w:type="dxa"/>
+          </w:tcPr>
+          <w:p>
+            <w:pPr>
+              <w:rPr>
+                <w:b/>
+                <w:bCs/>
+                <w:color w:val="196B24" w:themeColor="accent3"/>
+              </w:rPr>
+            </w:pPr>
+          </w:p>
+        </w:tc>
+      </w:tr>
+      <w:tr>
+        <w:tc>
+          <w:tcPr>
+            <w:tcW w:w="1276" w:type="dxa"/>
+          </w:tcPr>
+          <w:p/>
+        </w:tc>
+        <w:tc>
+          <w:tcPr>
+            <w:tcW w:w="4395" w:type="dxa"/>
+          </w:tcPr>
+          <w:p>
+            <w:r>
+              <w:t>http://127.0.0.1:8000/search-history/</w:t>
+            </w:r>
+            <w:r>
+              <w:t>id/</w:t>
+            </w:r>
+          </w:p>
+        </w:tc>
+        <w:tc>
+          <w:tcPr>
+            <w:tcW w:w="1417" w:type="dxa"/>
+          </w:tcPr>
+          <w:p>
+            <w:pPr>
+              <w:rPr>
+                <w:b/>
+                <w:bCs/>
+              </w:rPr>
+            </w:pPr>
+            <w:r>
+              <w:rPr>
+                <w:b/>
+                <w:bCs/>
+              </w:rPr>
+              <w:t>GET</w:t>
+            </w:r>
+          </w:p>
+        </w:tc>
+        <w:tc>
+          <w:tcPr>
+            <w:tcW w:w="1134" w:type="dxa"/>
+          </w:tcPr>
+          <w:p>
+            <w:pPr>
+              <w:rPr>
+                <w:b/>
+                <w:bCs/>
+                <w:color w:val="196B24" w:themeColor="accent3"/>
+              </w:rPr>
+            </w:pPr>
+            <w:r>
+              <w:rPr>
+                <w:b/>
+                <w:bCs/>
+                <w:color w:val="196B24" w:themeColor="accent3"/>
+              </w:rPr>
+              <w:t>Pending</w:t>
+            </w:r>
+          </w:p>
+        </w:tc>
+        <w:tc>
+          <w:tcPr>
+            <w:tcW w:w="1985" w:type="dxa"/>
+          </w:tcPr>
+          <w:p>
+            <w:r>
+              <w:t>Lấy chi tiết một bản ghi lịch sử tìm kiếm theo id</w:t>
+            </w:r>
+          </w:p>
+        </w:tc>
+        <w:tc>
+          <w:tcPr>
+            <w:tcW w:w="1417" w:type="dxa"/>
+          </w:tcPr>
+          <w:p>
+            <w:pPr>
+              <w:rPr>
+                <w:b/>
+                <w:bCs/>
+                <w:color w:val="196B24" w:themeColor="accent3"/>
+              </w:rPr>
+            </w:pPr>
+          </w:p>
+        </w:tc>
+      </w:tr>
+      <w:tr>
+        <w:tc>
+          <w:tcPr>
+            <w:tcW w:w="1276" w:type="dxa"/>
+          </w:tcPr>
+          <w:p/>
+        </w:tc>
+        <w:tc>
+          <w:tcPr>
+            <w:tcW w:w="4395" w:type="dxa"/>
+          </w:tcPr>
+          <w:p>
+            <w:r>
+              <w:t>http://127.0.0.1:8000/search-history/</w:t>
+            </w:r>
+            <w:r>
+              <w:t>id/</w:t>
+            </w:r>
+          </w:p>
+        </w:tc>
+        <w:tc>
+          <w:tcPr>
+            <w:tcW w:w="1417" w:type="dxa"/>
+          </w:tcPr>
+          <w:p>
+            <w:pPr>
+              <w:rPr>
+                <w:b/>
+                <w:bCs/>
+              </w:rPr>
+            </w:pPr>
+            <w:r>
+              <w:rPr>
+                <w:b/>
+                <w:bCs/>
+              </w:rPr>
+              <w:t>PATCH</w:t>
+            </w:r>
+          </w:p>
+        </w:tc>
+        <w:tc>
+          <w:tcPr>
+            <w:tcW w:w="1134" w:type="dxa"/>
+          </w:tcPr>
+          <w:p>
+            <w:pPr>
+              <w:rPr>
+                <w:b/>
+                <w:bCs/>
+                <w:color w:val="196B24" w:themeColor="accent3"/>
+              </w:rPr>
+            </w:pPr>
+            <w:r>
+              <w:rPr>
+                <w:b/>
+                <w:bCs/>
+                <w:color w:val="196B24" w:themeColor="accent3"/>
+              </w:rPr>
+              <w:t>Pending</w:t>
+            </w:r>
+          </w:p>
+        </w:tc>
+        <w:tc>
+          <w:tcPr>
+            <w:tcW w:w="1985" w:type="dxa"/>
+          </w:tcPr>
+          <w:p>
+            <w:r>
+              <w:t>Cập nhật một phần thông tin của bản ghi lịch sử tìm kiếm theo id.</w:t>
+            </w:r>
+          </w:p>
+        </w:tc>
+        <w:tc>
+          <w:tcPr>
+            <w:tcW w:w="1417" w:type="dxa"/>
+          </w:tcPr>
+          <w:p>
+            <w:pPr>
+              <w:rPr>
+                <w:b/>
+                <w:bCs/>
+                <w:color w:val="196B24" w:themeColor="accent3"/>
+              </w:rPr>
+            </w:pPr>
+          </w:p>
+        </w:tc>
+      </w:tr>
+      <w:tr>
+        <w:tc>
+          <w:tcPr>
+            <w:tcW w:w="1276" w:type="dxa"/>
+          </w:tcPr>
+          <w:p/>
+        </w:tc>
+        <w:tc>
+          <w:tcPr>
+            <w:tcW w:w="4395" w:type="dxa"/>
+          </w:tcPr>
+          <w:p>
+            <w:r>
+              <w:t>http://127.0.0.1:8000/search-history/</w:t>
+            </w:r>
+            <w:r>
+              <w:t>id/</w:t>
+            </w:r>
+          </w:p>
+        </w:tc>
+        <w:tc>
+          <w:tcPr>
+            <w:tcW w:w="1417" w:type="dxa"/>
+          </w:tcPr>
+          <w:p>
+            <w:pPr>
+              <w:rPr>
+                <w:b/>
+                <w:bCs/>
+              </w:rPr>
+            </w:pPr>
+            <w:r>
+              <w:rPr>
+                <w:b/>
+                <w:bCs/>
+              </w:rPr>
+              <w:t>DELETE</w:t>
+            </w:r>
+          </w:p>
+        </w:tc>
+        <w:tc>
+          <w:tcPr>
+            <w:tcW w:w="1134" w:type="dxa"/>
+          </w:tcPr>
+          <w:p>
+            <w:pPr>
+              <w:rPr>
+                <w:b/>
+                <w:bCs/>
+                <w:color w:val="196B24" w:themeColor="accent3"/>
+              </w:rPr>
+            </w:pPr>
+            <w:r>
+              <w:rPr>
+                <w:b/>
+                <w:bCs/>
+                <w:color w:val="196B24" w:themeColor="accent3"/>
+              </w:rPr>
+              <w:t>Pending</w:t>
+            </w:r>
+          </w:p>
+        </w:tc>
+        <w:tc>
+          <w:tcPr>
+            <w:tcW w:w="1985" w:type="dxa"/>
+          </w:tcPr>
+          <w:p>
+            <w:r>
+              <w:t>Xóa một bản ghi lịch sử tìm kiếm theo id</w:t>
+            </w:r>
+          </w:p>
+        </w:tc>
+        <w:tc>
+          <w:tcPr>
+            <w:tcW w:w="1417" w:type="dxa"/>
+          </w:tcPr>
+          <w:p>
+            <w:pPr>
+              <w:rPr>
+                <w:b/>
+                <w:bCs/>
+                <w:color w:val="196B24" w:themeColor="accent3"/>
+              </w:rPr>
+            </w:pPr>
+          </w:p>
+        </w:tc>
+      </w:tr>
+      <w:tr>
+        <w:tc>
+          <w:tcPr>
+            <w:tcW w:w="1276" w:type="dxa"/>
+            <w:shd w:val="clear" w:color="auto" w:fill="D9D9D9" w:themeFill="background1" w:themeFillShade="D9"/>
+          </w:tcPr>
+          <w:p/>
+        </w:tc>
+        <w:tc>
+          <w:tcPr>
+            <w:tcW w:w="4395" w:type="dxa"/>
+            <w:shd w:val="clear" w:color="auto" w:fill="D9D9D9" w:themeFill="background1" w:themeFillShade="D9"/>
+          </w:tcPr>
+          <w:p>
+            <w:pPr>
+              <w:rPr>
+                <w:color w:val="FF0000"/>
+              </w:rPr>
+            </w:pPr>
+          </w:p>
+        </w:tc>
+        <w:tc>
+          <w:tcPr>
+            <w:tcW w:w="1417" w:type="dxa"/>
+            <w:shd w:val="clear" w:color="auto" w:fill="D9D9D9" w:themeFill="background1" w:themeFillShade="D9"/>
+          </w:tcPr>
+          <w:p>
+            <w:pPr>
+              <w:rPr>
+                <w:b/>
+                <w:bCs/>
+              </w:rPr>
+            </w:pPr>
+          </w:p>
+        </w:tc>
+        <w:tc>
+          <w:tcPr>
+            <w:tcW w:w="1134" w:type="dxa"/>
+            <w:shd w:val="clear" w:color="auto" w:fill="D9D9D9" w:themeFill="background1" w:themeFillShade="D9"/>
+          </w:tcPr>
+          <w:p>
+            <w:pPr>
+              <w:rPr>
+                <w:b/>
+                <w:bCs/>
+                <w:color w:val="196B24" w:themeColor="accent3"/>
+              </w:rPr>
+            </w:pPr>
+          </w:p>
+        </w:tc>
+        <w:tc>
+          <w:tcPr>
+            <w:tcW w:w="1985" w:type="dxa"/>
+            <w:shd w:val="clear" w:color="auto" w:fill="D9D9D9" w:themeFill="background1" w:themeFillShade="D9"/>
+          </w:tcPr>
+          <w:p/>
+        </w:tc>
+        <w:tc>
+          <w:tcPr>
+            <w:tcW w:w="1417" w:type="dxa"/>
+            <w:shd w:val="clear" w:color="auto" w:fill="D9D9D9" w:themeFill="background1" w:themeFillShade="D9"/>
+          </w:tcPr>
+          <w:p>
+            <w:pPr>
+              <w:rPr>
+                <w:b/>
+                <w:bCs/>
+                <w:color w:val="196B24" w:themeColor="accent3"/>
+              </w:rPr>
+            </w:pPr>
+          </w:p>
+        </w:tc>
+      </w:tr>
+      <w:tr>
+        <w:tc>
+          <w:tcPr>
+            <w:tcW w:w="1276" w:type="dxa"/>
+          </w:tcPr>
+          <w:p/>
+        </w:tc>
+        <w:tc>
+          <w:tcPr>
+            <w:tcW w:w="4395" w:type="dxa"/>
+          </w:tcPr>
+          <w:tbl>
+            <w:tblPr>
+              <w:tblW w:w="0" w:type="auto"/>
+              <w:tblCellSpacing w:w="15" w:type="dxa"/>
+              <w:tblCellMar>
+                <w:top w:w="15" w:type="dxa"/>
+                <w:left w:w="15" w:type="dxa"/>
+                <w:bottom w:w="15" w:type="dxa"/>
+                <w:right w:w="15" w:type="dxa"/>
+              </w:tblCellMar>
+              <w:tblLook w:val="04A0" w:firstRow="1" w:lastRow="0" w:firstColumn="1" w:lastColumn="0" w:noHBand="0" w:noVBand="1"/>
+            </w:tblPr>
+            <w:tblGrid>
+              <w:gridCol w:w="2731"/>
+            </w:tblGrid>
+            <w:tr>
+              <w:trPr>
+                <w:tblCellSpacing w:w="15" w:type="dxa"/>
+              </w:trPr>
+              <w:tc>
+                <w:tcPr>
+                  <w:tcW w:w="2671" w:type="dxa"/>
+                  <w:vAlign w:val="center"/>
+                  <w:hideMark/>
+                </w:tcPr>
+                <w:p>
+                  <w:pPr>
+                    <w:spacing w:after="0" w:line="240" w:lineRule="auto"/>
+                    <w:rPr>
+                      <w:lang w:val="vi-VN"/>
+                    </w:rPr>
+                  </w:pPr>
+                  <w:r>
+                    <w:rPr>
+                      <w:lang w:val="vi-VN"/>
+                    </w:rPr>
+                    <w:t>/notifications/unread/</w:t>
+                  </w:r>
+                </w:p>
+              </w:tc>
+            </w:tr>
+          </w:tbl>
+          <w:p>
+            <w:pPr>
+              <w:rPr>
+                <w:vanish/>
+                <w:color w:val="FF0000"/>
+                <w:lang w:val="vi-VN"/>
+              </w:rPr>
+            </w:pPr>
+          </w:p>
+          <w:tbl>
+            <w:tblPr>
+              <w:tblW w:w="0" w:type="auto"/>
+              <w:tblCellSpacing w:w="15" w:type="dxa"/>
+              <w:tblCellMar>
+                <w:top w:w="15" w:type="dxa"/>
+                <w:left w:w="15" w:type="dxa"/>
+                <w:bottom w:w="15" w:type="dxa"/>
+                <w:right w:w="15" w:type="dxa"/>
+              </w:tblCellMar>
+              <w:tblLook w:val="04A0" w:firstRow="1" w:lastRow="0" w:firstColumn="1" w:lastColumn="0" w:noHBand="0" w:noVBand="1"/>
+            </w:tblPr>
+            <w:tblGrid>
+              <w:gridCol w:w="110"/>
+            </w:tblGrid>
+            <w:tr>
+              <w:trPr>
+                <w:tblCellSpacing w:w="15" w:type="dxa"/>
+              </w:trPr>
+              <w:tc>
+                <w:tcPr>
+                  <w:tcW w:w="36" w:type="dxa"/>
+                  <w:vAlign w:val="center"/>
+                  <w:hideMark/>
+                </w:tcPr>
+                <w:p>
+                  <w:pPr>
+                    <w:spacing w:after="0" w:line="240" w:lineRule="auto"/>
+                    <w:rPr>
+                      <w:color w:val="FF0000"/>
+                      <w:lang w:val="vi-VN"/>
+                    </w:rPr>
+                  </w:pPr>
+                </w:p>
+              </w:tc>
+            </w:tr>
+          </w:tbl>
+          <w:p>
+            <w:pPr>
+              <w:rPr>
+                <w:color w:val="FF0000"/>
+              </w:rPr>
+            </w:pPr>
+          </w:p>
+        </w:tc>
+        <w:tc>
+          <w:tcPr>
+            <w:tcW w:w="1417" w:type="dxa"/>
+          </w:tcPr>
+          <w:p>
+            <w:pPr>
+              <w:rPr>
+                <w:b/>
+                <w:bCs/>
+              </w:rPr>
+            </w:pPr>
+            <w:r>
+              <w:rPr>
+                <w:b/>
+                <w:bCs/>
+              </w:rPr>
+              <w:t>GET</w:t>
+            </w:r>
+          </w:p>
+        </w:tc>
+        <w:tc>
+          <w:tcPr>
+            <w:tcW w:w="1134" w:type="dxa"/>
+          </w:tcPr>
+          <w:p>
+            <w:pPr>
+              <w:rPr>
+                <w:b/>
+                <w:bCs/>
+                <w:color w:val="196B24" w:themeColor="accent3"/>
+              </w:rPr>
+            </w:pPr>
+            <w:r>
+              <w:rPr>
+                <w:b/>
+                <w:bCs/>
+                <w:color w:val="196B24" w:themeColor="accent3"/>
+              </w:rPr>
+              <w:t>Pending</w:t>
+            </w:r>
+          </w:p>
+        </w:tc>
+        <w:tc>
+          <w:tcPr>
+            <w:tcW w:w="1985" w:type="dxa"/>
+          </w:tcPr>
+          <w:p>
+            <w:pPr>
+              <w:rPr>
+                <w:vanish/>
+                <w:lang w:val="vi-VN"/>
+              </w:rPr>
+            </w:pPr>
+          </w:p>
+          <w:tbl>
+            <w:tblPr>
+              <w:tblW w:w="0" w:type="auto"/>
+              <w:tblCellSpacing w:w="15" w:type="dxa"/>
+              <w:tblCellMar>
+                <w:top w:w="15" w:type="dxa"/>
+                <w:left w:w="15" w:type="dxa"/>
+                <w:bottom w:w="15" w:type="dxa"/>
+                <w:right w:w="15" w:type="dxa"/>
+              </w:tblCellMar>
+              <w:tblLook w:val="04A0" w:firstRow="1" w:lastRow="0" w:firstColumn="1" w:lastColumn="0" w:noHBand="0" w:noVBand="1"/>
+            </w:tblPr>
+            <w:tblGrid>
+              <w:gridCol w:w="110"/>
+            </w:tblGrid>
+            <w:tr>
+              <w:trPr>
+                <w:tblCellSpacing w:w="15" w:type="dxa"/>
+              </w:trPr>
+              <w:tc>
+                <w:tcPr>
+                  <w:tcW w:w="36" w:type="dxa"/>
+                  <w:vAlign w:val="center"/>
+                  <w:hideMark/>
+                </w:tcPr>
+                <w:p>
+                  <w:pPr>
+                    <w:spacing w:after="0" w:line="240" w:lineRule="auto"/>
+                    <w:rPr>
+                      <w:lang w:val="vi-VN"/>
+                    </w:rPr>
+                  </w:pPr>
+                </w:p>
+              </w:tc>
+            </w:tr>
+          </w:tbl>
+          <w:p>
+            <w:r>
+              <w:t>Lấy tất cả thông báo chưa đọc</w:t>
+            </w:r>
+          </w:p>
+        </w:tc>
+        <w:tc>
+          <w:tcPr>
+            <w:tcW w:w="1417" w:type="dxa"/>
+          </w:tcPr>
+          <w:p>
+            <w:pPr>
+              <w:rPr>
+                <w:b/>
+                <w:bCs/>
+                <w:color w:val="196B24" w:themeColor="accent3"/>
+              </w:rPr>
+            </w:pPr>
+          </w:p>
+        </w:tc>
+      </w:tr>
+      <w:tr>
+        <w:tc>
+          <w:tcPr>
+            <w:tcW w:w="1276" w:type="dxa"/>
+          </w:tcPr>
+          <w:p/>
+        </w:tc>
+        <w:tc>
+          <w:tcPr>
+            <w:tcW w:w="4395" w:type="dxa"/>
+          </w:tcPr>
+          <w:tbl>
+            <w:tblPr>
+              <w:tblW w:w="0" w:type="auto"/>
+              <w:tblCellSpacing w:w="15" w:type="dxa"/>
+              <w:tblCellMar>
+                <w:top w:w="15" w:type="dxa"/>
+                <w:left w:w="15" w:type="dxa"/>
+                <w:bottom w:w="15" w:type="dxa"/>
+                <w:right w:w="15" w:type="dxa"/>
+              </w:tblCellMar>
+              <w:tblLook w:val="04A0" w:firstRow="1" w:lastRow="0" w:firstColumn="1" w:lastColumn="0" w:noHBand="0" w:noVBand="1"/>
+            </w:tblPr>
+            <w:tblGrid>
+              <w:gridCol w:w="3091"/>
+            </w:tblGrid>
+            <w:tr>
+              <w:trPr>
+                <w:tblCellSpacing w:w="15" w:type="dxa"/>
+              </w:trPr>
+              <w:tc>
+                <w:tcPr>
+                  <w:tcW w:w="3031" w:type="dxa"/>
+                  <w:vAlign w:val="center"/>
+                  <w:hideMark/>
+                </w:tcPr>
+                <w:p>
+                  <w:pPr>
+                    <w:spacing w:after="0" w:line="240" w:lineRule="auto"/>
+                    <w:rPr>
+                      <w:lang w:val="vi-VN"/>
+                    </w:rPr>
+                  </w:pPr>
+                  <w:r>
+                    <w:rPr>
+                      <w:lang w:val="vi-VN"/>
+                    </w:rPr>
+                    <w:t>/notifications/{id}/read/</w:t>
+                  </w:r>
+                </w:p>
+              </w:tc>
+            </w:tr>
+          </w:tbl>
+          <w:p>
+            <w:pPr>
+              <w:rPr>
+                <w:vanish/>
+                <w:lang w:val="vi-VN"/>
+              </w:rPr>
+            </w:pPr>
+          </w:p>
+          <w:tbl>
+            <w:tblPr>
+              <w:tblW w:w="0" w:type="auto"/>
+              <w:tblCellSpacing w:w="15" w:type="dxa"/>
+              <w:tblCellMar>
+                <w:top w:w="15" w:type="dxa"/>
+                <w:left w:w="15" w:type="dxa"/>
+                <w:bottom w:w="15" w:type="dxa"/>
+                <w:right w:w="15" w:type="dxa"/>
+              </w:tblCellMar>
+              <w:tblLook w:val="04A0" w:firstRow="1" w:lastRow="0" w:firstColumn="1" w:lastColumn="0" w:noHBand="0" w:noVBand="1"/>
+            </w:tblPr>
+            <w:tblGrid>
+              <w:gridCol w:w="110"/>
+            </w:tblGrid>
+            <w:tr>
+              <w:trPr>
+                <w:tblCellSpacing w:w="15" w:type="dxa"/>
+              </w:trPr>
+              <w:tc>
+                <w:tcPr>
+                  <w:tcW w:w="36" w:type="dxa"/>
+                  <w:vAlign w:val="center"/>
+                  <w:hideMark/>
+                </w:tcPr>
+                <w:p>
+                  <w:pPr>
+                    <w:spacing w:after="0" w:line="240" w:lineRule="auto"/>
+                    <w:rPr>
+                      <w:lang w:val="vi-VN"/>
+                    </w:rPr>
+                  </w:pPr>
+                </w:p>
+              </w:tc>
+            </w:tr>
+          </w:tbl>
+          <w:p/>
+        </w:tc>
+        <w:tc>
+          <w:tcPr>
+            <w:tcW w:w="1417" w:type="dxa"/>
+          </w:tcPr>
+          <w:p>
+            <w:pPr>
+              <w:rPr>
+                <w:b/>
+                <w:bCs/>
+              </w:rPr>
+            </w:pPr>
+            <w:r>
+              <w:rPr>
+                <w:b/>
+                <w:bCs/>
+              </w:rPr>
+              <w:t>PUT</w:t>
+            </w:r>
+          </w:p>
+        </w:tc>
+        <w:tc>
+          <w:tcPr>
+            <w:tcW w:w="1134" w:type="dxa"/>
+          </w:tcPr>
+          <w:p>
+            <w:pPr>
+              <w:rPr>
+                <w:b/>
+                <w:bCs/>
+                <w:color w:val="196B24" w:themeColor="accent3"/>
+              </w:rPr>
+            </w:pPr>
+            <w:r>
+              <w:rPr>
+                <w:b/>
+                <w:bCs/>
+                <w:color w:val="196B24" w:themeColor="accent3"/>
+              </w:rPr>
+              <w:t>Pending</w:t>
+            </w:r>
+          </w:p>
+        </w:tc>
+        <w:tc>
+          <w:tcPr>
+            <w:tcW w:w="1985" w:type="dxa"/>
+          </w:tcPr>
+          <w:p>
+            <w:pPr>
+              <w:rPr>
+                <w:vanish/>
+                <w:lang w:val="vi-VN"/>
+              </w:rPr>
+            </w:pPr>
+          </w:p>
+          <w:p>
+            <w:r>
+              <w:t>Đánh dấu 1 thông báo là đã đọc</w:t>
+            </w:r>
+          </w:p>
+        </w:tc>
+        <w:tc>
+          <w:tcPr>
+            <w:tcW w:w="1417" w:type="dxa"/>
+          </w:tcPr>
+          <w:p>
+            <w:pPr>
+              <w:rPr>
+                <w:b/>
+                <w:bCs/>
+                <w:color w:val="196B24" w:themeColor="accent3"/>
+              </w:rPr>
+            </w:pPr>
+          </w:p>
+        </w:tc>
+      </w:tr>
+      <w:tr>
+        <w:tc>
+          <w:tcPr>
+            <w:tcW w:w="1276" w:type="dxa"/>
+          </w:tcPr>
+          <w:p/>
+        </w:tc>
+        <w:tc>
+          <w:tcPr>
+            <w:tcW w:w="4395" w:type="dxa"/>
+          </w:tcPr>
+          <w:tbl>
+            <w:tblPr>
+              <w:tblW w:w="0" w:type="auto"/>
+              <w:tblCellSpacing w:w="15" w:type="dxa"/>
+              <w:tblCellMar>
+                <w:top w:w="15" w:type="dxa"/>
+                <w:left w:w="15" w:type="dxa"/>
+                <w:bottom w:w="15" w:type="dxa"/>
+                <w:right w:w="15" w:type="dxa"/>
+              </w:tblCellMar>
+              <w:tblLook w:val="04A0" w:firstRow="1" w:lastRow="0" w:firstColumn="1" w:lastColumn="0" w:noHBand="0" w:noVBand="1"/>
+            </w:tblPr>
+            <w:tblGrid>
+              <w:gridCol w:w="2971"/>
+            </w:tblGrid>
+            <w:tr>
+              <w:trPr>
+                <w:tblCellSpacing w:w="15" w:type="dxa"/>
+              </w:trPr>
+              <w:tc>
+                <w:tcPr>
+                  <w:tcW w:w="2911" w:type="dxa"/>
+                  <w:vAlign w:val="center"/>
+                  <w:hideMark/>
+                </w:tcPr>
+                <w:p>
+                  <w:pPr>
+                    <w:spacing w:after="0" w:line="240" w:lineRule="auto"/>
+                    <w:rPr>
+                      <w:lang w:val="vi-VN"/>
+                    </w:rPr>
+                  </w:pPr>
+                  <w:r>
+                    <w:rPr>
+                      <w:lang w:val="vi-VN"/>
+                    </w:rPr>
+                    <w:t>/notifications/read_all/</w:t>
+                  </w:r>
+                </w:p>
+              </w:tc>
+            </w:tr>
+          </w:tbl>
+          <w:p>
+            <w:pPr>
+              <w:rPr>
+                <w:vanish/>
+                <w:lang w:val="vi-VN"/>
+              </w:rPr>
+            </w:pPr>
+          </w:p>
+          <w:tbl>
+            <w:tblPr>
+              <w:tblW w:w="0" w:type="auto"/>
+              <w:tblCellSpacing w:w="15" w:type="dxa"/>
+              <w:tblCellMar>
+                <w:top w:w="15" w:type="dxa"/>
+                <w:left w:w="15" w:type="dxa"/>
+                <w:bottom w:w="15" w:type="dxa"/>
+                <w:right w:w="15" w:type="dxa"/>
+              </w:tblCellMar>
+              <w:tblLook w:val="04A0" w:firstRow="1" w:lastRow="0" w:firstColumn="1" w:lastColumn="0" w:noHBand="0" w:noVBand="1"/>
+            </w:tblPr>
+            <w:tblGrid>
+              <w:gridCol w:w="110"/>
+            </w:tblGrid>
+            <w:tr>
+              <w:trPr>
+                <w:tblCellSpacing w:w="15" w:type="dxa"/>
+              </w:trPr>
+              <w:tc>
+                <w:tcPr>
+                  <w:tcW w:w="36" w:type="dxa"/>
+                  <w:vAlign w:val="center"/>
+                  <w:hideMark/>
+                </w:tcPr>
+                <w:p>
+                  <w:pPr>
+                    <w:spacing w:after="0" w:line="240" w:lineRule="auto"/>
+                    <w:rPr>
+                      <w:lang w:val="vi-VN"/>
+                    </w:rPr>
+                  </w:pPr>
+                </w:p>
+              </w:tc>
+            </w:tr>
+          </w:tbl>
+          <w:p/>
+        </w:tc>
+        <w:tc>
+          <w:tcPr>
+            <w:tcW w:w="1417" w:type="dxa"/>
+          </w:tcPr>
+          <w:p>
+            <w:pPr>
+              <w:rPr>
+                <w:b/>
+                <w:bCs/>
+              </w:rPr>
+            </w:pPr>
+            <w:r>
+              <w:rPr>
+                <w:b/>
+                <w:bCs/>
+              </w:rPr>
+              <w:t>PUT</w:t>
+            </w:r>
+          </w:p>
+        </w:tc>
+        <w:tc>
+          <w:tcPr>
+            <w:tcW w:w="1134" w:type="dxa"/>
+          </w:tcPr>
+          <w:p>
+            <w:pPr>
+              <w:rPr>
+                <w:b/>
+                <w:bCs/>
+                <w:color w:val="196B24" w:themeColor="accent3"/>
+              </w:rPr>
+            </w:pPr>
+            <w:r>
+              <w:rPr>
+                <w:b/>
+                <w:bCs/>
+                <w:color w:val="196B24" w:themeColor="accent3"/>
+              </w:rPr>
+              <w:t>Pending</w:t>
+            </w:r>
+          </w:p>
+        </w:tc>
+        <w:tc>
+          <w:tcPr>
+            <w:tcW w:w="1985" w:type="dxa"/>
+          </w:tcPr>
+          <w:p>
+            <w:r>
+              <w:t>Đánh dấu tất cả thông báo là đã đọc</w:t>
+            </w:r>
+          </w:p>
+        </w:tc>
+        <w:tc>
+          <w:tcPr>
+            <w:tcW w:w="1417" w:type="dxa"/>
+          </w:tcPr>
+          <w:p>
+            <w:pPr>
+              <w:rPr>
+                <w:b/>
+                <w:bCs/>
+                <w:color w:val="196B24" w:themeColor="accent3"/>
+              </w:rPr>
+            </w:pPr>
+          </w:p>
+        </w:tc>
+      </w:tr>
+      <w:tr>
+        <w:tc>
+          <w:tcPr>
+            <w:tcW w:w="1276" w:type="dxa"/>
+          </w:tcPr>
+          <w:p/>
+        </w:tc>
+        <w:tc>
+          <w:tcPr>
+            <w:tcW w:w="4395" w:type="dxa"/>
+          </w:tcPr>
+          <w:p>
+            <w:pPr>
+              <w:rPr>
+                <w:color w:val="FF0000"/>
+              </w:rPr>
+            </w:pPr>
+          </w:p>
+        </w:tc>
+        <w:tc>
+          <w:tcPr>
+            <w:tcW w:w="1417" w:type="dxa"/>
+          </w:tcPr>
+          <w:p>
+            <w:pPr>
+              <w:rPr>
+                <w:b/>
+                <w:bCs/>
+              </w:rPr>
+            </w:pPr>
+          </w:p>
+        </w:tc>
+        <w:tc>
+          <w:tcPr>
+            <w:tcW w:w="1134" w:type="dxa"/>
+          </w:tcPr>
+          <w:p>
+            <w:pPr>
+              <w:rPr>
+                <w:b/>
+                <w:bCs/>
+                <w:color w:val="196B24" w:themeColor="accent3"/>
+              </w:rPr>
+            </w:pPr>
+          </w:p>
+        </w:tc>
+        <w:tc>
+          <w:tcPr>
+            <w:tcW w:w="1985" w:type="dxa"/>
+          </w:tcPr>
+          <w:p/>
+        </w:tc>
+        <w:tc>
+          <w:tcPr>
+            <w:tcW w:w="1417" w:type="dxa"/>
+          </w:tcPr>
+          <w:p>
+            <w:pPr>
+              <w:rPr>
+                <w:b/>
+                <w:bCs/>
+                <w:color w:val="196B24" w:themeColor="accent3"/>
+              </w:rPr>
+            </w:pPr>
+          </w:p>
+        </w:tc>
+      </w:tr>
+      <w:tr>
+        <w:tc>
+          <w:tcPr>
+            <w:tcW w:w="1276" w:type="dxa"/>
+          </w:tcPr>
+          <w:p/>
+        </w:tc>
+        <w:tc>
+          <w:tcPr>
+            <w:tcW w:w="4395" w:type="dxa"/>
+          </w:tcPr>
+          <w:p>
+            <w:pPr>
+              <w:rPr>
+                <w:color w:val="FF0000"/>
+              </w:rPr>
+            </w:pPr>
+          </w:p>
+        </w:tc>
+        <w:tc>
+          <w:tcPr>
+            <w:tcW w:w="1417" w:type="dxa"/>
+          </w:tcPr>
+          <w:p>
+            <w:pPr>
+              <w:rPr>
+                <w:b/>
+                <w:bCs/>
+              </w:rPr>
+            </w:pPr>
+          </w:p>
+        </w:tc>
+        <w:tc>
+          <w:tcPr>
+            <w:tcW w:w="1134" w:type="dxa"/>
+          </w:tcPr>
+          <w:p>
+            <w:pPr>
+              <w:rPr>
+                <w:b/>
+                <w:bCs/>
+                <w:color w:val="196B24" w:themeColor="accent3"/>
+              </w:rPr>
+            </w:pPr>
+          </w:p>
+        </w:tc>
+        <w:tc>
+          <w:tcPr>
+            <w:tcW w:w="1985" w:type="dxa"/>
+          </w:tcPr>
+          <w:p/>
+        </w:tc>
+        <w:tc>
+          <w:tcPr>
+            <w:tcW w:w="1417" w:type="dxa"/>
+          </w:tcPr>
+          <w:p>
+            <w:pPr>
+              <w:rPr>
+                <w:b/>
+                <w:bCs/>
+                <w:color w:val="196B24" w:themeColor="accent3"/>
+              </w:rPr>
+            </w:pPr>
+          </w:p>
+        </w:tc>
+      </w:tr>
+      <w:tr>
+        <w:tc>
+          <w:tcPr>
+            <w:tcW w:w="1276" w:type="dxa"/>
+          </w:tcPr>
+          <w:p/>
+        </w:tc>
+        <w:tc>
+          <w:tcPr>
+            <w:tcW w:w="4395" w:type="dxa"/>
+          </w:tcPr>
+          <w:p>
+            <w:pPr>
+              <w:rPr>
+                <w:color w:val="FF0000"/>
+              </w:rPr>
+            </w:pPr>
+          </w:p>
+        </w:tc>
+        <w:tc>
+          <w:tcPr>
+            <w:tcW w:w="1417" w:type="dxa"/>
+          </w:tcPr>
+          <w:p>
+            <w:pPr>
+              <w:rPr>
+                <w:b/>
+                <w:bCs/>
+              </w:rPr>
+            </w:pPr>
+          </w:p>
+        </w:tc>
+        <w:tc>
+          <w:tcPr>
+            <w:tcW w:w="1134" w:type="dxa"/>
+          </w:tcPr>
+          <w:p>
+            <w:pPr>
+              <w:rPr>
+                <w:b/>
+                <w:bCs/>
+                <w:color w:val="196B24" w:themeColor="accent3"/>
+              </w:rPr>
+            </w:pPr>
+          </w:p>
+        </w:tc>
+        <w:tc>
+          <w:tcPr>
+            <w:tcW w:w="1985" w:type="dxa"/>
+          </w:tcPr>
+          <w:p/>
+        </w:tc>
+        <w:tc>
+          <w:tcPr>
+            <w:tcW w:w="1417" w:type="dxa"/>
+          </w:tcPr>
+          <w:p>
+            <w:pPr>
+              <w:rPr>
+                <w:b/>
+                <w:bCs/>
+                <w:color w:val="196B24" w:themeColor="accent3"/>
+              </w:rPr>
+            </w:pPr>
+          </w:p>
+        </w:tc>
+      </w:tr>
+      <w:tr>
+        <w:tc>
+          <w:tcPr>
+            <w:tcW w:w="1276" w:type="dxa"/>
+          </w:tcPr>
+          <w:p/>
+        </w:tc>
+        <w:tc>
+          <w:tcPr>
+            <w:tcW w:w="4395" w:type="dxa"/>
+          </w:tcPr>
+          <w:p>
+            <w:pPr>
+              <w:rPr>
+                <w:color w:val="FF0000"/>
+              </w:rPr>
+            </w:pPr>
+          </w:p>
+        </w:tc>
+        <w:tc>
+          <w:tcPr>
+            <w:tcW w:w="1417" w:type="dxa"/>
+          </w:tcPr>
+          <w:p>
+            <w:pPr>
+              <w:rPr>
+                <w:b/>
+                <w:bCs/>
+              </w:rPr>
+            </w:pPr>
+          </w:p>
+        </w:tc>
+        <w:tc>
+          <w:tcPr>
+            <w:tcW w:w="1134" w:type="dxa"/>
+          </w:tcPr>
+          <w:p>
+            <w:pPr>
+              <w:rPr>
+                <w:b/>
+                <w:bCs/>
+                <w:color w:val="196B24" w:themeColor="accent3"/>
+              </w:rPr>
+            </w:pPr>
+          </w:p>
+        </w:tc>
+        <w:tc>
+          <w:tcPr>
+            <w:tcW w:w="1985" w:type="dxa"/>
+          </w:tcPr>
+          <w:p/>
         </w:tc>
         <w:tc>
           <w:tcPr>

</xml_diff>

<commit_message>
thêm api chat room, chưa test
</commit_message>
<xml_diff>
--- a/Hỗ trợ tìm kiếm nhà trọ.docx
+++ b/Hỗ trợ tìm kiếm nhà trọ.docx
@@ -15245,17 +15245,19 @@
         <w:tc>
           <w:tcPr>
             <w:tcW w:w="1276" w:type="dxa"/>
+            <w:shd w:val="clear" w:color="auto" w:fill="D9D9D9" w:themeFill="background1" w:themeFillShade="D9"/>
           </w:tcPr>
           <w:p/>
         </w:tc>
         <w:tc>
           <w:tcPr>
             <w:tcW w:w="4395" w:type="dxa"/>
-          </w:tcPr>
-          <w:p>
-            <w:pPr>
-              <w:rPr>
-                <w:color w:val="FF0000"/>
+            <w:shd w:val="clear" w:color="auto" w:fill="D9D9D9" w:themeFill="background1" w:themeFillShade="D9"/>
+          </w:tcPr>
+          <w:p>
+            <w:pPr>
+              <w:rPr>
+                <w:color w:val="000000" w:themeColor="text1"/>
               </w:rPr>
             </w:pPr>
           </w:p>
@@ -15263,6 +15265,7 @@
         <w:tc>
           <w:tcPr>
             <w:tcW w:w="1417" w:type="dxa"/>
+            <w:shd w:val="clear" w:color="auto" w:fill="D9D9D9" w:themeFill="background1" w:themeFillShade="D9"/>
           </w:tcPr>
           <w:p>
             <w:pPr>
@@ -15276,6 +15279,7 @@
         <w:tc>
           <w:tcPr>
             <w:tcW w:w="1134" w:type="dxa"/>
+            <w:shd w:val="clear" w:color="auto" w:fill="D9D9D9" w:themeFill="background1" w:themeFillShade="D9"/>
           </w:tcPr>
           <w:p>
             <w:pPr>
@@ -15290,12 +15294,14 @@
         <w:tc>
           <w:tcPr>
             <w:tcW w:w="1985" w:type="dxa"/>
+            <w:shd w:val="clear" w:color="auto" w:fill="D9D9D9" w:themeFill="background1" w:themeFillShade="D9"/>
           </w:tcPr>
           <w:p/>
         </w:tc>
         <w:tc>
           <w:tcPr>
             <w:tcW w:w="1417" w:type="dxa"/>
+            <w:shd w:val="clear" w:color="auto" w:fill="D9D9D9" w:themeFill="background1" w:themeFillShade="D9"/>
           </w:tcPr>
           <w:p>
             <w:pPr>
@@ -15313,7 +15319,11 @@
           <w:tcPr>
             <w:tcW w:w="1276" w:type="dxa"/>
           </w:tcPr>
-          <w:p/>
+          <w:p>
+            <w:r>
+              <w:t>ChatRoom</w:t>
+            </w:r>
+          </w:p>
         </w:tc>
         <w:tc>
           <w:tcPr>
@@ -15322,9 +15332,15 @@
           <w:p>
             <w:pPr>
               <w:rPr>
-                <w:color w:val="FF0000"/>
-              </w:rPr>
-            </w:pPr>
+                <w:color w:val="000000" w:themeColor="text1"/>
+              </w:rPr>
+            </w:pPr>
+            <w:r>
+              <w:rPr>
+                <w:color w:val="000000" w:themeColor="text1"/>
+              </w:rPr>
+              <w:t>http://127.0.0.1:8000/chat-rooms/</w:t>
+            </w:r>
           </w:p>
         </w:tc>
         <w:tc>
@@ -15338,6 +15354,13 @@
                 <w:bCs/>
               </w:rPr>
             </w:pPr>
+            <w:r>
+              <w:rPr>
+                <w:b/>
+                <w:bCs/>
+              </w:rPr>
+              <w:t>GET</w:t>
+            </w:r>
           </w:p>
         </w:tc>
         <w:tc>
@@ -15352,13 +15375,25 @@
                 <w:color w:val="196B24" w:themeColor="accent3"/>
               </w:rPr>
             </w:pPr>
+            <w:r>
+              <w:rPr>
+                <w:b/>
+                <w:bCs/>
+                <w:color w:val="196B24" w:themeColor="accent3"/>
+              </w:rPr>
+              <w:t>Pending</w:t>
+            </w:r>
           </w:p>
         </w:tc>
         <w:tc>
           <w:tcPr>
             <w:tcW w:w="1985" w:type="dxa"/>
           </w:tcPr>
-          <w:p/>
+          <w:p>
+            <w:r>
+              <w:t>Lấy danh sách tất cả phòng chat của người dùng hiện tại</w:t>
+            </w:r>
+          </w:p>
         </w:tc>
         <w:tc>
           <w:tcPr>
@@ -15389,9 +15424,15 @@
           <w:p>
             <w:pPr>
               <w:rPr>
-                <w:color w:val="FF0000"/>
-              </w:rPr>
-            </w:pPr>
+                <w:color w:val="000000" w:themeColor="text1"/>
+              </w:rPr>
+            </w:pPr>
+            <w:r>
+              <w:rPr>
+                <w:color w:val="000000" w:themeColor="text1"/>
+              </w:rPr>
+              <w:t>http://127.0.0.1:8000/chat-rooms/</w:t>
+            </w:r>
           </w:p>
         </w:tc>
         <w:tc>
@@ -15405,6 +15446,13 @@
                 <w:bCs/>
               </w:rPr>
             </w:pPr>
+            <w:r>
+              <w:rPr>
+                <w:b/>
+                <w:bCs/>
+              </w:rPr>
+              <w:t>POST</w:t>
+            </w:r>
           </w:p>
         </w:tc>
         <w:tc>
@@ -15419,13 +15467,25 @@
                 <w:color w:val="196B24" w:themeColor="accent3"/>
               </w:rPr>
             </w:pPr>
+            <w:r>
+              <w:rPr>
+                <w:b/>
+                <w:bCs/>
+                <w:color w:val="196B24" w:themeColor="accent3"/>
+              </w:rPr>
+              <w:t>Pending</w:t>
+            </w:r>
           </w:p>
         </w:tc>
         <w:tc>
           <w:tcPr>
             <w:tcW w:w="1985" w:type="dxa"/>
           </w:tcPr>
-          <w:p/>
+          <w:p>
+            <w:r>
+              <w:t>Tạo phòng chat mới</w:t>
+            </w:r>
+          </w:p>
         </w:tc>
         <w:tc>
           <w:tcPr>
@@ -15456,9 +15516,15 @@
           <w:p>
             <w:pPr>
               <w:rPr>
-                <w:color w:val="FF0000"/>
-              </w:rPr>
-            </w:pPr>
+                <w:color w:val="000000" w:themeColor="text1"/>
+              </w:rPr>
+            </w:pPr>
+            <w:r>
+              <w:rPr>
+                <w:color w:val="000000" w:themeColor="text1"/>
+              </w:rPr>
+              <w:t>http://127.0.0.1:8000/chat-rooms/{id}/</w:t>
+            </w:r>
           </w:p>
         </w:tc>
         <w:tc>
@@ -15472,6 +15538,13 @@
                 <w:bCs/>
               </w:rPr>
             </w:pPr>
+            <w:r>
+              <w:rPr>
+                <w:b/>
+                <w:bCs/>
+              </w:rPr>
+              <w:t>GET</w:t>
+            </w:r>
           </w:p>
         </w:tc>
         <w:tc>
@@ -15486,13 +15559,842 @@
                 <w:color w:val="196B24" w:themeColor="accent3"/>
               </w:rPr>
             </w:pPr>
+            <w:r>
+              <w:rPr>
+                <w:b/>
+                <w:bCs/>
+                <w:color w:val="196B24" w:themeColor="accent3"/>
+              </w:rPr>
+              <w:t>Pending</w:t>
+            </w:r>
           </w:p>
         </w:tc>
         <w:tc>
           <w:tcPr>
             <w:tcW w:w="1985" w:type="dxa"/>
           </w:tcPr>
+          <w:p>
+            <w:r>
+              <w:t>Lấy thông tin chi tiết một phòng chat</w:t>
+            </w:r>
+          </w:p>
+        </w:tc>
+        <w:tc>
+          <w:tcPr>
+            <w:tcW w:w="1417" w:type="dxa"/>
+          </w:tcPr>
+          <w:p>
+            <w:pPr>
+              <w:rPr>
+                <w:b/>
+                <w:bCs/>
+                <w:color w:val="196B24" w:themeColor="accent3"/>
+              </w:rPr>
+            </w:pPr>
+          </w:p>
+        </w:tc>
+      </w:tr>
+      <w:tr>
+        <w:tc>
+          <w:tcPr>
+            <w:tcW w:w="1276" w:type="dxa"/>
+          </w:tcPr>
           <w:p/>
+        </w:tc>
+        <w:tc>
+          <w:tcPr>
+            <w:tcW w:w="4395" w:type="dxa"/>
+          </w:tcPr>
+          <w:p>
+            <w:pPr>
+              <w:rPr>
+                <w:color w:val="000000" w:themeColor="text1"/>
+              </w:rPr>
+            </w:pPr>
+            <w:r>
+              <w:rPr>
+                <w:color w:val="000000" w:themeColor="text1"/>
+              </w:rPr>
+              <w:t>http://127.0.0.1:8000/chat-rooms/{id}/</w:t>
+            </w:r>
+          </w:p>
+        </w:tc>
+        <w:tc>
+          <w:tcPr>
+            <w:tcW w:w="1417" w:type="dxa"/>
+          </w:tcPr>
+          <w:p>
+            <w:pPr>
+              <w:rPr>
+                <w:b/>
+                <w:bCs/>
+              </w:rPr>
+            </w:pPr>
+            <w:r>
+              <w:rPr>
+                <w:b/>
+                <w:bCs/>
+              </w:rPr>
+              <w:t>PATCH</w:t>
+            </w:r>
+          </w:p>
+        </w:tc>
+        <w:tc>
+          <w:tcPr>
+            <w:tcW w:w="1134" w:type="dxa"/>
+          </w:tcPr>
+          <w:p>
+            <w:pPr>
+              <w:rPr>
+                <w:b/>
+                <w:bCs/>
+                <w:color w:val="196B24" w:themeColor="accent3"/>
+              </w:rPr>
+            </w:pPr>
+            <w:r>
+              <w:rPr>
+                <w:b/>
+                <w:bCs/>
+                <w:color w:val="196B24" w:themeColor="accent3"/>
+              </w:rPr>
+              <w:t>Pending</w:t>
+            </w:r>
+          </w:p>
+        </w:tc>
+        <w:tc>
+          <w:tcPr>
+            <w:tcW w:w="1985" w:type="dxa"/>
+          </w:tcPr>
+          <w:p>
+            <w:r>
+              <w:t>Cập nhật thông tin phòng chat</w:t>
+            </w:r>
+          </w:p>
+        </w:tc>
+        <w:tc>
+          <w:tcPr>
+            <w:tcW w:w="1417" w:type="dxa"/>
+          </w:tcPr>
+          <w:p>
+            <w:pPr>
+              <w:rPr>
+                <w:b/>
+                <w:bCs/>
+                <w:color w:val="196B24" w:themeColor="accent3"/>
+              </w:rPr>
+            </w:pPr>
+          </w:p>
+        </w:tc>
+      </w:tr>
+      <w:tr>
+        <w:tc>
+          <w:tcPr>
+            <w:tcW w:w="1276" w:type="dxa"/>
+          </w:tcPr>
+          <w:p/>
+        </w:tc>
+        <w:tc>
+          <w:tcPr>
+            <w:tcW w:w="4395" w:type="dxa"/>
+          </w:tcPr>
+          <w:p>
+            <w:pPr>
+              <w:rPr>
+                <w:color w:val="000000" w:themeColor="text1"/>
+              </w:rPr>
+            </w:pPr>
+            <w:r>
+              <w:rPr>
+                <w:color w:val="000000" w:themeColor="text1"/>
+              </w:rPr>
+              <w:t>h</w:t>
+            </w:r>
+            <w:r>
+              <w:rPr>
+                <w:color w:val="000000" w:themeColor="text1"/>
+              </w:rPr>
+              <w:t>ttp://127.0.0.1:8000/chat-rooms/{id}/</w:t>
+            </w:r>
+          </w:p>
+        </w:tc>
+        <w:tc>
+          <w:tcPr>
+            <w:tcW w:w="1417" w:type="dxa"/>
+          </w:tcPr>
+          <w:p>
+            <w:pPr>
+              <w:rPr>
+                <w:b/>
+                <w:bCs/>
+              </w:rPr>
+            </w:pPr>
+            <w:r>
+              <w:rPr>
+                <w:b/>
+                <w:bCs/>
+              </w:rPr>
+              <w:t>DELETE</w:t>
+            </w:r>
+          </w:p>
+        </w:tc>
+        <w:tc>
+          <w:tcPr>
+            <w:tcW w:w="1134" w:type="dxa"/>
+          </w:tcPr>
+          <w:p>
+            <w:pPr>
+              <w:rPr>
+                <w:b/>
+                <w:bCs/>
+                <w:color w:val="196B24" w:themeColor="accent3"/>
+              </w:rPr>
+            </w:pPr>
+            <w:r>
+              <w:rPr>
+                <w:b/>
+                <w:bCs/>
+                <w:color w:val="196B24" w:themeColor="accent3"/>
+              </w:rPr>
+              <w:t>Pending</w:t>
+            </w:r>
+          </w:p>
+        </w:tc>
+        <w:tc>
+          <w:tcPr>
+            <w:tcW w:w="1985" w:type="dxa"/>
+          </w:tcPr>
+          <w:p>
+            <w:r>
+              <w:t>Xóa phòng chat</w:t>
+            </w:r>
+          </w:p>
+        </w:tc>
+        <w:tc>
+          <w:tcPr>
+            <w:tcW w:w="1417" w:type="dxa"/>
+          </w:tcPr>
+          <w:p>
+            <w:pPr>
+              <w:rPr>
+                <w:b/>
+                <w:bCs/>
+                <w:color w:val="196B24" w:themeColor="accent3"/>
+              </w:rPr>
+            </w:pPr>
+          </w:p>
+        </w:tc>
+      </w:tr>
+      <w:tr>
+        <w:tc>
+          <w:tcPr>
+            <w:tcW w:w="1276" w:type="dxa"/>
+          </w:tcPr>
+          <w:p/>
+        </w:tc>
+        <w:tc>
+          <w:tcPr>
+            <w:tcW w:w="4395" w:type="dxa"/>
+          </w:tcPr>
+          <w:p>
+            <w:pPr>
+              <w:rPr>
+                <w:color w:val="000000" w:themeColor="text1"/>
+              </w:rPr>
+            </w:pPr>
+          </w:p>
+        </w:tc>
+        <w:tc>
+          <w:tcPr>
+            <w:tcW w:w="1417" w:type="dxa"/>
+          </w:tcPr>
+          <w:p>
+            <w:pPr>
+              <w:rPr>
+                <w:b/>
+                <w:bCs/>
+              </w:rPr>
+            </w:pPr>
+          </w:p>
+        </w:tc>
+        <w:tc>
+          <w:tcPr>
+            <w:tcW w:w="1134" w:type="dxa"/>
+          </w:tcPr>
+          <w:p>
+            <w:pPr>
+              <w:rPr>
+                <w:b/>
+                <w:bCs/>
+                <w:color w:val="196B24" w:themeColor="accent3"/>
+              </w:rPr>
+            </w:pPr>
+          </w:p>
+        </w:tc>
+        <w:tc>
+          <w:tcPr>
+            <w:tcW w:w="1985" w:type="dxa"/>
+          </w:tcPr>
+          <w:p/>
+        </w:tc>
+        <w:tc>
+          <w:tcPr>
+            <w:tcW w:w="1417" w:type="dxa"/>
+          </w:tcPr>
+          <w:p>
+            <w:pPr>
+              <w:rPr>
+                <w:b/>
+                <w:bCs/>
+                <w:color w:val="196B24" w:themeColor="accent3"/>
+              </w:rPr>
+            </w:pPr>
+          </w:p>
+        </w:tc>
+      </w:tr>
+      <w:tr>
+        <w:tc>
+          <w:tcPr>
+            <w:tcW w:w="1276" w:type="dxa"/>
+          </w:tcPr>
+          <w:p/>
+        </w:tc>
+        <w:tc>
+          <w:tcPr>
+            <w:tcW w:w="4395" w:type="dxa"/>
+          </w:tcPr>
+          <w:p>
+            <w:pPr>
+              <w:rPr>
+                <w:color w:val="000000" w:themeColor="text1"/>
+              </w:rPr>
+            </w:pPr>
+            <w:r>
+              <w:rPr>
+                <w:color w:val="000000" w:themeColor="text1"/>
+              </w:rPr>
+              <w:t>http://127.0.0.1:8000/chat-rooms/{chat_room_id}/messages/</w:t>
+            </w:r>
+          </w:p>
+        </w:tc>
+        <w:tc>
+          <w:tcPr>
+            <w:tcW w:w="1417" w:type="dxa"/>
+          </w:tcPr>
+          <w:p>
+            <w:pPr>
+              <w:rPr>
+                <w:b/>
+                <w:bCs/>
+              </w:rPr>
+            </w:pPr>
+            <w:r>
+              <w:rPr>
+                <w:b/>
+                <w:bCs/>
+              </w:rPr>
+              <w:t>GET</w:t>
+            </w:r>
+          </w:p>
+        </w:tc>
+        <w:tc>
+          <w:tcPr>
+            <w:tcW w:w="1134" w:type="dxa"/>
+          </w:tcPr>
+          <w:p>
+            <w:pPr>
+              <w:rPr>
+                <w:b/>
+                <w:bCs/>
+                <w:color w:val="196B24" w:themeColor="accent3"/>
+              </w:rPr>
+            </w:pPr>
+            <w:r>
+              <w:rPr>
+                <w:b/>
+                <w:bCs/>
+                <w:color w:val="196B24" w:themeColor="accent3"/>
+              </w:rPr>
+              <w:t>Pending</w:t>
+            </w:r>
+          </w:p>
+        </w:tc>
+        <w:tc>
+          <w:tcPr>
+            <w:tcW w:w="1985" w:type="dxa"/>
+          </w:tcPr>
+          <w:p>
+            <w:r>
+              <w:t>Lấy danh sách tin nhắn trong một phòng chat</w:t>
+            </w:r>
+          </w:p>
+        </w:tc>
+        <w:tc>
+          <w:tcPr>
+            <w:tcW w:w="1417" w:type="dxa"/>
+          </w:tcPr>
+          <w:p>
+            <w:pPr>
+              <w:rPr>
+                <w:b/>
+                <w:bCs/>
+                <w:color w:val="196B24" w:themeColor="accent3"/>
+              </w:rPr>
+            </w:pPr>
+          </w:p>
+        </w:tc>
+      </w:tr>
+      <w:tr>
+        <w:tc>
+          <w:tcPr>
+            <w:tcW w:w="1276" w:type="dxa"/>
+          </w:tcPr>
+          <w:p/>
+        </w:tc>
+        <w:tc>
+          <w:tcPr>
+            <w:tcW w:w="4395" w:type="dxa"/>
+          </w:tcPr>
+          <w:p>
+            <w:pPr>
+              <w:rPr>
+                <w:color w:val="000000" w:themeColor="text1"/>
+              </w:rPr>
+            </w:pPr>
+            <w:r>
+              <w:rPr>
+                <w:color w:val="000000" w:themeColor="text1"/>
+              </w:rPr>
+              <w:t>http://127.0.0.1:8000/chat-rooms/{chat_room_id}/messages/</w:t>
+            </w:r>
+          </w:p>
+        </w:tc>
+        <w:tc>
+          <w:tcPr>
+            <w:tcW w:w="1417" w:type="dxa"/>
+          </w:tcPr>
+          <w:p>
+            <w:pPr>
+              <w:rPr>
+                <w:b/>
+                <w:bCs/>
+              </w:rPr>
+            </w:pPr>
+            <w:r>
+              <w:rPr>
+                <w:b/>
+                <w:bCs/>
+              </w:rPr>
+              <w:t>POST</w:t>
+            </w:r>
+          </w:p>
+        </w:tc>
+        <w:tc>
+          <w:tcPr>
+            <w:tcW w:w="1134" w:type="dxa"/>
+          </w:tcPr>
+          <w:p>
+            <w:pPr>
+              <w:rPr>
+                <w:b/>
+                <w:bCs/>
+                <w:color w:val="196B24" w:themeColor="accent3"/>
+              </w:rPr>
+            </w:pPr>
+            <w:r>
+              <w:rPr>
+                <w:b/>
+                <w:bCs/>
+                <w:color w:val="196B24" w:themeColor="accent3"/>
+              </w:rPr>
+              <w:t>Pending</w:t>
+            </w:r>
+          </w:p>
+        </w:tc>
+        <w:tc>
+          <w:tcPr>
+            <w:tcW w:w="1985" w:type="dxa"/>
+          </w:tcPr>
+          <w:p>
+            <w:r>
+              <w:t>Gửi tin nhắn mới vào phòng chat</w:t>
+            </w:r>
+          </w:p>
+        </w:tc>
+        <w:tc>
+          <w:tcPr>
+            <w:tcW w:w="1417" w:type="dxa"/>
+          </w:tcPr>
+          <w:p>
+            <w:pPr>
+              <w:rPr>
+                <w:b/>
+                <w:bCs/>
+                <w:color w:val="196B24" w:themeColor="accent3"/>
+              </w:rPr>
+            </w:pPr>
+            <w:r>
+              <w:rPr>
+                <w:b/>
+                <w:bCs/>
+                <w:color w:val="196B24" w:themeColor="accent3"/>
+              </w:rPr>
+              <w:t>Body: {"content": "Nội dung tin nhắn"}</w:t>
+            </w:r>
+          </w:p>
+        </w:tc>
+      </w:tr>
+      <w:tr>
+        <w:tc>
+          <w:tcPr>
+            <w:tcW w:w="1276" w:type="dxa"/>
+          </w:tcPr>
+          <w:p/>
+        </w:tc>
+        <w:tc>
+          <w:tcPr>
+            <w:tcW w:w="4395" w:type="dxa"/>
+          </w:tcPr>
+          <w:p>
+            <w:pPr>
+              <w:rPr>
+                <w:color w:val="000000" w:themeColor="text1"/>
+              </w:rPr>
+            </w:pPr>
+            <w:r>
+              <w:rPr>
+                <w:color w:val="000000" w:themeColor="text1"/>
+              </w:rPr>
+              <w:t>http://127.0.0.1:8000/chat-rooms/{chat_room_id}/messages/{id}/</w:t>
+            </w:r>
+          </w:p>
+        </w:tc>
+        <w:tc>
+          <w:tcPr>
+            <w:tcW w:w="1417" w:type="dxa"/>
+          </w:tcPr>
+          <w:p>
+            <w:pPr>
+              <w:rPr>
+                <w:b/>
+                <w:bCs/>
+              </w:rPr>
+            </w:pPr>
+            <w:r>
+              <w:rPr>
+                <w:b/>
+                <w:bCs/>
+              </w:rPr>
+              <w:t>GET</w:t>
+            </w:r>
+          </w:p>
+        </w:tc>
+        <w:tc>
+          <w:tcPr>
+            <w:tcW w:w="1134" w:type="dxa"/>
+          </w:tcPr>
+          <w:p>
+            <w:pPr>
+              <w:rPr>
+                <w:b/>
+                <w:bCs/>
+                <w:color w:val="196B24" w:themeColor="accent3"/>
+              </w:rPr>
+            </w:pPr>
+            <w:r>
+              <w:rPr>
+                <w:b/>
+                <w:bCs/>
+                <w:color w:val="196B24" w:themeColor="accent3"/>
+              </w:rPr>
+              <w:t>Pending</w:t>
+            </w:r>
+          </w:p>
+        </w:tc>
+        <w:tc>
+          <w:tcPr>
+            <w:tcW w:w="1985" w:type="dxa"/>
+          </w:tcPr>
+          <w:p>
+            <w:r>
+              <w:t>Lấy thông tin chi tiết một tin nhắn</w:t>
+            </w:r>
+          </w:p>
+        </w:tc>
+        <w:tc>
+          <w:tcPr>
+            <w:tcW w:w="1417" w:type="dxa"/>
+          </w:tcPr>
+          <w:p>
+            <w:pPr>
+              <w:rPr>
+                <w:b/>
+                <w:bCs/>
+                <w:color w:val="196B24" w:themeColor="accent3"/>
+              </w:rPr>
+            </w:pPr>
+          </w:p>
+        </w:tc>
+      </w:tr>
+      <w:tr>
+        <w:tc>
+          <w:tcPr>
+            <w:tcW w:w="1276" w:type="dxa"/>
+          </w:tcPr>
+          <w:p/>
+        </w:tc>
+        <w:tc>
+          <w:tcPr>
+            <w:tcW w:w="4395" w:type="dxa"/>
+          </w:tcPr>
+          <w:p>
+            <w:pPr>
+              <w:rPr>
+                <w:color w:val="000000" w:themeColor="text1"/>
+              </w:rPr>
+            </w:pPr>
+            <w:r>
+              <w:rPr>
+                <w:color w:val="000000" w:themeColor="text1"/>
+              </w:rPr>
+              <w:t>http://127.0.0.1:8000/chat-rooms/{chat_room_id}/messages/{id}/</w:t>
+            </w:r>
+          </w:p>
+        </w:tc>
+        <w:tc>
+          <w:tcPr>
+            <w:tcW w:w="1417" w:type="dxa"/>
+          </w:tcPr>
+          <w:p>
+            <w:pPr>
+              <w:rPr>
+                <w:b/>
+                <w:bCs/>
+              </w:rPr>
+            </w:pPr>
+            <w:r>
+              <w:rPr>
+                <w:b/>
+                <w:bCs/>
+              </w:rPr>
+              <w:t>PATCH</w:t>
+            </w:r>
+          </w:p>
+        </w:tc>
+        <w:tc>
+          <w:tcPr>
+            <w:tcW w:w="1134" w:type="dxa"/>
+          </w:tcPr>
+          <w:p>
+            <w:pPr>
+              <w:rPr>
+                <w:b/>
+                <w:bCs/>
+                <w:color w:val="196B24" w:themeColor="accent3"/>
+              </w:rPr>
+            </w:pPr>
+            <w:r>
+              <w:rPr>
+                <w:b/>
+                <w:bCs/>
+                <w:color w:val="196B24" w:themeColor="accent3"/>
+              </w:rPr>
+              <w:t>Pending</w:t>
+            </w:r>
+          </w:p>
+        </w:tc>
+        <w:tc>
+          <w:tcPr>
+            <w:tcW w:w="1985" w:type="dxa"/>
+          </w:tcPr>
+          <w:p>
+            <w:r>
+              <w:t>Cập nhật tin nhắn</w:t>
+            </w:r>
+          </w:p>
+        </w:tc>
+        <w:tc>
+          <w:tcPr>
+            <w:tcW w:w="1417" w:type="dxa"/>
+          </w:tcPr>
+          <w:p>
+            <w:pPr>
+              <w:rPr>
+                <w:b/>
+                <w:bCs/>
+                <w:color w:val="196B24" w:themeColor="accent3"/>
+              </w:rPr>
+            </w:pPr>
+          </w:p>
+        </w:tc>
+      </w:tr>
+      <w:tr>
+        <w:tc>
+          <w:tcPr>
+            <w:tcW w:w="1276" w:type="dxa"/>
+          </w:tcPr>
+          <w:p/>
+        </w:tc>
+        <w:tc>
+          <w:tcPr>
+            <w:tcW w:w="4395" w:type="dxa"/>
+          </w:tcPr>
+          <w:p>
+            <w:pPr>
+              <w:rPr>
+                <w:color w:val="000000" w:themeColor="text1"/>
+              </w:rPr>
+            </w:pPr>
+            <w:r>
+              <w:rPr>
+                <w:color w:val="000000" w:themeColor="text1"/>
+              </w:rPr>
+              <w:t>http://127.0.0.1:8000/chat-rooms/{chat_room_id}/messages/{id}/</w:t>
+            </w:r>
+          </w:p>
+        </w:tc>
+        <w:tc>
+          <w:tcPr>
+            <w:tcW w:w="1417" w:type="dxa"/>
+          </w:tcPr>
+          <w:p>
+            <w:pPr>
+              <w:rPr>
+                <w:b/>
+                <w:bCs/>
+              </w:rPr>
+            </w:pPr>
+            <w:r>
+              <w:rPr>
+                <w:b/>
+                <w:bCs/>
+              </w:rPr>
+              <w:t>DELETE</w:t>
+            </w:r>
+          </w:p>
+        </w:tc>
+        <w:tc>
+          <w:tcPr>
+            <w:tcW w:w="1134" w:type="dxa"/>
+          </w:tcPr>
+          <w:p>
+            <w:pPr>
+              <w:rPr>
+                <w:b/>
+                <w:bCs/>
+                <w:color w:val="196B24" w:themeColor="accent3"/>
+              </w:rPr>
+            </w:pPr>
+            <w:r>
+              <w:rPr>
+                <w:b/>
+                <w:bCs/>
+                <w:color w:val="196B24" w:themeColor="accent3"/>
+              </w:rPr>
+              <w:t>Pending</w:t>
+            </w:r>
+          </w:p>
+        </w:tc>
+        <w:tc>
+          <w:tcPr>
+            <w:tcW w:w="1985" w:type="dxa"/>
+          </w:tcPr>
+          <w:p>
+            <w:r>
+              <w:t>Xóa tin nhắn</w:t>
+            </w:r>
+          </w:p>
+        </w:tc>
+        <w:tc>
+          <w:tcPr>
+            <w:tcW w:w="1417" w:type="dxa"/>
+          </w:tcPr>
+          <w:p>
+            <w:pPr>
+              <w:rPr>
+                <w:b/>
+                <w:bCs/>
+                <w:color w:val="196B24" w:themeColor="accent3"/>
+              </w:rPr>
+            </w:pPr>
+          </w:p>
+        </w:tc>
+      </w:tr>
+      <w:tr>
+        <w:tc>
+          <w:tcPr>
+            <w:tcW w:w="1276" w:type="dxa"/>
+          </w:tcPr>
+          <w:p/>
+        </w:tc>
+        <w:tc>
+          <w:tcPr>
+            <w:tcW w:w="4395" w:type="dxa"/>
+          </w:tcPr>
+          <w:p>
+            <w:pPr>
+              <w:rPr>
+                <w:color w:val="000000" w:themeColor="text1"/>
+              </w:rPr>
+            </w:pPr>
+            <w:r>
+              <w:rPr>
+                <w:color w:val="000000" w:themeColor="text1"/>
+              </w:rPr>
+              <w:t>http://127.0.0.1:8000/chat-rooms/{chat_room_id}/messages/{id}/read/</w:t>
+            </w:r>
+          </w:p>
+        </w:tc>
+        <w:tc>
+          <w:tcPr>
+            <w:tcW w:w="1417" w:type="dxa"/>
+          </w:tcPr>
+          <w:p>
+            <w:pPr>
+              <w:rPr>
+                <w:b/>
+                <w:bCs/>
+              </w:rPr>
+            </w:pPr>
+            <w:r>
+              <w:rPr>
+                <w:b/>
+                <w:bCs/>
+              </w:rPr>
+              <w:t>PUT</w:t>
+            </w:r>
+          </w:p>
+        </w:tc>
+        <w:tc>
+          <w:tcPr>
+            <w:tcW w:w="1134" w:type="dxa"/>
+          </w:tcPr>
+          <w:p>
+            <w:pPr>
+              <w:rPr>
+                <w:b/>
+                <w:bCs/>
+                <w:color w:val="196B24" w:themeColor="accent3"/>
+              </w:rPr>
+            </w:pPr>
+            <w:r>
+              <w:rPr>
+                <w:b/>
+                <w:bCs/>
+                <w:color w:val="196B24" w:themeColor="accent3"/>
+              </w:rPr>
+              <w:t>Pending</w:t>
+            </w:r>
+          </w:p>
+        </w:tc>
+        <w:tc>
+          <w:tcPr>
+            <w:tcW w:w="1985" w:type="dxa"/>
+          </w:tcPr>
+          <w:p>
+            <w:r>
+              <w:t>Đánh dấu tin nhắn là đã đọc</w:t>
+            </w:r>
+          </w:p>
         </w:tc>
         <w:tc>
           <w:tcPr>

</xml_diff>

<commit_message>
đang sửa đổi, landlord, tenant, và user, có vấn đề trong việc tạo dữ liệu mới
</commit_message>
<xml_diff>
--- a/Hỗ trợ tìm kiếm nhà trọ.docx
+++ b/Hỗ trợ tìm kiếm nhà trọ.docx
@@ -9764,9 +9764,9 @@
               <w:rPr>
                 <w:b/>
                 <w:bCs/>
-                <w:color w:val="A02B93" w:themeColor="accent5"/>
-              </w:rPr>
-              <w:t>Pending</w:t>
+                <w:color w:val="196B24" w:themeColor="accent3"/>
+              </w:rPr>
+              <w:t>OK</w:t>
             </w:r>
           </w:p>
         </w:tc>
@@ -9777,6 +9777,9 @@
           <w:p>
             <w:r>
               <w:t>Lấy list users</w:t>
+            </w:r>
+            <w:r>
+              <w:t xml:space="preserve"> (có chứng thực)</w:t>
             </w:r>
           </w:p>
         </w:tc>
@@ -9808,7 +9811,7 @@
           </w:tcPr>
           <w:p>
             <w:r>
-              <w:t>Tạm thời để lại vì cần có thêm xác thực tài khoản, xem tiếp video anh thành</w:t>
+              <w:t>{{127}}/oauth/token/</w:t>
             </w:r>
           </w:p>
         </w:tc>
@@ -9823,6 +9826,13 @@
                 <w:bCs/>
               </w:rPr>
             </w:pPr>
+            <w:r>
+              <w:rPr>
+                <w:b/>
+                <w:bCs/>
+              </w:rPr>
+              <w:t>POST</w:t>
+            </w:r>
           </w:p>
         </w:tc>
         <w:tc>
@@ -9841,9 +9851,9 @@
               <w:rPr>
                 <w:b/>
                 <w:bCs/>
-                <w:color w:val="A02B93" w:themeColor="accent5"/>
-              </w:rPr>
-              <w:t>Pending</w:t>
+                <w:color w:val="196B24" w:themeColor="accent3"/>
+              </w:rPr>
+              <w:t>OK</w:t>
             </w:r>
           </w:p>
         </w:tc>
@@ -9851,6 +9861,22 @@
           <w:tcPr>
             <w:tcW w:w="1985" w:type="dxa"/>
           </w:tcPr>
+          <w:p>
+            <w:pPr>
+              <w:rPr>
+                <w:lang w:val="vi-VN"/>
+              </w:rPr>
+            </w:pPr>
+            <w:r>
+              <w:t xml:space="preserve">Lấy </w:t>
+            </w:r>
+            <w:r>
+              <w:rPr>
+                <w:lang w:val="vi-VN"/>
+              </w:rPr>
+              <w:t>access_token</w:t>
+            </w:r>
+          </w:p>
           <w:p/>
         </w:tc>
         <w:tc>
@@ -9873,11 +9899,7 @@
           <w:tcPr>
             <w:tcW w:w="1276" w:type="dxa"/>
           </w:tcPr>
-          <w:p>
-            <w:r>
-              <w:t>POSTMAN</w:t>
-            </w:r>
-          </w:p>
+          <w:p/>
         </w:tc>
         <w:tc>
           <w:tcPr>
@@ -9885,7 +9907,7 @@
           </w:tcPr>
           <w:p>
             <w:r>
-              <w:t>{{127}}/oauth/token/</w:t>
+              <w:t>{{127}}/users/current-user/</w:t>
             </w:r>
           </w:p>
         </w:tc>
@@ -9905,7 +9927,7 @@
                 <w:b/>
                 <w:bCs/>
               </w:rPr>
-              <w:t>POST</w:t>
+              <w:t>GET</w:t>
             </w:r>
           </w:p>
         </w:tc>
@@ -9936,22 +9958,10 @@
             <w:tcW w:w="1985" w:type="dxa"/>
           </w:tcPr>
           <w:p>
-            <w:pPr>
-              <w:rPr>
-                <w:lang w:val="vi-VN"/>
-              </w:rPr>
-            </w:pPr>
-            <w:r>
-              <w:t xml:space="preserve">Lấy </w:t>
-            </w:r>
-            <w:r>
-              <w:rPr>
-                <w:lang w:val="vi-VN"/>
-              </w:rPr>
-              <w:t>access_token</w:t>
-            </w:r>
-          </w:p>
-          <w:p/>
+            <w:r>
+              <w:t>Lấy user hiện tại</w:t>
+            </w:r>
+          </w:p>
         </w:tc>
         <w:tc>
           <w:tcPr>
@@ -10001,7 +10011,7 @@
                 <w:b/>
                 <w:bCs/>
               </w:rPr>
-              <w:t>GET</w:t>
+              <w:t>PATH</w:t>
             </w:r>
           </w:p>
         </w:tc>
@@ -10033,7 +10043,7 @@
           </w:tcPr>
           <w:p>
             <w:r>
-              <w:t>Lấy user hiện tại</w:t>
+              <w:t>Thay đổi, cập nhập thông tin user</w:t>
             </w:r>
           </w:p>
         </w:tc>
@@ -10065,7 +10075,7 @@
           </w:tcPr>
           <w:p>
             <w:r>
-              <w:t>{{127}}/users/current-user/</w:t>
+              <w:t>{{127}}/users/change-password/</w:t>
             </w:r>
           </w:p>
         </w:tc>
@@ -10085,7 +10095,7 @@
                 <w:b/>
                 <w:bCs/>
               </w:rPr>
-              <w:t>PATH</w:t>
+              <w:t>POST</w:t>
             </w:r>
           </w:p>
         </w:tc>
@@ -10117,7 +10127,10 @@
           </w:tcPr>
           <w:p>
             <w:r>
-              <w:t>Thay đổi, cập nhập thông tin user</w:t>
+              <w:t>Thay đổi mật khẩu</w:t>
+            </w:r>
+            <w:r>
+              <w:t xml:space="preserve"> (code này có thểm yêu cầu nhập lại mật khẩu mới)</w:t>
             </w:r>
           </w:p>
         </w:tc>
@@ -10148,9 +10161,13 @@
             <w:tcW w:w="4395" w:type="dxa"/>
           </w:tcPr>
           <w:p>
-            <w:r>
-              <w:t>{{127}}/users/change-password/</w:t>
-            </w:r>
+            <w:pPr>
+              <w:rPr>
+                <w:b/>
+                <w:bCs/>
+                <w:color w:val="FF0000"/>
+              </w:rPr>
+            </w:pPr>
           </w:p>
         </w:tc>
         <w:tc>
@@ -10164,13 +10181,6 @@
                 <w:bCs/>
               </w:rPr>
             </w:pPr>
-            <w:r>
-              <w:rPr>
-                <w:b/>
-                <w:bCs/>
-              </w:rPr>
-              <w:t>POST</w:t>
-            </w:r>
           </w:p>
         </w:tc>
         <w:tc>
@@ -10185,28 +10195,13 @@
                 <w:color w:val="196B24" w:themeColor="accent3"/>
               </w:rPr>
             </w:pPr>
-            <w:r>
-              <w:rPr>
-                <w:b/>
-                <w:bCs/>
-                <w:color w:val="196B24" w:themeColor="accent3"/>
-              </w:rPr>
-              <w:t>OK</w:t>
-            </w:r>
           </w:p>
         </w:tc>
         <w:tc>
           <w:tcPr>
             <w:tcW w:w="1985" w:type="dxa"/>
           </w:tcPr>
-          <w:p>
-            <w:r>
-              <w:t>Thay đổi mật khẩu</w:t>
-            </w:r>
-            <w:r>
-              <w:t xml:space="preserve"> (code này có thểm yêu cầu nhập lại mật khẩu mới)</w:t>
-            </w:r>
-          </w:p>
+          <w:p/>
         </w:tc>
         <w:tc>
           <w:tcPr>
@@ -10296,6 +10291,213 @@
         <w:tc>
           <w:tcPr>
             <w:tcW w:w="1276" w:type="dxa"/>
+          </w:tcPr>
+          <w:p/>
+        </w:tc>
+        <w:tc>
+          <w:tcPr>
+            <w:tcW w:w="4395" w:type="dxa"/>
+          </w:tcPr>
+          <w:p>
+            <w:pPr>
+              <w:rPr>
+                <w:b/>
+                <w:bCs/>
+                <w:color w:val="FF0000"/>
+              </w:rPr>
+            </w:pPr>
+          </w:p>
+        </w:tc>
+        <w:tc>
+          <w:tcPr>
+            <w:tcW w:w="1417" w:type="dxa"/>
+          </w:tcPr>
+          <w:p>
+            <w:pPr>
+              <w:rPr>
+                <w:b/>
+                <w:bCs/>
+              </w:rPr>
+            </w:pPr>
+          </w:p>
+        </w:tc>
+        <w:tc>
+          <w:tcPr>
+            <w:tcW w:w="1134" w:type="dxa"/>
+          </w:tcPr>
+          <w:p>
+            <w:pPr>
+              <w:rPr>
+                <w:b/>
+                <w:bCs/>
+                <w:color w:val="196B24" w:themeColor="accent3"/>
+              </w:rPr>
+            </w:pPr>
+          </w:p>
+        </w:tc>
+        <w:tc>
+          <w:tcPr>
+            <w:tcW w:w="1985" w:type="dxa"/>
+          </w:tcPr>
+          <w:p/>
+        </w:tc>
+        <w:tc>
+          <w:tcPr>
+            <w:tcW w:w="1417" w:type="dxa"/>
+          </w:tcPr>
+          <w:p>
+            <w:pPr>
+              <w:rPr>
+                <w:b/>
+                <w:bCs/>
+                <w:color w:val="196B24" w:themeColor="accent3"/>
+              </w:rPr>
+            </w:pPr>
+          </w:p>
+        </w:tc>
+      </w:tr>
+      <w:tr>
+        <w:tc>
+          <w:tcPr>
+            <w:tcW w:w="1276" w:type="dxa"/>
+          </w:tcPr>
+          <w:p/>
+        </w:tc>
+        <w:tc>
+          <w:tcPr>
+            <w:tcW w:w="4395" w:type="dxa"/>
+          </w:tcPr>
+          <w:p>
+            <w:pPr>
+              <w:rPr>
+                <w:b/>
+                <w:bCs/>
+                <w:color w:val="FF0000"/>
+              </w:rPr>
+            </w:pPr>
+          </w:p>
+        </w:tc>
+        <w:tc>
+          <w:tcPr>
+            <w:tcW w:w="1417" w:type="dxa"/>
+          </w:tcPr>
+          <w:p>
+            <w:pPr>
+              <w:rPr>
+                <w:b/>
+                <w:bCs/>
+              </w:rPr>
+            </w:pPr>
+          </w:p>
+        </w:tc>
+        <w:tc>
+          <w:tcPr>
+            <w:tcW w:w="1134" w:type="dxa"/>
+          </w:tcPr>
+          <w:p>
+            <w:pPr>
+              <w:rPr>
+                <w:b/>
+                <w:bCs/>
+                <w:color w:val="196B24" w:themeColor="accent3"/>
+              </w:rPr>
+            </w:pPr>
+          </w:p>
+        </w:tc>
+        <w:tc>
+          <w:tcPr>
+            <w:tcW w:w="1985" w:type="dxa"/>
+          </w:tcPr>
+          <w:p/>
+        </w:tc>
+        <w:tc>
+          <w:tcPr>
+            <w:tcW w:w="1417" w:type="dxa"/>
+          </w:tcPr>
+          <w:p>
+            <w:pPr>
+              <w:rPr>
+                <w:b/>
+                <w:bCs/>
+                <w:color w:val="196B24" w:themeColor="accent3"/>
+              </w:rPr>
+            </w:pPr>
+          </w:p>
+        </w:tc>
+      </w:tr>
+      <w:tr>
+        <w:tc>
+          <w:tcPr>
+            <w:tcW w:w="1276" w:type="dxa"/>
+          </w:tcPr>
+          <w:p/>
+        </w:tc>
+        <w:tc>
+          <w:tcPr>
+            <w:tcW w:w="4395" w:type="dxa"/>
+          </w:tcPr>
+          <w:p>
+            <w:pPr>
+              <w:rPr>
+                <w:b/>
+                <w:bCs/>
+                <w:color w:val="FF0000"/>
+              </w:rPr>
+            </w:pPr>
+          </w:p>
+        </w:tc>
+        <w:tc>
+          <w:tcPr>
+            <w:tcW w:w="1417" w:type="dxa"/>
+          </w:tcPr>
+          <w:p>
+            <w:pPr>
+              <w:rPr>
+                <w:b/>
+                <w:bCs/>
+              </w:rPr>
+            </w:pPr>
+          </w:p>
+        </w:tc>
+        <w:tc>
+          <w:tcPr>
+            <w:tcW w:w="1134" w:type="dxa"/>
+          </w:tcPr>
+          <w:p>
+            <w:pPr>
+              <w:rPr>
+                <w:b/>
+                <w:bCs/>
+                <w:color w:val="196B24" w:themeColor="accent3"/>
+              </w:rPr>
+            </w:pPr>
+          </w:p>
+        </w:tc>
+        <w:tc>
+          <w:tcPr>
+            <w:tcW w:w="1985" w:type="dxa"/>
+          </w:tcPr>
+          <w:p/>
+        </w:tc>
+        <w:tc>
+          <w:tcPr>
+            <w:tcW w:w="1417" w:type="dxa"/>
+          </w:tcPr>
+          <w:p>
+            <w:pPr>
+              <w:rPr>
+                <w:b/>
+                <w:bCs/>
+                <w:color w:val="196B24" w:themeColor="accent3"/>
+              </w:rPr>
+            </w:pPr>
+          </w:p>
+        </w:tc>
+      </w:tr>
+      <w:tr>
+        <w:tc>
+          <w:tcPr>
+            <w:tcW w:w="1276" w:type="dxa"/>
             <w:shd w:val="clear" w:color="auto" w:fill="D9D9D9" w:themeFill="background1" w:themeFillShade="D9"/>
           </w:tcPr>
           <w:p/>
@@ -10523,7 +10725,11 @@
           </w:tcPr>
           <w:p>
             <w:r>
-              <w:t>Còn vấn đề tên có dấu đã tạo code nhưng chưa kiểm chứng được (chắc chưa được, đã test lần 1)</w:t>
+              <w:t xml:space="preserve">Còn vấn đề tên có dấu đã tạo code nhưng chưa kiểm </w:t>
+            </w:r>
+            <w:r>
+              <w:lastRenderedPageBreak/>
+              <w:t>chứng được (chắc chưa được, đã test lần 1)</w:t>
             </w:r>
           </w:p>
         </w:tc>
@@ -10545,6 +10751,7 @@
                 <w:bCs/>
                 <w:color w:val="196B24" w:themeColor="accent3"/>
               </w:rPr>
+              <w:lastRenderedPageBreak/>
               <w:t>PASS</w:t>
             </w:r>
           </w:p>
@@ -10989,7 +11196,353 @@
           <w:tcPr>
             <w:tcW w:w="4395" w:type="dxa"/>
           </w:tcPr>
+          <w:p>
+            <w:pPr>
+              <w:rPr>
+                <w:color w:val="FF0000"/>
+              </w:rPr>
+            </w:pPr>
+            <w:r>
+              <w:rPr>
+                <w:color w:val="FF0000"/>
+              </w:rPr>
+              <w:t>http://127.0.0.1:8000/landlords/TranBich/</w:t>
+            </w:r>
+          </w:p>
+        </w:tc>
+        <w:tc>
+          <w:tcPr>
+            <w:tcW w:w="1417" w:type="dxa"/>
+          </w:tcPr>
+          <w:p>
+            <w:pPr>
+              <w:rPr>
+                <w:b/>
+                <w:bCs/>
+              </w:rPr>
+            </w:pPr>
+            <w:r>
+              <w:rPr>
+                <w:b/>
+                <w:bCs/>
+              </w:rPr>
+              <w:t>GET</w:t>
+            </w:r>
+          </w:p>
+        </w:tc>
+        <w:tc>
+          <w:tcPr>
+            <w:tcW w:w="1134" w:type="dxa"/>
+          </w:tcPr>
+          <w:p>
+            <w:pPr>
+              <w:rPr>
+                <w:b/>
+                <w:bCs/>
+                <w:color w:val="196B24" w:themeColor="accent3"/>
+              </w:rPr>
+            </w:pPr>
+          </w:p>
+        </w:tc>
+        <w:tc>
+          <w:tcPr>
+            <w:tcW w:w="1985" w:type="dxa"/>
+          </w:tcPr>
+          <w:p>
+            <w:r>
+              <w:t>Lấy thông tin chi tiết của một chủ trọ theo usernam</w:t>
+            </w:r>
+            <w:r>
+              <w:t>e</w:t>
+            </w:r>
+          </w:p>
+        </w:tc>
+        <w:tc>
+          <w:tcPr>
+            <w:tcW w:w="1417" w:type="dxa"/>
+          </w:tcPr>
+          <w:p>
+            <w:pPr>
+              <w:rPr>
+                <w:b/>
+                <w:bCs/>
+                <w:color w:val="196B24" w:themeColor="accent3"/>
+              </w:rPr>
+            </w:pPr>
+          </w:p>
+        </w:tc>
+      </w:tr>
+      <w:tr>
+        <w:tc>
+          <w:tcPr>
+            <w:tcW w:w="1276" w:type="dxa"/>
+          </w:tcPr>
           <w:p/>
+        </w:tc>
+        <w:tc>
+          <w:tcPr>
+            <w:tcW w:w="4395" w:type="dxa"/>
+          </w:tcPr>
+          <w:p>
+            <w:pPr>
+              <w:rPr>
+                <w:color w:val="FF0000"/>
+              </w:rPr>
+            </w:pPr>
+            <w:r>
+              <w:rPr>
+                <w:color w:val="FF0000"/>
+              </w:rPr>
+              <w:t xml:space="preserve">http://127.0.0.1:8000/landlords/ </w:t>
+            </w:r>
+            <w:r>
+              <w:rPr>
+                <w:color w:val="FF0000"/>
+              </w:rPr>
+              <w:t>QuangHieu</w:t>
+            </w:r>
+            <w:r>
+              <w:rPr>
+                <w:color w:val="FF0000"/>
+              </w:rPr>
+              <w:t>/</w:t>
+            </w:r>
+          </w:p>
+        </w:tc>
+        <w:tc>
+          <w:tcPr>
+            <w:tcW w:w="1417" w:type="dxa"/>
+          </w:tcPr>
+          <w:p>
+            <w:pPr>
+              <w:rPr>
+                <w:b/>
+                <w:bCs/>
+              </w:rPr>
+            </w:pPr>
+            <w:r>
+              <w:rPr>
+                <w:b/>
+                <w:bCs/>
+              </w:rPr>
+              <w:t>PUT</w:t>
+            </w:r>
+          </w:p>
+        </w:tc>
+        <w:tc>
+          <w:tcPr>
+            <w:tcW w:w="1134" w:type="dxa"/>
+          </w:tcPr>
+          <w:p>
+            <w:pPr>
+              <w:rPr>
+                <w:b/>
+                <w:bCs/>
+                <w:color w:val="196B24" w:themeColor="accent3"/>
+              </w:rPr>
+            </w:pPr>
+          </w:p>
+        </w:tc>
+        <w:tc>
+          <w:tcPr>
+            <w:tcW w:w="1985" w:type="dxa"/>
+          </w:tcPr>
+          <w:p>
+            <w:r>
+              <w:t>Cập nhật thông tin chủ trọ</w:t>
+            </w:r>
+            <w:r>
+              <w:t xml:space="preserve"> (phải get ra để hiển thị muốn sửa tất cả, không có PATCH)</w:t>
+            </w:r>
+          </w:p>
+        </w:tc>
+        <w:tc>
+          <w:tcPr>
+            <w:tcW w:w="1417" w:type="dxa"/>
+          </w:tcPr>
+          <w:p>
+            <w:pPr>
+              <w:rPr>
+                <w:b/>
+                <w:bCs/>
+                <w:color w:val="196B24" w:themeColor="accent3"/>
+              </w:rPr>
+            </w:pPr>
+          </w:p>
+        </w:tc>
+      </w:tr>
+      <w:tr>
+        <w:tc>
+          <w:tcPr>
+            <w:tcW w:w="1276" w:type="dxa"/>
+          </w:tcPr>
+          <w:p/>
+        </w:tc>
+        <w:tc>
+          <w:tcPr>
+            <w:tcW w:w="4395" w:type="dxa"/>
+          </w:tcPr>
+          <w:p>
+            <w:pPr>
+              <w:rPr>
+                <w:color w:val="FF0000"/>
+              </w:rPr>
+            </w:pPr>
+            <w:r>
+              <w:rPr>
+                <w:color w:val="FF0000"/>
+              </w:rPr>
+              <w:t>{{127}}/landlords/QuangHieu/verify/</w:t>
+            </w:r>
+          </w:p>
+        </w:tc>
+        <w:tc>
+          <w:tcPr>
+            <w:tcW w:w="1417" w:type="dxa"/>
+          </w:tcPr>
+          <w:p>
+            <w:pPr>
+              <w:rPr>
+                <w:b/>
+                <w:bCs/>
+              </w:rPr>
+            </w:pPr>
+            <w:r>
+              <w:rPr>
+                <w:b/>
+                <w:bCs/>
+              </w:rPr>
+              <w:t>PATCH</w:t>
+            </w:r>
+          </w:p>
+        </w:tc>
+        <w:tc>
+          <w:tcPr>
+            <w:tcW w:w="1134" w:type="dxa"/>
+          </w:tcPr>
+          <w:p>
+            <w:pPr>
+              <w:rPr>
+                <w:b/>
+                <w:bCs/>
+                <w:color w:val="196B24" w:themeColor="accent3"/>
+              </w:rPr>
+            </w:pPr>
+          </w:p>
+        </w:tc>
+        <w:tc>
+          <w:tcPr>
+            <w:tcW w:w="1985" w:type="dxa"/>
+          </w:tcPr>
+          <w:p>
+            <w:r>
+              <w:t>Xác thực chủ trọ</w:t>
+            </w:r>
+            <w:r>
+              <w:t>, chỉ admin làm được. click thành công là xác thực</w:t>
+            </w:r>
+          </w:p>
+        </w:tc>
+        <w:tc>
+          <w:tcPr>
+            <w:tcW w:w="1417" w:type="dxa"/>
+          </w:tcPr>
+          <w:p>
+            <w:pPr>
+              <w:rPr>
+                <w:b/>
+                <w:bCs/>
+                <w:color w:val="196B24" w:themeColor="accent3"/>
+              </w:rPr>
+            </w:pPr>
+          </w:p>
+        </w:tc>
+      </w:tr>
+      <w:tr>
+        <w:tc>
+          <w:tcPr>
+            <w:tcW w:w="1276" w:type="dxa"/>
+          </w:tcPr>
+          <w:p/>
+        </w:tc>
+        <w:tc>
+          <w:tcPr>
+            <w:tcW w:w="4395" w:type="dxa"/>
+          </w:tcPr>
+          <w:p>
+            <w:pPr>
+              <w:rPr>
+                <w:color w:val="FF0000"/>
+              </w:rPr>
+            </w:pPr>
+          </w:p>
+        </w:tc>
+        <w:tc>
+          <w:tcPr>
+            <w:tcW w:w="1417" w:type="dxa"/>
+          </w:tcPr>
+          <w:p>
+            <w:pPr>
+              <w:rPr>
+                <w:b/>
+                <w:bCs/>
+              </w:rPr>
+            </w:pPr>
+          </w:p>
+        </w:tc>
+        <w:tc>
+          <w:tcPr>
+            <w:tcW w:w="1134" w:type="dxa"/>
+          </w:tcPr>
+          <w:p>
+            <w:pPr>
+              <w:rPr>
+                <w:b/>
+                <w:bCs/>
+                <w:color w:val="196B24" w:themeColor="accent3"/>
+              </w:rPr>
+            </w:pPr>
+          </w:p>
+        </w:tc>
+        <w:tc>
+          <w:tcPr>
+            <w:tcW w:w="1985" w:type="dxa"/>
+          </w:tcPr>
+          <w:p/>
+        </w:tc>
+        <w:tc>
+          <w:tcPr>
+            <w:tcW w:w="1417" w:type="dxa"/>
+          </w:tcPr>
+          <w:p>
+            <w:pPr>
+              <w:rPr>
+                <w:b/>
+                <w:bCs/>
+                <w:color w:val="196B24" w:themeColor="accent3"/>
+              </w:rPr>
+            </w:pPr>
+          </w:p>
+        </w:tc>
+      </w:tr>
+      <w:tr>
+        <w:tc>
+          <w:tcPr>
+            <w:tcW w:w="1276" w:type="dxa"/>
+          </w:tcPr>
+          <w:p/>
+        </w:tc>
+        <w:tc>
+          <w:tcPr>
+            <w:tcW w:w="4395" w:type="dxa"/>
+          </w:tcPr>
+          <w:p>
+            <w:pPr>
+              <w:rPr>
+                <w:color w:val="FF0000"/>
+              </w:rPr>
+            </w:pPr>
+          </w:p>
         </w:tc>
         <w:tc>
           <w:tcPr>
@@ -11940,6 +12493,7 @@
           </w:tcPr>
           <w:p>
             <w:r>
+              <w:lastRenderedPageBreak/>
               <w:t>Comment</w:t>
             </w:r>
           </w:p>
@@ -16040,7 +16594,16 @@
                 <w:bCs/>
                 <w:color w:val="196B24" w:themeColor="accent3"/>
               </w:rPr>
-              <w:t>Body: {"content": "Nội dung tin nhắn"}</w:t>
+              <w:t xml:space="preserve">Body: {"content": </w:t>
+            </w:r>
+            <w:r>
+              <w:rPr>
+                <w:b/>
+                <w:bCs/>
+                <w:color w:val="196B24" w:themeColor="accent3"/>
+              </w:rPr>
+              <w:lastRenderedPageBreak/>
+              <w:t>"Nội dung tin nhắn"}</w:t>
             </w:r>
           </w:p>
         </w:tc>
@@ -24569,7 +25132,6 @@
     <w:next w:val="Normal"/>
     <w:link w:val="Heading3Char"/>
     <w:uiPriority w:val="9"/>
-    <w:semiHidden/>
     <w:unhideWhenUsed/>
     <w:qFormat/>
     <w:rsid w:val="00503910"/>
@@ -24775,7 +25337,6 @@
     <w:basedOn w:val="DefaultParagraphFont"/>
     <w:link w:val="Heading3"/>
     <w:uiPriority w:val="9"/>
-    <w:semiHidden/>
     <w:rsid w:val="00503910"/>
     <w:rPr>
       <w:rFonts w:eastAsiaTheme="majorEastAsia" w:cstheme="majorBidi"/>

</xml_diff>

<commit_message>
cập nhập sửa lỗi login for user
</commit_message>
<xml_diff>
--- a/Hỗ trợ tìm kiếm nhà trọ.docx
+++ b/Hỗ trợ tìm kiếm nhà trọ.docx
@@ -9943,14 +9943,6 @@
                 <w:color w:val="196B24" w:themeColor="accent3"/>
               </w:rPr>
             </w:pPr>
-            <w:r>
-              <w:rPr>
-                <w:b/>
-                <w:bCs/>
-                <w:color w:val="196B24" w:themeColor="accent3"/>
-              </w:rPr>
-              <w:t>OK</w:t>
-            </w:r>
           </w:p>
         </w:tc>
         <w:tc>
@@ -10027,14 +10019,6 @@
                 <w:color w:val="196B24" w:themeColor="accent3"/>
               </w:rPr>
             </w:pPr>
-            <w:r>
-              <w:rPr>
-                <w:b/>
-                <w:bCs/>
-                <w:color w:val="196B24" w:themeColor="accent3"/>
-              </w:rPr>
-              <w:t>OK</w:t>
-            </w:r>
           </w:p>
         </w:tc>
         <w:tc>
@@ -10111,14 +10095,6 @@
                 <w:color w:val="196B24" w:themeColor="accent3"/>
               </w:rPr>
             </w:pPr>
-            <w:r>
-              <w:rPr>
-                <w:b/>
-                <w:bCs/>
-                <w:color w:val="196B24" w:themeColor="accent3"/>
-              </w:rPr>
-              <w:t>OK</w:t>
-            </w:r>
           </w:p>
         </w:tc>
         <w:tc>
@@ -10168,6 +10144,14 @@
                 <w:color w:val="FF0000"/>
               </w:rPr>
             </w:pPr>
+            <w:r>
+              <w:rPr>
+                <w:b/>
+                <w:bCs/>
+                <w:color w:val="FF0000"/>
+              </w:rPr>
+              <w:t>http://127.0.0.1:8000/users/</w:t>
+            </w:r>
           </w:p>
         </w:tc>
         <w:tc>
@@ -10181,6 +10165,13 @@
                 <w:bCs/>
               </w:rPr>
             </w:pPr>
+            <w:r>
+              <w:rPr>
+                <w:b/>
+                <w:bCs/>
+              </w:rPr>
+              <w:t>POST</w:t>
+            </w:r>
           </w:p>
         </w:tc>
         <w:tc>
@@ -10195,13 +10186,25 @@
                 <w:color w:val="196B24" w:themeColor="accent3"/>
               </w:rPr>
             </w:pPr>
+            <w:r>
+              <w:rPr>
+                <w:b/>
+                <w:bCs/>
+                <w:color w:val="196B24" w:themeColor="accent3"/>
+              </w:rPr>
+              <w:t>OK</w:t>
+            </w:r>
           </w:p>
         </w:tc>
         <w:tc>
           <w:tcPr>
             <w:tcW w:w="1985" w:type="dxa"/>
           </w:tcPr>
-          <w:p/>
+          <w:p>
+            <w:r>
+              <w:t>Đăng ký tài khoản</w:t>
+            </w:r>
+          </w:p>
         </w:tc>
         <w:tc>
           <w:tcPr>
@@ -10237,6 +10240,14 @@
                 <w:color w:val="FF0000"/>
               </w:rPr>
             </w:pPr>
+            <w:r>
+              <w:rPr>
+                <w:b/>
+                <w:bCs/>
+                <w:color w:val="FF0000"/>
+              </w:rPr>
+              <w:t>http://127.0.0.1:8000/users/login/</w:t>
+            </w:r>
           </w:p>
         </w:tc>
         <w:tc>

</xml_diff>

<commit_message>
cập nhập sửa lỗi api landlord
</commit_message>
<xml_diff>
--- a/Hỗ trợ tìm kiếm nhà trọ.docx
+++ b/Hỗ trợ tìm kiếm nhà trọ.docx
@@ -9723,7 +9723,15 @@
             <w:tcW w:w="4395" w:type="dxa"/>
           </w:tcPr>
           <w:p>
-            <w:r>
+            <w:pPr>
+              <w:rPr>
+                <w:color w:val="FF0000"/>
+              </w:rPr>
+            </w:pPr>
+            <w:r>
+              <w:rPr>
+                <w:color w:val="FF0000"/>
+              </w:rPr>
               <w:t>http://127.0.0.1:8000/users/</w:t>
             </w:r>
           </w:p>
@@ -9810,7 +9818,15 @@
             <w:tcW w:w="4395" w:type="dxa"/>
           </w:tcPr>
           <w:p>
-            <w:r>
+            <w:pPr>
+              <w:rPr>
+                <w:color w:val="FF0000"/>
+              </w:rPr>
+            </w:pPr>
+            <w:r>
+              <w:rPr>
+                <w:color w:val="FF0000"/>
+              </w:rPr>
               <w:t>{{127}}/oauth/token/</w:t>
             </w:r>
           </w:p>
@@ -9862,19 +9878,26 @@
             <w:tcW w:w="1985" w:type="dxa"/>
           </w:tcPr>
           <w:p>
-            <w:pPr>
+            <w:r>
+              <w:t xml:space="preserve">Lấy </w:t>
+            </w:r>
+            <w:r>
               <w:rPr>
                 <w:lang w:val="vi-VN"/>
               </w:rPr>
-            </w:pPr>
-            <w:r>
-              <w:t xml:space="preserve">Lấy </w:t>
+              <w:t>access_token</w:t>
+            </w:r>
+            <w:r>
+              <w:t xml:space="preserve">. Dùng làm login, và lưu </w:t>
             </w:r>
             <w:r>
               <w:rPr>
                 <w:lang w:val="vi-VN"/>
               </w:rPr>
               <w:t>access_token</w:t>
+            </w:r>
+            <w:r>
+              <w:t xml:space="preserve"> lại</w:t>
             </w:r>
           </w:p>
           <w:p/>
@@ -9907,7 +9930,10 @@
           </w:tcPr>
           <w:p>
             <w:r>
-              <w:t>{{127}}/users/current-user/</w:t>
+              <w:rPr>
+                <w:color w:val="FF0000"/>
+              </w:rPr>
+              <w:t>http://127.0.0.1:8000/users/current-user/</w:t>
             </w:r>
           </w:p>
         </w:tc>
@@ -9943,6 +9969,14 @@
                 <w:color w:val="196B24" w:themeColor="accent3"/>
               </w:rPr>
             </w:pPr>
+            <w:r>
+              <w:rPr>
+                <w:b/>
+                <w:bCs/>
+                <w:color w:val="196B24" w:themeColor="accent3"/>
+              </w:rPr>
+              <w:t>OK</w:t>
+            </w:r>
           </w:p>
         </w:tc>
         <w:tc>
@@ -9982,7 +10016,15 @@
             <w:tcW w:w="4395" w:type="dxa"/>
           </w:tcPr>
           <w:p>
-            <w:r>
+            <w:pPr>
+              <w:rPr>
+                <w:color w:val="FF0000"/>
+              </w:rPr>
+            </w:pPr>
+            <w:r>
+              <w:rPr>
+                <w:color w:val="FF0000"/>
+              </w:rPr>
               <w:t>{{127}}/users/current-user/</w:t>
             </w:r>
           </w:p>
@@ -10019,6 +10061,14 @@
                 <w:color w:val="196B24" w:themeColor="accent3"/>
               </w:rPr>
             </w:pPr>
+            <w:r>
+              <w:rPr>
+                <w:b/>
+                <w:bCs/>
+                <w:color w:val="196B24" w:themeColor="accent3"/>
+              </w:rPr>
+              <w:t>OK</w:t>
+            </w:r>
           </w:p>
         </w:tc>
         <w:tc>
@@ -10058,7 +10108,15 @@
             <w:tcW w:w="4395" w:type="dxa"/>
           </w:tcPr>
           <w:p>
-            <w:r>
+            <w:pPr>
+              <w:rPr>
+                <w:color w:val="FF0000"/>
+              </w:rPr>
+            </w:pPr>
+            <w:r>
+              <w:rPr>
+                <w:color w:val="FF0000"/>
+              </w:rPr>
               <w:t>{{127}}/users/change-password/</w:t>
             </w:r>
           </w:p>
@@ -10095,6 +10153,14 @@
                 <w:color w:val="196B24" w:themeColor="accent3"/>
               </w:rPr>
             </w:pPr>
+            <w:r>
+              <w:rPr>
+                <w:b/>
+                <w:bCs/>
+                <w:color w:val="196B24" w:themeColor="accent3"/>
+              </w:rPr>
+              <w:t>OK</w:t>
+            </w:r>
           </w:p>
         </w:tc>
         <w:tc>
@@ -10139,15 +10205,11 @@
           <w:p>
             <w:pPr>
               <w:rPr>
-                <w:b/>
-                <w:bCs/>
                 <w:color w:val="FF0000"/>
               </w:rPr>
             </w:pPr>
             <w:r>
               <w:rPr>
-                <w:b/>
-                <w:bCs/>
                 <w:color w:val="FF0000"/>
               </w:rPr>
               <w:t>http://127.0.0.1:8000/users/</w:t>
@@ -10235,18 +10297,14 @@
           <w:p>
             <w:pPr>
               <w:rPr>
-                <w:b/>
-                <w:bCs/>
                 <w:color w:val="FF0000"/>
               </w:rPr>
             </w:pPr>
             <w:r>
               <w:rPr>
-                <w:b/>
-                <w:bCs/>
                 <w:color w:val="FF0000"/>
               </w:rPr>
-              <w:t>http://127.0.0.1:8000/users/login/</w:t>
+              <w:t>http://127.0.0.1:8000/users/BinhHanh/</w:t>
             </w:r>
           </w:p>
         </w:tc>
@@ -10261,6 +10319,13 @@
                 <w:bCs/>
               </w:rPr>
             </w:pPr>
+            <w:r>
+              <w:rPr>
+                <w:b/>
+                <w:bCs/>
+              </w:rPr>
+              <w:t>GET</w:t>
+            </w:r>
           </w:p>
         </w:tc>
         <w:tc>
@@ -10275,13 +10340,35 @@
                 <w:color w:val="196B24" w:themeColor="accent3"/>
               </w:rPr>
             </w:pPr>
+            <w:r>
+              <w:rPr>
+                <w:b/>
+                <w:bCs/>
+                <w:color w:val="196B24" w:themeColor="accent3"/>
+              </w:rPr>
+              <w:t>OK</w:t>
+            </w:r>
           </w:p>
         </w:tc>
         <w:tc>
           <w:tcPr>
             <w:tcW w:w="1985" w:type="dxa"/>
           </w:tcPr>
-          <w:p/>
+          <w:p>
+            <w:r>
+              <w:t>Xem thông tin user theo id (slugname)</w:t>
+            </w:r>
+            <w:r>
+              <w:br/>
+              <w:t>(B</w:t>
+            </w:r>
+            <w:r>
+              <w:t>ất kỳ user nào đã đăng nhập (có token hợp lệ)</w:t>
+            </w:r>
+            <w:r>
+              <w:t>)</w:t>
+            </w:r>
+          </w:p>
         </w:tc>
         <w:tc>
           <w:tcPr>
@@ -10312,8 +10399,6 @@
           <w:p>
             <w:pPr>
               <w:rPr>
-                <w:b/>
-                <w:bCs/>
                 <w:color w:val="FF0000"/>
               </w:rPr>
             </w:pPr>
@@ -10381,8 +10466,6 @@
           <w:p>
             <w:pPr>
               <w:rPr>
-                <w:b/>
-                <w:bCs/>
                 <w:color w:val="FF0000"/>
               </w:rPr>
             </w:pPr>
@@ -10450,8 +10533,6 @@
           <w:p>
             <w:pPr>
               <w:rPr>
-                <w:b/>
-                <w:bCs/>
                 <w:color w:val="FF0000"/>
               </w:rPr>
             </w:pPr>
@@ -10736,11 +10817,7 @@
           </w:tcPr>
           <w:p>
             <w:r>
-              <w:t xml:space="preserve">Còn vấn đề tên có dấu đã tạo code nhưng chưa kiểm </w:t>
-            </w:r>
-            <w:r>
-              <w:lastRenderedPageBreak/>
-              <w:t>chứng được (chắc chưa được, đã test lần 1)</w:t>
+              <w:t>Còn vấn đề tên có dấu đã tạo code nhưng chưa kiểm chứng được (chắc chưa được, đã test lần 1)</w:t>
             </w:r>
           </w:p>
         </w:tc>
@@ -10762,7 +10839,6 @@
                 <w:bCs/>
                 <w:color w:val="196B24" w:themeColor="accent3"/>
               </w:rPr>
-              <w:lastRenderedPageBreak/>
               <w:t>PASS</w:t>
             </w:r>
           </w:p>
@@ -11217,7 +11293,7 @@
               <w:rPr>
                 <w:color w:val="FF0000"/>
               </w:rPr>
-              <w:t>http://127.0.0.1:8000/landlords/TranBich/</w:t>
+              <w:t>http://127.0.0.1:8000/landlords/NhatHa/</w:t>
             </w:r>
           </w:p>
         </w:tc>
@@ -11253,6 +11329,14 @@
                 <w:color w:val="196B24" w:themeColor="accent3"/>
               </w:rPr>
             </w:pPr>
+            <w:r>
+              <w:rPr>
+                <w:b/>
+                <w:bCs/>
+                <w:color w:val="196B24" w:themeColor="accent3"/>
+              </w:rPr>
+              <w:t>OK</w:t>
+            </w:r>
           </w:p>
         </w:tc>
         <w:tc>
@@ -11304,19 +11388,7 @@
               <w:rPr>
                 <w:color w:val="FF0000"/>
               </w:rPr>
-              <w:t xml:space="preserve">http://127.0.0.1:8000/landlords/ </w:t>
-            </w:r>
-            <w:r>
-              <w:rPr>
-                <w:color w:val="FF0000"/>
-              </w:rPr>
-              <w:t>QuangHieu</w:t>
-            </w:r>
-            <w:r>
-              <w:rPr>
-                <w:color w:val="FF0000"/>
-              </w:rPr>
-              <w:t>/</w:t>
+              <w:t>{{127}}/landlords/QuangHieu/</w:t>
             </w:r>
           </w:p>
         </w:tc>
@@ -11352,6 +11424,14 @@
                 <w:color w:val="196B24" w:themeColor="accent3"/>
               </w:rPr>
             </w:pPr>
+            <w:r>
+              <w:rPr>
+                <w:b/>
+                <w:bCs/>
+                <w:color w:val="196B24" w:themeColor="accent3"/>
+              </w:rPr>
+              <w:t>OK</w:t>
+            </w:r>
           </w:p>
         </w:tc>
         <w:tc>
@@ -11403,7 +11483,7 @@
               <w:rPr>
                 <w:color w:val="FF0000"/>
               </w:rPr>
-              <w:t>{{127}}/landlords/QuangHieu/verify/</w:t>
+              <w:t>http://127.0.0.1:8000/landlords/NhatHa/verify/</w:t>
             </w:r>
           </w:p>
         </w:tc>
@@ -11439,6 +11519,14 @@
                 <w:color w:val="196B24" w:themeColor="accent3"/>
               </w:rPr>
             </w:pPr>
+            <w:r>
+              <w:rPr>
+                <w:b/>
+                <w:bCs/>
+                <w:color w:val="196B24" w:themeColor="accent3"/>
+              </w:rPr>
+              <w:t>OK</w:t>
+            </w:r>
           </w:p>
         </w:tc>
         <w:tc>
@@ -12175,7 +12263,11 @@
           </w:tcPr>
           <w:p>
             <w:r>
-              <w:t>Cập nhật toàn bộ nội dung bài viết (id). Gửi toàn bộ dữ liệu mới.</w:t>
+              <w:t xml:space="preserve">Cập nhật toàn bộ nội dung bài viết </w:t>
+            </w:r>
+            <w:r>
+              <w:lastRenderedPageBreak/>
+              <w:t>(id). Gửi toàn bộ dữ liệu mới.</w:t>
             </w:r>
           </w:p>
         </w:tc>
@@ -12504,7 +12596,6 @@
           </w:tcPr>
           <w:p>
             <w:r>
-              <w:lastRenderedPageBreak/>
               <w:t>Comment</w:t>
             </w:r>
           </w:p>
@@ -16605,16 +16696,7 @@
                 <w:bCs/>
                 <w:color w:val="196B24" w:themeColor="accent3"/>
               </w:rPr>
-              <w:t xml:space="preserve">Body: {"content": </w:t>
-            </w:r>
-            <w:r>
-              <w:rPr>
-                <w:b/>
-                <w:bCs/>
-                <w:color w:val="196B24" w:themeColor="accent3"/>
-              </w:rPr>
-              <w:lastRenderedPageBreak/>
-              <w:t>"Nội dung tin nhắn"}</w:t>
+              <w:t>Body: {"content": "Nội dung tin nhắn"}</w:t>
             </w:r>
           </w:p>
         </w:tc>

</xml_diff>

<commit_message>
cập nhập api cho tenant, chưa sử dụng slug name cho landlord và tenant
</commit_message>
<xml_diff>
--- a/Hỗ trợ tìm kiếm nhà trọ.docx
+++ b/Hỗ trợ tìm kiếm nhà trọ.docx
@@ -10801,25 +10801,13 @@
                 <w:color w:val="196B24" w:themeColor="accent3"/>
               </w:rPr>
             </w:pPr>
-            <w:r>
-              <w:rPr>
-                <w:b/>
-                <w:bCs/>
-                <w:color w:val="196B24" w:themeColor="accent3"/>
-              </w:rPr>
-              <w:t>OK</w:t>
-            </w:r>
           </w:p>
         </w:tc>
         <w:tc>
           <w:tcPr>
             <w:tcW w:w="1985" w:type="dxa"/>
           </w:tcPr>
-          <w:p>
-            <w:r>
-              <w:t>Còn vấn đề tên có dấu đã tạo code nhưng chưa kiểm chứng được (chắc chưa được, đã test lần 1)</w:t>
-            </w:r>
-          </w:p>
+          <w:p/>
         </w:tc>
         <w:tc>
           <w:tcPr>
@@ -10833,14 +10821,6 @@
                 <w:color w:val="196B24" w:themeColor="accent3"/>
               </w:rPr>
             </w:pPr>
-            <w:r>
-              <w:rPr>
-                <w:b/>
-                <w:bCs/>
-                <w:color w:val="196B24" w:themeColor="accent3"/>
-              </w:rPr>
-              <w:t>PASS</w:t>
-            </w:r>
           </w:p>
         </w:tc>
       </w:tr>
@@ -10866,7 +10846,7 @@
               <w:rPr>
                 <w:color w:val="FF0000"/>
               </w:rPr>
-              <w:t>http://127.0.0.1:8000/tenants/?user_id=27/</w:t>
+              <w:t>http://127.0.0.1:8000/tenants/HaLinh/</w:t>
             </w:r>
           </w:p>
         </w:tc>
@@ -10916,7 +10896,11 @@
           <w:tcPr>
             <w:tcW w:w="1985" w:type="dxa"/>
           </w:tcPr>
-          <w:p/>
+          <w:p>
+            <w:r>
+              <w:t>Lấy thông tin người thuê</w:t>
+            </w:r>
+          </w:p>
         </w:tc>
         <w:tc>
           <w:tcPr>
@@ -10955,7 +10939,7 @@
               <w:rPr>
                 <w:color w:val="FF0000"/>
               </w:rPr>
-              <w:t>http://127.0.0.1:8000/tenants/?q= Lê Thị Thủy</w:t>
+              <w:t>http://127.0.0.1:8000/tenants/?user_id=27/</w:t>
             </w:r>
           </w:p>
         </w:tc>
@@ -10991,14 +10975,6 @@
                 <w:color w:val="196B24" w:themeColor="accent3"/>
               </w:rPr>
             </w:pPr>
-            <w:r>
-              <w:rPr>
-                <w:b/>
-                <w:bCs/>
-                <w:color w:val="196B24" w:themeColor="accent3"/>
-              </w:rPr>
-              <w:t>OK</w:t>
-            </w:r>
           </w:p>
         </w:tc>
         <w:tc>
@@ -11044,6 +11020,87 @@
               <w:rPr>
                 <w:color w:val="FF0000"/>
               </w:rPr>
+              <w:t>http://127.0.0.1:8000/tenants/?q= Lê Thị Thủy</w:t>
+            </w:r>
+          </w:p>
+        </w:tc>
+        <w:tc>
+          <w:tcPr>
+            <w:tcW w:w="1417" w:type="dxa"/>
+          </w:tcPr>
+          <w:p>
+            <w:pPr>
+              <w:rPr>
+                <w:b/>
+                <w:bCs/>
+              </w:rPr>
+            </w:pPr>
+            <w:r>
+              <w:rPr>
+                <w:b/>
+                <w:bCs/>
+              </w:rPr>
+              <w:t>GET</w:t>
+            </w:r>
+          </w:p>
+        </w:tc>
+        <w:tc>
+          <w:tcPr>
+            <w:tcW w:w="1134" w:type="dxa"/>
+          </w:tcPr>
+          <w:p>
+            <w:pPr>
+              <w:rPr>
+                <w:b/>
+                <w:bCs/>
+                <w:color w:val="196B24" w:themeColor="accent3"/>
+              </w:rPr>
+            </w:pPr>
+          </w:p>
+        </w:tc>
+        <w:tc>
+          <w:tcPr>
+            <w:tcW w:w="1985" w:type="dxa"/>
+          </w:tcPr>
+          <w:p/>
+        </w:tc>
+        <w:tc>
+          <w:tcPr>
+            <w:tcW w:w="1417" w:type="dxa"/>
+          </w:tcPr>
+          <w:p>
+            <w:pPr>
+              <w:rPr>
+                <w:b/>
+                <w:bCs/>
+                <w:color w:val="196B24" w:themeColor="accent3"/>
+              </w:rPr>
+            </w:pPr>
+          </w:p>
+        </w:tc>
+      </w:tr>
+      <w:tr>
+        <w:tc>
+          <w:tcPr>
+            <w:tcW w:w="1276" w:type="dxa"/>
+            <w:vMerge/>
+          </w:tcPr>
+          <w:p/>
+        </w:tc>
+        <w:tc>
+          <w:tcPr>
+            <w:tcW w:w="4395" w:type="dxa"/>
+          </w:tcPr>
+          <w:p>
+            <w:pPr>
+              <w:rPr>
+                <w:color w:val="FF0000"/>
+              </w:rPr>
+            </w:pPr>
+            <w:r>
+              <w:rPr>
+                <w:color w:val="FF0000"/>
+              </w:rPr>
               <w:t>http://127.0.0.1:8000/tenants/?slug=le-thi-thu</w:t>
             </w:r>
           </w:p>
@@ -11073,6 +11130,86 @@
                 <w:color w:val="196B24" w:themeColor="accent3"/>
               </w:rPr>
             </w:pPr>
+          </w:p>
+        </w:tc>
+        <w:tc>
+          <w:tcPr>
+            <w:tcW w:w="1985" w:type="dxa"/>
+          </w:tcPr>
+          <w:p/>
+        </w:tc>
+        <w:tc>
+          <w:tcPr>
+            <w:tcW w:w="1417" w:type="dxa"/>
+          </w:tcPr>
+          <w:p>
+            <w:pPr>
+              <w:rPr>
+                <w:b/>
+                <w:bCs/>
+                <w:color w:val="196B24" w:themeColor="accent3"/>
+              </w:rPr>
+            </w:pPr>
+          </w:p>
+        </w:tc>
+      </w:tr>
+      <w:tr>
+        <w:tc>
+          <w:tcPr>
+            <w:tcW w:w="1276" w:type="dxa"/>
+          </w:tcPr>
+          <w:p/>
+        </w:tc>
+        <w:tc>
+          <w:tcPr>
+            <w:tcW w:w="4395" w:type="dxa"/>
+          </w:tcPr>
+          <w:p>
+            <w:pPr>
+              <w:rPr>
+                <w:color w:val="FF0000"/>
+              </w:rPr>
+            </w:pPr>
+            <w:r>
+              <w:rPr>
+                <w:color w:val="FF0000"/>
+              </w:rPr>
+              <w:t>http://127.0.0.1:8000/tenants/HaLinh/</w:t>
+            </w:r>
+          </w:p>
+        </w:tc>
+        <w:tc>
+          <w:tcPr>
+            <w:tcW w:w="1417" w:type="dxa"/>
+          </w:tcPr>
+          <w:p>
+            <w:pPr>
+              <w:rPr>
+                <w:b/>
+                <w:bCs/>
+              </w:rPr>
+            </w:pPr>
+            <w:r>
+              <w:rPr>
+                <w:b/>
+                <w:bCs/>
+              </w:rPr>
+              <w:t>PATCH</w:t>
+            </w:r>
+          </w:p>
+        </w:tc>
+        <w:tc>
+          <w:tcPr>
+            <w:tcW w:w="1134" w:type="dxa"/>
+          </w:tcPr>
+          <w:p>
+            <w:pPr>
+              <w:rPr>
+                <w:b/>
+                <w:bCs/>
+                <w:color w:val="196B24" w:themeColor="accent3"/>
+              </w:rPr>
+            </w:pPr>
             <w:r>
               <w:rPr>
                 <w:b/>
@@ -11087,7 +11224,282 @@
           <w:tcPr>
             <w:tcW w:w="1985" w:type="dxa"/>
           </w:tcPr>
+          <w:p>
+            <w:r>
+              <w:t>Cập nhật thông tin người thuê</w:t>
+            </w:r>
+          </w:p>
+        </w:tc>
+        <w:tc>
+          <w:tcPr>
+            <w:tcW w:w="1417" w:type="dxa"/>
+          </w:tcPr>
+          <w:p>
+            <w:pPr>
+              <w:rPr>
+                <w:b/>
+                <w:bCs/>
+                <w:color w:val="196B24" w:themeColor="accent3"/>
+              </w:rPr>
+            </w:pPr>
+          </w:p>
+        </w:tc>
+      </w:tr>
+      <w:tr>
+        <w:tc>
+          <w:tcPr>
+            <w:tcW w:w="1276" w:type="dxa"/>
+          </w:tcPr>
           <w:p/>
+        </w:tc>
+        <w:tc>
+          <w:tcPr>
+            <w:tcW w:w="4395" w:type="dxa"/>
+          </w:tcPr>
+          <w:p>
+            <w:pPr>
+              <w:rPr>
+                <w:color w:val="FF0000"/>
+              </w:rPr>
+            </w:pPr>
+            <w:r>
+              <w:rPr>
+                <w:color w:val="FF0000"/>
+              </w:rPr>
+              <w:t>http://127.0.0.1:8000/tenants/HaLinh/rooms/</w:t>
+            </w:r>
+          </w:p>
+        </w:tc>
+        <w:tc>
+          <w:tcPr>
+            <w:tcW w:w="1417" w:type="dxa"/>
+          </w:tcPr>
+          <w:p>
+            <w:pPr>
+              <w:rPr>
+                <w:b/>
+                <w:bCs/>
+              </w:rPr>
+            </w:pPr>
+            <w:r>
+              <w:rPr>
+                <w:b/>
+                <w:bCs/>
+              </w:rPr>
+              <w:t>GET</w:t>
+            </w:r>
+          </w:p>
+        </w:tc>
+        <w:tc>
+          <w:tcPr>
+            <w:tcW w:w="1134" w:type="dxa"/>
+          </w:tcPr>
+          <w:p>
+            <w:pPr>
+              <w:rPr>
+                <w:b/>
+                <w:bCs/>
+                <w:color w:val="196B24" w:themeColor="accent3"/>
+              </w:rPr>
+            </w:pPr>
+            <w:r>
+              <w:rPr>
+                <w:b/>
+                <w:bCs/>
+                <w:color w:val="196B24" w:themeColor="accent3"/>
+              </w:rPr>
+              <w:t>OK</w:t>
+            </w:r>
+          </w:p>
+        </w:tc>
+        <w:tc>
+          <w:tcPr>
+            <w:tcW w:w="1985" w:type="dxa"/>
+          </w:tcPr>
+          <w:p>
+            <w:pPr>
+              <w:jc w:val="center"/>
+            </w:pPr>
+            <w:r>
+              <w:t>Lấy danh sách phòng đã thuê</w:t>
+            </w:r>
+          </w:p>
+        </w:tc>
+        <w:tc>
+          <w:tcPr>
+            <w:tcW w:w="1417" w:type="dxa"/>
+          </w:tcPr>
+          <w:p>
+            <w:pPr>
+              <w:rPr>
+                <w:b/>
+                <w:bCs/>
+                <w:color w:val="196B24" w:themeColor="accent3"/>
+              </w:rPr>
+            </w:pPr>
+          </w:p>
+        </w:tc>
+      </w:tr>
+      <w:tr>
+        <w:tc>
+          <w:tcPr>
+            <w:tcW w:w="1276" w:type="dxa"/>
+          </w:tcPr>
+          <w:p/>
+        </w:tc>
+        <w:tc>
+          <w:tcPr>
+            <w:tcW w:w="4395" w:type="dxa"/>
+          </w:tcPr>
+          <w:p>
+            <w:pPr>
+              <w:rPr>
+                <w:color w:val="FF0000"/>
+              </w:rPr>
+            </w:pPr>
+            <w:r>
+              <w:rPr>
+                <w:color w:val="FF0000"/>
+              </w:rPr>
+              <w:t>http://127.0.0.1:8000/tenants/HaLinh/payments/</w:t>
+            </w:r>
+          </w:p>
+        </w:tc>
+        <w:tc>
+          <w:tcPr>
+            <w:tcW w:w="1417" w:type="dxa"/>
+          </w:tcPr>
+          <w:p>
+            <w:pPr>
+              <w:rPr>
+                <w:b/>
+                <w:bCs/>
+              </w:rPr>
+            </w:pPr>
+          </w:p>
+        </w:tc>
+        <w:tc>
+          <w:tcPr>
+            <w:tcW w:w="1134" w:type="dxa"/>
+          </w:tcPr>
+          <w:p>
+            <w:pPr>
+              <w:rPr>
+                <w:b/>
+                <w:bCs/>
+                <w:color w:val="196B24" w:themeColor="accent3"/>
+              </w:rPr>
+            </w:pPr>
+            <w:r>
+              <w:rPr>
+                <w:b/>
+                <w:bCs/>
+                <w:color w:val="196B24" w:themeColor="accent3"/>
+              </w:rPr>
+              <w:t>Pending</w:t>
+            </w:r>
+          </w:p>
+        </w:tc>
+        <w:tc>
+          <w:tcPr>
+            <w:tcW w:w="1985" w:type="dxa"/>
+          </w:tcPr>
+          <w:p>
+            <w:pPr>
+              <w:jc w:val="center"/>
+            </w:pPr>
+            <w:r>
+              <w:t>Lấy lịch sử thanh toán</w:t>
+            </w:r>
+          </w:p>
+        </w:tc>
+        <w:tc>
+          <w:tcPr>
+            <w:tcW w:w="1417" w:type="dxa"/>
+          </w:tcPr>
+          <w:p>
+            <w:pPr>
+              <w:rPr>
+                <w:b/>
+                <w:bCs/>
+                <w:color w:val="196B24" w:themeColor="accent3"/>
+              </w:rPr>
+            </w:pPr>
+          </w:p>
+        </w:tc>
+      </w:tr>
+      <w:tr>
+        <w:tc>
+          <w:tcPr>
+            <w:tcW w:w="1276" w:type="dxa"/>
+          </w:tcPr>
+          <w:p/>
+        </w:tc>
+        <w:tc>
+          <w:tcPr>
+            <w:tcW w:w="4395" w:type="dxa"/>
+          </w:tcPr>
+          <w:p>
+            <w:pPr>
+              <w:rPr>
+                <w:color w:val="FF0000"/>
+              </w:rPr>
+            </w:pPr>
+            <w:r>
+              <w:rPr>
+                <w:color w:val="FF0000"/>
+              </w:rPr>
+              <w:t>http://127.0.0.1:8000/tenants/HaLinh/saved-posts/</w:t>
+            </w:r>
+          </w:p>
+        </w:tc>
+        <w:tc>
+          <w:tcPr>
+            <w:tcW w:w="1417" w:type="dxa"/>
+          </w:tcPr>
+          <w:p>
+            <w:pPr>
+              <w:rPr>
+                <w:b/>
+                <w:bCs/>
+              </w:rPr>
+            </w:pPr>
+          </w:p>
+        </w:tc>
+        <w:tc>
+          <w:tcPr>
+            <w:tcW w:w="1134" w:type="dxa"/>
+          </w:tcPr>
+          <w:p>
+            <w:pPr>
+              <w:rPr>
+                <w:b/>
+                <w:bCs/>
+                <w:color w:val="196B24" w:themeColor="accent3"/>
+              </w:rPr>
+            </w:pPr>
+            <w:r>
+              <w:rPr>
+                <w:b/>
+                <w:bCs/>
+                <w:color w:val="196B24" w:themeColor="accent3"/>
+              </w:rPr>
+              <w:t>Pending</w:t>
+            </w:r>
+          </w:p>
+        </w:tc>
+        <w:tc>
+          <w:tcPr>
+            <w:tcW w:w="1985" w:type="dxa"/>
+          </w:tcPr>
+          <w:p>
+            <w:pPr>
+              <w:jc w:val="center"/>
+            </w:pPr>
+            <w:r>
+              <w:t>Lấy danh sách bài đăng đã lưu</w:t>
+            </w:r>
+          </w:p>
         </w:tc>
         <w:tc>
           <w:tcPr>
@@ -12164,7 +12576,11 @@
               <w:t>Cập nhật một phần nội dung bài viết (id).</w:t>
             </w:r>
             <w:r>
-              <w:t xml:space="preserve"> (chỉ chủ bài viết mới cập nhập được)</w:t>
+              <w:t xml:space="preserve"> (chỉ chủ </w:t>
+            </w:r>
+            <w:r>
+              <w:lastRenderedPageBreak/>
+              <w:t>bài viết mới cập nhập được)</w:t>
             </w:r>
           </w:p>
         </w:tc>
@@ -12263,11 +12679,7 @@
           </w:tcPr>
           <w:p>
             <w:r>
-              <w:t xml:space="preserve">Cập nhật toàn bộ nội dung bài viết </w:t>
-            </w:r>
-            <w:r>
-              <w:lastRenderedPageBreak/>
-              <w:t>(id). Gửi toàn bộ dữ liệu mới.</w:t>
+              <w:t>Cập nhật toàn bộ nội dung bài viết (id). Gửi toàn bộ dữ liệu mới.</w:t>
             </w:r>
           </w:p>
         </w:tc>
@@ -14181,6 +14593,7 @@
           </w:tcPr>
           <w:p>
             <w:r>
+              <w:lastRenderedPageBreak/>
               <w:t>VNPAY</w:t>
             </w:r>
           </w:p>

</xml_diff>

<commit_message>
kiểm tra các api
</commit_message>
<xml_diff>
--- a/Hỗ trợ tìm kiếm nhà trọ.docx
+++ b/Hỗ trợ tìm kiếm nhà trọ.docx
@@ -15259,7 +15259,7 @@
               <w:rPr>
                 <w:color w:val="FF0000"/>
               </w:rPr>
-              <w:t>http://127.0.0.1:8000/search-history/</w:t>
+              <w:t>{{ngrok}}/search-histories/</w:t>
             </w:r>
           </w:p>
         </w:tc>
@@ -15346,8 +15346,16 @@
             <w:tcW w:w="4395" w:type="dxa"/>
           </w:tcPr>
           <w:p>
-            <w:r>
-              <w:t>http://127.0.0.1:8000/search-history/</w:t>
+            <w:pPr>
+              <w:rPr>
+                <w:color w:val="FF0000"/>
+              </w:rPr>
+            </w:pPr>
+            <w:r>
+              <w:rPr>
+                <w:color w:val="FF0000"/>
+              </w:rPr>
+              <w:t>{{ngrok}}/search-histories/</w:t>
             </w:r>
           </w:p>
         </w:tc>
@@ -15389,7 +15397,7 @@
                 <w:bCs/>
                 <w:color w:val="196B24" w:themeColor="accent3"/>
               </w:rPr>
-              <w:t>Pending</w:t>
+              <w:t>OK</w:t>
             </w:r>
           </w:p>
         </w:tc>
@@ -15430,11 +15438,16 @@
             <w:tcW w:w="4395" w:type="dxa"/>
           </w:tcPr>
           <w:p>
-            <w:r>
-              <w:t>http://127.0.0.1:8000/search-history/</w:t>
-            </w:r>
-            <w:r>
-              <w:t>id/</w:t>
+            <w:pPr>
+              <w:rPr>
+                <w:color w:val="FF0000"/>
+              </w:rPr>
+            </w:pPr>
+            <w:r>
+              <w:rPr>
+                <w:color w:val="FF0000"/>
+              </w:rPr>
+              <w:t>{{ngrok}}/search-histories/2/</w:t>
             </w:r>
           </w:p>
         </w:tc>
@@ -15476,7 +15489,7 @@
                 <w:bCs/>
                 <w:color w:val="196B24" w:themeColor="accent3"/>
               </w:rPr>
-              <w:t>Pending</w:t>
+              <w:t>OK</w:t>
             </w:r>
           </w:p>
         </w:tc>
@@ -15517,11 +15530,16 @@
             <w:tcW w:w="4395" w:type="dxa"/>
           </w:tcPr>
           <w:p>
-            <w:r>
-              <w:t>http://127.0.0.1:8000/search-history/</w:t>
-            </w:r>
-            <w:r>
-              <w:t>id/</w:t>
+            <w:pPr>
+              <w:rPr>
+                <w:color w:val="FF0000"/>
+              </w:rPr>
+            </w:pPr>
+            <w:r>
+              <w:rPr>
+                <w:color w:val="FF0000"/>
+              </w:rPr>
+              <w:t>{{ngrok}}/search-histories/2/</w:t>
             </w:r>
           </w:p>
         </w:tc>
@@ -15541,6 +15559,13 @@
                 <w:b/>
                 <w:bCs/>
               </w:rPr>
+              <w:t xml:space="preserve">PUT | </w:t>
+            </w:r>
+            <w:r>
+              <w:rPr>
+                <w:b/>
+                <w:bCs/>
+              </w:rPr>
               <w:t>PATCH</w:t>
             </w:r>
           </w:p>
@@ -15563,7 +15588,7 @@
                 <w:bCs/>
                 <w:color w:val="196B24" w:themeColor="accent3"/>
               </w:rPr>
-              <w:t>Pending</w:t>
+              <w:t>OK</w:t>
             </w:r>
           </w:p>
         </w:tc>
@@ -15604,11 +15629,16 @@
             <w:tcW w:w="4395" w:type="dxa"/>
           </w:tcPr>
           <w:p>
-            <w:r>
-              <w:t>http://127.0.0.1:8000/search-history/</w:t>
-            </w:r>
-            <w:r>
-              <w:t>id/</w:t>
+            <w:pPr>
+              <w:rPr>
+                <w:color w:val="FF0000"/>
+              </w:rPr>
+            </w:pPr>
+            <w:r>
+              <w:rPr>
+                <w:color w:val="FF0000"/>
+              </w:rPr>
+              <w:t>{{ngrok}}/search-histories/1/</w:t>
             </w:r>
           </w:p>
         </w:tc>
@@ -15650,7 +15680,7 @@
                 <w:bCs/>
                 <w:color w:val="196B24" w:themeColor="accent3"/>
               </w:rPr>
-              <w:t>Pending</w:t>
+              <w:t>OK</w:t>
             </w:r>
           </w:p>
         </w:tc>
@@ -15763,48 +15793,6 @@
           <w:tcPr>
             <w:tcW w:w="4395" w:type="dxa"/>
           </w:tcPr>
-          <w:tbl>
-            <w:tblPr>
-              <w:tblW w:w="0" w:type="auto"/>
-              <w:tblCellSpacing w:w="15" w:type="dxa"/>
-              <w:tblCellMar>
-                <w:top w:w="15" w:type="dxa"/>
-                <w:left w:w="15" w:type="dxa"/>
-                <w:bottom w:w="15" w:type="dxa"/>
-                <w:right w:w="15" w:type="dxa"/>
-              </w:tblCellMar>
-              <w:tblLook w:val="04A0" w:firstRow="1" w:lastRow="0" w:firstColumn="1" w:lastColumn="0" w:noHBand="0" w:noVBand="1"/>
-            </w:tblPr>
-            <w:tblGrid>
-              <w:gridCol w:w="2731"/>
-            </w:tblGrid>
-            <w:tr>
-              <w:trPr>
-                <w:tblCellSpacing w:w="15" w:type="dxa"/>
-              </w:trPr>
-              <w:tc>
-                <w:tcPr>
-                  <w:tcW w:w="2671" w:type="dxa"/>
-                  <w:vAlign w:val="center"/>
-                  <w:hideMark/>
-                </w:tcPr>
-                <w:p>
-                  <w:pPr>
-                    <w:spacing w:after="0" w:line="240" w:lineRule="auto"/>
-                    <w:rPr>
-                      <w:lang w:val="vi-VN"/>
-                    </w:rPr>
-                  </w:pPr>
-                  <w:r>
-                    <w:rPr>
-                      <w:lang w:val="vi-VN"/>
-                    </w:rPr>
-                    <w:t>/notifications/unread/</w:t>
-                  </w:r>
-                </w:p>
-              </w:tc>
-            </w:tr>
-          </w:tbl>
           <w:p>
             <w:pPr>
               <w:rPr>
@@ -15857,6 +15845,12 @@
                 <w:color w:val="FF0000"/>
               </w:rPr>
             </w:pPr>
+            <w:r>
+              <w:rPr>
+                <w:color w:val="FF0000"/>
+              </w:rPr>
+              <w:t>{{ngrok}}/notifications/unread/</w:t>
+            </w:r>
           </w:p>
         </w:tc>
         <w:tc>
@@ -15897,7 +15891,7 @@
                 <w:bCs/>
                 <w:color w:val="196B24" w:themeColor="accent3"/>
               </w:rPr>
-              <w:t>Pending</w:t>
+              <w:t>OK</w:t>
             </w:r>
           </w:p>
         </w:tc>
@@ -15981,6 +15975,15 @@
           <w:tcPr>
             <w:tcW w:w="4395" w:type="dxa"/>
           </w:tcPr>
+          <w:p>
+            <w:pPr>
+              <w:rPr>
+                <w:vanish/>
+                <w:color w:val="FF0000"/>
+                <w:lang w:val="vi-VN"/>
+              </w:rPr>
+            </w:pPr>
+          </w:p>
           <w:tbl>
             <w:tblPr>
               <w:tblW w:w="0" w:type="auto"/>
@@ -15994,7 +15997,7 @@
               <w:tblLook w:val="04A0" w:firstRow="1" w:lastRow="0" w:firstColumn="1" w:lastColumn="0" w:noHBand="0" w:noVBand="1"/>
             </w:tblPr>
             <w:tblGrid>
-              <w:gridCol w:w="3091"/>
+              <w:gridCol w:w="110"/>
             </w:tblGrid>
             <w:tr>
               <w:trPr>
@@ -16002,7 +16005,7 @@
               </w:trPr>
               <w:tc>
                 <w:tcPr>
-                  <w:tcW w:w="3031" w:type="dxa"/>
+                  <w:tcW w:w="36" w:type="dxa"/>
                   <w:vAlign w:val="center"/>
                   <w:hideMark/>
                 </w:tcPr>
@@ -16010,19 +16013,114 @@
                   <w:pPr>
                     <w:spacing w:after="0" w:line="240" w:lineRule="auto"/>
                     <w:rPr>
+                      <w:color w:val="FF0000"/>
                       <w:lang w:val="vi-VN"/>
                     </w:rPr>
                   </w:pPr>
-                  <w:r>
-                    <w:rPr>
-                      <w:lang w:val="vi-VN"/>
-                    </w:rPr>
-                    <w:t>/notifications/{id}/read/</w:t>
-                  </w:r>
                 </w:p>
               </w:tc>
             </w:tr>
           </w:tbl>
+          <w:p>
+            <w:pPr>
+              <w:rPr>
+                <w:color w:val="FF0000"/>
+              </w:rPr>
+            </w:pPr>
+            <w:r>
+              <w:rPr>
+                <w:color w:val="FF0000"/>
+              </w:rPr>
+              <w:t>{{ngrok}}/notifications/2/read/</w:t>
+            </w:r>
+          </w:p>
+        </w:tc>
+        <w:tc>
+          <w:tcPr>
+            <w:tcW w:w="1417" w:type="dxa"/>
+          </w:tcPr>
+          <w:p>
+            <w:pPr>
+              <w:rPr>
+                <w:b/>
+                <w:bCs/>
+              </w:rPr>
+            </w:pPr>
+            <w:r>
+              <w:rPr>
+                <w:b/>
+                <w:bCs/>
+              </w:rPr>
+              <w:t>PUT</w:t>
+            </w:r>
+          </w:p>
+        </w:tc>
+        <w:tc>
+          <w:tcPr>
+            <w:tcW w:w="1134" w:type="dxa"/>
+          </w:tcPr>
+          <w:p>
+            <w:pPr>
+              <w:rPr>
+                <w:b/>
+                <w:bCs/>
+                <w:color w:val="196B24" w:themeColor="accent3"/>
+              </w:rPr>
+            </w:pPr>
+            <w:r>
+              <w:rPr>
+                <w:b/>
+                <w:bCs/>
+                <w:color w:val="196B24" w:themeColor="accent3"/>
+              </w:rPr>
+              <w:t>OK</w:t>
+            </w:r>
+          </w:p>
+        </w:tc>
+        <w:tc>
+          <w:tcPr>
+            <w:tcW w:w="1985" w:type="dxa"/>
+          </w:tcPr>
+          <w:p>
+            <w:pPr>
+              <w:rPr>
+                <w:vanish/>
+                <w:lang w:val="vi-VN"/>
+              </w:rPr>
+            </w:pPr>
+          </w:p>
+          <w:p>
+            <w:r>
+              <w:t>Đánh dấu 1 thông báo là đã đọc</w:t>
+            </w:r>
+          </w:p>
+        </w:tc>
+        <w:tc>
+          <w:tcPr>
+            <w:tcW w:w="1417" w:type="dxa"/>
+          </w:tcPr>
+          <w:p>
+            <w:pPr>
+              <w:rPr>
+                <w:b/>
+                <w:bCs/>
+                <w:color w:val="196B24" w:themeColor="accent3"/>
+              </w:rPr>
+            </w:pPr>
+          </w:p>
+        </w:tc>
+      </w:tr>
+      <w:tr>
+        <w:tc>
+          <w:tcPr>
+            <w:tcW w:w="1276" w:type="dxa"/>
+          </w:tcPr>
+          <w:p/>
+        </w:tc>
+        <w:tc>
+          <w:tcPr>
+            <w:tcW w:w="4395" w:type="dxa"/>
+          </w:tcPr>
           <w:p>
             <w:pPr>
               <w:rPr>
@@ -16067,181 +16165,11 @@
               </w:tc>
             </w:tr>
           </w:tbl>
-          <w:p/>
-        </w:tc>
-        <w:tc>
-          <w:tcPr>
-            <w:tcW w:w="1417" w:type="dxa"/>
-          </w:tcPr>
-          <w:p>
-            <w:pPr>
-              <w:rPr>
-                <w:b/>
-                <w:bCs/>
-              </w:rPr>
-            </w:pPr>
-            <w:r>
-              <w:rPr>
-                <w:b/>
-                <w:bCs/>
-              </w:rPr>
-              <w:t>PUT</w:t>
-            </w:r>
-          </w:p>
-        </w:tc>
-        <w:tc>
-          <w:tcPr>
-            <w:tcW w:w="1134" w:type="dxa"/>
-          </w:tcPr>
-          <w:p>
-            <w:pPr>
-              <w:rPr>
-                <w:b/>
-                <w:bCs/>
-                <w:color w:val="196B24" w:themeColor="accent3"/>
-              </w:rPr>
-            </w:pPr>
-            <w:r>
-              <w:rPr>
-                <w:b/>
-                <w:bCs/>
-                <w:color w:val="196B24" w:themeColor="accent3"/>
-              </w:rPr>
-              <w:t>Pending</w:t>
-            </w:r>
-          </w:p>
-        </w:tc>
-        <w:tc>
-          <w:tcPr>
-            <w:tcW w:w="1985" w:type="dxa"/>
-          </w:tcPr>
-          <w:p>
-            <w:pPr>
-              <w:rPr>
-                <w:vanish/>
-                <w:lang w:val="vi-VN"/>
-              </w:rPr>
-            </w:pPr>
-          </w:p>
-          <w:p>
-            <w:r>
-              <w:t>Đánh dấu 1 thông báo là đã đọc</w:t>
-            </w:r>
-          </w:p>
-        </w:tc>
-        <w:tc>
-          <w:tcPr>
-            <w:tcW w:w="1417" w:type="dxa"/>
-          </w:tcPr>
-          <w:p>
-            <w:pPr>
-              <w:rPr>
-                <w:b/>
-                <w:bCs/>
-                <w:color w:val="196B24" w:themeColor="accent3"/>
-              </w:rPr>
-            </w:pPr>
-          </w:p>
-        </w:tc>
-      </w:tr>
-      <w:tr>
-        <w:tc>
-          <w:tcPr>
-            <w:tcW w:w="1276" w:type="dxa"/>
-          </w:tcPr>
-          <w:p/>
-        </w:tc>
-        <w:tc>
-          <w:tcPr>
-            <w:tcW w:w="4395" w:type="dxa"/>
-          </w:tcPr>
-          <w:tbl>
-            <w:tblPr>
-              <w:tblW w:w="0" w:type="auto"/>
-              <w:tblCellSpacing w:w="15" w:type="dxa"/>
-              <w:tblCellMar>
-                <w:top w:w="15" w:type="dxa"/>
-                <w:left w:w="15" w:type="dxa"/>
-                <w:bottom w:w="15" w:type="dxa"/>
-                <w:right w:w="15" w:type="dxa"/>
-              </w:tblCellMar>
-              <w:tblLook w:val="04A0" w:firstRow="1" w:lastRow="0" w:firstColumn="1" w:lastColumn="0" w:noHBand="0" w:noVBand="1"/>
-            </w:tblPr>
-            <w:tblGrid>
-              <w:gridCol w:w="2971"/>
-            </w:tblGrid>
-            <w:tr>
-              <w:trPr>
-                <w:tblCellSpacing w:w="15" w:type="dxa"/>
-              </w:trPr>
-              <w:tc>
-                <w:tcPr>
-                  <w:tcW w:w="2911" w:type="dxa"/>
-                  <w:vAlign w:val="center"/>
-                  <w:hideMark/>
-                </w:tcPr>
-                <w:p>
-                  <w:pPr>
-                    <w:spacing w:after="0" w:line="240" w:lineRule="auto"/>
-                    <w:rPr>
-                      <w:lang w:val="vi-VN"/>
-                    </w:rPr>
-                  </w:pPr>
-                  <w:r>
-                    <w:rPr>
-                      <w:lang w:val="vi-VN"/>
-                    </w:rPr>
-                    <w:t>/notifications/read_all/</w:t>
-                  </w:r>
-                </w:p>
-              </w:tc>
-            </w:tr>
-          </w:tbl>
-          <w:p>
-            <w:pPr>
-              <w:rPr>
-                <w:vanish/>
-                <w:lang w:val="vi-VN"/>
-              </w:rPr>
-            </w:pPr>
-          </w:p>
-          <w:tbl>
-            <w:tblPr>
-              <w:tblW w:w="0" w:type="auto"/>
-              <w:tblCellSpacing w:w="15" w:type="dxa"/>
-              <w:tblCellMar>
-                <w:top w:w="15" w:type="dxa"/>
-                <w:left w:w="15" w:type="dxa"/>
-                <w:bottom w:w="15" w:type="dxa"/>
-                <w:right w:w="15" w:type="dxa"/>
-              </w:tblCellMar>
-              <w:tblLook w:val="04A0" w:firstRow="1" w:lastRow="0" w:firstColumn="1" w:lastColumn="0" w:noHBand="0" w:noVBand="1"/>
-            </w:tblPr>
-            <w:tblGrid>
-              <w:gridCol w:w="110"/>
-            </w:tblGrid>
-            <w:tr>
-              <w:trPr>
-                <w:tblCellSpacing w:w="15" w:type="dxa"/>
-              </w:trPr>
-              <w:tc>
-                <w:tcPr>
-                  <w:tcW w:w="36" w:type="dxa"/>
-                  <w:vAlign w:val="center"/>
-                  <w:hideMark/>
-                </w:tcPr>
-                <w:p>
-                  <w:pPr>
-                    <w:spacing w:after="0" w:line="240" w:lineRule="auto"/>
-                    <w:rPr>
-                      <w:lang w:val="vi-VN"/>
-                    </w:rPr>
-                  </w:pPr>
-                </w:p>
-              </w:tc>
-            </w:tr>
-          </w:tbl>
-          <w:p/>
+          <w:p>
+            <w:r>
+              <w:t>{{ngrok}}/notifications/read_all/</w:t>
+            </w:r>
+          </w:p>
         </w:tc>
         <w:tc>
           <w:tcPr>

</xml_diff>

<commit_message>
check api postman, fix bug
</commit_message>
<xml_diff>
--- a/Hỗ trợ tìm kiếm nhà trọ.docx
+++ b/Hỗ trợ tìm kiếm nhà trọ.docx
@@ -8497,14 +8497,6 @@
                 <w:color w:val="196B24" w:themeColor="accent3"/>
               </w:rPr>
               <w:t>OK</w:t>
-            </w:r>
-            <w:r>
-              <w:rPr>
-                <w:b/>
-                <w:bCs/>
-                <w:color w:val="196B24" w:themeColor="accent3"/>
-              </w:rPr>
-              <w:t>, thấy sao sao</w:t>
             </w:r>
           </w:p>
         </w:tc>
@@ -15238,6 +15230,7 @@
         <w:tc>
           <w:tcPr>
             <w:tcW w:w="1276" w:type="dxa"/>
+            <w:vMerge w:val="restart"/>
           </w:tcPr>
           <w:p>
             <w:r>
@@ -15334,12 +15327,9 @@
         <w:tc>
           <w:tcPr>
             <w:tcW w:w="1276" w:type="dxa"/>
-          </w:tcPr>
-          <w:p>
-            <w:r>
-              <w:t>Còn nữa mà tạm chưa kiểm tra</w:t>
-            </w:r>
-          </w:p>
+            <w:vMerge/>
+          </w:tcPr>
+          <w:p/>
         </w:tc>
         <w:tc>
           <w:tcPr>
@@ -15430,6 +15420,7 @@
         <w:tc>
           <w:tcPr>
             <w:tcW w:w="1276" w:type="dxa"/>
+            <w:vMerge/>
           </w:tcPr>
           <w:p/>
         </w:tc>
@@ -15522,6 +15513,7 @@
         <w:tc>
           <w:tcPr>
             <w:tcW w:w="1276" w:type="dxa"/>
+            <w:vMerge/>
           </w:tcPr>
           <w:p/>
         </w:tc>
@@ -15559,14 +15551,7 @@
                 <w:b/>
                 <w:bCs/>
               </w:rPr>
-              <w:t xml:space="preserve">PUT | </w:t>
-            </w:r>
-            <w:r>
-              <w:rPr>
-                <w:b/>
-                <w:bCs/>
-              </w:rPr>
-              <w:t>PATCH</w:t>
+              <w:t>PUT | PATCH</w:t>
             </w:r>
           </w:p>
         </w:tc>
@@ -15621,6 +15606,7 @@
         <w:tc>
           <w:tcPr>
             <w:tcW w:w="1276" w:type="dxa"/>
+            <w:vMerge/>
           </w:tcPr>
           <w:p/>
         </w:tc>
@@ -15786,8 +15772,13 @@
         <w:tc>
           <w:tcPr>
             <w:tcW w:w="1276" w:type="dxa"/>
-          </w:tcPr>
-          <w:p/>
+            <w:vMerge w:val="restart"/>
+          </w:tcPr>
+          <w:p>
+            <w:r>
+              <w:t>notifications</w:t>
+            </w:r>
+          </w:p>
         </w:tc>
         <w:tc>
           <w:tcPr>
@@ -15968,6 +15959,7 @@
         <w:tc>
           <w:tcPr>
             <w:tcW w:w="1276" w:type="dxa"/>
+            <w:vMerge/>
           </w:tcPr>
           <w:p/>
         </w:tc>
@@ -16114,6 +16106,7 @@
         <w:tc>
           <w:tcPr>
             <w:tcW w:w="1276" w:type="dxa"/>
+            <w:vMerge/>
           </w:tcPr>
           <w:p/>
         </w:tc>
@@ -16125,6 +16118,7 @@
             <w:pPr>
               <w:rPr>
                 <w:vanish/>
+                <w:color w:val="ED0000"/>
                 <w:lang w:val="vi-VN"/>
               </w:rPr>
             </w:pPr>
@@ -16158,6 +16152,7 @@
                   <w:pPr>
                     <w:spacing w:after="0" w:line="240" w:lineRule="auto"/>
                     <w:rPr>
+                      <w:color w:val="ED0000"/>
                       <w:lang w:val="vi-VN"/>
                     </w:rPr>
                   </w:pPr>
@@ -16166,7 +16161,15 @@
             </w:tr>
           </w:tbl>
           <w:p>
-            <w:r>
+            <w:pPr>
+              <w:rPr>
+                <w:color w:val="ED0000"/>
+              </w:rPr>
+            </w:pPr>
+            <w:r>
+              <w:rPr>
+                <w:color w:val="ED0000"/>
+              </w:rPr>
               <w:t>{{ngrok}}/notifications/read_all/</w:t>
             </w:r>
           </w:p>
@@ -16209,7 +16212,7 @@
                 <w:bCs/>
                 <w:color w:val="196B24" w:themeColor="accent3"/>
               </w:rPr>
-              <w:t>Pending</w:t>
+              <w:t>OK</w:t>
             </w:r>
           </w:p>
         </w:tc>
@@ -16242,6 +16245,566 @@
         <w:tc>
           <w:tcPr>
             <w:tcW w:w="1276" w:type="dxa"/>
+            <w:vMerge/>
+          </w:tcPr>
+          <w:p/>
+        </w:tc>
+        <w:tc>
+          <w:tcPr>
+            <w:tcW w:w="4395" w:type="dxa"/>
+          </w:tcPr>
+          <w:p>
+            <w:pPr>
+              <w:rPr>
+                <w:vanish/>
+                <w:color w:val="ED0000"/>
+                <w:lang w:val="vi-VN"/>
+              </w:rPr>
+            </w:pPr>
+            <w:r>
+              <w:rPr>
+                <w:color w:val="ED0000"/>
+              </w:rPr>
+              <w:t>{{ngrok}}/notifications/2/</w:t>
+            </w:r>
+          </w:p>
+        </w:tc>
+        <w:tc>
+          <w:tcPr>
+            <w:tcW w:w="1417" w:type="dxa"/>
+          </w:tcPr>
+          <w:p>
+            <w:pPr>
+              <w:rPr>
+                <w:b/>
+                <w:bCs/>
+              </w:rPr>
+            </w:pPr>
+            <w:r>
+              <w:rPr>
+                <w:b/>
+                <w:bCs/>
+              </w:rPr>
+              <w:t>GET</w:t>
+            </w:r>
+          </w:p>
+        </w:tc>
+        <w:tc>
+          <w:tcPr>
+            <w:tcW w:w="1134" w:type="dxa"/>
+          </w:tcPr>
+          <w:p>
+            <w:pPr>
+              <w:rPr>
+                <w:b/>
+                <w:bCs/>
+                <w:color w:val="196B24" w:themeColor="accent3"/>
+              </w:rPr>
+            </w:pPr>
+            <w:r>
+              <w:rPr>
+                <w:b/>
+                <w:bCs/>
+                <w:color w:val="196B24" w:themeColor="accent3"/>
+              </w:rPr>
+              <w:t>OK</w:t>
+            </w:r>
+          </w:p>
+        </w:tc>
+        <w:tc>
+          <w:tcPr>
+            <w:tcW w:w="1985" w:type="dxa"/>
+          </w:tcPr>
+          <w:p>
+            <w:r>
+              <w:t>Lấy chi tiết một thông báo</w:t>
+            </w:r>
+          </w:p>
+        </w:tc>
+        <w:tc>
+          <w:tcPr>
+            <w:tcW w:w="1417" w:type="dxa"/>
+          </w:tcPr>
+          <w:p>
+            <w:pPr>
+              <w:rPr>
+                <w:b/>
+                <w:bCs/>
+                <w:color w:val="196B24" w:themeColor="accent3"/>
+              </w:rPr>
+            </w:pPr>
+          </w:p>
+        </w:tc>
+      </w:tr>
+      <w:tr>
+        <w:tc>
+          <w:tcPr>
+            <w:tcW w:w="1276" w:type="dxa"/>
+            <w:vMerge/>
+          </w:tcPr>
+          <w:p/>
+        </w:tc>
+        <w:tc>
+          <w:tcPr>
+            <w:tcW w:w="4395" w:type="dxa"/>
+          </w:tcPr>
+          <w:p>
+            <w:pPr>
+              <w:rPr>
+                <w:vanish/>
+                <w:color w:val="ED0000"/>
+                <w:lang w:val="vi-VN"/>
+              </w:rPr>
+            </w:pPr>
+            <w:r>
+              <w:rPr>
+                <w:color w:val="ED0000"/>
+                <w:lang w:val="vi-VN"/>
+              </w:rPr>
+              <w:t>{{ngrok}}/notifications/</w:t>
+            </w:r>
+            <w:r>
+              <w:rPr>
+                <w:color w:val="ED0000"/>
+              </w:rPr>
+              <w:t>2</w:t>
+            </w:r>
+            <w:r>
+              <w:rPr>
+                <w:color w:val="ED0000"/>
+                <w:lang w:val="vi-VN"/>
+              </w:rPr>
+              <w:t>/</w:t>
+            </w:r>
+          </w:p>
+        </w:tc>
+        <w:tc>
+          <w:tcPr>
+            <w:tcW w:w="1417" w:type="dxa"/>
+          </w:tcPr>
+          <w:p>
+            <w:pPr>
+              <w:rPr>
+                <w:b/>
+                <w:bCs/>
+              </w:rPr>
+            </w:pPr>
+            <w:r>
+              <w:rPr>
+                <w:b/>
+                <w:bCs/>
+              </w:rPr>
+              <w:t>DELETE</w:t>
+            </w:r>
+          </w:p>
+        </w:tc>
+        <w:tc>
+          <w:tcPr>
+            <w:tcW w:w="1134" w:type="dxa"/>
+          </w:tcPr>
+          <w:p>
+            <w:pPr>
+              <w:rPr>
+                <w:b/>
+                <w:bCs/>
+                <w:color w:val="196B24" w:themeColor="accent3"/>
+              </w:rPr>
+            </w:pPr>
+            <w:r>
+              <w:rPr>
+                <w:b/>
+                <w:bCs/>
+                <w:color w:val="196B24" w:themeColor="accent3"/>
+              </w:rPr>
+              <w:t>OK</w:t>
+            </w:r>
+          </w:p>
+        </w:tc>
+        <w:tc>
+          <w:tcPr>
+            <w:tcW w:w="1985" w:type="dxa"/>
+          </w:tcPr>
+          <w:p>
+            <w:r>
+              <w:t>Xóa một thông báo</w:t>
+            </w:r>
+          </w:p>
+        </w:tc>
+        <w:tc>
+          <w:tcPr>
+            <w:tcW w:w="1417" w:type="dxa"/>
+          </w:tcPr>
+          <w:p>
+            <w:pPr>
+              <w:rPr>
+                <w:b/>
+                <w:bCs/>
+                <w:color w:val="196B24" w:themeColor="accent3"/>
+              </w:rPr>
+            </w:pPr>
+          </w:p>
+        </w:tc>
+      </w:tr>
+      <w:tr>
+        <w:tc>
+          <w:tcPr>
+            <w:tcW w:w="1276" w:type="dxa"/>
+            <w:vMerge/>
+          </w:tcPr>
+          <w:p/>
+        </w:tc>
+        <w:tc>
+          <w:tcPr>
+            <w:tcW w:w="4395" w:type="dxa"/>
+          </w:tcPr>
+          <w:p>
+            <w:pPr>
+              <w:rPr>
+                <w:vanish/>
+                <w:color w:val="ED0000"/>
+                <w:lang w:val="vi-VN"/>
+              </w:rPr>
+            </w:pPr>
+            <w:r>
+              <w:rPr>
+                <w:color w:val="ED0000"/>
+                <w:lang w:val="vi-VN"/>
+              </w:rPr>
+              <w:t>{{ngrok}}/notifications/delete_all/</w:t>
+            </w:r>
+          </w:p>
+        </w:tc>
+        <w:tc>
+          <w:tcPr>
+            <w:tcW w:w="1417" w:type="dxa"/>
+          </w:tcPr>
+          <w:p>
+            <w:pPr>
+              <w:rPr>
+                <w:b/>
+                <w:bCs/>
+              </w:rPr>
+            </w:pPr>
+            <w:r>
+              <w:rPr>
+                <w:b/>
+                <w:bCs/>
+              </w:rPr>
+              <w:t>DELETE</w:t>
+            </w:r>
+          </w:p>
+        </w:tc>
+        <w:tc>
+          <w:tcPr>
+            <w:tcW w:w="1134" w:type="dxa"/>
+          </w:tcPr>
+          <w:p>
+            <w:pPr>
+              <w:rPr>
+                <w:b/>
+                <w:bCs/>
+                <w:color w:val="196B24" w:themeColor="accent3"/>
+              </w:rPr>
+            </w:pPr>
+            <w:r>
+              <w:rPr>
+                <w:b/>
+                <w:bCs/>
+                <w:color w:val="196B24" w:themeColor="accent3"/>
+              </w:rPr>
+              <w:t>OK</w:t>
+            </w:r>
+          </w:p>
+        </w:tc>
+        <w:tc>
+          <w:tcPr>
+            <w:tcW w:w="1985" w:type="dxa"/>
+          </w:tcPr>
+          <w:p>
+            <w:r>
+              <w:t>Xóa tất cả thông báo</w:t>
+            </w:r>
+          </w:p>
+        </w:tc>
+        <w:tc>
+          <w:tcPr>
+            <w:tcW w:w="1417" w:type="dxa"/>
+          </w:tcPr>
+          <w:p>
+            <w:pPr>
+              <w:rPr>
+                <w:b/>
+                <w:bCs/>
+                <w:color w:val="196B24" w:themeColor="accent3"/>
+              </w:rPr>
+            </w:pPr>
+          </w:p>
+        </w:tc>
+      </w:tr>
+      <w:tr>
+        <w:tc>
+          <w:tcPr>
+            <w:tcW w:w="1276" w:type="dxa"/>
+            <w:vMerge/>
+          </w:tcPr>
+          <w:p/>
+        </w:tc>
+        <w:tc>
+          <w:tcPr>
+            <w:tcW w:w="4395" w:type="dxa"/>
+          </w:tcPr>
+          <w:p>
+            <w:pPr>
+              <w:rPr>
+                <w:vanish/>
+                <w:color w:val="ED0000"/>
+                <w:lang w:val="vi-VN"/>
+              </w:rPr>
+            </w:pPr>
+            <w:r>
+              <w:rPr>
+                <w:color w:val="ED0000"/>
+                <w:lang w:val="vi-VN"/>
+              </w:rPr>
+              <w:t>{{ngrok}}/notifications/unread_count/</w:t>
+            </w:r>
+          </w:p>
+        </w:tc>
+        <w:tc>
+          <w:tcPr>
+            <w:tcW w:w="1417" w:type="dxa"/>
+          </w:tcPr>
+          <w:p>
+            <w:pPr>
+              <w:rPr>
+                <w:b/>
+                <w:bCs/>
+              </w:rPr>
+            </w:pPr>
+            <w:r>
+              <w:rPr>
+                <w:b/>
+                <w:bCs/>
+              </w:rPr>
+              <w:t>GET</w:t>
+            </w:r>
+          </w:p>
+        </w:tc>
+        <w:tc>
+          <w:tcPr>
+            <w:tcW w:w="1134" w:type="dxa"/>
+          </w:tcPr>
+          <w:p>
+            <w:pPr>
+              <w:rPr>
+                <w:b/>
+                <w:bCs/>
+                <w:color w:val="196B24" w:themeColor="accent3"/>
+              </w:rPr>
+            </w:pPr>
+            <w:r>
+              <w:rPr>
+                <w:b/>
+                <w:bCs/>
+                <w:color w:val="196B24" w:themeColor="accent3"/>
+              </w:rPr>
+              <w:t>OK</w:t>
+            </w:r>
+          </w:p>
+        </w:tc>
+        <w:tc>
+          <w:tcPr>
+            <w:tcW w:w="1985" w:type="dxa"/>
+          </w:tcPr>
+          <w:p>
+            <w:r>
+              <w:t>Đếm số thông báo chưa đọc</w:t>
+            </w:r>
+          </w:p>
+        </w:tc>
+        <w:tc>
+          <w:tcPr>
+            <w:tcW w:w="1417" w:type="dxa"/>
+          </w:tcPr>
+          <w:p>
+            <w:pPr>
+              <w:rPr>
+                <w:b/>
+                <w:bCs/>
+                <w:color w:val="196B24" w:themeColor="accent3"/>
+              </w:rPr>
+            </w:pPr>
+          </w:p>
+        </w:tc>
+      </w:tr>
+      <w:tr>
+        <w:tc>
+          <w:tcPr>
+            <w:tcW w:w="1276" w:type="dxa"/>
+            <w:vMerge/>
+          </w:tcPr>
+          <w:p/>
+        </w:tc>
+        <w:tc>
+          <w:tcPr>
+            <w:tcW w:w="4395" w:type="dxa"/>
+          </w:tcPr>
+          <w:p>
+            <w:pPr>
+              <w:rPr>
+                <w:vanish/>
+                <w:color w:val="ED0000"/>
+                <w:lang w:val="vi-VN"/>
+              </w:rPr>
+            </w:pPr>
+            <w:r>
+              <w:rPr>
+                <w:color w:val="ED0000"/>
+                <w:lang w:val="vi-VN"/>
+              </w:rPr>
+              <w:t>{{ngrok}}/notifications/by_type/?type=SYSTEM</w:t>
+            </w:r>
+          </w:p>
+        </w:tc>
+        <w:tc>
+          <w:tcPr>
+            <w:tcW w:w="1417" w:type="dxa"/>
+          </w:tcPr>
+          <w:p>
+            <w:pPr>
+              <w:rPr>
+                <w:b/>
+                <w:bCs/>
+              </w:rPr>
+            </w:pPr>
+            <w:r>
+              <w:rPr>
+                <w:b/>
+                <w:bCs/>
+              </w:rPr>
+              <w:t>GET</w:t>
+            </w:r>
+          </w:p>
+        </w:tc>
+        <w:tc>
+          <w:tcPr>
+            <w:tcW w:w="1134" w:type="dxa"/>
+          </w:tcPr>
+          <w:p>
+            <w:pPr>
+              <w:rPr>
+                <w:b/>
+                <w:bCs/>
+                <w:color w:val="196B24" w:themeColor="accent3"/>
+              </w:rPr>
+            </w:pPr>
+            <w:r>
+              <w:rPr>
+                <w:b/>
+                <w:bCs/>
+                <w:color w:val="196B24" w:themeColor="accent3"/>
+              </w:rPr>
+              <w:t>OK</w:t>
+            </w:r>
+          </w:p>
+        </w:tc>
+        <w:tc>
+          <w:tcPr>
+            <w:tcW w:w="1985" w:type="dxa"/>
+          </w:tcPr>
+          <w:p>
+            <w:r>
+              <w:t>Lọc thông báo theo loại</w:t>
+            </w:r>
+          </w:p>
+        </w:tc>
+        <w:tc>
+          <w:tcPr>
+            <w:tcW w:w="1417" w:type="dxa"/>
+          </w:tcPr>
+          <w:p>
+            <w:pPr>
+              <w:rPr>
+                <w:b/>
+                <w:bCs/>
+                <w:color w:val="196B24" w:themeColor="accent3"/>
+              </w:rPr>
+            </w:pPr>
+          </w:p>
+        </w:tc>
+      </w:tr>
+      <w:tr>
+        <w:tc>
+          <w:tcPr>
+            <w:tcW w:w="1276" w:type="dxa"/>
+          </w:tcPr>
+          <w:p/>
+        </w:tc>
+        <w:tc>
+          <w:tcPr>
+            <w:tcW w:w="4395" w:type="dxa"/>
+          </w:tcPr>
+          <w:p>
+            <w:pPr>
+              <w:rPr>
+                <w:vanish/>
+                <w:lang w:val="vi-VN"/>
+              </w:rPr>
+            </w:pPr>
+          </w:p>
+        </w:tc>
+        <w:tc>
+          <w:tcPr>
+            <w:tcW w:w="1417" w:type="dxa"/>
+          </w:tcPr>
+          <w:p>
+            <w:pPr>
+              <w:rPr>
+                <w:b/>
+                <w:bCs/>
+              </w:rPr>
+            </w:pPr>
+          </w:p>
+        </w:tc>
+        <w:tc>
+          <w:tcPr>
+            <w:tcW w:w="1134" w:type="dxa"/>
+          </w:tcPr>
+          <w:p>
+            <w:pPr>
+              <w:rPr>
+                <w:b/>
+                <w:bCs/>
+                <w:color w:val="196B24" w:themeColor="accent3"/>
+              </w:rPr>
+            </w:pPr>
+          </w:p>
+        </w:tc>
+        <w:tc>
+          <w:tcPr>
+            <w:tcW w:w="1985" w:type="dxa"/>
+          </w:tcPr>
+          <w:p/>
+        </w:tc>
+        <w:tc>
+          <w:tcPr>
+            <w:tcW w:w="1417" w:type="dxa"/>
+          </w:tcPr>
+          <w:p>
+            <w:pPr>
+              <w:rPr>
+                <w:b/>
+                <w:bCs/>
+                <w:color w:val="196B24" w:themeColor="accent3"/>
+              </w:rPr>
+            </w:pPr>
+          </w:p>
+        </w:tc>
+      </w:tr>
+      <w:tr>
+        <w:tc>
+          <w:tcPr>
+            <w:tcW w:w="1276" w:type="dxa"/>
             <w:shd w:val="clear" w:color="auto" w:fill="D9D9D9" w:themeFill="background1" w:themeFillShade="D9"/>
           </w:tcPr>
           <w:p/>
@@ -16330,14 +16893,14 @@
           <w:p>
             <w:pPr>
               <w:rPr>
-                <w:color w:val="000000" w:themeColor="text1"/>
-              </w:rPr>
-            </w:pPr>
-            <w:r>
-              <w:rPr>
-                <w:color w:val="000000" w:themeColor="text1"/>
-              </w:rPr>
-              <w:t>http://127.0.0.1:8000/chat-rooms/</w:t>
+                <w:color w:val="FF0000"/>
+              </w:rPr>
+            </w:pPr>
+            <w:r>
+              <w:rPr>
+                <w:color w:val="FF0000"/>
+              </w:rPr>
+              <w:t>{{ngrok}}/chat-rooms/</w:t>
             </w:r>
           </w:p>
         </w:tc>
@@ -16379,7 +16942,7 @@
                 <w:bCs/>
                 <w:color w:val="196B24" w:themeColor="accent3"/>
               </w:rPr>
-              <w:t>Pending</w:t>
+              <w:t>OK</w:t>
             </w:r>
           </w:p>
         </w:tc>
@@ -16423,14 +16986,14 @@
           <w:p>
             <w:pPr>
               <w:rPr>
-                <w:color w:val="000000" w:themeColor="text1"/>
-              </w:rPr>
-            </w:pPr>
-            <w:r>
-              <w:rPr>
-                <w:color w:val="000000" w:themeColor="text1"/>
-              </w:rPr>
-              <w:t>http://127.0.0.1:8000/chat-rooms/</w:t>
+                <w:color w:val="FF0000"/>
+              </w:rPr>
+            </w:pPr>
+            <w:r>
+              <w:rPr>
+                <w:color w:val="FF0000"/>
+              </w:rPr>
+              <w:t>{{ngrok}}/chat-rooms/</w:t>
             </w:r>
           </w:p>
         </w:tc>
@@ -16472,7 +17035,7 @@
                 <w:bCs/>
                 <w:color w:val="196B24" w:themeColor="accent3"/>
               </w:rPr>
-              <w:t>Pending</w:t>
+              <w:t>OK</w:t>
             </w:r>
           </w:p>
         </w:tc>
@@ -16521,9 +17084,9 @@
             </w:pPr>
             <w:r>
               <w:rPr>
-                <w:color w:val="000000" w:themeColor="text1"/>
-              </w:rPr>
-              <w:t>http://127.0.0.1:8000/chat-rooms/{id}/</w:t>
+                <w:color w:val="FF0000"/>
+              </w:rPr>
+              <w:t>{{ngrok}}/chat-rooms/3/</w:t>
             </w:r>
           </w:p>
         </w:tc>
@@ -16565,7 +17128,7 @@
                 <w:bCs/>
                 <w:color w:val="196B24" w:themeColor="accent3"/>
               </w:rPr>
-              <w:t>Pending</w:t>
+              <w:t>OK</w:t>
             </w:r>
           </w:p>
         </w:tc>
@@ -16609,14 +17172,14 @@
           <w:p>
             <w:pPr>
               <w:rPr>
-                <w:color w:val="000000" w:themeColor="text1"/>
-              </w:rPr>
-            </w:pPr>
-            <w:r>
-              <w:rPr>
-                <w:color w:val="000000" w:themeColor="text1"/>
-              </w:rPr>
-              <w:t>http://127.0.0.1:8000/chat-rooms/{id}/</w:t>
+                <w:color w:val="FF0000"/>
+              </w:rPr>
+            </w:pPr>
+            <w:r>
+              <w:rPr>
+                <w:color w:val="FF0000"/>
+              </w:rPr>
+              <w:t>{{ngrok}}/chat-rooms/3/</w:t>
             </w:r>
           </w:p>
         </w:tc>
@@ -16636,6 +17199,13 @@
                 <w:b/>
                 <w:bCs/>
               </w:rPr>
+              <w:t xml:space="preserve">PUT | </w:t>
+            </w:r>
+            <w:r>
+              <w:rPr>
+                <w:b/>
+                <w:bCs/>
+              </w:rPr>
               <w:t>PATCH</w:t>
             </w:r>
           </w:p>
@@ -16658,7 +17228,7 @@
                 <w:bCs/>
                 <w:color w:val="196B24" w:themeColor="accent3"/>
               </w:rPr>
-              <w:t>Pending</w:t>
+              <w:t>OK</w:t>
             </w:r>
           </w:p>
         </w:tc>
@@ -16702,14 +17272,14 @@
           <w:p>
             <w:pPr>
               <w:rPr>
-                <w:color w:val="000000" w:themeColor="text1"/>
-              </w:rPr>
-            </w:pPr>
-            <w:r>
-              <w:rPr>
-                <w:color w:val="000000" w:themeColor="text1"/>
-              </w:rPr>
-              <w:t>http://127.0.0.1:8000/chat-rooms/{id}/</w:t>
+                <w:color w:val="FF0000"/>
+              </w:rPr>
+            </w:pPr>
+            <w:r>
+              <w:rPr>
+                <w:color w:val="FF0000"/>
+              </w:rPr>
+              <w:t>{{ngrok}}/chat-rooms/2/</w:t>
             </w:r>
           </w:p>
         </w:tc>
@@ -16751,7 +17321,7 @@
                 <w:bCs/>
                 <w:color w:val="196B24" w:themeColor="accent3"/>
               </w:rPr>
-              <w:t>Pending</w:t>
+              <w:t>OK</w:t>
             </w:r>
           </w:p>
         </w:tc>
@@ -16863,14 +17433,14 @@
           <w:p>
             <w:pPr>
               <w:rPr>
-                <w:color w:val="000000" w:themeColor="text1"/>
-              </w:rPr>
-            </w:pPr>
-            <w:r>
-              <w:rPr>
-                <w:color w:val="000000" w:themeColor="text1"/>
-              </w:rPr>
-              <w:t>http://127.0.0.1:8000/chat-rooms/{chat_room_id}/messages/</w:t>
+                <w:color w:val="FF0000"/>
+              </w:rPr>
+            </w:pPr>
+            <w:r>
+              <w:rPr>
+                <w:color w:val="FF0000"/>
+              </w:rPr>
+              <w:t>{{ngrok}}/chat-rooms/1/messages/</w:t>
             </w:r>
           </w:p>
         </w:tc>
@@ -16912,7 +17482,7 @@
                 <w:bCs/>
                 <w:color w:val="196B24" w:themeColor="accent3"/>
               </w:rPr>
-              <w:t>Pending</w:t>
+              <w:t>OK</w:t>
             </w:r>
           </w:p>
         </w:tc>
@@ -16956,14 +17526,14 @@
           <w:p>
             <w:pPr>
               <w:rPr>
-                <w:color w:val="000000" w:themeColor="text1"/>
-              </w:rPr>
-            </w:pPr>
-            <w:r>
-              <w:rPr>
-                <w:color w:val="000000" w:themeColor="text1"/>
-              </w:rPr>
-              <w:t>http://127.0.0.1:8000/chat-rooms/{chat_room_id}/messages/</w:t>
+                <w:color w:val="FF0000"/>
+              </w:rPr>
+            </w:pPr>
+            <w:r>
+              <w:rPr>
+                <w:color w:val="FF0000"/>
+              </w:rPr>
+              <w:t>{{ngrok}}/chat-rooms/3/messages/</w:t>
             </w:r>
           </w:p>
         </w:tc>
@@ -17005,7 +17575,7 @@
                 <w:bCs/>
                 <w:color w:val="196B24" w:themeColor="accent3"/>
               </w:rPr>
-              <w:t>Pending</w:t>
+              <w:t>OK</w:t>
             </w:r>
           </w:p>
         </w:tc>
@@ -17057,14 +17627,14 @@
           <w:p>
             <w:pPr>
               <w:rPr>
-                <w:color w:val="000000" w:themeColor="text1"/>
-              </w:rPr>
-            </w:pPr>
-            <w:r>
-              <w:rPr>
-                <w:color w:val="000000" w:themeColor="text1"/>
-              </w:rPr>
-              <w:t>http://127.0.0.1:8000/chat-rooms/{chat_room_id}/messages/{id}/</w:t>
+                <w:color w:val="FF0000"/>
+              </w:rPr>
+            </w:pPr>
+            <w:r>
+              <w:rPr>
+                <w:color w:val="FF0000"/>
+              </w:rPr>
+              <w:t>{{ngrok}}/chat-rooms/3/messages/3/</w:t>
             </w:r>
           </w:p>
         </w:tc>
@@ -17106,7 +17676,7 @@
                 <w:bCs/>
                 <w:color w:val="196B24" w:themeColor="accent3"/>
               </w:rPr>
-              <w:t>Pending</w:t>
+              <w:t>OK</w:t>
             </w:r>
           </w:p>
         </w:tc>
@@ -17150,14 +17720,14 @@
           <w:p>
             <w:pPr>
               <w:rPr>
-                <w:color w:val="000000" w:themeColor="text1"/>
-              </w:rPr>
-            </w:pPr>
-            <w:r>
-              <w:rPr>
-                <w:color w:val="000000" w:themeColor="text1"/>
-              </w:rPr>
-              <w:t>http://127.0.0.1:8000/chat-rooms/{chat_room_id}/messages/{id}/</w:t>
+                <w:color w:val="FF0000"/>
+              </w:rPr>
+            </w:pPr>
+            <w:r>
+              <w:rPr>
+                <w:color w:val="FF0000"/>
+              </w:rPr>
+              <w:t>{{ngrok}}/chat-rooms/3/messages/3/</w:t>
             </w:r>
           </w:p>
         </w:tc>
@@ -17177,7 +17747,14 @@
                 <w:b/>
                 <w:bCs/>
               </w:rPr>
-              <w:t>PATCH</w:t>
+              <w:t>PUT</w:t>
+            </w:r>
+            <w:r>
+              <w:rPr>
+                <w:b/>
+                <w:bCs/>
+              </w:rPr>
+              <w:t xml:space="preserve"> | PATCH</w:t>
             </w:r>
           </w:p>
         </w:tc>
@@ -17199,7 +17776,7 @@
                 <w:bCs/>
                 <w:color w:val="196B24" w:themeColor="accent3"/>
               </w:rPr>
-              <w:t>Pending</w:t>
+              <w:t>OK</w:t>
             </w:r>
           </w:p>
         </w:tc>
@@ -17216,15 +17793,24 @@
         <w:tc>
           <w:tcPr>
             <w:tcW w:w="1417" w:type="dxa"/>
-          </w:tcPr>
-          <w:p>
-            <w:pPr>
-              <w:rPr>
-                <w:b/>
-                <w:bCs/>
-                <w:color w:val="196B24" w:themeColor="accent3"/>
-              </w:rPr>
-            </w:pPr>
+            <w:vMerge w:val="restart"/>
+          </w:tcPr>
+          <w:p>
+            <w:pPr>
+              <w:rPr>
+                <w:b/>
+                <w:bCs/>
+                <w:color w:val="196B24" w:themeColor="accent3"/>
+              </w:rPr>
+            </w:pPr>
+            <w:r>
+              <w:rPr>
+                <w:b/>
+                <w:bCs/>
+                <w:color w:val="196B24" w:themeColor="accent3"/>
+              </w:rPr>
+              <w:t>Mess của nguồi nào, chỉ có người đó xóa được</w:t>
+            </w:r>
           </w:p>
         </w:tc>
       </w:tr>
@@ -17248,9 +17834,9 @@
             </w:pPr>
             <w:r>
               <w:rPr>
-                <w:color w:val="000000" w:themeColor="text1"/>
-              </w:rPr>
-              <w:t>http://127.0.0.1:8000/chat-rooms/{chat_room_id}/messages/{id}/</w:t>
+                <w:color w:val="FF0000"/>
+              </w:rPr>
+              <w:t>{{ngrok}}/chat-rooms/3/messages/3/</w:t>
             </w:r>
           </w:p>
         </w:tc>
@@ -17292,7 +17878,7 @@
                 <w:bCs/>
                 <w:color w:val="196B24" w:themeColor="accent3"/>
               </w:rPr>
-              <w:t>Pending</w:t>
+              <w:t>OK</w:t>
             </w:r>
           </w:p>
         </w:tc>
@@ -17309,6 +17895,7 @@
         <w:tc>
           <w:tcPr>
             <w:tcW w:w="1417" w:type="dxa"/>
+            <w:vMerge/>
           </w:tcPr>
           <w:p>
             <w:pPr>
@@ -17336,14 +17923,14 @@
           <w:p>
             <w:pPr>
               <w:rPr>
-                <w:color w:val="000000" w:themeColor="text1"/>
-              </w:rPr>
-            </w:pPr>
-            <w:r>
-              <w:rPr>
-                <w:color w:val="000000" w:themeColor="text1"/>
-              </w:rPr>
-              <w:t>http://127.0.0.1:8000/chat-rooms/{chat_room_id}/messages/{id}/read/</w:t>
+                <w:color w:val="FF0000"/>
+              </w:rPr>
+            </w:pPr>
+            <w:r>
+              <w:rPr>
+                <w:color w:val="FF0000"/>
+              </w:rPr>
+              <w:t>{{ngrok}}/chat-rooms/3/messages/3/read/</w:t>
             </w:r>
           </w:p>
         </w:tc>
@@ -17385,7 +17972,7 @@
                 <w:bCs/>
                 <w:color w:val="196B24" w:themeColor="accent3"/>
               </w:rPr>
-              <w:t>Pending</w:t>
+              <w:t>OK</w:t>
             </w:r>
           </w:p>
         </w:tc>
@@ -17860,6 +18447,102 @@
           <w:tcPr>
             <w:tcW w:w="1276" w:type="dxa"/>
           </w:tcPr>
+          <w:p>
+            <w:r>
+              <w:t xml:space="preserve">Room -tenant </w:t>
+            </w:r>
+          </w:p>
+        </w:tc>
+        <w:tc>
+          <w:tcPr>
+            <w:tcW w:w="4395" w:type="dxa"/>
+          </w:tcPr>
+          <w:p>
+            <w:pPr>
+              <w:rPr>
+                <w:color w:val="ED0000"/>
+              </w:rPr>
+            </w:pPr>
+            <w:r>
+              <w:rPr>
+                <w:color w:val="ED0000"/>
+              </w:rPr>
+              <w:t>{{ngrok}}/room-tenants/</w:t>
+            </w:r>
+          </w:p>
+        </w:tc>
+        <w:tc>
+          <w:tcPr>
+            <w:tcW w:w="1417" w:type="dxa"/>
+          </w:tcPr>
+          <w:p>
+            <w:pPr>
+              <w:rPr>
+                <w:b/>
+                <w:bCs/>
+              </w:rPr>
+            </w:pPr>
+            <w:r>
+              <w:rPr>
+                <w:b/>
+                <w:bCs/>
+              </w:rPr>
+              <w:t>GET</w:t>
+            </w:r>
+          </w:p>
+        </w:tc>
+        <w:tc>
+          <w:tcPr>
+            <w:tcW w:w="1134" w:type="dxa"/>
+          </w:tcPr>
+          <w:p>
+            <w:pPr>
+              <w:rPr>
+                <w:b/>
+                <w:bCs/>
+                <w:color w:val="196B24" w:themeColor="accent3"/>
+              </w:rPr>
+            </w:pPr>
+            <w:r>
+              <w:rPr>
+                <w:b/>
+                <w:bCs/>
+                <w:color w:val="196B24" w:themeColor="accent3"/>
+              </w:rPr>
+              <w:t>OK</w:t>
+            </w:r>
+          </w:p>
+        </w:tc>
+        <w:tc>
+          <w:tcPr>
+            <w:tcW w:w="1985" w:type="dxa"/>
+          </w:tcPr>
+          <w:p>
+            <w:r>
+              <w:t>Lấy danh sách yêu cầu thuê phòng</w:t>
+            </w:r>
+          </w:p>
+        </w:tc>
+        <w:tc>
+          <w:tcPr>
+            <w:tcW w:w="1417" w:type="dxa"/>
+          </w:tcPr>
+          <w:p>
+            <w:pPr>
+              <w:rPr>
+                <w:b/>
+                <w:bCs/>
+                <w:color w:val="196B24" w:themeColor="accent3"/>
+              </w:rPr>
+            </w:pPr>
+          </w:p>
+        </w:tc>
+      </w:tr>
+      <w:tr>
+        <w:tc>
+          <w:tcPr>
+            <w:tcW w:w="1276" w:type="dxa"/>
+          </w:tcPr>
           <w:p/>
         </w:tc>
         <w:tc>
@@ -17869,9 +18552,15 @@
           <w:p>
             <w:pPr>
               <w:rPr>
-                <w:color w:val="000000" w:themeColor="text1"/>
-              </w:rPr>
-            </w:pPr>
+                <w:color w:val="ED0000"/>
+              </w:rPr>
+            </w:pPr>
+            <w:r>
+              <w:rPr>
+                <w:color w:val="ED0000"/>
+              </w:rPr>
+              <w:t>{{ngrok}}/room-tenants/</w:t>
+            </w:r>
           </w:p>
         </w:tc>
         <w:tc>
@@ -17885,6 +18574,13 @@
                 <w:bCs/>
               </w:rPr>
             </w:pPr>
+            <w:r>
+              <w:rPr>
+                <w:b/>
+                <w:bCs/>
+              </w:rPr>
+              <w:t>POST</w:t>
+            </w:r>
           </w:p>
         </w:tc>
         <w:tc>
@@ -17899,13 +18595,485 @@
                 <w:color w:val="196B24" w:themeColor="accent3"/>
               </w:rPr>
             </w:pPr>
+            <w:r>
+              <w:rPr>
+                <w:b/>
+                <w:bCs/>
+                <w:color w:val="196B24" w:themeColor="accent3"/>
+              </w:rPr>
+              <w:t>OK</w:t>
+            </w:r>
           </w:p>
         </w:tc>
         <w:tc>
           <w:tcPr>
             <w:tcW w:w="1985" w:type="dxa"/>
           </w:tcPr>
+          <w:p>
+            <w:r>
+              <w:t>Tạo yêu cầu thuê phòng mới</w:t>
+            </w:r>
+          </w:p>
+        </w:tc>
+        <w:tc>
+          <w:tcPr>
+            <w:tcW w:w="1417" w:type="dxa"/>
+          </w:tcPr>
+          <w:p>
+            <w:pPr>
+              <w:rPr>
+                <w:b/>
+                <w:bCs/>
+                <w:color w:val="196B24" w:themeColor="accent3"/>
+              </w:rPr>
+            </w:pPr>
+          </w:p>
+        </w:tc>
+      </w:tr>
+      <w:tr>
+        <w:tc>
+          <w:tcPr>
+            <w:tcW w:w="1276" w:type="dxa"/>
+          </w:tcPr>
           <w:p/>
+        </w:tc>
+        <w:tc>
+          <w:tcPr>
+            <w:tcW w:w="4395" w:type="dxa"/>
+          </w:tcPr>
+          <w:p>
+            <w:pPr>
+              <w:rPr>
+                <w:color w:val="ED0000"/>
+              </w:rPr>
+            </w:pPr>
+            <w:r>
+              <w:rPr>
+                <w:color w:val="ED0000"/>
+              </w:rPr>
+              <w:t>{{ngrok}}/room-tenants/{id}/</w:t>
+            </w:r>
+          </w:p>
+        </w:tc>
+        <w:tc>
+          <w:tcPr>
+            <w:tcW w:w="1417" w:type="dxa"/>
+          </w:tcPr>
+          <w:p>
+            <w:pPr>
+              <w:rPr>
+                <w:b/>
+                <w:bCs/>
+              </w:rPr>
+            </w:pPr>
+            <w:r>
+              <w:rPr>
+                <w:b/>
+                <w:bCs/>
+              </w:rPr>
+              <w:t>GET</w:t>
+            </w:r>
+          </w:p>
+        </w:tc>
+        <w:tc>
+          <w:tcPr>
+            <w:tcW w:w="1134" w:type="dxa"/>
+          </w:tcPr>
+          <w:p>
+            <w:pPr>
+              <w:rPr>
+                <w:b/>
+                <w:bCs/>
+                <w:color w:val="196B24" w:themeColor="accent3"/>
+              </w:rPr>
+            </w:pPr>
+            <w:r>
+              <w:rPr>
+                <w:b/>
+                <w:bCs/>
+                <w:color w:val="196B24" w:themeColor="accent3"/>
+              </w:rPr>
+              <w:t>OK</w:t>
+            </w:r>
+          </w:p>
+        </w:tc>
+        <w:tc>
+          <w:tcPr>
+            <w:tcW w:w="1985" w:type="dxa"/>
+          </w:tcPr>
+          <w:p>
+            <w:r>
+              <w:t>Lấy chi tiết một yêu cầu thuê phòng</w:t>
+            </w:r>
+          </w:p>
+        </w:tc>
+        <w:tc>
+          <w:tcPr>
+            <w:tcW w:w="1417" w:type="dxa"/>
+          </w:tcPr>
+          <w:p>
+            <w:pPr>
+              <w:rPr>
+                <w:b/>
+                <w:bCs/>
+                <w:color w:val="196B24" w:themeColor="accent3"/>
+              </w:rPr>
+            </w:pPr>
+          </w:p>
+        </w:tc>
+      </w:tr>
+      <w:tr>
+        <w:tc>
+          <w:tcPr>
+            <w:tcW w:w="1276" w:type="dxa"/>
+          </w:tcPr>
+          <w:p/>
+        </w:tc>
+        <w:tc>
+          <w:tcPr>
+            <w:tcW w:w="4395" w:type="dxa"/>
+          </w:tcPr>
+          <w:p>
+            <w:pPr>
+              <w:rPr>
+                <w:color w:val="ED0000"/>
+              </w:rPr>
+            </w:pPr>
+            <w:r>
+              <w:rPr>
+                <w:color w:val="ED0000"/>
+              </w:rPr>
+              <w:t>{{ngrok}}/room-tenants/{id}/</w:t>
+            </w:r>
+          </w:p>
+        </w:tc>
+        <w:tc>
+          <w:tcPr>
+            <w:tcW w:w="1417" w:type="dxa"/>
+          </w:tcPr>
+          <w:p>
+            <w:pPr>
+              <w:rPr>
+                <w:b/>
+                <w:bCs/>
+              </w:rPr>
+            </w:pPr>
+            <w:r>
+              <w:rPr>
+                <w:b/>
+                <w:bCs/>
+              </w:rPr>
+              <w:t>PUT</w:t>
+            </w:r>
+          </w:p>
+        </w:tc>
+        <w:tc>
+          <w:tcPr>
+            <w:tcW w:w="1134" w:type="dxa"/>
+          </w:tcPr>
+          <w:p>
+            <w:pPr>
+              <w:rPr>
+                <w:b/>
+                <w:bCs/>
+                <w:color w:val="196B24" w:themeColor="accent3"/>
+              </w:rPr>
+            </w:pPr>
+            <w:r>
+              <w:rPr>
+                <w:b/>
+                <w:bCs/>
+                <w:color w:val="196B24" w:themeColor="accent3"/>
+              </w:rPr>
+              <w:t>OK</w:t>
+            </w:r>
+          </w:p>
+        </w:tc>
+        <w:tc>
+          <w:tcPr>
+            <w:tcW w:w="1985" w:type="dxa"/>
+          </w:tcPr>
+          <w:p>
+            <w:r>
+              <w:t>Cập nhật toàn bộ thông tin yêu cầu thuê phòng</w:t>
+            </w:r>
+          </w:p>
+        </w:tc>
+        <w:tc>
+          <w:tcPr>
+            <w:tcW w:w="1417" w:type="dxa"/>
+          </w:tcPr>
+          <w:p>
+            <w:pPr>
+              <w:rPr>
+                <w:b/>
+                <w:bCs/>
+                <w:color w:val="196B24" w:themeColor="accent3"/>
+              </w:rPr>
+            </w:pPr>
+          </w:p>
+        </w:tc>
+      </w:tr>
+      <w:tr>
+        <w:tc>
+          <w:tcPr>
+            <w:tcW w:w="1276" w:type="dxa"/>
+          </w:tcPr>
+          <w:p/>
+        </w:tc>
+        <w:tc>
+          <w:tcPr>
+            <w:tcW w:w="4395" w:type="dxa"/>
+          </w:tcPr>
+          <w:p>
+            <w:pPr>
+              <w:rPr>
+                <w:color w:val="ED0000"/>
+              </w:rPr>
+            </w:pPr>
+            <w:r>
+              <w:rPr>
+                <w:color w:val="ED0000"/>
+              </w:rPr>
+              <w:t>{{ngrok}}/room-tenants/{id}/</w:t>
+            </w:r>
+          </w:p>
+        </w:tc>
+        <w:tc>
+          <w:tcPr>
+            <w:tcW w:w="1417" w:type="dxa"/>
+          </w:tcPr>
+          <w:p>
+            <w:pPr>
+              <w:rPr>
+                <w:b/>
+                <w:bCs/>
+              </w:rPr>
+            </w:pPr>
+            <w:r>
+              <w:rPr>
+                <w:b/>
+                <w:bCs/>
+              </w:rPr>
+              <w:t>PATCH</w:t>
+            </w:r>
+          </w:p>
+        </w:tc>
+        <w:tc>
+          <w:tcPr>
+            <w:tcW w:w="1134" w:type="dxa"/>
+          </w:tcPr>
+          <w:p>
+            <w:pPr>
+              <w:rPr>
+                <w:b/>
+                <w:bCs/>
+                <w:color w:val="196B24" w:themeColor="accent3"/>
+              </w:rPr>
+            </w:pPr>
+            <w:r>
+              <w:rPr>
+                <w:b/>
+                <w:bCs/>
+                <w:color w:val="196B24" w:themeColor="accent3"/>
+              </w:rPr>
+              <w:t>OK</w:t>
+            </w:r>
+          </w:p>
+        </w:tc>
+        <w:tc>
+          <w:tcPr>
+            <w:tcW w:w="1985" w:type="dxa"/>
+          </w:tcPr>
+          <w:p>
+            <w:r>
+              <w:t>Cập nhật một phần thông tin yêu cầu thuê phòng</w:t>
+            </w:r>
+          </w:p>
+        </w:tc>
+        <w:tc>
+          <w:tcPr>
+            <w:tcW w:w="1417" w:type="dxa"/>
+          </w:tcPr>
+          <w:p>
+            <w:pPr>
+              <w:rPr>
+                <w:b/>
+                <w:bCs/>
+                <w:color w:val="196B24" w:themeColor="accent3"/>
+              </w:rPr>
+            </w:pPr>
+          </w:p>
+        </w:tc>
+      </w:tr>
+      <w:tr>
+        <w:tc>
+          <w:tcPr>
+            <w:tcW w:w="1276" w:type="dxa"/>
+          </w:tcPr>
+          <w:p/>
+        </w:tc>
+        <w:tc>
+          <w:tcPr>
+            <w:tcW w:w="4395" w:type="dxa"/>
+          </w:tcPr>
+          <w:p>
+            <w:pPr>
+              <w:rPr>
+                <w:color w:val="ED0000"/>
+              </w:rPr>
+            </w:pPr>
+            <w:r>
+              <w:rPr>
+                <w:color w:val="ED0000"/>
+              </w:rPr>
+              <w:t>{{ngrok}}/room-tenants/{id}/</w:t>
+            </w:r>
+          </w:p>
+        </w:tc>
+        <w:tc>
+          <w:tcPr>
+            <w:tcW w:w="1417" w:type="dxa"/>
+          </w:tcPr>
+          <w:p>
+            <w:pPr>
+              <w:rPr>
+                <w:b/>
+                <w:bCs/>
+              </w:rPr>
+            </w:pPr>
+            <w:r>
+              <w:rPr>
+                <w:b/>
+                <w:bCs/>
+              </w:rPr>
+              <w:t>DELETE</w:t>
+            </w:r>
+          </w:p>
+        </w:tc>
+        <w:tc>
+          <w:tcPr>
+            <w:tcW w:w="1134" w:type="dxa"/>
+          </w:tcPr>
+          <w:p>
+            <w:pPr>
+              <w:rPr>
+                <w:b/>
+                <w:bCs/>
+                <w:color w:val="196B24" w:themeColor="accent3"/>
+              </w:rPr>
+            </w:pPr>
+            <w:r>
+              <w:rPr>
+                <w:b/>
+                <w:bCs/>
+                <w:color w:val="196B24" w:themeColor="accent3"/>
+              </w:rPr>
+              <w:t>OK</w:t>
+            </w:r>
+          </w:p>
+        </w:tc>
+        <w:tc>
+          <w:tcPr>
+            <w:tcW w:w="1985" w:type="dxa"/>
+          </w:tcPr>
+          <w:p>
+            <w:r>
+              <w:t>. Xóa yêu cầu thuê phòng</w:t>
+            </w:r>
+          </w:p>
+        </w:tc>
+        <w:tc>
+          <w:tcPr>
+            <w:tcW w:w="1417" w:type="dxa"/>
+          </w:tcPr>
+          <w:p>
+            <w:pPr>
+              <w:rPr>
+                <w:b/>
+                <w:bCs/>
+                <w:color w:val="196B24" w:themeColor="accent3"/>
+              </w:rPr>
+            </w:pPr>
+          </w:p>
+        </w:tc>
+      </w:tr>
+      <w:tr>
+        <w:tc>
+          <w:tcPr>
+            <w:tcW w:w="1276" w:type="dxa"/>
+          </w:tcPr>
+          <w:p/>
+        </w:tc>
+        <w:tc>
+          <w:tcPr>
+            <w:tcW w:w="4395" w:type="dxa"/>
+          </w:tcPr>
+          <w:p>
+            <w:pPr>
+              <w:rPr>
+                <w:color w:val="ED0000"/>
+              </w:rPr>
+            </w:pPr>
+            <w:r>
+              <w:rPr>
+                <w:color w:val="ED0000"/>
+              </w:rPr>
+              <w:t>{{ngrok}}/room-tenants/{id}/status/</w:t>
+            </w:r>
+          </w:p>
+        </w:tc>
+        <w:tc>
+          <w:tcPr>
+            <w:tcW w:w="1417" w:type="dxa"/>
+          </w:tcPr>
+          <w:p>
+            <w:pPr>
+              <w:rPr>
+                <w:b/>
+                <w:bCs/>
+              </w:rPr>
+            </w:pPr>
+            <w:r>
+              <w:rPr>
+                <w:b/>
+                <w:bCs/>
+              </w:rPr>
+              <w:t>PUT</w:t>
+            </w:r>
+          </w:p>
+        </w:tc>
+        <w:tc>
+          <w:tcPr>
+            <w:tcW w:w="1134" w:type="dxa"/>
+          </w:tcPr>
+          <w:p>
+            <w:pPr>
+              <w:rPr>
+                <w:b/>
+                <w:bCs/>
+                <w:color w:val="196B24" w:themeColor="accent3"/>
+              </w:rPr>
+            </w:pPr>
+            <w:r>
+              <w:rPr>
+                <w:b/>
+                <w:bCs/>
+                <w:color w:val="196B24" w:themeColor="accent3"/>
+              </w:rPr>
+              <w:t>OK</w:t>
+            </w:r>
+          </w:p>
+        </w:tc>
+        <w:tc>
+          <w:tcPr>
+            <w:tcW w:w="1985" w:type="dxa"/>
+          </w:tcPr>
+          <w:p>
+            <w:r>
+              <w:t>Cập nhật trạng thái yêu cầu thuê phòng</w:t>
+            </w:r>
+          </w:p>
         </w:tc>
         <w:tc>
           <w:tcPr>

</xml_diff>

<commit_message>
kiểm tra các api hiện có
</commit_message>
<xml_diff>
--- a/Hỗ trợ tìm kiếm nhà trọ.docx
+++ b/Hỗ trợ tìm kiếm nhà trọ.docx
@@ -8255,7 +8255,15 @@
           </w:tcPr>
           <w:p>
             <w:r>
-              <w:t>landlords</w:t>
+              <w:t>L</w:t>
+            </w:r>
+            <w:r>
+              <w:t>andlords</w:t>
+            </w:r>
+          </w:p>
+          <w:p>
+            <w:r>
+              <w:t>1</w:t>
             </w:r>
           </w:p>
         </w:tc>
@@ -8411,10 +8419,16 @@
         <w:tc>
           <w:tcPr>
             <w:tcW w:w="1276" w:type="dxa"/>
-          </w:tcPr>
-          <w:p>
-            <w:r>
-              <w:t>motels</w:t>
+            <w:vMerge w:val="restart"/>
+          </w:tcPr>
+          <w:p>
+            <w:r>
+              <w:t>Motels</w:t>
+            </w:r>
+          </w:p>
+          <w:p>
+            <w:r>
+              <w:t>2</w:t>
             </w:r>
           </w:p>
         </w:tc>
@@ -8452,14 +8466,7 @@
                 <w:b/>
                 <w:bCs/>
               </w:rPr>
-              <w:t>GET</w:t>
-            </w:r>
-            <w:r>
-              <w:rPr>
-                <w:b/>
-                <w:bCs/>
-              </w:rPr>
-              <w:t xml:space="preserve"> | POST</w:t>
+              <w:t>GET | POST</w:t>
             </w:r>
           </w:p>
           <w:p>
@@ -8529,6 +8536,7 @@
         <w:tc>
           <w:tcPr>
             <w:tcW w:w="1276" w:type="dxa"/>
+            <w:vMerge/>
           </w:tcPr>
           <w:p/>
         </w:tc>
@@ -8546,19 +8554,7 @@
               <w:rPr>
                 <w:color w:val="FF0000"/>
               </w:rPr>
-              <w:t>http://127.0.0.1:8000/motels/</w:t>
-            </w:r>
-            <w:r>
-              <w:rPr>
-                <w:color w:val="FF0000"/>
-              </w:rPr>
-              <w:t>8</w:t>
-            </w:r>
-            <w:r>
-              <w:rPr>
-                <w:color w:val="FF0000"/>
-              </w:rPr>
-              <w:t>/</w:t>
+              <w:t>http://127.0.0.1:8000/motels/8/</w:t>
             </w:r>
           </w:p>
         </w:tc>
@@ -8633,6 +8629,7 @@
         <w:tc>
           <w:tcPr>
             <w:tcW w:w="1276" w:type="dxa"/>
+            <w:vMerge/>
           </w:tcPr>
           <w:p/>
         </w:tc>
@@ -8670,14 +8667,7 @@
                 <w:b/>
                 <w:bCs/>
               </w:rPr>
-              <w:t>GET</w:t>
-            </w:r>
-            <w:r>
-              <w:rPr>
-                <w:b/>
-                <w:bCs/>
-              </w:rPr>
-              <w:t xml:space="preserve"> | PUT | PATCH | DELETE</w:t>
+              <w:t>GET | PUT | PATCH | DELETE</w:t>
             </w:r>
           </w:p>
         </w:tc>
@@ -8709,10 +8699,7 @@
           </w:tcPr>
           <w:p>
             <w:r>
-              <w:t>Gọi motel theo slug name</w:t>
-            </w:r>
-            <w:r>
-              <w:t xml:space="preserve"> có dấu</w:t>
+              <w:t>Gọi motel theo slug name có dấu</w:t>
             </w:r>
           </w:p>
         </w:tc>
@@ -8743,6 +8730,7 @@
         <w:tc>
           <w:tcPr>
             <w:tcW w:w="1276" w:type="dxa"/>
+            <w:vMerge/>
           </w:tcPr>
           <w:p/>
         </w:tc>
@@ -8883,10 +8871,16 @@
         <w:tc>
           <w:tcPr>
             <w:tcW w:w="1276" w:type="dxa"/>
-          </w:tcPr>
-          <w:p>
-            <w:r>
-              <w:t>rooms</w:t>
+            <w:vMerge w:val="restart"/>
+          </w:tcPr>
+          <w:p>
+            <w:r>
+              <w:t>Rooms</w:t>
+            </w:r>
+          </w:p>
+          <w:p>
+            <w:r>
+              <w:t>3</w:t>
             </w:r>
           </w:p>
         </w:tc>
@@ -8904,7 +8898,7 @@
               <w:rPr>
                 <w:color w:val="FF0000"/>
               </w:rPr>
-              <w:t>http://127.0.0.1:8000/rooms/</w:t>
+              <w:t>{{ngrok}}/rooms/</w:t>
             </w:r>
           </w:p>
         </w:tc>
@@ -8924,14 +8918,7 @@
                 <w:b/>
                 <w:bCs/>
               </w:rPr>
-              <w:t>GET</w:t>
-            </w:r>
-            <w:r>
-              <w:rPr>
-                <w:b/>
-                <w:bCs/>
-              </w:rPr>
-              <w:t xml:space="preserve"> | POST</w:t>
+              <w:t>GET | POST</w:t>
             </w:r>
           </w:p>
         </w:tc>
@@ -8986,6 +8973,7 @@
         <w:tc>
           <w:tcPr>
             <w:tcW w:w="1276" w:type="dxa"/>
+            <w:vMerge/>
           </w:tcPr>
           <w:p/>
         </w:tc>
@@ -8998,19 +8986,7 @@
               <w:rPr>
                 <w:color w:val="FF0000"/>
               </w:rPr>
-              <w:t>http://127.0.0.1:8000/rooms/</w:t>
-            </w:r>
-            <w:r>
-              <w:rPr>
-                <w:color w:val="FF0000"/>
-              </w:rPr>
-              <w:t>5</w:t>
-            </w:r>
-            <w:r>
-              <w:rPr>
-                <w:color w:val="FF0000"/>
-              </w:rPr>
-              <w:t>/</w:t>
+              <w:t>{{ngrok}}/rooms/5/</w:t>
             </w:r>
           </w:p>
         </w:tc>
@@ -9030,14 +9006,7 @@
                 <w:b/>
                 <w:bCs/>
               </w:rPr>
-              <w:t>GET</w:t>
-            </w:r>
-            <w:r>
-              <w:rPr>
-                <w:b/>
-                <w:bCs/>
-              </w:rPr>
-              <w:t xml:space="preserve"> | PUT | DELETE</w:t>
+              <w:t>GET | PUT | DELETE</w:t>
             </w:r>
           </w:p>
         </w:tc>
@@ -9092,6 +9061,7 @@
         <w:tc>
           <w:tcPr>
             <w:tcW w:w="1276" w:type="dxa"/>
+            <w:vMerge/>
           </w:tcPr>
           <w:p/>
         </w:tc>
@@ -9109,7 +9079,7 @@
               <w:rPr>
                 <w:color w:val="FF0000"/>
               </w:rPr>
-              <w:t>http://127.0.0.1:8000/rooms/nha-tro-tran-bich-phong-01/</w:t>
+              <w:t>{{ngrok}}/rooms/nha-tro-tran-bich-phong-01/</w:t>
             </w:r>
           </w:p>
         </w:tc>
@@ -9190,6 +9160,7 @@
         <w:tc>
           <w:tcPr>
             <w:tcW w:w="1276" w:type="dxa"/>
+            <w:vMerge/>
           </w:tcPr>
           <w:p/>
         </w:tc>
@@ -9207,13 +9178,7 @@
               <w:rPr>
                 <w:color w:val="FF0000"/>
               </w:rPr>
-              <w:t>http://127.0.0.1:8000/rooms/?motel_id=</w:t>
-            </w:r>
-            <w:r>
-              <w:rPr>
-                <w:color w:val="FF0000"/>
-              </w:rPr>
-              <w:t>8</w:t>
+              <w:t>{{ngrok}}/rooms/?motel_id=8</w:t>
             </w:r>
           </w:p>
         </w:tc>
@@ -9288,6 +9253,7 @@
         <w:tc>
           <w:tcPr>
             <w:tcW w:w="1276" w:type="dxa"/>
+            <w:vMerge/>
           </w:tcPr>
           <w:p/>
         </w:tc>
@@ -9300,7 +9266,7 @@
               <w:rPr>
                 <w:color w:val="FF0000"/>
               </w:rPr>
-              <w:t>http://127.0.0.1:8000/rooms/?motel_slug=nha-tro-tran-bich</w:t>
+              <w:t>{{ngrok}}/rooms/?motel_slug=nha-tro-tran-bich</w:t>
             </w:r>
           </w:p>
         </w:tc>
@@ -9375,6 +9341,7 @@
         <w:tc>
           <w:tcPr>
             <w:tcW w:w="1276" w:type="dxa"/>
+            <w:vMerge/>
           </w:tcPr>
           <w:p/>
         </w:tc>
@@ -9392,7 +9359,7 @@
               <w:rPr>
                 <w:color w:val="FF0000"/>
               </w:rPr>
-              <w:t>http://127.0.0.1:8000/rooms/?q=phong</w:t>
+              <w:t>{{ngrok}}/rooms/?q=phong</w:t>
             </w:r>
           </w:p>
         </w:tc>
@@ -9473,6 +9440,7 @@
         <w:tc>
           <w:tcPr>
             <w:tcW w:w="1276" w:type="dxa"/>
+            <w:vMerge/>
           </w:tcPr>
           <w:p/>
         </w:tc>
@@ -9544,6 +9512,7 @@
         <w:tc>
           <w:tcPr>
             <w:tcW w:w="1276" w:type="dxa"/>
+            <w:vMerge/>
           </w:tcPr>
           <w:p/>
         </w:tc>
@@ -9561,7 +9530,7 @@
               <w:rPr>
                 <w:color w:val="FF0000"/>
               </w:rPr>
-              <w:t>http://127.0.0.1:8000/rooms/?q=phong&amp;motel_id=8</w:t>
+              <w:t>{{ngrok}}/rooms/?q=phong&amp;motel_id=8</w:t>
             </w:r>
           </w:p>
         </w:tc>
@@ -9703,10 +9672,16 @@
         <w:tc>
           <w:tcPr>
             <w:tcW w:w="1276" w:type="dxa"/>
-          </w:tcPr>
-          <w:p>
-            <w:r>
-              <w:t>users</w:t>
+            <w:vMerge w:val="restart"/>
+          </w:tcPr>
+          <w:p>
+            <w:r>
+              <w:t>Users</w:t>
+            </w:r>
+          </w:p>
+          <w:p>
+            <w:r>
+              <w:t>4</w:t>
             </w:r>
           </w:p>
         </w:tc>
@@ -9776,10 +9751,7 @@
           </w:tcPr>
           <w:p>
             <w:r>
-              <w:t>Lấy list users</w:t>
-            </w:r>
-            <w:r>
-              <w:t xml:space="preserve"> (có chứng thực)</w:t>
+              <w:t>Lấy list users (có chứng thực)</w:t>
             </w:r>
           </w:p>
         </w:tc>
@@ -9802,6 +9774,7 @@
         <w:tc>
           <w:tcPr>
             <w:tcW w:w="1276" w:type="dxa"/>
+            <w:vMerge/>
           </w:tcPr>
           <w:p/>
         </w:tc>
@@ -9913,6 +9886,7 @@
         <w:tc>
           <w:tcPr>
             <w:tcW w:w="1276" w:type="dxa"/>
+            <w:vMerge/>
           </w:tcPr>
           <w:p/>
         </w:tc>
@@ -10000,6 +9974,7 @@
         <w:tc>
           <w:tcPr>
             <w:tcW w:w="1276" w:type="dxa"/>
+            <w:vMerge/>
           </w:tcPr>
           <w:p/>
         </w:tc>
@@ -10092,6 +10067,7 @@
         <w:tc>
           <w:tcPr>
             <w:tcW w:w="1276" w:type="dxa"/>
+            <w:vMerge/>
           </w:tcPr>
           <w:p/>
         </w:tc>
@@ -10161,10 +10137,7 @@
           </w:tcPr>
           <w:p>
             <w:r>
-              <w:t>Thay đổi mật khẩu</w:t>
-            </w:r>
-            <w:r>
-              <w:t xml:space="preserve"> (code này có thểm yêu cầu nhập lại mật khẩu mới)</w:t>
+              <w:t>Thay đổi mật khẩu (code này có thểm yêu cầu nhập lại mật khẩu mới)</w:t>
             </w:r>
           </w:p>
         </w:tc>
@@ -10187,6 +10160,7 @@
         <w:tc>
           <w:tcPr>
             <w:tcW w:w="1276" w:type="dxa"/>
+            <w:vMerge/>
           </w:tcPr>
           <w:p/>
         </w:tc>
@@ -10279,6 +10253,7 @@
         <w:tc>
           <w:tcPr>
             <w:tcW w:w="1276" w:type="dxa"/>
+            <w:vMerge/>
           </w:tcPr>
           <w:p/>
         </w:tc>
@@ -10448,24 +10423,21 @@
         <w:tc>
           <w:tcPr>
             <w:tcW w:w="1276" w:type="dxa"/>
+            <w:shd w:val="clear" w:color="auto" w:fill="D9D9D9" w:themeFill="background1" w:themeFillShade="D9"/>
           </w:tcPr>
           <w:p/>
         </w:tc>
         <w:tc>
           <w:tcPr>
             <w:tcW w:w="4395" w:type="dxa"/>
-          </w:tcPr>
-          <w:p>
-            <w:pPr>
-              <w:rPr>
-                <w:color w:val="FF0000"/>
-              </w:rPr>
-            </w:pPr>
-          </w:p>
+            <w:shd w:val="clear" w:color="auto" w:fill="D9D9D9" w:themeFill="background1" w:themeFillShade="D9"/>
+          </w:tcPr>
+          <w:p/>
         </w:tc>
         <w:tc>
           <w:tcPr>
             <w:tcW w:w="1417" w:type="dxa"/>
+            <w:shd w:val="clear" w:color="auto" w:fill="D9D9D9" w:themeFill="background1" w:themeFillShade="D9"/>
           </w:tcPr>
           <w:p>
             <w:pPr>
@@ -10479,6 +10451,7 @@
         <w:tc>
           <w:tcPr>
             <w:tcW w:w="1134" w:type="dxa"/>
+            <w:shd w:val="clear" w:color="auto" w:fill="D9D9D9" w:themeFill="background1" w:themeFillShade="D9"/>
           </w:tcPr>
           <w:p>
             <w:pPr>
@@ -10493,12 +10466,14 @@
         <w:tc>
           <w:tcPr>
             <w:tcW w:w="1985" w:type="dxa"/>
+            <w:shd w:val="clear" w:color="auto" w:fill="D9D9D9" w:themeFill="background1" w:themeFillShade="D9"/>
           </w:tcPr>
           <w:p/>
         </w:tc>
         <w:tc>
           <w:tcPr>
             <w:tcW w:w="1417" w:type="dxa"/>
+            <w:shd w:val="clear" w:color="auto" w:fill="D9D9D9" w:themeFill="background1" w:themeFillShade="D9"/>
           </w:tcPr>
           <w:p>
             <w:pPr>
@@ -10515,8 +10490,18 @@
         <w:tc>
           <w:tcPr>
             <w:tcW w:w="1276" w:type="dxa"/>
-          </w:tcPr>
-          <w:p/>
+            <w:vMerge w:val="restart"/>
+          </w:tcPr>
+          <w:p>
+            <w:r>
+              <w:t>Tenants</w:t>
+            </w:r>
+          </w:p>
+          <w:p>
+            <w:r>
+              <w:t>5</w:t>
+            </w:r>
+          </w:p>
         </w:tc>
         <w:tc>
           <w:tcPr>
@@ -10528,6 +10513,12 @@
                 <w:color w:val="FF0000"/>
               </w:rPr>
             </w:pPr>
+            <w:r>
+              <w:rPr>
+                <w:color w:val="FF0000"/>
+              </w:rPr>
+              <w:t>http://127.0.0.1:8000/tenants/</w:t>
+            </w:r>
           </w:p>
         </w:tc>
         <w:tc>
@@ -10541,6 +10532,13 @@
                 <w:bCs/>
               </w:rPr>
             </w:pPr>
+            <w:r>
+              <w:rPr>
+                <w:b/>
+                <w:bCs/>
+              </w:rPr>
+              <w:t>GET</w:t>
+            </w:r>
           </w:p>
         </w:tc>
         <w:tc>
@@ -10555,13 +10553,25 @@
                 <w:color w:val="196B24" w:themeColor="accent3"/>
               </w:rPr>
             </w:pPr>
+            <w:r>
+              <w:rPr>
+                <w:b/>
+                <w:bCs/>
+                <w:color w:val="196B24" w:themeColor="accent3"/>
+              </w:rPr>
+              <w:t>OK</w:t>
+            </w:r>
           </w:p>
         </w:tc>
         <w:tc>
           <w:tcPr>
             <w:tcW w:w="1985" w:type="dxa"/>
           </w:tcPr>
-          <w:p/>
+          <w:p>
+            <w:r>
+              <w:t xml:space="preserve">Lấy list tenants </w:t>
+            </w:r>
+          </w:p>
         </w:tc>
         <w:tc>
           <w:tcPr>
@@ -10582,57 +10592,64 @@
         <w:tc>
           <w:tcPr>
             <w:tcW w:w="1276" w:type="dxa"/>
-            <w:shd w:val="clear" w:color="auto" w:fill="D9D9D9" w:themeFill="background1" w:themeFillShade="D9"/>
+            <w:vMerge/>
           </w:tcPr>
           <w:p/>
         </w:tc>
         <w:tc>
           <w:tcPr>
             <w:tcW w:w="4395" w:type="dxa"/>
-            <w:shd w:val="clear" w:color="auto" w:fill="D9D9D9" w:themeFill="background1" w:themeFillShade="D9"/>
+          </w:tcPr>
+          <w:p>
+            <w:pPr>
+              <w:rPr>
+                <w:color w:val="FF0000"/>
+              </w:rPr>
+            </w:pPr>
+            <w:r>
+              <w:rPr>
+                <w:color w:val="FF0000"/>
+              </w:rPr>
+              <w:t>http://127.0.0.1:8000/tenants/le-thi-thuy/</w:t>
+            </w:r>
+          </w:p>
+        </w:tc>
+        <w:tc>
+          <w:tcPr>
+            <w:tcW w:w="1417" w:type="dxa"/>
+          </w:tcPr>
+          <w:p>
+            <w:pPr>
+              <w:rPr>
+                <w:b/>
+                <w:bCs/>
+              </w:rPr>
+            </w:pPr>
+          </w:p>
+        </w:tc>
+        <w:tc>
+          <w:tcPr>
+            <w:tcW w:w="1134" w:type="dxa"/>
+          </w:tcPr>
+          <w:p>
+            <w:pPr>
+              <w:rPr>
+                <w:b/>
+                <w:bCs/>
+                <w:color w:val="196B24" w:themeColor="accent3"/>
+              </w:rPr>
+            </w:pPr>
+          </w:p>
+        </w:tc>
+        <w:tc>
+          <w:tcPr>
+            <w:tcW w:w="1985" w:type="dxa"/>
           </w:tcPr>
           <w:p/>
         </w:tc>
         <w:tc>
           <w:tcPr>
             <w:tcW w:w="1417" w:type="dxa"/>
-            <w:shd w:val="clear" w:color="auto" w:fill="D9D9D9" w:themeFill="background1" w:themeFillShade="D9"/>
-          </w:tcPr>
-          <w:p>
-            <w:pPr>
-              <w:rPr>
-                <w:b/>
-                <w:bCs/>
-              </w:rPr>
-            </w:pPr>
-          </w:p>
-        </w:tc>
-        <w:tc>
-          <w:tcPr>
-            <w:tcW w:w="1134" w:type="dxa"/>
-            <w:shd w:val="clear" w:color="auto" w:fill="D9D9D9" w:themeFill="background1" w:themeFillShade="D9"/>
-          </w:tcPr>
-          <w:p>
-            <w:pPr>
-              <w:rPr>
-                <w:b/>
-                <w:bCs/>
-                <w:color w:val="196B24" w:themeColor="accent3"/>
-              </w:rPr>
-            </w:pPr>
-          </w:p>
-        </w:tc>
-        <w:tc>
-          <w:tcPr>
-            <w:tcW w:w="1985" w:type="dxa"/>
-            <w:shd w:val="clear" w:color="auto" w:fill="D9D9D9" w:themeFill="background1" w:themeFillShade="D9"/>
-          </w:tcPr>
-          <w:p/>
-        </w:tc>
-        <w:tc>
-          <w:tcPr>
-            <w:tcW w:w="1417" w:type="dxa"/>
-            <w:shd w:val="clear" w:color="auto" w:fill="D9D9D9" w:themeFill="background1" w:themeFillShade="D9"/>
           </w:tcPr>
           <w:p>
             <w:pPr>
@@ -10649,13 +10666,9 @@
         <w:tc>
           <w:tcPr>
             <w:tcW w:w="1276" w:type="dxa"/>
-            <w:vMerge w:val="restart"/>
-          </w:tcPr>
-          <w:p>
-            <w:r>
-              <w:t>tenants</w:t>
-            </w:r>
-          </w:p>
+            <w:vMerge/>
+          </w:tcPr>
+          <w:p/>
         </w:tc>
         <w:tc>
           <w:tcPr>
@@ -10671,7 +10684,7 @@
               <w:rPr>
                 <w:color w:val="FF0000"/>
               </w:rPr>
-              <w:t>http://127.0.0.1:8000/tenants/</w:t>
+              <w:t>http://127.0.0.1:8000/tenants/HaLinh/</w:t>
             </w:r>
           </w:p>
         </w:tc>
@@ -10723,7 +10736,7 @@
           </w:tcPr>
           <w:p>
             <w:r>
-              <w:t xml:space="preserve">Lấy list tenants </w:t>
+              <w:t>Lấy thông tin người thuê</w:t>
             </w:r>
           </w:p>
         </w:tc>
@@ -10764,7 +10777,7 @@
               <w:rPr>
                 <w:color w:val="FF0000"/>
               </w:rPr>
-              <w:t>http://127.0.0.1:8000/tenants/le-thi-thuy/</w:t>
+              <w:t>http://127.0.0.1:8000/tenants/?user_id=27/</w:t>
             </w:r>
           </w:p>
         </w:tc>
@@ -10779,6 +10792,13 @@
                 <w:bCs/>
               </w:rPr>
             </w:pPr>
+            <w:r>
+              <w:rPr>
+                <w:b/>
+                <w:bCs/>
+              </w:rPr>
+              <w:t>GET</w:t>
+            </w:r>
           </w:p>
         </w:tc>
         <w:tc>
@@ -10838,7 +10858,7 @@
               <w:rPr>
                 <w:color w:val="FF0000"/>
               </w:rPr>
-              <w:t>http://127.0.0.1:8000/tenants/HaLinh/</w:t>
+              <w:t>http://127.0.0.1:8000/tenants/?q= Lê Thị Thủy</w:t>
             </w:r>
           </w:p>
         </w:tc>
@@ -10874,25 +10894,13 @@
                 <w:color w:val="196B24" w:themeColor="accent3"/>
               </w:rPr>
             </w:pPr>
-            <w:r>
-              <w:rPr>
-                <w:b/>
-                <w:bCs/>
-                <w:color w:val="196B24" w:themeColor="accent3"/>
-              </w:rPr>
-              <w:t>OK</w:t>
-            </w:r>
           </w:p>
         </w:tc>
         <w:tc>
           <w:tcPr>
             <w:tcW w:w="1985" w:type="dxa"/>
           </w:tcPr>
-          <w:p>
-            <w:r>
-              <w:t>Lấy thông tin người thuê</w:t>
-            </w:r>
-          </w:p>
+          <w:p/>
         </w:tc>
         <w:tc>
           <w:tcPr>
@@ -10931,7 +10939,7 @@
               <w:rPr>
                 <w:color w:val="FF0000"/>
               </w:rPr>
-              <w:t>http://127.0.0.1:8000/tenants/?user_id=27/</w:t>
+              <w:t>http://127.0.0.1:8000/tenants/?slug=le-thi-thu</w:t>
             </w:r>
           </w:p>
         </w:tc>
@@ -10946,13 +10954,6 @@
                 <w:bCs/>
               </w:rPr>
             </w:pPr>
-            <w:r>
-              <w:rPr>
-                <w:b/>
-                <w:bCs/>
-              </w:rPr>
-              <w:t>GET</w:t>
-            </w:r>
           </w:p>
         </w:tc>
         <w:tc>
@@ -11012,7 +11013,7 @@
               <w:rPr>
                 <w:color w:val="FF0000"/>
               </w:rPr>
-              <w:t>http://127.0.0.1:8000/tenants/?q= Lê Thị Thủy</w:t>
+              <w:t>http://127.0.0.1:8000/tenants/HaLinh/</w:t>
             </w:r>
           </w:p>
         </w:tc>
@@ -11032,7 +11033,7 @@
                 <w:b/>
                 <w:bCs/>
               </w:rPr>
-              <w:t>GET</w:t>
+              <w:t>PATCH</w:t>
             </w:r>
           </w:p>
         </w:tc>
@@ -11048,13 +11049,25 @@
                 <w:color w:val="196B24" w:themeColor="accent3"/>
               </w:rPr>
             </w:pPr>
+            <w:r>
+              <w:rPr>
+                <w:b/>
+                <w:bCs/>
+                <w:color w:val="196B24" w:themeColor="accent3"/>
+              </w:rPr>
+              <w:t>OK</w:t>
+            </w:r>
           </w:p>
         </w:tc>
         <w:tc>
           <w:tcPr>
             <w:tcW w:w="1985" w:type="dxa"/>
           </w:tcPr>
-          <w:p/>
+          <w:p>
+            <w:r>
+              <w:t>Cập nhật thông tin người thuê</w:t>
+            </w:r>
+          </w:p>
         </w:tc>
         <w:tc>
           <w:tcPr>
@@ -11093,7 +11106,7 @@
               <w:rPr>
                 <w:color w:val="FF0000"/>
               </w:rPr>
-              <w:t>http://127.0.0.1:8000/tenants/?slug=le-thi-thu</w:t>
+              <w:t>http://127.0.0.1:8000/tenants/HaLinh/rooms/</w:t>
             </w:r>
           </w:p>
         </w:tc>
@@ -11108,6 +11121,13 @@
                 <w:bCs/>
               </w:rPr>
             </w:pPr>
+            <w:r>
+              <w:rPr>
+                <w:b/>
+                <w:bCs/>
+              </w:rPr>
+              <w:t>GET</w:t>
+            </w:r>
           </w:p>
         </w:tc>
         <w:tc>
@@ -11122,13 +11142,28 @@
                 <w:color w:val="196B24" w:themeColor="accent3"/>
               </w:rPr>
             </w:pPr>
+            <w:r>
+              <w:rPr>
+                <w:b/>
+                <w:bCs/>
+                <w:color w:val="196B24" w:themeColor="accent3"/>
+              </w:rPr>
+              <w:t>OK</w:t>
+            </w:r>
           </w:p>
         </w:tc>
         <w:tc>
           <w:tcPr>
             <w:tcW w:w="1985" w:type="dxa"/>
           </w:tcPr>
-          <w:p/>
+          <w:p>
+            <w:pPr>
+              <w:jc w:val="center"/>
+            </w:pPr>
+            <w:r>
+              <w:t>Lấy danh sách phòng đã thuê</w:t>
+            </w:r>
+          </w:p>
         </w:tc>
         <w:tc>
           <w:tcPr>
@@ -11149,6 +11184,7 @@
         <w:tc>
           <w:tcPr>
             <w:tcW w:w="1276" w:type="dxa"/>
+            <w:vMerge/>
           </w:tcPr>
           <w:p/>
         </w:tc>
@@ -11166,7 +11202,7 @@
               <w:rPr>
                 <w:color w:val="FF0000"/>
               </w:rPr>
-              <w:t>http://127.0.0.1:8000/tenants/HaLinh/</w:t>
+              <w:t>http://127.0.0.1:8000/tenants/HaLinh/payments/</w:t>
             </w:r>
           </w:p>
         </w:tc>
@@ -11181,13 +11217,6 @@
                 <w:bCs/>
               </w:rPr>
             </w:pPr>
-            <w:r>
-              <w:rPr>
-                <w:b/>
-                <w:bCs/>
-              </w:rPr>
-              <w:t>PATCH</w:t>
-            </w:r>
           </w:p>
         </w:tc>
         <w:tc>
@@ -11208,7 +11237,7 @@
                 <w:bCs/>
                 <w:color w:val="196B24" w:themeColor="accent3"/>
               </w:rPr>
-              <w:t>OK</w:t>
+              <w:t>Pending</w:t>
             </w:r>
           </w:p>
         </w:tc>
@@ -11217,8 +11246,11 @@
             <w:tcW w:w="1985" w:type="dxa"/>
           </w:tcPr>
           <w:p>
-            <w:r>
-              <w:t>Cập nhật thông tin người thuê</w:t>
+            <w:pPr>
+              <w:jc w:val="center"/>
+            </w:pPr>
+            <w:r>
+              <w:t>Lấy lịch sử thanh toán</w:t>
             </w:r>
           </w:p>
         </w:tc>
@@ -11241,189 +11273,7 @@
         <w:tc>
           <w:tcPr>
             <w:tcW w:w="1276" w:type="dxa"/>
-          </w:tcPr>
-          <w:p/>
-        </w:tc>
-        <w:tc>
-          <w:tcPr>
-            <w:tcW w:w="4395" w:type="dxa"/>
-          </w:tcPr>
-          <w:p>
-            <w:pPr>
-              <w:rPr>
-                <w:color w:val="FF0000"/>
-              </w:rPr>
-            </w:pPr>
-            <w:r>
-              <w:rPr>
-                <w:color w:val="FF0000"/>
-              </w:rPr>
-              <w:t>http://127.0.0.1:8000/tenants/HaLinh/rooms/</w:t>
-            </w:r>
-          </w:p>
-        </w:tc>
-        <w:tc>
-          <w:tcPr>
-            <w:tcW w:w="1417" w:type="dxa"/>
-          </w:tcPr>
-          <w:p>
-            <w:pPr>
-              <w:rPr>
-                <w:b/>
-                <w:bCs/>
-              </w:rPr>
-            </w:pPr>
-            <w:r>
-              <w:rPr>
-                <w:b/>
-                <w:bCs/>
-              </w:rPr>
-              <w:t>GET</w:t>
-            </w:r>
-          </w:p>
-        </w:tc>
-        <w:tc>
-          <w:tcPr>
-            <w:tcW w:w="1134" w:type="dxa"/>
-          </w:tcPr>
-          <w:p>
-            <w:pPr>
-              <w:rPr>
-                <w:b/>
-                <w:bCs/>
-                <w:color w:val="196B24" w:themeColor="accent3"/>
-              </w:rPr>
-            </w:pPr>
-            <w:r>
-              <w:rPr>
-                <w:b/>
-                <w:bCs/>
-                <w:color w:val="196B24" w:themeColor="accent3"/>
-              </w:rPr>
-              <w:t>OK</w:t>
-            </w:r>
-          </w:p>
-        </w:tc>
-        <w:tc>
-          <w:tcPr>
-            <w:tcW w:w="1985" w:type="dxa"/>
-          </w:tcPr>
-          <w:p>
-            <w:pPr>
-              <w:jc w:val="center"/>
-            </w:pPr>
-            <w:r>
-              <w:t>Lấy danh sách phòng đã thuê</w:t>
-            </w:r>
-          </w:p>
-        </w:tc>
-        <w:tc>
-          <w:tcPr>
-            <w:tcW w:w="1417" w:type="dxa"/>
-          </w:tcPr>
-          <w:p>
-            <w:pPr>
-              <w:rPr>
-                <w:b/>
-                <w:bCs/>
-                <w:color w:val="196B24" w:themeColor="accent3"/>
-              </w:rPr>
-            </w:pPr>
-          </w:p>
-        </w:tc>
-      </w:tr>
-      <w:tr>
-        <w:tc>
-          <w:tcPr>
-            <w:tcW w:w="1276" w:type="dxa"/>
-          </w:tcPr>
-          <w:p/>
-        </w:tc>
-        <w:tc>
-          <w:tcPr>
-            <w:tcW w:w="4395" w:type="dxa"/>
-          </w:tcPr>
-          <w:p>
-            <w:pPr>
-              <w:rPr>
-                <w:color w:val="FF0000"/>
-              </w:rPr>
-            </w:pPr>
-            <w:r>
-              <w:rPr>
-                <w:color w:val="FF0000"/>
-              </w:rPr>
-              <w:t>http://127.0.0.1:8000/tenants/HaLinh/payments/</w:t>
-            </w:r>
-          </w:p>
-        </w:tc>
-        <w:tc>
-          <w:tcPr>
-            <w:tcW w:w="1417" w:type="dxa"/>
-          </w:tcPr>
-          <w:p>
-            <w:pPr>
-              <w:rPr>
-                <w:b/>
-                <w:bCs/>
-              </w:rPr>
-            </w:pPr>
-          </w:p>
-        </w:tc>
-        <w:tc>
-          <w:tcPr>
-            <w:tcW w:w="1134" w:type="dxa"/>
-          </w:tcPr>
-          <w:p>
-            <w:pPr>
-              <w:rPr>
-                <w:b/>
-                <w:bCs/>
-                <w:color w:val="196B24" w:themeColor="accent3"/>
-              </w:rPr>
-            </w:pPr>
-            <w:r>
-              <w:rPr>
-                <w:b/>
-                <w:bCs/>
-                <w:color w:val="196B24" w:themeColor="accent3"/>
-              </w:rPr>
-              <w:t>Pending</w:t>
-            </w:r>
-          </w:p>
-        </w:tc>
-        <w:tc>
-          <w:tcPr>
-            <w:tcW w:w="1985" w:type="dxa"/>
-          </w:tcPr>
-          <w:p>
-            <w:pPr>
-              <w:jc w:val="center"/>
-            </w:pPr>
-            <w:r>
-              <w:t>Lấy lịch sử thanh toán</w:t>
-            </w:r>
-          </w:p>
-        </w:tc>
-        <w:tc>
-          <w:tcPr>
-            <w:tcW w:w="1417" w:type="dxa"/>
-          </w:tcPr>
-          <w:p>
-            <w:pPr>
-              <w:rPr>
-                <w:b/>
-                <w:bCs/>
-                <w:color w:val="196B24" w:themeColor="accent3"/>
-              </w:rPr>
-            </w:pPr>
-          </w:p>
-        </w:tc>
-      </w:tr>
-      <w:tr>
-        <w:tc>
-          <w:tcPr>
-            <w:tcW w:w="1276" w:type="dxa"/>
+            <w:vMerge/>
           </w:tcPr>
           <w:p/>
         </w:tc>
@@ -11582,16 +11432,22 @@
         <w:tc>
           <w:tcPr>
             <w:tcW w:w="1276" w:type="dxa"/>
+            <w:vMerge w:val="restart"/>
           </w:tcPr>
           <w:p>
             <w:r>
               <w:rPr>
                 <w:lang w:val="vi-VN"/>
               </w:rPr>
-              <w:t>landlord</w:t>
+              <w:t>Landlord</w:t>
             </w:r>
             <w:r>
               <w:t>s</w:t>
+            </w:r>
+          </w:p>
+          <w:p>
+            <w:r>
+              <w:t>6</w:t>
             </w:r>
           </w:p>
         </w:tc>
@@ -11680,6 +11536,7 @@
         <w:tc>
           <w:tcPr>
             <w:tcW w:w="1276" w:type="dxa"/>
+            <w:vMerge/>
           </w:tcPr>
           <w:p/>
         </w:tc>
@@ -11775,6 +11632,7 @@
         <w:tc>
           <w:tcPr>
             <w:tcW w:w="1276" w:type="dxa"/>
+            <w:vMerge/>
           </w:tcPr>
           <w:p/>
         </w:tc>
@@ -11870,6 +11728,7 @@
         <w:tc>
           <w:tcPr>
             <w:tcW w:w="1276" w:type="dxa"/>
+            <w:vMerge/>
           </w:tcPr>
           <w:p/>
         </w:tc>
@@ -11945,73 +11804,6 @@
               <w:t>, chỉ admin làm được. click thành công là xác thực</w:t>
             </w:r>
           </w:p>
-        </w:tc>
-        <w:tc>
-          <w:tcPr>
-            <w:tcW w:w="1417" w:type="dxa"/>
-          </w:tcPr>
-          <w:p>
-            <w:pPr>
-              <w:rPr>
-                <w:b/>
-                <w:bCs/>
-                <w:color w:val="196B24" w:themeColor="accent3"/>
-              </w:rPr>
-            </w:pPr>
-          </w:p>
-        </w:tc>
-      </w:tr>
-      <w:tr>
-        <w:tc>
-          <w:tcPr>
-            <w:tcW w:w="1276" w:type="dxa"/>
-          </w:tcPr>
-          <w:p/>
-        </w:tc>
-        <w:tc>
-          <w:tcPr>
-            <w:tcW w:w="4395" w:type="dxa"/>
-          </w:tcPr>
-          <w:p>
-            <w:pPr>
-              <w:rPr>
-                <w:color w:val="FF0000"/>
-              </w:rPr>
-            </w:pPr>
-          </w:p>
-        </w:tc>
-        <w:tc>
-          <w:tcPr>
-            <w:tcW w:w="1417" w:type="dxa"/>
-          </w:tcPr>
-          <w:p>
-            <w:pPr>
-              <w:rPr>
-                <w:b/>
-                <w:bCs/>
-              </w:rPr>
-            </w:pPr>
-          </w:p>
-        </w:tc>
-        <w:tc>
-          <w:tcPr>
-            <w:tcW w:w="1134" w:type="dxa"/>
-          </w:tcPr>
-          <w:p>
-            <w:pPr>
-              <w:rPr>
-                <w:b/>
-                <w:bCs/>
-                <w:color w:val="196B24" w:themeColor="accent3"/>
-              </w:rPr>
-            </w:pPr>
-          </w:p>
-        </w:tc>
-        <w:tc>
-          <w:tcPr>
-            <w:tcW w:w="1985" w:type="dxa"/>
-          </w:tcPr>
-          <w:p/>
         </w:tc>
         <w:tc>
           <w:tcPr>
@@ -12179,12 +11971,7 @@
           </w:p>
           <w:p>
             <w:r>
-              <w:t>Postman</w:t>
-            </w:r>
-          </w:p>
-          <w:p>
-            <w:r>
-              <w:t>Có chứng thực</w:t>
+              <w:t>7</w:t>
             </w:r>
           </w:p>
         </w:tc>
@@ -12568,11 +12355,7 @@
               <w:t>Cập nhật một phần nội dung bài viết (id).</w:t>
             </w:r>
             <w:r>
-              <w:t xml:space="preserve"> (chỉ chủ </w:t>
-            </w:r>
-            <w:r>
-              <w:lastRenderedPageBreak/>
-              <w:t>bài viết mới cập nhập được)</w:t>
+              <w:t xml:space="preserve"> (chỉ chủ bài viết mới cập nhập được)</w:t>
             </w:r>
           </w:p>
         </w:tc>
@@ -13003,6 +12786,11 @@
               <w:t>Comment</w:t>
             </w:r>
           </w:p>
+          <w:p>
+            <w:r>
+              <w:t>8</w:t>
+            </w:r>
+          </w:p>
         </w:tc>
         <w:tc>
           <w:tcPr>
@@ -13847,6 +13635,11 @@
           <w:p>
             <w:r>
               <w:t>motelRatings</w:t>
+            </w:r>
+          </w:p>
+          <w:p>
+            <w:r>
+              <w:t>9</w:t>
             </w:r>
           </w:p>
         </w:tc>
@@ -14589,6 +14382,11 @@
               <w:t>VNPAY</w:t>
             </w:r>
           </w:p>
+          <w:p>
+            <w:r>
+              <w:t>10</w:t>
+            </w:r>
+          </w:p>
         </w:tc>
         <w:tc>
           <w:tcPr>
@@ -14906,6 +14704,11 @@
               <w:t>Search motel</w:t>
             </w:r>
           </w:p>
+          <w:p>
+            <w:r>
+              <w:t>11</w:t>
+            </w:r>
+          </w:p>
         </w:tc>
         <w:tc>
           <w:tcPr>
@@ -15237,6 +15040,11 @@
               <w:t>search-history</w:t>
             </w:r>
           </w:p>
+          <w:p>
+            <w:r>
+              <w:t>12</w:t>
+            </w:r>
+          </w:p>
         </w:tc>
         <w:tc>
           <w:tcPr>
@@ -15776,7 +15584,15 @@
           </w:tcPr>
           <w:p>
             <w:r>
-              <w:t>notifications</w:t>
+              <w:t>N</w:t>
+            </w:r>
+            <w:r>
+              <w:t>otifications</w:t>
+            </w:r>
+          </w:p>
+          <w:p>
+            <w:r>
+              <w:t>13</w:t>
             </w:r>
           </w:p>
         </w:tc>
@@ -16885,6 +16701,11 @@
               <w:t>ChatRoom</w:t>
             </w:r>
           </w:p>
+          <w:p>
+            <w:r>
+              <w:t>14</w:t>
+            </w:r>
+          </w:p>
         </w:tc>
         <w:tc>
           <w:tcPr>
@@ -18085,6 +17906,11 @@
               <w:t>Follow</w:t>
             </w:r>
           </w:p>
+          <w:p>
+            <w:r>
+              <w:t>15</w:t>
+            </w:r>
+          </w:p>
         </w:tc>
         <w:tc>
           <w:tcPr>
@@ -18093,14 +17919,14 @@
           <w:p>
             <w:pPr>
               <w:rPr>
-                <w:color w:val="000000" w:themeColor="text1"/>
-              </w:rPr>
-            </w:pPr>
-            <w:r>
-              <w:rPr>
-                <w:color w:val="000000" w:themeColor="text1"/>
-              </w:rPr>
-              <w:t>http://127.0.0.1:8000/follows/</w:t>
+                <w:color w:val="FF0000"/>
+              </w:rPr>
+            </w:pPr>
+            <w:r>
+              <w:rPr>
+                <w:color w:val="FF0000"/>
+              </w:rPr>
+              <w:t>{{ngrok}}/follows/</w:t>
             </w:r>
           </w:p>
         </w:tc>
@@ -18142,7 +17968,7 @@
                 <w:bCs/>
                 <w:color w:val="196B24" w:themeColor="accent3"/>
               </w:rPr>
-              <w:t>Pending</w:t>
+              <w:t>OK</w:t>
             </w:r>
           </w:p>
         </w:tc>
@@ -18186,14 +18012,14 @@
           <w:p>
             <w:pPr>
               <w:rPr>
-                <w:color w:val="000000" w:themeColor="text1"/>
-              </w:rPr>
-            </w:pPr>
-            <w:r>
-              <w:rPr>
-                <w:color w:val="000000" w:themeColor="text1"/>
-              </w:rPr>
-              <w:t>http://127.0.0.1:8000/follows/</w:t>
+                <w:color w:val="FF0000"/>
+              </w:rPr>
+            </w:pPr>
+            <w:r>
+              <w:rPr>
+                <w:color w:val="FF0000"/>
+              </w:rPr>
+              <w:t>{{ngrok}}/follows/</w:t>
             </w:r>
           </w:p>
         </w:tc>
@@ -18235,7 +18061,7 @@
                 <w:bCs/>
                 <w:color w:val="196B24" w:themeColor="accent3"/>
               </w:rPr>
-              <w:t>Pending</w:t>
+              <w:t>OK</w:t>
             </w:r>
           </w:p>
         </w:tc>
@@ -18245,7 +18071,7 @@
           </w:tcPr>
           <w:p>
             <w:r>
-              <w:t>Theo dõi một người dùng</w:t>
+              <w:t>Theo dõi một người dùng khác</w:t>
             </w:r>
           </w:p>
         </w:tc>
@@ -18279,26 +18105,14 @@
           <w:p>
             <w:pPr>
               <w:rPr>
-                <w:color w:val="000000" w:themeColor="text1"/>
-              </w:rPr>
-            </w:pPr>
-            <w:r>
-              <w:rPr>
-                <w:color w:val="000000" w:themeColor="text1"/>
-              </w:rPr>
-              <w:t>http://127.0.0.1:8000/follows/</w:t>
-            </w:r>
-            <w:r>
-              <w:rPr>
-                <w:color w:val="000000" w:themeColor="text1"/>
-              </w:rPr>
-              <w:t>1</w:t>
-            </w:r>
-            <w:r>
-              <w:rPr>
-                <w:color w:val="000000" w:themeColor="text1"/>
-              </w:rPr>
-              <w:t>/</w:t>
+                <w:color w:val="FF0000"/>
+              </w:rPr>
+            </w:pPr>
+            <w:r>
+              <w:rPr>
+                <w:color w:val="FF0000"/>
+              </w:rPr>
+              <w:t>{{ngrok}}/follows/47/</w:t>
             </w:r>
           </w:p>
         </w:tc>
@@ -18340,7 +18154,7 @@
                 <w:bCs/>
                 <w:color w:val="196B24" w:themeColor="accent3"/>
               </w:rPr>
-              <w:t>Pending</w:t>
+              <w:t>OK</w:t>
             </w:r>
           </w:p>
         </w:tc>
@@ -18446,10 +18260,16 @@
         <w:tc>
           <w:tcPr>
             <w:tcW w:w="1276" w:type="dxa"/>
+            <w:vMerge w:val="restart"/>
           </w:tcPr>
           <w:p>
             <w:r>
               <w:t xml:space="preserve">Room -tenant </w:t>
+            </w:r>
+          </w:p>
+          <w:p>
+            <w:r>
+              <w:t>16</w:t>
             </w:r>
           </w:p>
         </w:tc>
@@ -18542,6 +18362,7 @@
         <w:tc>
           <w:tcPr>
             <w:tcW w:w="1276" w:type="dxa"/>
+            <w:vMerge/>
           </w:tcPr>
           <w:p/>
         </w:tc>
@@ -18634,6 +18455,7 @@
         <w:tc>
           <w:tcPr>
             <w:tcW w:w="1276" w:type="dxa"/>
+            <w:vMerge/>
           </w:tcPr>
           <w:p/>
         </w:tc>
@@ -18726,6 +18548,7 @@
         <w:tc>
           <w:tcPr>
             <w:tcW w:w="1276" w:type="dxa"/>
+            <w:vMerge/>
           </w:tcPr>
           <w:p/>
         </w:tc>
@@ -18818,6 +18641,7 @@
         <w:tc>
           <w:tcPr>
             <w:tcW w:w="1276" w:type="dxa"/>
+            <w:vMerge/>
           </w:tcPr>
           <w:p/>
         </w:tc>
@@ -18910,6 +18734,7 @@
         <w:tc>
           <w:tcPr>
             <w:tcW w:w="1276" w:type="dxa"/>
+            <w:vMerge/>
           </w:tcPr>
           <w:p/>
         </w:tc>
@@ -19002,6 +18827,7 @@
         <w:tc>
           <w:tcPr>
             <w:tcW w:w="1276" w:type="dxa"/>
+            <w:vMerge/>
           </w:tcPr>
           <w:p/>
         </w:tc>

</xml_diff>

<commit_message>
bắt đầu kiểm tra code
</commit_message>
<xml_diff>
--- a/Hỗ trợ tìm kiếm nhà trọ.docx
+++ b/Hỗ trợ tìm kiếm nhà trọ.docx
@@ -18920,12 +18920,14 @@
         <w:tc>
           <w:tcPr>
             <w:tcW w:w="1276" w:type="dxa"/>
+            <w:shd w:val="clear" w:color="auto" w:fill="D9D9D9" w:themeFill="background1" w:themeFillShade="D9"/>
           </w:tcPr>
           <w:p/>
         </w:tc>
         <w:tc>
           <w:tcPr>
             <w:tcW w:w="4395" w:type="dxa"/>
+            <w:shd w:val="clear" w:color="auto" w:fill="D9D9D9" w:themeFill="background1" w:themeFillShade="D9"/>
           </w:tcPr>
           <w:p>
             <w:pPr>
@@ -18938,6 +18940,7 @@
         <w:tc>
           <w:tcPr>
             <w:tcW w:w="1417" w:type="dxa"/>
+            <w:shd w:val="clear" w:color="auto" w:fill="D9D9D9" w:themeFill="background1" w:themeFillShade="D9"/>
           </w:tcPr>
           <w:p>
             <w:pPr>
@@ -18951,6 +18954,7 @@
         <w:tc>
           <w:tcPr>
             <w:tcW w:w="1134" w:type="dxa"/>
+            <w:shd w:val="clear" w:color="auto" w:fill="D9D9D9" w:themeFill="background1" w:themeFillShade="D9"/>
           </w:tcPr>
           <w:p>
             <w:pPr>
@@ -18965,12 +18969,14 @@
         <w:tc>
           <w:tcPr>
             <w:tcW w:w="1985" w:type="dxa"/>
+            <w:shd w:val="clear" w:color="auto" w:fill="D9D9D9" w:themeFill="background1" w:themeFillShade="D9"/>
           </w:tcPr>
           <w:p/>
         </w:tc>
         <w:tc>
           <w:tcPr>
             <w:tcW w:w="1417" w:type="dxa"/>
+            <w:shd w:val="clear" w:color="auto" w:fill="D9D9D9" w:themeFill="background1" w:themeFillShade="D9"/>
           </w:tcPr>
           <w:p>
             <w:pPr>
@@ -18987,6 +18993,109 @@
         <w:tc>
           <w:tcPr>
             <w:tcW w:w="1276" w:type="dxa"/>
+            <w:vMerge w:val="restart"/>
+          </w:tcPr>
+          <w:p>
+            <w:r>
+              <w:t>Payments</w:t>
+            </w:r>
+          </w:p>
+          <w:p>
+            <w:r>
+              <w:t>17</w:t>
+            </w:r>
+          </w:p>
+        </w:tc>
+        <w:tc>
+          <w:tcPr>
+            <w:tcW w:w="4395" w:type="dxa"/>
+          </w:tcPr>
+          <w:p>
+            <w:pPr>
+              <w:rPr>
+                <w:color w:val="FF0000"/>
+              </w:rPr>
+            </w:pPr>
+            <w:r>
+              <w:rPr>
+                <w:color w:val="FF0000"/>
+              </w:rPr>
+              <w:t>{{ngrok}}/payments/</w:t>
+            </w:r>
+          </w:p>
+        </w:tc>
+        <w:tc>
+          <w:tcPr>
+            <w:tcW w:w="1417" w:type="dxa"/>
+          </w:tcPr>
+          <w:p>
+            <w:pPr>
+              <w:rPr>
+                <w:b/>
+                <w:bCs/>
+              </w:rPr>
+            </w:pPr>
+            <w:r>
+              <w:rPr>
+                <w:b/>
+                <w:bCs/>
+              </w:rPr>
+              <w:t>GET</w:t>
+            </w:r>
+          </w:p>
+        </w:tc>
+        <w:tc>
+          <w:tcPr>
+            <w:tcW w:w="1134" w:type="dxa"/>
+          </w:tcPr>
+          <w:p>
+            <w:pPr>
+              <w:rPr>
+                <w:b/>
+                <w:bCs/>
+                <w:color w:val="196B24" w:themeColor="accent3"/>
+              </w:rPr>
+            </w:pPr>
+            <w:r>
+              <w:rPr>
+                <w:b/>
+                <w:bCs/>
+                <w:color w:val="196B24" w:themeColor="accent3"/>
+              </w:rPr>
+              <w:t>OK</w:t>
+            </w:r>
+          </w:p>
+        </w:tc>
+        <w:tc>
+          <w:tcPr>
+            <w:tcW w:w="1985" w:type="dxa"/>
+          </w:tcPr>
+          <w:p>
+            <w:r>
+              <w:t>Lấy danh sách tất cả các thanh toán của người dùng đang đăng nhập</w:t>
+            </w:r>
+          </w:p>
+        </w:tc>
+        <w:tc>
+          <w:tcPr>
+            <w:tcW w:w="1417" w:type="dxa"/>
+          </w:tcPr>
+          <w:p>
+            <w:pPr>
+              <w:rPr>
+                <w:b/>
+                <w:bCs/>
+                <w:color w:val="196B24" w:themeColor="accent3"/>
+              </w:rPr>
+            </w:pPr>
+          </w:p>
+        </w:tc>
+      </w:tr>
+      <w:tr>
+        <w:tc>
+          <w:tcPr>
+            <w:tcW w:w="1276" w:type="dxa"/>
+            <w:vMerge/>
           </w:tcPr>
           <w:p/>
         </w:tc>
@@ -18997,7 +19106,817 @@
           <w:p>
             <w:pPr>
               <w:rPr>
-                <w:color w:val="000000" w:themeColor="text1"/>
+                <w:color w:val="FF0000"/>
+              </w:rPr>
+            </w:pPr>
+            <w:r>
+              <w:rPr>
+                <w:color w:val="FF0000"/>
+              </w:rPr>
+              <w:t>{{ngrok}}/payments/</w:t>
+            </w:r>
+          </w:p>
+        </w:tc>
+        <w:tc>
+          <w:tcPr>
+            <w:tcW w:w="1417" w:type="dxa"/>
+          </w:tcPr>
+          <w:p>
+            <w:pPr>
+              <w:rPr>
+                <w:b/>
+                <w:bCs/>
+              </w:rPr>
+            </w:pPr>
+            <w:r>
+              <w:rPr>
+                <w:b/>
+                <w:bCs/>
+              </w:rPr>
+              <w:t>POST</w:t>
+            </w:r>
+          </w:p>
+        </w:tc>
+        <w:tc>
+          <w:tcPr>
+            <w:tcW w:w="1134" w:type="dxa"/>
+          </w:tcPr>
+          <w:p>
+            <w:pPr>
+              <w:rPr>
+                <w:b/>
+                <w:bCs/>
+                <w:color w:val="196B24" w:themeColor="accent3"/>
+              </w:rPr>
+            </w:pPr>
+            <w:r>
+              <w:rPr>
+                <w:b/>
+                <w:bCs/>
+                <w:color w:val="196B24" w:themeColor="accent3"/>
+              </w:rPr>
+              <w:t>OK</w:t>
+            </w:r>
+          </w:p>
+        </w:tc>
+        <w:tc>
+          <w:tcPr>
+            <w:tcW w:w="1985" w:type="dxa"/>
+          </w:tcPr>
+          <w:p>
+            <w:r>
+              <w:t>Tạo một thanh toán mới</w:t>
+            </w:r>
+          </w:p>
+        </w:tc>
+        <w:tc>
+          <w:tcPr>
+            <w:tcW w:w="1417" w:type="dxa"/>
+          </w:tcPr>
+          <w:p>
+            <w:pPr>
+              <w:rPr>
+                <w:b/>
+                <w:bCs/>
+                <w:color w:val="196B24" w:themeColor="accent3"/>
+              </w:rPr>
+            </w:pPr>
+          </w:p>
+        </w:tc>
+      </w:tr>
+      <w:tr>
+        <w:tc>
+          <w:tcPr>
+            <w:tcW w:w="1276" w:type="dxa"/>
+            <w:vMerge/>
+          </w:tcPr>
+          <w:p/>
+        </w:tc>
+        <w:tc>
+          <w:tcPr>
+            <w:tcW w:w="4395" w:type="dxa"/>
+          </w:tcPr>
+          <w:p>
+            <w:pPr>
+              <w:rPr>
+                <w:color w:val="FF0000"/>
+              </w:rPr>
+            </w:pPr>
+            <w:r>
+              <w:rPr>
+                <w:color w:val="FF0000"/>
+              </w:rPr>
+              <w:t>{{ngrok}}/payments/method/VNPAY/</w:t>
+            </w:r>
+          </w:p>
+        </w:tc>
+        <w:tc>
+          <w:tcPr>
+            <w:tcW w:w="1417" w:type="dxa"/>
+          </w:tcPr>
+          <w:p>
+            <w:pPr>
+              <w:rPr>
+                <w:b/>
+                <w:bCs/>
+              </w:rPr>
+            </w:pPr>
+            <w:r>
+              <w:rPr>
+                <w:b/>
+                <w:bCs/>
+              </w:rPr>
+              <w:t>GET</w:t>
+            </w:r>
+          </w:p>
+        </w:tc>
+        <w:tc>
+          <w:tcPr>
+            <w:tcW w:w="1134" w:type="dxa"/>
+          </w:tcPr>
+          <w:p>
+            <w:pPr>
+              <w:rPr>
+                <w:b/>
+                <w:bCs/>
+                <w:color w:val="196B24" w:themeColor="accent3"/>
+              </w:rPr>
+            </w:pPr>
+            <w:r>
+              <w:rPr>
+                <w:b/>
+                <w:bCs/>
+                <w:color w:val="196B24" w:themeColor="accent3"/>
+              </w:rPr>
+              <w:t>OK</w:t>
+            </w:r>
+          </w:p>
+        </w:tc>
+        <w:tc>
+          <w:tcPr>
+            <w:tcW w:w="1985" w:type="dxa"/>
+          </w:tcPr>
+          <w:p>
+            <w:r>
+              <w:t>Lấy danh sách thanh toán theo phương thức thanh toán</w:t>
+            </w:r>
+          </w:p>
+        </w:tc>
+        <w:tc>
+          <w:tcPr>
+            <w:tcW w:w="1417" w:type="dxa"/>
+          </w:tcPr>
+          <w:p>
+            <w:pPr>
+              <w:rPr>
+                <w:b/>
+                <w:bCs/>
+                <w:color w:val="196B24" w:themeColor="accent3"/>
+              </w:rPr>
+            </w:pPr>
+          </w:p>
+        </w:tc>
+      </w:tr>
+      <w:tr>
+        <w:tc>
+          <w:tcPr>
+            <w:tcW w:w="1276" w:type="dxa"/>
+            <w:vMerge/>
+          </w:tcPr>
+          <w:p/>
+        </w:tc>
+        <w:tc>
+          <w:tcPr>
+            <w:tcW w:w="4395" w:type="dxa"/>
+          </w:tcPr>
+          <w:p>
+            <w:pPr>
+              <w:rPr>
+                <w:color w:val="FF0000"/>
+              </w:rPr>
+            </w:pPr>
+            <w:r>
+              <w:rPr>
+                <w:color w:val="FF0000"/>
+              </w:rPr>
+              <w:t>{{ngrok}}/payments/status/PENDING/</w:t>
+            </w:r>
+          </w:p>
+        </w:tc>
+        <w:tc>
+          <w:tcPr>
+            <w:tcW w:w="1417" w:type="dxa"/>
+          </w:tcPr>
+          <w:p>
+            <w:pPr>
+              <w:rPr>
+                <w:b/>
+                <w:bCs/>
+              </w:rPr>
+            </w:pPr>
+            <w:r>
+              <w:rPr>
+                <w:b/>
+                <w:bCs/>
+              </w:rPr>
+              <w:t>GET</w:t>
+            </w:r>
+          </w:p>
+        </w:tc>
+        <w:tc>
+          <w:tcPr>
+            <w:tcW w:w="1134" w:type="dxa"/>
+          </w:tcPr>
+          <w:p>
+            <w:pPr>
+              <w:rPr>
+                <w:b/>
+                <w:bCs/>
+                <w:color w:val="196B24" w:themeColor="accent3"/>
+              </w:rPr>
+            </w:pPr>
+            <w:r>
+              <w:rPr>
+                <w:b/>
+                <w:bCs/>
+                <w:color w:val="196B24" w:themeColor="accent3"/>
+              </w:rPr>
+              <w:t>OK</w:t>
+            </w:r>
+          </w:p>
+        </w:tc>
+        <w:tc>
+          <w:tcPr>
+            <w:tcW w:w="1985" w:type="dxa"/>
+          </w:tcPr>
+          <w:p>
+            <w:r>
+              <w:t>Lấy thanh toán theo trạng thái</w:t>
+            </w:r>
+          </w:p>
+        </w:tc>
+        <w:tc>
+          <w:tcPr>
+            <w:tcW w:w="1417" w:type="dxa"/>
+          </w:tcPr>
+          <w:p>
+            <w:pPr>
+              <w:rPr>
+                <w:b/>
+                <w:bCs/>
+                <w:color w:val="196B24" w:themeColor="accent3"/>
+              </w:rPr>
+            </w:pPr>
+          </w:p>
+        </w:tc>
+      </w:tr>
+      <w:tr>
+        <w:tc>
+          <w:tcPr>
+            <w:tcW w:w="1276" w:type="dxa"/>
+            <w:vMerge/>
+          </w:tcPr>
+          <w:p/>
+        </w:tc>
+        <w:tc>
+          <w:tcPr>
+            <w:tcW w:w="4395" w:type="dxa"/>
+          </w:tcPr>
+          <w:p>
+            <w:pPr>
+              <w:rPr>
+                <w:color w:val="FF0000"/>
+              </w:rPr>
+            </w:pPr>
+            <w:r>
+              <w:rPr>
+                <w:color w:val="FF0000"/>
+              </w:rPr>
+              <w:t>{{ngrok}}/payments/room/4/</w:t>
+            </w:r>
+          </w:p>
+        </w:tc>
+        <w:tc>
+          <w:tcPr>
+            <w:tcW w:w="1417" w:type="dxa"/>
+          </w:tcPr>
+          <w:p>
+            <w:pPr>
+              <w:rPr>
+                <w:b/>
+                <w:bCs/>
+              </w:rPr>
+            </w:pPr>
+            <w:r>
+              <w:rPr>
+                <w:b/>
+                <w:bCs/>
+              </w:rPr>
+              <w:t>GET</w:t>
+            </w:r>
+          </w:p>
+        </w:tc>
+        <w:tc>
+          <w:tcPr>
+            <w:tcW w:w="1134" w:type="dxa"/>
+          </w:tcPr>
+          <w:p>
+            <w:pPr>
+              <w:rPr>
+                <w:b/>
+                <w:bCs/>
+                <w:color w:val="196B24" w:themeColor="accent3"/>
+              </w:rPr>
+            </w:pPr>
+            <w:r>
+              <w:rPr>
+                <w:b/>
+                <w:bCs/>
+                <w:color w:val="196B24" w:themeColor="accent3"/>
+              </w:rPr>
+              <w:t>OK</w:t>
+            </w:r>
+          </w:p>
+        </w:tc>
+        <w:tc>
+          <w:tcPr>
+            <w:tcW w:w="1985" w:type="dxa"/>
+          </w:tcPr>
+          <w:p>
+            <w:r>
+              <w:t>Lấy thanh toán theo phòng</w:t>
+            </w:r>
+          </w:p>
+        </w:tc>
+        <w:tc>
+          <w:tcPr>
+            <w:tcW w:w="1417" w:type="dxa"/>
+          </w:tcPr>
+          <w:p>
+            <w:pPr>
+              <w:rPr>
+                <w:b/>
+                <w:bCs/>
+                <w:color w:val="196B24" w:themeColor="accent3"/>
+              </w:rPr>
+            </w:pPr>
+          </w:p>
+        </w:tc>
+      </w:tr>
+      <w:tr>
+        <w:tc>
+          <w:tcPr>
+            <w:tcW w:w="1276" w:type="dxa"/>
+            <w:vMerge/>
+          </w:tcPr>
+          <w:p/>
+        </w:tc>
+        <w:tc>
+          <w:tcPr>
+            <w:tcW w:w="4395" w:type="dxa"/>
+          </w:tcPr>
+          <w:p>
+            <w:pPr>
+              <w:rPr>
+                <w:color w:val="FF0000"/>
+              </w:rPr>
+            </w:pPr>
+            <w:r>
+              <w:rPr>
+                <w:color w:val="FF0000"/>
+              </w:rPr>
+              <w:t>{{ngrok}}/payments/21cde795-527e-41ac-a69c-f820514caa75/update-status/</w:t>
+            </w:r>
+          </w:p>
+        </w:tc>
+        <w:tc>
+          <w:tcPr>
+            <w:tcW w:w="1417" w:type="dxa"/>
+          </w:tcPr>
+          <w:p>
+            <w:pPr>
+              <w:rPr>
+                <w:b/>
+                <w:bCs/>
+              </w:rPr>
+            </w:pPr>
+            <w:r>
+              <w:rPr>
+                <w:b/>
+                <w:bCs/>
+              </w:rPr>
+              <w:t>PATCH</w:t>
+            </w:r>
+          </w:p>
+        </w:tc>
+        <w:tc>
+          <w:tcPr>
+            <w:tcW w:w="1134" w:type="dxa"/>
+          </w:tcPr>
+          <w:p>
+            <w:pPr>
+              <w:rPr>
+                <w:b/>
+                <w:bCs/>
+                <w:color w:val="196B24" w:themeColor="accent3"/>
+              </w:rPr>
+            </w:pPr>
+            <w:r>
+              <w:rPr>
+                <w:b/>
+                <w:bCs/>
+                <w:color w:val="196B24" w:themeColor="accent3"/>
+              </w:rPr>
+              <w:t>OK</w:t>
+            </w:r>
+          </w:p>
+        </w:tc>
+        <w:tc>
+          <w:tcPr>
+            <w:tcW w:w="1985" w:type="dxa"/>
+          </w:tcPr>
+          <w:p>
+            <w:r>
+              <w:t>Cập nhật trạng thái thanh toán</w:t>
+            </w:r>
+          </w:p>
+        </w:tc>
+        <w:tc>
+          <w:tcPr>
+            <w:tcW w:w="1417" w:type="dxa"/>
+          </w:tcPr>
+          <w:p>
+            <w:pPr>
+              <w:rPr>
+                <w:b/>
+                <w:bCs/>
+                <w:color w:val="196B24" w:themeColor="accent3"/>
+              </w:rPr>
+            </w:pPr>
+          </w:p>
+        </w:tc>
+      </w:tr>
+      <w:tr>
+        <w:tc>
+          <w:tcPr>
+            <w:tcW w:w="1276" w:type="dxa"/>
+            <w:vMerge/>
+          </w:tcPr>
+          <w:p/>
+        </w:tc>
+        <w:tc>
+          <w:tcPr>
+            <w:tcW w:w="4395" w:type="dxa"/>
+          </w:tcPr>
+          <w:p>
+            <w:pPr>
+              <w:rPr>
+                <w:color w:val="FF0000"/>
+              </w:rPr>
+            </w:pPr>
+            <w:r>
+              <w:rPr>
+                <w:color w:val="FF0000"/>
+              </w:rPr>
+              <w:t>{{ngrok}}/payments/21cde795-527e-41ac-a69c-f820514caa75/</w:t>
+            </w:r>
+          </w:p>
+        </w:tc>
+        <w:tc>
+          <w:tcPr>
+            <w:tcW w:w="1417" w:type="dxa"/>
+          </w:tcPr>
+          <w:p>
+            <w:pPr>
+              <w:rPr>
+                <w:b/>
+                <w:bCs/>
+              </w:rPr>
+            </w:pPr>
+            <w:r>
+              <w:rPr>
+                <w:b/>
+                <w:bCs/>
+              </w:rPr>
+              <w:t>GET</w:t>
+            </w:r>
+          </w:p>
+        </w:tc>
+        <w:tc>
+          <w:tcPr>
+            <w:tcW w:w="1134" w:type="dxa"/>
+          </w:tcPr>
+          <w:p>
+            <w:pPr>
+              <w:rPr>
+                <w:b/>
+                <w:bCs/>
+                <w:color w:val="196B24" w:themeColor="accent3"/>
+              </w:rPr>
+            </w:pPr>
+            <w:r>
+              <w:rPr>
+                <w:b/>
+                <w:bCs/>
+                <w:color w:val="196B24" w:themeColor="accent3"/>
+              </w:rPr>
+              <w:t>OK</w:t>
+            </w:r>
+          </w:p>
+        </w:tc>
+        <w:tc>
+          <w:tcPr>
+            <w:tcW w:w="1985" w:type="dxa"/>
+          </w:tcPr>
+          <w:p>
+            <w:r>
+              <w:t>Lấy chi tiết một thanh toán</w:t>
+            </w:r>
+          </w:p>
+        </w:tc>
+        <w:tc>
+          <w:tcPr>
+            <w:tcW w:w="1417" w:type="dxa"/>
+          </w:tcPr>
+          <w:p>
+            <w:pPr>
+              <w:rPr>
+                <w:b/>
+                <w:bCs/>
+                <w:color w:val="196B24" w:themeColor="accent3"/>
+              </w:rPr>
+            </w:pPr>
+          </w:p>
+        </w:tc>
+      </w:tr>
+      <w:tr>
+        <w:tc>
+          <w:tcPr>
+            <w:tcW w:w="1276" w:type="dxa"/>
+            <w:vMerge/>
+          </w:tcPr>
+          <w:p/>
+        </w:tc>
+        <w:tc>
+          <w:tcPr>
+            <w:tcW w:w="4395" w:type="dxa"/>
+          </w:tcPr>
+          <w:p>
+            <w:pPr>
+              <w:rPr>
+                <w:color w:val="FF0000"/>
+              </w:rPr>
+            </w:pPr>
+            <w:r>
+              <w:rPr>
+                <w:color w:val="FF0000"/>
+              </w:rPr>
+              <w:t>{{ngrok}}/payments/21cde795-527e-41ac-a69c-f820514caa75/</w:t>
+            </w:r>
+          </w:p>
+        </w:tc>
+        <w:tc>
+          <w:tcPr>
+            <w:tcW w:w="1417" w:type="dxa"/>
+          </w:tcPr>
+          <w:p>
+            <w:pPr>
+              <w:rPr>
+                <w:b/>
+                <w:bCs/>
+              </w:rPr>
+            </w:pPr>
+            <w:r>
+              <w:rPr>
+                <w:b/>
+                <w:bCs/>
+              </w:rPr>
+              <w:t>PATCH | PUT</w:t>
+            </w:r>
+          </w:p>
+        </w:tc>
+        <w:tc>
+          <w:tcPr>
+            <w:tcW w:w="1134" w:type="dxa"/>
+          </w:tcPr>
+          <w:p>
+            <w:pPr>
+              <w:rPr>
+                <w:b/>
+                <w:bCs/>
+                <w:color w:val="196B24" w:themeColor="accent3"/>
+              </w:rPr>
+            </w:pPr>
+            <w:r>
+              <w:rPr>
+                <w:b/>
+                <w:bCs/>
+                <w:color w:val="196B24" w:themeColor="accent3"/>
+              </w:rPr>
+              <w:t>OK</w:t>
+            </w:r>
+          </w:p>
+        </w:tc>
+        <w:tc>
+          <w:tcPr>
+            <w:tcW w:w="1985" w:type="dxa"/>
+          </w:tcPr>
+          <w:p>
+            <w:r>
+              <w:t>Cập nhật thanh toán</w:t>
+            </w:r>
+          </w:p>
+        </w:tc>
+        <w:tc>
+          <w:tcPr>
+            <w:tcW w:w="1417" w:type="dxa"/>
+          </w:tcPr>
+          <w:p>
+            <w:pPr>
+              <w:rPr>
+                <w:b/>
+                <w:bCs/>
+                <w:color w:val="196B24" w:themeColor="accent3"/>
+              </w:rPr>
+            </w:pPr>
+          </w:p>
+        </w:tc>
+      </w:tr>
+      <w:tr>
+        <w:tc>
+          <w:tcPr>
+            <w:tcW w:w="1276" w:type="dxa"/>
+            <w:vMerge/>
+          </w:tcPr>
+          <w:p/>
+        </w:tc>
+        <w:tc>
+          <w:tcPr>
+            <w:tcW w:w="4395" w:type="dxa"/>
+          </w:tcPr>
+          <w:p>
+            <w:pPr>
+              <w:rPr>
+                <w:color w:val="FF0000"/>
+              </w:rPr>
+            </w:pPr>
+            <w:r>
+              <w:rPr>
+                <w:color w:val="FF0000"/>
+              </w:rPr>
+              <w:t>{{ngrok}}/payments/21cde795-527e-41ac-a69c-f820514caa75/</w:t>
+            </w:r>
+          </w:p>
+        </w:tc>
+        <w:tc>
+          <w:tcPr>
+            <w:tcW w:w="1417" w:type="dxa"/>
+          </w:tcPr>
+          <w:p>
+            <w:pPr>
+              <w:rPr>
+                <w:b/>
+                <w:bCs/>
+              </w:rPr>
+            </w:pPr>
+            <w:r>
+              <w:rPr>
+                <w:b/>
+                <w:bCs/>
+              </w:rPr>
+              <w:t>DELETE</w:t>
+            </w:r>
+          </w:p>
+        </w:tc>
+        <w:tc>
+          <w:tcPr>
+            <w:tcW w:w="1134" w:type="dxa"/>
+          </w:tcPr>
+          <w:p>
+            <w:pPr>
+              <w:rPr>
+                <w:b/>
+                <w:bCs/>
+                <w:color w:val="196B24" w:themeColor="accent3"/>
+              </w:rPr>
+            </w:pPr>
+            <w:r>
+              <w:rPr>
+                <w:b/>
+                <w:bCs/>
+                <w:color w:val="196B24" w:themeColor="accent3"/>
+              </w:rPr>
+              <w:t>OK</w:t>
+            </w:r>
+          </w:p>
+        </w:tc>
+        <w:tc>
+          <w:tcPr>
+            <w:tcW w:w="1985" w:type="dxa"/>
+          </w:tcPr>
+          <w:p>
+            <w:r>
+              <w:t>Xóa thanh toán</w:t>
+            </w:r>
+          </w:p>
+        </w:tc>
+        <w:tc>
+          <w:tcPr>
+            <w:tcW w:w="1417" w:type="dxa"/>
+          </w:tcPr>
+          <w:p>
+            <w:pPr>
+              <w:rPr>
+                <w:b/>
+                <w:bCs/>
+                <w:color w:val="196B24" w:themeColor="accent3"/>
+              </w:rPr>
+            </w:pPr>
+          </w:p>
+        </w:tc>
+      </w:tr>
+      <w:tr>
+        <w:tc>
+          <w:tcPr>
+            <w:tcW w:w="1276" w:type="dxa"/>
+          </w:tcPr>
+          <w:p/>
+        </w:tc>
+        <w:tc>
+          <w:tcPr>
+            <w:tcW w:w="4395" w:type="dxa"/>
+          </w:tcPr>
+          <w:p>
+            <w:pPr>
+              <w:rPr>
+                <w:color w:val="FF0000"/>
+              </w:rPr>
+            </w:pPr>
+          </w:p>
+        </w:tc>
+        <w:tc>
+          <w:tcPr>
+            <w:tcW w:w="1417" w:type="dxa"/>
+          </w:tcPr>
+          <w:p>
+            <w:pPr>
+              <w:rPr>
+                <w:b/>
+                <w:bCs/>
+              </w:rPr>
+            </w:pPr>
+          </w:p>
+        </w:tc>
+        <w:tc>
+          <w:tcPr>
+            <w:tcW w:w="1134" w:type="dxa"/>
+          </w:tcPr>
+          <w:p>
+            <w:pPr>
+              <w:rPr>
+                <w:b/>
+                <w:bCs/>
+                <w:color w:val="196B24" w:themeColor="accent3"/>
+              </w:rPr>
+            </w:pPr>
+          </w:p>
+        </w:tc>
+        <w:tc>
+          <w:tcPr>
+            <w:tcW w:w="1985" w:type="dxa"/>
+          </w:tcPr>
+          <w:p/>
+        </w:tc>
+        <w:tc>
+          <w:tcPr>
+            <w:tcW w:w="1417" w:type="dxa"/>
+          </w:tcPr>
+          <w:p>
+            <w:pPr>
+              <w:rPr>
+                <w:b/>
+                <w:bCs/>
+                <w:color w:val="196B24" w:themeColor="accent3"/>
+              </w:rPr>
+            </w:pPr>
+          </w:p>
+        </w:tc>
+      </w:tr>
+      <w:tr>
+        <w:tc>
+          <w:tcPr>
+            <w:tcW w:w="1276" w:type="dxa"/>
+          </w:tcPr>
+          <w:p/>
+        </w:tc>
+        <w:tc>
+          <w:tcPr>
+            <w:tcW w:w="4395" w:type="dxa"/>
+          </w:tcPr>
+          <w:p>
+            <w:pPr>
+              <w:rPr>
+                <w:color w:val="FF0000"/>
               </w:rPr>
             </w:pPr>
           </w:p>

</xml_diff>

<commit_message>
thêm quyền admin, chưa kiểm tra
</commit_message>
<xml_diff>
--- a/Hỗ trợ tìm kiếm nhà trọ.docx
+++ b/Hỗ trợ tìm kiếm nhà trọ.docx
@@ -12303,7 +12303,7 @@
                 <w:bCs/>
                 <w:color w:val="196B24" w:themeColor="accent3"/>
               </w:rPr>
-              <w:t>Pending</w:t>
+              <w:t>OK</w:t>
             </w:r>
           </w:p>
         </w:tc>
@@ -12407,6 +12407,651 @@
             <w:r>
               <w:t>Lấy danh sách bài đăng đã lưu</w:t>
             </w:r>
+          </w:p>
+        </w:tc>
+        <w:tc>
+          <w:tcPr>
+            <w:tcW w:w="1417" w:type="dxa"/>
+          </w:tcPr>
+          <w:p>
+            <w:pPr>
+              <w:rPr>
+                <w:b/>
+                <w:bCs/>
+                <w:color w:val="196B24" w:themeColor="accent3"/>
+              </w:rPr>
+            </w:pPr>
+          </w:p>
+        </w:tc>
+      </w:tr>
+      <w:tr>
+        <w:tc>
+          <w:tcPr>
+            <w:tcW w:w="1276" w:type="dxa"/>
+          </w:tcPr>
+          <w:p>
+            <w:r>
+              <w:t xml:space="preserve">Filter </w:t>
+            </w:r>
+          </w:p>
+        </w:tc>
+        <w:tc>
+          <w:tcPr>
+            <w:tcW w:w="4395" w:type="dxa"/>
+          </w:tcPr>
+          <w:p>
+            <w:pPr>
+              <w:rPr>
+                <w:color w:val="FF0000"/>
+              </w:rPr>
+            </w:pPr>
+            <w:r>
+              <w:rPr>
+                <w:color w:val="FF0000"/>
+              </w:rPr>
+              <w:t>{{ngrok}}/tenants/?id=27</w:t>
+            </w:r>
+          </w:p>
+        </w:tc>
+        <w:tc>
+          <w:tcPr>
+            <w:tcW w:w="1417" w:type="dxa"/>
+          </w:tcPr>
+          <w:p>
+            <w:pPr>
+              <w:rPr>
+                <w:b/>
+                <w:bCs/>
+              </w:rPr>
+            </w:pPr>
+            <w:r>
+              <w:rPr>
+                <w:b/>
+                <w:bCs/>
+              </w:rPr>
+              <w:t>GET</w:t>
+            </w:r>
+          </w:p>
+        </w:tc>
+        <w:tc>
+          <w:tcPr>
+            <w:tcW w:w="1134" w:type="dxa"/>
+          </w:tcPr>
+          <w:p>
+            <w:pPr>
+              <w:rPr>
+                <w:b/>
+                <w:bCs/>
+                <w:color w:val="196B24" w:themeColor="accent3"/>
+              </w:rPr>
+            </w:pPr>
+            <w:r>
+              <w:rPr>
+                <w:b/>
+                <w:bCs/>
+                <w:color w:val="196B24" w:themeColor="accent3"/>
+              </w:rPr>
+              <w:t>OK</w:t>
+            </w:r>
+          </w:p>
+        </w:tc>
+        <w:tc>
+          <w:tcPr>
+            <w:tcW w:w="1985" w:type="dxa"/>
+          </w:tcPr>
+          <w:p>
+            <w:pPr>
+              <w:jc w:val="center"/>
+            </w:pPr>
+            <w:r>
+              <w:t>Lọc theo user_id</w:t>
+            </w:r>
+          </w:p>
+        </w:tc>
+        <w:tc>
+          <w:tcPr>
+            <w:tcW w:w="1417" w:type="dxa"/>
+          </w:tcPr>
+          <w:p>
+            <w:pPr>
+              <w:rPr>
+                <w:b/>
+                <w:bCs/>
+                <w:color w:val="196B24" w:themeColor="accent3"/>
+              </w:rPr>
+            </w:pPr>
+          </w:p>
+        </w:tc>
+      </w:tr>
+      <w:tr>
+        <w:tc>
+          <w:tcPr>
+            <w:tcW w:w="1276" w:type="dxa"/>
+          </w:tcPr>
+          <w:p/>
+        </w:tc>
+        <w:tc>
+          <w:tcPr>
+            <w:tcW w:w="4395" w:type="dxa"/>
+          </w:tcPr>
+          <w:p>
+            <w:pPr>
+              <w:rPr>
+                <w:color w:val="FF0000"/>
+              </w:rPr>
+            </w:pPr>
+            <w:r>
+              <w:rPr>
+                <w:color w:val="FF0000"/>
+              </w:rPr>
+              <w:t>{{ngrok}}/tenants/?q=Lê Th</w:t>
+            </w:r>
+          </w:p>
+        </w:tc>
+        <w:tc>
+          <w:tcPr>
+            <w:tcW w:w="1417" w:type="dxa"/>
+          </w:tcPr>
+          <w:p>
+            <w:pPr>
+              <w:rPr>
+                <w:b/>
+                <w:bCs/>
+              </w:rPr>
+            </w:pPr>
+            <w:r>
+              <w:rPr>
+                <w:b/>
+                <w:bCs/>
+              </w:rPr>
+              <w:t>GET</w:t>
+            </w:r>
+          </w:p>
+        </w:tc>
+        <w:tc>
+          <w:tcPr>
+            <w:tcW w:w="1134" w:type="dxa"/>
+          </w:tcPr>
+          <w:p>
+            <w:pPr>
+              <w:rPr>
+                <w:b/>
+                <w:bCs/>
+                <w:color w:val="196B24" w:themeColor="accent3"/>
+              </w:rPr>
+            </w:pPr>
+            <w:r>
+              <w:rPr>
+                <w:b/>
+                <w:bCs/>
+                <w:color w:val="196B24" w:themeColor="accent3"/>
+              </w:rPr>
+              <w:t>OK</w:t>
+            </w:r>
+          </w:p>
+        </w:tc>
+        <w:tc>
+          <w:tcPr>
+            <w:tcW w:w="1985" w:type="dxa"/>
+          </w:tcPr>
+          <w:p>
+            <w:pPr>
+              <w:jc w:val="center"/>
+            </w:pPr>
+            <w:r>
+              <w:t>Có chứa tên</w:t>
+            </w:r>
+          </w:p>
+        </w:tc>
+        <w:tc>
+          <w:tcPr>
+            <w:tcW w:w="1417" w:type="dxa"/>
+          </w:tcPr>
+          <w:p>
+            <w:pPr>
+              <w:rPr>
+                <w:b/>
+                <w:bCs/>
+                <w:color w:val="196B24" w:themeColor="accent3"/>
+              </w:rPr>
+            </w:pPr>
+          </w:p>
+        </w:tc>
+      </w:tr>
+      <w:tr>
+        <w:tc>
+          <w:tcPr>
+            <w:tcW w:w="1276" w:type="dxa"/>
+          </w:tcPr>
+          <w:p/>
+        </w:tc>
+        <w:tc>
+          <w:tcPr>
+            <w:tcW w:w="4395" w:type="dxa"/>
+          </w:tcPr>
+          <w:p>
+            <w:pPr>
+              <w:rPr>
+                <w:color w:val="FF0000"/>
+              </w:rPr>
+            </w:pPr>
+            <w:r>
+              <w:rPr>
+                <w:color w:val="FF0000"/>
+              </w:rPr>
+              <w:t>{{ngrok}}/tenants/?slug_source=le-thi-thuy</w:t>
+            </w:r>
+          </w:p>
+        </w:tc>
+        <w:tc>
+          <w:tcPr>
+            <w:tcW w:w="1417" w:type="dxa"/>
+          </w:tcPr>
+          <w:p>
+            <w:pPr>
+              <w:rPr>
+                <w:b/>
+                <w:bCs/>
+              </w:rPr>
+            </w:pPr>
+            <w:r>
+              <w:rPr>
+                <w:b/>
+                <w:bCs/>
+              </w:rPr>
+              <w:t>GET</w:t>
+            </w:r>
+          </w:p>
+        </w:tc>
+        <w:tc>
+          <w:tcPr>
+            <w:tcW w:w="1134" w:type="dxa"/>
+          </w:tcPr>
+          <w:p>
+            <w:pPr>
+              <w:rPr>
+                <w:b/>
+                <w:bCs/>
+                <w:color w:val="196B24" w:themeColor="accent3"/>
+              </w:rPr>
+            </w:pPr>
+            <w:r>
+              <w:rPr>
+                <w:b/>
+                <w:bCs/>
+                <w:color w:val="196B24" w:themeColor="accent3"/>
+              </w:rPr>
+              <w:t>OK</w:t>
+            </w:r>
+          </w:p>
+        </w:tc>
+        <w:tc>
+          <w:tcPr>
+            <w:tcW w:w="1985" w:type="dxa"/>
+          </w:tcPr>
+          <w:p>
+            <w:pPr>
+              <w:jc w:val="center"/>
+            </w:pPr>
+            <w:r>
+              <w:t>Slug name</w:t>
+            </w:r>
+          </w:p>
+        </w:tc>
+        <w:tc>
+          <w:tcPr>
+            <w:tcW w:w="1417" w:type="dxa"/>
+          </w:tcPr>
+          <w:p>
+            <w:pPr>
+              <w:rPr>
+                <w:b/>
+                <w:bCs/>
+                <w:color w:val="196B24" w:themeColor="accent3"/>
+              </w:rPr>
+            </w:pPr>
+          </w:p>
+        </w:tc>
+      </w:tr>
+      <w:tr>
+        <w:tc>
+          <w:tcPr>
+            <w:tcW w:w="1276" w:type="dxa"/>
+          </w:tcPr>
+          <w:p/>
+        </w:tc>
+        <w:tc>
+          <w:tcPr>
+            <w:tcW w:w="4395" w:type="dxa"/>
+          </w:tcPr>
+          <w:p>
+            <w:pPr>
+              <w:rPr>
+                <w:color w:val="FF0000"/>
+              </w:rPr>
+            </w:pPr>
+            <w:r>
+              <w:rPr>
+                <w:color w:val="FF0000"/>
+              </w:rPr>
+              <w:t>{{ngrok}}/tenants/?gender=male</w:t>
+            </w:r>
+          </w:p>
+        </w:tc>
+        <w:tc>
+          <w:tcPr>
+            <w:tcW w:w="1417" w:type="dxa"/>
+          </w:tcPr>
+          <w:p>
+            <w:pPr>
+              <w:rPr>
+                <w:b/>
+                <w:bCs/>
+              </w:rPr>
+            </w:pPr>
+            <w:r>
+              <w:rPr>
+                <w:b/>
+                <w:bCs/>
+              </w:rPr>
+              <w:t>GET</w:t>
+            </w:r>
+          </w:p>
+        </w:tc>
+        <w:tc>
+          <w:tcPr>
+            <w:tcW w:w="1134" w:type="dxa"/>
+          </w:tcPr>
+          <w:p>
+            <w:pPr>
+              <w:rPr>
+                <w:b/>
+                <w:bCs/>
+                <w:color w:val="196B24" w:themeColor="accent3"/>
+              </w:rPr>
+            </w:pPr>
+            <w:r>
+              <w:rPr>
+                <w:b/>
+                <w:bCs/>
+                <w:color w:val="196B24" w:themeColor="accent3"/>
+              </w:rPr>
+              <w:t>OK</w:t>
+            </w:r>
+          </w:p>
+        </w:tc>
+        <w:tc>
+          <w:tcPr>
+            <w:tcW w:w="1985" w:type="dxa"/>
+          </w:tcPr>
+          <w:p>
+            <w:pPr>
+              <w:jc w:val="center"/>
+            </w:pPr>
+            <w:r>
+              <w:t>Giới tính</w:t>
+            </w:r>
+          </w:p>
+        </w:tc>
+        <w:tc>
+          <w:tcPr>
+            <w:tcW w:w="1417" w:type="dxa"/>
+          </w:tcPr>
+          <w:p>
+            <w:pPr>
+              <w:rPr>
+                <w:b/>
+                <w:bCs/>
+                <w:color w:val="196B24" w:themeColor="accent3"/>
+              </w:rPr>
+            </w:pPr>
+          </w:p>
+        </w:tc>
+      </w:tr>
+      <w:tr>
+        <w:tc>
+          <w:tcPr>
+            <w:tcW w:w="1276" w:type="dxa"/>
+          </w:tcPr>
+          <w:p/>
+        </w:tc>
+        <w:tc>
+          <w:tcPr>
+            <w:tcW w:w="4395" w:type="dxa"/>
+          </w:tcPr>
+          <w:p>
+            <w:pPr>
+              <w:rPr>
+                <w:color w:val="FF0000"/>
+              </w:rPr>
+            </w:pPr>
+            <w:r>
+              <w:rPr>
+                <w:color w:val="FF0000"/>
+              </w:rPr>
+              <w:t>{{ngrok}}/tenants/?min_age=20</w:t>
+            </w:r>
+          </w:p>
+        </w:tc>
+        <w:tc>
+          <w:tcPr>
+            <w:tcW w:w="1417" w:type="dxa"/>
+          </w:tcPr>
+          <w:p>
+            <w:pPr>
+              <w:rPr>
+                <w:b/>
+                <w:bCs/>
+              </w:rPr>
+            </w:pPr>
+            <w:r>
+              <w:rPr>
+                <w:b/>
+                <w:bCs/>
+              </w:rPr>
+              <w:t>GET</w:t>
+            </w:r>
+          </w:p>
+        </w:tc>
+        <w:tc>
+          <w:tcPr>
+            <w:tcW w:w="1134" w:type="dxa"/>
+          </w:tcPr>
+          <w:p>
+            <w:pPr>
+              <w:rPr>
+                <w:b/>
+                <w:bCs/>
+                <w:color w:val="196B24" w:themeColor="accent3"/>
+              </w:rPr>
+            </w:pPr>
+            <w:r>
+              <w:rPr>
+                <w:b/>
+                <w:bCs/>
+                <w:color w:val="196B24" w:themeColor="accent3"/>
+              </w:rPr>
+              <w:t>OK</w:t>
+            </w:r>
+          </w:p>
+        </w:tc>
+        <w:tc>
+          <w:tcPr>
+            <w:tcW w:w="1985" w:type="dxa"/>
+          </w:tcPr>
+          <w:p>
+            <w:pPr>
+              <w:jc w:val="center"/>
+            </w:pPr>
+            <w:r>
+              <w:t>Tuổi</w:t>
+            </w:r>
+          </w:p>
+        </w:tc>
+        <w:tc>
+          <w:tcPr>
+            <w:tcW w:w="1417" w:type="dxa"/>
+          </w:tcPr>
+          <w:p>
+            <w:pPr>
+              <w:rPr>
+                <w:b/>
+                <w:bCs/>
+                <w:color w:val="196B24" w:themeColor="accent3"/>
+              </w:rPr>
+            </w:pPr>
+          </w:p>
+        </w:tc>
+      </w:tr>
+      <w:tr>
+        <w:tc>
+          <w:tcPr>
+            <w:tcW w:w="1276" w:type="dxa"/>
+          </w:tcPr>
+          <w:p/>
+        </w:tc>
+        <w:tc>
+          <w:tcPr>
+            <w:tcW w:w="4395" w:type="dxa"/>
+          </w:tcPr>
+          <w:p>
+            <w:pPr>
+              <w:rPr>
+                <w:color w:val="FF0000"/>
+              </w:rPr>
+            </w:pPr>
+            <w:r>
+              <w:rPr>
+                <w:color w:val="FF0000"/>
+              </w:rPr>
+              <w:t>{{ngrok}}/tenants/?q=Nguyen&amp;gender=male&amp;min_age=22&amp;max_age=28</w:t>
+            </w:r>
+          </w:p>
+        </w:tc>
+        <w:tc>
+          <w:tcPr>
+            <w:tcW w:w="1417" w:type="dxa"/>
+          </w:tcPr>
+          <w:p>
+            <w:pPr>
+              <w:rPr>
+                <w:b/>
+                <w:bCs/>
+              </w:rPr>
+            </w:pPr>
+            <w:r>
+              <w:rPr>
+                <w:b/>
+                <w:bCs/>
+              </w:rPr>
+              <w:t>GET</w:t>
+            </w:r>
+          </w:p>
+        </w:tc>
+        <w:tc>
+          <w:tcPr>
+            <w:tcW w:w="1134" w:type="dxa"/>
+          </w:tcPr>
+          <w:p>
+            <w:pPr>
+              <w:rPr>
+                <w:b/>
+                <w:bCs/>
+                <w:color w:val="196B24" w:themeColor="accent3"/>
+              </w:rPr>
+            </w:pPr>
+            <w:r>
+              <w:rPr>
+                <w:b/>
+                <w:bCs/>
+                <w:color w:val="196B24" w:themeColor="accent3"/>
+              </w:rPr>
+              <w:t>OK</w:t>
+            </w:r>
+          </w:p>
+        </w:tc>
+        <w:tc>
+          <w:tcPr>
+            <w:tcW w:w="1985" w:type="dxa"/>
+          </w:tcPr>
+          <w:p>
+            <w:pPr>
+              <w:jc w:val="center"/>
+            </w:pPr>
+            <w:r>
+              <w:t>Kết hợp</w:t>
+            </w:r>
+          </w:p>
+        </w:tc>
+        <w:tc>
+          <w:tcPr>
+            <w:tcW w:w="1417" w:type="dxa"/>
+          </w:tcPr>
+          <w:p>
+            <w:pPr>
+              <w:rPr>
+                <w:b/>
+                <w:bCs/>
+                <w:color w:val="196B24" w:themeColor="accent3"/>
+              </w:rPr>
+            </w:pPr>
+          </w:p>
+        </w:tc>
+      </w:tr>
+      <w:tr>
+        <w:tc>
+          <w:tcPr>
+            <w:tcW w:w="1276" w:type="dxa"/>
+          </w:tcPr>
+          <w:p/>
+        </w:tc>
+        <w:tc>
+          <w:tcPr>
+            <w:tcW w:w="4395" w:type="dxa"/>
+          </w:tcPr>
+          <w:p>
+            <w:pPr>
+              <w:rPr>
+                <w:color w:val="FF0000"/>
+              </w:rPr>
+            </w:pPr>
+          </w:p>
+        </w:tc>
+        <w:tc>
+          <w:tcPr>
+            <w:tcW w:w="1417" w:type="dxa"/>
+          </w:tcPr>
+          <w:p>
+            <w:pPr>
+              <w:rPr>
+                <w:b/>
+                <w:bCs/>
+              </w:rPr>
+            </w:pPr>
+          </w:p>
+        </w:tc>
+        <w:tc>
+          <w:tcPr>
+            <w:tcW w:w="1134" w:type="dxa"/>
+          </w:tcPr>
+          <w:p>
+            <w:pPr>
+              <w:rPr>
+                <w:b/>
+                <w:bCs/>
+                <w:color w:val="196B24" w:themeColor="accent3"/>
+              </w:rPr>
+            </w:pPr>
+          </w:p>
+        </w:tc>
+        <w:tc>
+          <w:tcPr>
+            <w:tcW w:w="1985" w:type="dxa"/>
+          </w:tcPr>
+          <w:p>
+            <w:pPr>
+              <w:jc w:val="center"/>
+            </w:pPr>
           </w:p>
         </w:tc>
         <w:tc>
@@ -12505,6 +13150,7 @@
               <w:rPr>
                 <w:lang w:val="vi-VN"/>
               </w:rPr>
+              <w:lastRenderedPageBreak/>
               <w:t>Landlord</w:t>
             </w:r>
             <w:r>
@@ -12771,11 +13417,7 @@
               <w:t>Cập nhật thông tin chủ trọ</w:t>
             </w:r>
             <w:r>
-              <w:t xml:space="preserve"> (phải get ra để hiển thị muốn </w:t>
-            </w:r>
-            <w:r>
-              <w:lastRenderedPageBreak/>
-              <w:t>sửa tất cả, không có PATCH)</w:t>
+              <w:t xml:space="preserve"> (phải get ra để hiển thị muốn sửa tất cả, không có PATCH)</w:t>
             </w:r>
           </w:p>
         </w:tc>
@@ -14566,9 +15208,6 @@
             </w:r>
             <w:r>
               <w:br/>
-            </w:r>
-            <w:r>
-              <w:lastRenderedPageBreak/>
               <w:t>nhấn lần 2 là bỏ like</w:t>
             </w:r>
           </w:p>
@@ -16455,6 +17094,7 @@
           </w:tcPr>
           <w:p>
             <w:r>
+              <w:lastRenderedPageBreak/>
               <w:t>search-history</w:t>
             </w:r>
           </w:p>
@@ -20415,6 +21055,7 @@
           </w:tcPr>
           <w:p>
             <w:r>
+              <w:lastRenderedPageBreak/>
               <w:t>Payments</w:t>
             </w:r>
           </w:p>

</xml_diff>

<commit_message>
thêm các điều kiện xác thực
</commit_message>
<xml_diff>
--- a/Hỗ trợ tìm kiếm nhà trọ.docx
+++ b/Hỗ trợ tìm kiếm nhà trọ.docx
@@ -9047,6 +9047,13 @@
                 <w:bCs/>
               </w:rPr>
             </w:pPr>
+            <w:r>
+              <w:rPr>
+                <w:b/>
+                <w:bCs/>
+              </w:rPr>
+              <w:t>POST</w:t>
+            </w:r>
           </w:p>
         </w:tc>
         <w:tc>
@@ -9061,6 +9068,14 @@
                 <w:color w:val="196B24" w:themeColor="accent3"/>
               </w:rPr>
             </w:pPr>
+            <w:r>
+              <w:rPr>
+                <w:b/>
+                <w:bCs/>
+                <w:color w:val="196B24" w:themeColor="accent3"/>
+              </w:rPr>
+              <w:t>OK</w:t>
+            </w:r>
           </w:p>
         </w:tc>
         <w:tc>
@@ -9068,6 +9083,98 @@
             <w:tcW w:w="1985" w:type="dxa"/>
           </w:tcPr>
           <w:p/>
+        </w:tc>
+        <w:tc>
+          <w:tcPr>
+            <w:tcW w:w="1417" w:type="dxa"/>
+          </w:tcPr>
+          <w:p>
+            <w:pPr>
+              <w:rPr>
+                <w:b/>
+                <w:bCs/>
+                <w:color w:val="196B24" w:themeColor="accent3"/>
+              </w:rPr>
+            </w:pPr>
+          </w:p>
+        </w:tc>
+      </w:tr>
+      <w:tr>
+        <w:tc>
+          <w:tcPr>
+            <w:tcW w:w="1276" w:type="dxa"/>
+          </w:tcPr>
+          <w:p/>
+        </w:tc>
+        <w:tc>
+          <w:tcPr>
+            <w:tcW w:w="4395" w:type="dxa"/>
+          </w:tcPr>
+          <w:p>
+            <w:pPr>
+              <w:rPr>
+                <w:color w:val="FF0000"/>
+              </w:rPr>
+            </w:pPr>
+            <w:r>
+              <w:rPr>
+                <w:color w:val="FF0000"/>
+              </w:rPr>
+              <w:t>{{ngrok}}/motels/17/verify/</w:t>
+            </w:r>
+          </w:p>
+        </w:tc>
+        <w:tc>
+          <w:tcPr>
+            <w:tcW w:w="1417" w:type="dxa"/>
+          </w:tcPr>
+          <w:p>
+            <w:pPr>
+              <w:rPr>
+                <w:b/>
+                <w:bCs/>
+              </w:rPr>
+            </w:pPr>
+            <w:r>
+              <w:rPr>
+                <w:b/>
+                <w:bCs/>
+              </w:rPr>
+              <w:t>PATCH</w:t>
+            </w:r>
+          </w:p>
+        </w:tc>
+        <w:tc>
+          <w:tcPr>
+            <w:tcW w:w="1134" w:type="dxa"/>
+          </w:tcPr>
+          <w:p>
+            <w:pPr>
+              <w:rPr>
+                <w:b/>
+                <w:bCs/>
+                <w:color w:val="196B24" w:themeColor="accent3"/>
+              </w:rPr>
+            </w:pPr>
+            <w:r>
+              <w:rPr>
+                <w:b/>
+                <w:bCs/>
+                <w:color w:val="196B24" w:themeColor="accent3"/>
+              </w:rPr>
+              <w:t>OK</w:t>
+            </w:r>
+          </w:p>
+        </w:tc>
+        <w:tc>
+          <w:tcPr>
+            <w:tcW w:w="1985" w:type="dxa"/>
+          </w:tcPr>
+          <w:p>
+            <w:r>
+              <w:t xml:space="preserve">Xác thực nhà trọ, chỉ admin, phải đủ 3 hình, có địa chỉ, số điện thoại </w:t>
+            </w:r>
+          </w:p>
         </w:tc>
         <w:tc>
           <w:tcPr>
@@ -12712,6 +12819,7 @@
         <w:tc>
           <w:tcPr>
             <w:tcW w:w="1276" w:type="dxa"/>
+            <w:vMerge w:val="restart"/>
           </w:tcPr>
           <w:p>
             <w:r>
@@ -12811,6 +12919,7 @@
         <w:tc>
           <w:tcPr>
             <w:tcW w:w="1276" w:type="dxa"/>
+            <w:vMerge/>
           </w:tcPr>
           <w:p/>
         </w:tc>
@@ -12906,6 +13015,7 @@
         <w:tc>
           <w:tcPr>
             <w:tcW w:w="1276" w:type="dxa"/>
+            <w:vMerge/>
           </w:tcPr>
           <w:p/>
         </w:tc>
@@ -13001,6 +13111,7 @@
         <w:tc>
           <w:tcPr>
             <w:tcW w:w="1276" w:type="dxa"/>
+            <w:vMerge/>
           </w:tcPr>
           <w:p/>
         </w:tc>
@@ -13096,6 +13207,7 @@
         <w:tc>
           <w:tcPr>
             <w:tcW w:w="1276" w:type="dxa"/>
+            <w:vMerge/>
           </w:tcPr>
           <w:p/>
         </w:tc>
@@ -13191,6 +13303,7 @@
         <w:tc>
           <w:tcPr>
             <w:tcW w:w="1276" w:type="dxa"/>
+            <w:vMerge/>
           </w:tcPr>
           <w:p/>
         </w:tc>
@@ -20609,7 +20722,6 @@
           </w:p>
           <w:p>
             <w:r>
-              <w:lastRenderedPageBreak/>
               <w:t>16</w:t>
             </w:r>
           </w:p>
@@ -20628,7 +20740,6 @@
               <w:rPr>
                 <w:color w:val="ED0000"/>
               </w:rPr>
-              <w:lastRenderedPageBreak/>
               <w:t>{{ngrok}}/room-tenants/</w:t>
             </w:r>
           </w:p>
@@ -22263,6 +22374,7 @@
           </w:p>
           <w:p>
             <w:r>
+              <w:lastRenderedPageBreak/>
               <w:t>18</w:t>
             </w:r>
           </w:p>
@@ -22281,6 +22393,7 @@
               <w:rPr>
                 <w:color w:val="FF0000"/>
               </w:rPr>
+              <w:lastRenderedPageBreak/>
               <w:t>{{ngrok}}/motel-images/</w:t>
             </w:r>
           </w:p>
@@ -23731,7 +23844,16 @@
           <w:tcPr>
             <w:tcW w:w="1276" w:type="dxa"/>
           </w:tcPr>
-          <w:p/>
+          <w:p>
+            <w:r>
+              <w:t xml:space="preserve">Statistics </w:t>
+            </w:r>
+          </w:p>
+          <w:p>
+            <w:r>
+              <w:t>20</w:t>
+            </w:r>
+          </w:p>
         </w:tc>
         <w:tc>
           <w:tcPr>
@@ -23797,8 +23919,13 @@
         <w:tc>
           <w:tcPr>
             <w:tcW w:w="1276" w:type="dxa"/>
-          </w:tcPr>
-          <w:p/>
+            <w:vMerge w:val="restart"/>
+          </w:tcPr>
+          <w:p>
+            <w:r>
+              <w:t>landlord</w:t>
+            </w:r>
+          </w:p>
         </w:tc>
         <w:tc>
           <w:tcPr>
@@ -23810,19 +23937,32 @@
                 <w:color w:val="FF0000"/>
               </w:rPr>
             </w:pPr>
-          </w:p>
-        </w:tc>
-        <w:tc>
-          <w:tcPr>
-            <w:tcW w:w="1417" w:type="dxa"/>
-          </w:tcPr>
-          <w:p>
-            <w:pPr>
-              <w:rPr>
-                <w:b/>
-                <w:bCs/>
-              </w:rPr>
-            </w:pPr>
+            <w:r>
+              <w:rPr>
+                <w:color w:val="FF0000"/>
+              </w:rPr>
+              <w:t>{{ngrok}}/statistics/landlords/?type=month&amp;from=2024-01-01&amp;to=2025-12-31</w:t>
+            </w:r>
+          </w:p>
+        </w:tc>
+        <w:tc>
+          <w:tcPr>
+            <w:tcW w:w="1417" w:type="dxa"/>
+          </w:tcPr>
+          <w:p>
+            <w:pPr>
+              <w:rPr>
+                <w:b/>
+                <w:bCs/>
+              </w:rPr>
+            </w:pPr>
+            <w:r>
+              <w:rPr>
+                <w:b/>
+                <w:bCs/>
+              </w:rPr>
+              <w:t>GET</w:t>
+            </w:r>
           </w:p>
         </w:tc>
         <w:tc>
@@ -23837,13 +23977,25 @@
                 <w:color w:val="196B24" w:themeColor="accent3"/>
               </w:rPr>
             </w:pPr>
+            <w:r>
+              <w:rPr>
+                <w:b/>
+                <w:bCs/>
+                <w:color w:val="196B24" w:themeColor="accent3"/>
+              </w:rPr>
+              <w:t>OK</w:t>
+            </w:r>
           </w:p>
         </w:tc>
         <w:tc>
           <w:tcPr>
             <w:tcW w:w="1985" w:type="dxa"/>
           </w:tcPr>
-          <w:p/>
+          <w:p>
+            <w:r>
+              <w:t>Thống kê theo tháng (mặc định)</w:t>
+            </w:r>
+          </w:p>
         </w:tc>
         <w:tc>
           <w:tcPr>
@@ -23864,6 +24016,7 @@
         <w:tc>
           <w:tcPr>
             <w:tcW w:w="1276" w:type="dxa"/>
+            <w:vMerge/>
           </w:tcPr>
           <w:p/>
         </w:tc>
@@ -23877,19 +24030,32 @@
                 <w:color w:val="FF0000"/>
               </w:rPr>
             </w:pPr>
-          </w:p>
-        </w:tc>
-        <w:tc>
-          <w:tcPr>
-            <w:tcW w:w="1417" w:type="dxa"/>
-          </w:tcPr>
-          <w:p>
-            <w:pPr>
-              <w:rPr>
-                <w:b/>
-                <w:bCs/>
-              </w:rPr>
-            </w:pPr>
+            <w:r>
+              <w:rPr>
+                <w:color w:val="FF0000"/>
+              </w:rPr>
+              <w:t>{{ngrok}}/statistics/landlords/?type=day&amp;from=2020-01-01&amp;to=2025-12-31</w:t>
+            </w:r>
+          </w:p>
+        </w:tc>
+        <w:tc>
+          <w:tcPr>
+            <w:tcW w:w="1417" w:type="dxa"/>
+          </w:tcPr>
+          <w:p>
+            <w:pPr>
+              <w:rPr>
+                <w:b/>
+                <w:bCs/>
+              </w:rPr>
+            </w:pPr>
+            <w:r>
+              <w:rPr>
+                <w:b/>
+                <w:bCs/>
+              </w:rPr>
+              <w:t>GET</w:t>
+            </w:r>
           </w:p>
         </w:tc>
         <w:tc>
@@ -23904,13 +24070,28 @@
                 <w:color w:val="196B24" w:themeColor="accent3"/>
               </w:rPr>
             </w:pPr>
+            <w:r>
+              <w:rPr>
+                <w:b/>
+                <w:bCs/>
+                <w:color w:val="196B24" w:themeColor="accent3"/>
+              </w:rPr>
+              <w:t>OK</w:t>
+            </w:r>
           </w:p>
         </w:tc>
         <w:tc>
           <w:tcPr>
             <w:tcW w:w="1985" w:type="dxa"/>
           </w:tcPr>
-          <w:p/>
+          <w:p>
+            <w:r>
+              <w:t xml:space="preserve">Thống kê theo </w:t>
+            </w:r>
+            <w:r>
+              <w:t>ngày</w:t>
+            </w:r>
+          </w:p>
         </w:tc>
         <w:tc>
           <w:tcPr>
@@ -23931,6 +24112,7 @@
         <w:tc>
           <w:tcPr>
             <w:tcW w:w="1276" w:type="dxa"/>
+            <w:vMerge/>
           </w:tcPr>
           <w:p/>
         </w:tc>
@@ -23944,19 +24126,32 @@
                 <w:color w:val="FF0000"/>
               </w:rPr>
             </w:pPr>
-          </w:p>
-        </w:tc>
-        <w:tc>
-          <w:tcPr>
-            <w:tcW w:w="1417" w:type="dxa"/>
-          </w:tcPr>
-          <w:p>
-            <w:pPr>
-              <w:rPr>
-                <w:b/>
-                <w:bCs/>
-              </w:rPr>
-            </w:pPr>
+            <w:r>
+              <w:rPr>
+                <w:color w:val="FF0000"/>
+              </w:rPr>
+              <w:t>{{ngrok}}/statistics/landlords/?type=quarter&amp;from=2024-01-01&amp;to=2025-12-31</w:t>
+            </w:r>
+          </w:p>
+        </w:tc>
+        <w:tc>
+          <w:tcPr>
+            <w:tcW w:w="1417" w:type="dxa"/>
+          </w:tcPr>
+          <w:p>
+            <w:pPr>
+              <w:rPr>
+                <w:b/>
+                <w:bCs/>
+              </w:rPr>
+            </w:pPr>
+            <w:r>
+              <w:rPr>
+                <w:b/>
+                <w:bCs/>
+              </w:rPr>
+              <w:t>GET</w:t>
+            </w:r>
           </w:p>
         </w:tc>
         <w:tc>
@@ -23971,13 +24166,581 @@
                 <w:color w:val="196B24" w:themeColor="accent3"/>
               </w:rPr>
             </w:pPr>
+            <w:r>
+              <w:rPr>
+                <w:b/>
+                <w:bCs/>
+                <w:color w:val="196B24" w:themeColor="accent3"/>
+              </w:rPr>
+              <w:t>OK</w:t>
+            </w:r>
           </w:p>
         </w:tc>
         <w:tc>
           <w:tcPr>
             <w:tcW w:w="1985" w:type="dxa"/>
           </w:tcPr>
+          <w:p>
+            <w:r>
+              <w:t xml:space="preserve">Thống kê theo </w:t>
+            </w:r>
+            <w:r>
+              <w:t>quý</w:t>
+            </w:r>
+          </w:p>
+        </w:tc>
+        <w:tc>
+          <w:tcPr>
+            <w:tcW w:w="1417" w:type="dxa"/>
+          </w:tcPr>
+          <w:p>
+            <w:pPr>
+              <w:rPr>
+                <w:b/>
+                <w:bCs/>
+                <w:color w:val="196B24" w:themeColor="accent3"/>
+              </w:rPr>
+            </w:pPr>
+          </w:p>
+        </w:tc>
+      </w:tr>
+      <w:tr>
+        <w:tc>
+          <w:tcPr>
+            <w:tcW w:w="1276" w:type="dxa"/>
+            <w:vMerge/>
+          </w:tcPr>
           <w:p/>
+        </w:tc>
+        <w:tc>
+          <w:tcPr>
+            <w:tcW w:w="4395" w:type="dxa"/>
+          </w:tcPr>
+          <w:p>
+            <w:pPr>
+              <w:rPr>
+                <w:color w:val="FF0000"/>
+              </w:rPr>
+            </w:pPr>
+            <w:r>
+              <w:rPr>
+                <w:color w:val="FF0000"/>
+              </w:rPr>
+              <w:t>{{ngrok}}/statistics/landlords/?type=year&amp;from=2023-01-01&amp;to=2025-12-31</w:t>
+            </w:r>
+          </w:p>
+        </w:tc>
+        <w:tc>
+          <w:tcPr>
+            <w:tcW w:w="1417" w:type="dxa"/>
+          </w:tcPr>
+          <w:p>
+            <w:pPr>
+              <w:rPr>
+                <w:b/>
+                <w:bCs/>
+              </w:rPr>
+            </w:pPr>
+            <w:r>
+              <w:rPr>
+                <w:b/>
+                <w:bCs/>
+              </w:rPr>
+              <w:t>GET</w:t>
+            </w:r>
+          </w:p>
+        </w:tc>
+        <w:tc>
+          <w:tcPr>
+            <w:tcW w:w="1134" w:type="dxa"/>
+          </w:tcPr>
+          <w:p>
+            <w:pPr>
+              <w:rPr>
+                <w:b/>
+                <w:bCs/>
+                <w:color w:val="196B24" w:themeColor="accent3"/>
+              </w:rPr>
+            </w:pPr>
+            <w:r>
+              <w:rPr>
+                <w:b/>
+                <w:bCs/>
+                <w:color w:val="196B24" w:themeColor="accent3"/>
+              </w:rPr>
+              <w:t>OK</w:t>
+            </w:r>
+          </w:p>
+        </w:tc>
+        <w:tc>
+          <w:tcPr>
+            <w:tcW w:w="1985" w:type="dxa"/>
+          </w:tcPr>
+          <w:p>
+            <w:r>
+              <w:t xml:space="preserve">Thống kê theo </w:t>
+            </w:r>
+            <w:r>
+              <w:t>năm</w:t>
+            </w:r>
+          </w:p>
+        </w:tc>
+        <w:tc>
+          <w:tcPr>
+            <w:tcW w:w="1417" w:type="dxa"/>
+          </w:tcPr>
+          <w:p>
+            <w:pPr>
+              <w:rPr>
+                <w:b/>
+                <w:bCs/>
+                <w:color w:val="196B24" w:themeColor="accent3"/>
+              </w:rPr>
+            </w:pPr>
+          </w:p>
+        </w:tc>
+      </w:tr>
+      <w:tr>
+        <w:tc>
+          <w:tcPr>
+            <w:tcW w:w="1276" w:type="dxa"/>
+          </w:tcPr>
+          <w:p/>
+        </w:tc>
+        <w:tc>
+          <w:tcPr>
+            <w:tcW w:w="4395" w:type="dxa"/>
+            <w:shd w:val="clear" w:color="auto" w:fill="BFBFBF" w:themeFill="background1" w:themeFillShade="BF"/>
+          </w:tcPr>
+          <w:p>
+            <w:pPr>
+              <w:rPr>
+                <w:color w:val="FF0000"/>
+              </w:rPr>
+            </w:pPr>
+          </w:p>
+        </w:tc>
+        <w:tc>
+          <w:tcPr>
+            <w:tcW w:w="1417" w:type="dxa"/>
+            <w:shd w:val="clear" w:color="auto" w:fill="BFBFBF" w:themeFill="background1" w:themeFillShade="BF"/>
+          </w:tcPr>
+          <w:p>
+            <w:pPr>
+              <w:rPr>
+                <w:b/>
+                <w:bCs/>
+              </w:rPr>
+            </w:pPr>
+          </w:p>
+        </w:tc>
+        <w:tc>
+          <w:tcPr>
+            <w:tcW w:w="1134" w:type="dxa"/>
+            <w:shd w:val="clear" w:color="auto" w:fill="BFBFBF" w:themeFill="background1" w:themeFillShade="BF"/>
+          </w:tcPr>
+          <w:p>
+            <w:pPr>
+              <w:rPr>
+                <w:b/>
+                <w:bCs/>
+                <w:color w:val="196B24" w:themeColor="accent3"/>
+              </w:rPr>
+            </w:pPr>
+          </w:p>
+        </w:tc>
+        <w:tc>
+          <w:tcPr>
+            <w:tcW w:w="1985" w:type="dxa"/>
+            <w:shd w:val="clear" w:color="auto" w:fill="BFBFBF" w:themeFill="background1" w:themeFillShade="BF"/>
+          </w:tcPr>
+          <w:p/>
+        </w:tc>
+        <w:tc>
+          <w:tcPr>
+            <w:tcW w:w="1417" w:type="dxa"/>
+            <w:shd w:val="clear" w:color="auto" w:fill="BFBFBF" w:themeFill="background1" w:themeFillShade="BF"/>
+          </w:tcPr>
+          <w:p>
+            <w:pPr>
+              <w:rPr>
+                <w:b/>
+                <w:bCs/>
+                <w:color w:val="196B24" w:themeColor="accent3"/>
+              </w:rPr>
+            </w:pPr>
+          </w:p>
+        </w:tc>
+      </w:tr>
+      <w:tr>
+        <w:tc>
+          <w:tcPr>
+            <w:tcW w:w="1276" w:type="dxa"/>
+            <w:vMerge w:val="restart"/>
+          </w:tcPr>
+          <w:p>
+            <w:r>
+              <w:t>User, người dùng</w:t>
+            </w:r>
+          </w:p>
+        </w:tc>
+        <w:tc>
+          <w:tcPr>
+            <w:tcW w:w="4395" w:type="dxa"/>
+          </w:tcPr>
+          <w:p>
+            <w:pPr>
+              <w:rPr>
+                <w:color w:val="FF0000"/>
+              </w:rPr>
+            </w:pPr>
+            <w:r>
+              <w:rPr>
+                <w:color w:val="FF0000"/>
+              </w:rPr>
+              <w:t>{{ngrok}}/statistics/users/?type=day&amp;from=2024-01-01&amp;to=2025-12-31</w:t>
+            </w:r>
+          </w:p>
+        </w:tc>
+        <w:tc>
+          <w:tcPr>
+            <w:tcW w:w="1417" w:type="dxa"/>
+          </w:tcPr>
+          <w:p>
+            <w:pPr>
+              <w:rPr>
+                <w:b/>
+                <w:bCs/>
+              </w:rPr>
+            </w:pPr>
+            <w:r>
+              <w:rPr>
+                <w:b/>
+                <w:bCs/>
+              </w:rPr>
+              <w:t>GET</w:t>
+            </w:r>
+          </w:p>
+        </w:tc>
+        <w:tc>
+          <w:tcPr>
+            <w:tcW w:w="1134" w:type="dxa"/>
+          </w:tcPr>
+          <w:p>
+            <w:pPr>
+              <w:rPr>
+                <w:b/>
+                <w:bCs/>
+                <w:color w:val="196B24" w:themeColor="accent3"/>
+              </w:rPr>
+            </w:pPr>
+            <w:r>
+              <w:rPr>
+                <w:b/>
+                <w:bCs/>
+                <w:color w:val="196B24" w:themeColor="accent3"/>
+              </w:rPr>
+              <w:t>OK</w:t>
+            </w:r>
+          </w:p>
+        </w:tc>
+        <w:tc>
+          <w:tcPr>
+            <w:tcW w:w="1985" w:type="dxa"/>
+          </w:tcPr>
+          <w:p>
+            <w:r>
+              <w:t xml:space="preserve">Thống kê theo </w:t>
+            </w:r>
+            <w:r>
+              <w:t>ngày</w:t>
+            </w:r>
+          </w:p>
+        </w:tc>
+        <w:tc>
+          <w:tcPr>
+            <w:tcW w:w="1417" w:type="dxa"/>
+          </w:tcPr>
+          <w:p>
+            <w:pPr>
+              <w:rPr>
+                <w:b/>
+                <w:bCs/>
+                <w:color w:val="196B24" w:themeColor="accent3"/>
+              </w:rPr>
+            </w:pPr>
+          </w:p>
+        </w:tc>
+      </w:tr>
+      <w:tr>
+        <w:tc>
+          <w:tcPr>
+            <w:tcW w:w="1276" w:type="dxa"/>
+            <w:vMerge/>
+          </w:tcPr>
+          <w:p/>
+        </w:tc>
+        <w:tc>
+          <w:tcPr>
+            <w:tcW w:w="4395" w:type="dxa"/>
+          </w:tcPr>
+          <w:p>
+            <w:pPr>
+              <w:rPr>
+                <w:color w:val="FF0000"/>
+              </w:rPr>
+            </w:pPr>
+            <w:r>
+              <w:rPr>
+                <w:color w:val="FF0000"/>
+              </w:rPr>
+              <w:t>{{ngrok}}/statistics/users/?type=month&amp;from=2024-01-01&amp;to=2025-12-31</w:t>
+            </w:r>
+          </w:p>
+        </w:tc>
+        <w:tc>
+          <w:tcPr>
+            <w:tcW w:w="1417" w:type="dxa"/>
+          </w:tcPr>
+          <w:p>
+            <w:pPr>
+              <w:rPr>
+                <w:b/>
+                <w:bCs/>
+              </w:rPr>
+            </w:pPr>
+            <w:r>
+              <w:rPr>
+                <w:b/>
+                <w:bCs/>
+              </w:rPr>
+              <w:t>GET</w:t>
+            </w:r>
+          </w:p>
+        </w:tc>
+        <w:tc>
+          <w:tcPr>
+            <w:tcW w:w="1134" w:type="dxa"/>
+          </w:tcPr>
+          <w:p>
+            <w:pPr>
+              <w:rPr>
+                <w:b/>
+                <w:bCs/>
+                <w:color w:val="196B24" w:themeColor="accent3"/>
+              </w:rPr>
+            </w:pPr>
+            <w:r>
+              <w:rPr>
+                <w:b/>
+                <w:bCs/>
+                <w:color w:val="196B24" w:themeColor="accent3"/>
+              </w:rPr>
+              <w:t>OK</w:t>
+            </w:r>
+          </w:p>
+        </w:tc>
+        <w:tc>
+          <w:tcPr>
+            <w:tcW w:w="1985" w:type="dxa"/>
+          </w:tcPr>
+          <w:p>
+            <w:r>
+              <w:t>Thống kê theo tháng</w:t>
+            </w:r>
+          </w:p>
+        </w:tc>
+        <w:tc>
+          <w:tcPr>
+            <w:tcW w:w="1417" w:type="dxa"/>
+          </w:tcPr>
+          <w:p>
+            <w:pPr>
+              <w:rPr>
+                <w:b/>
+                <w:bCs/>
+                <w:color w:val="196B24" w:themeColor="accent3"/>
+              </w:rPr>
+            </w:pPr>
+          </w:p>
+        </w:tc>
+      </w:tr>
+      <w:tr>
+        <w:tc>
+          <w:tcPr>
+            <w:tcW w:w="1276" w:type="dxa"/>
+            <w:vMerge/>
+          </w:tcPr>
+          <w:p/>
+        </w:tc>
+        <w:tc>
+          <w:tcPr>
+            <w:tcW w:w="4395" w:type="dxa"/>
+          </w:tcPr>
+          <w:p>
+            <w:pPr>
+              <w:rPr>
+                <w:color w:val="FF0000"/>
+              </w:rPr>
+            </w:pPr>
+            <w:r>
+              <w:rPr>
+                <w:color w:val="FF0000"/>
+              </w:rPr>
+              <w:t>{{ngrok}}/statistics/users/?type=quarter&amp;from=2024-01-01&amp;to=2025-12-31</w:t>
+            </w:r>
+          </w:p>
+        </w:tc>
+        <w:tc>
+          <w:tcPr>
+            <w:tcW w:w="1417" w:type="dxa"/>
+          </w:tcPr>
+          <w:p>
+            <w:pPr>
+              <w:rPr>
+                <w:b/>
+                <w:bCs/>
+              </w:rPr>
+            </w:pPr>
+            <w:r>
+              <w:rPr>
+                <w:b/>
+                <w:bCs/>
+              </w:rPr>
+              <w:t>GET</w:t>
+            </w:r>
+          </w:p>
+        </w:tc>
+        <w:tc>
+          <w:tcPr>
+            <w:tcW w:w="1134" w:type="dxa"/>
+          </w:tcPr>
+          <w:p>
+            <w:pPr>
+              <w:rPr>
+                <w:b/>
+                <w:bCs/>
+                <w:color w:val="196B24" w:themeColor="accent3"/>
+              </w:rPr>
+            </w:pPr>
+            <w:r>
+              <w:rPr>
+                <w:b/>
+                <w:bCs/>
+                <w:color w:val="196B24" w:themeColor="accent3"/>
+              </w:rPr>
+              <w:t>OK</w:t>
+            </w:r>
+          </w:p>
+        </w:tc>
+        <w:tc>
+          <w:tcPr>
+            <w:tcW w:w="1985" w:type="dxa"/>
+          </w:tcPr>
+          <w:p>
+            <w:r>
+              <w:t xml:space="preserve">Thống kê theo </w:t>
+            </w:r>
+            <w:r>
+              <w:t>quý</w:t>
+            </w:r>
+          </w:p>
+        </w:tc>
+        <w:tc>
+          <w:tcPr>
+            <w:tcW w:w="1417" w:type="dxa"/>
+          </w:tcPr>
+          <w:p>
+            <w:pPr>
+              <w:rPr>
+                <w:b/>
+                <w:bCs/>
+                <w:color w:val="196B24" w:themeColor="accent3"/>
+              </w:rPr>
+            </w:pPr>
+          </w:p>
+        </w:tc>
+      </w:tr>
+      <w:tr>
+        <w:tc>
+          <w:tcPr>
+            <w:tcW w:w="1276" w:type="dxa"/>
+            <w:vMerge/>
+          </w:tcPr>
+          <w:p/>
+        </w:tc>
+        <w:tc>
+          <w:tcPr>
+            <w:tcW w:w="4395" w:type="dxa"/>
+          </w:tcPr>
+          <w:p>
+            <w:pPr>
+              <w:rPr>
+                <w:color w:val="FF0000"/>
+              </w:rPr>
+            </w:pPr>
+            <w:r>
+              <w:rPr>
+                <w:color w:val="FF0000"/>
+              </w:rPr>
+              <w:t>{{ngrok}}/statistics/users/?type=year&amp;from=2020-01-01&amp;to=2025-12-31</w:t>
+            </w:r>
+          </w:p>
+        </w:tc>
+        <w:tc>
+          <w:tcPr>
+            <w:tcW w:w="1417" w:type="dxa"/>
+          </w:tcPr>
+          <w:p>
+            <w:pPr>
+              <w:rPr>
+                <w:b/>
+                <w:bCs/>
+              </w:rPr>
+            </w:pPr>
+            <w:r>
+              <w:rPr>
+                <w:b/>
+                <w:bCs/>
+              </w:rPr>
+              <w:t>GET</w:t>
+            </w:r>
+          </w:p>
+        </w:tc>
+        <w:tc>
+          <w:tcPr>
+            <w:tcW w:w="1134" w:type="dxa"/>
+          </w:tcPr>
+          <w:p>
+            <w:pPr>
+              <w:rPr>
+                <w:b/>
+                <w:bCs/>
+                <w:color w:val="196B24" w:themeColor="accent3"/>
+              </w:rPr>
+            </w:pPr>
+            <w:r>
+              <w:rPr>
+                <w:b/>
+                <w:bCs/>
+                <w:color w:val="196B24" w:themeColor="accent3"/>
+              </w:rPr>
+              <w:t>OK</w:t>
+            </w:r>
+          </w:p>
+        </w:tc>
+        <w:tc>
+          <w:tcPr>
+            <w:tcW w:w="1985" w:type="dxa"/>
+          </w:tcPr>
+          <w:p>
+            <w:r>
+              <w:t xml:space="preserve">Thống kê theo </w:t>
+            </w:r>
+            <w:r>
+              <w:t>năm</w:t>
+            </w:r>
+          </w:p>
         </w:tc>
         <w:tc>
           <w:tcPr>

</xml_diff>

<commit_message>
cập nhập hình ảnh khi post
</commit_message>
<xml_diff>
--- a/Hỗ trợ tìm kiếm nhà trọ.docx
+++ b/Hỗ trợ tìm kiếm nhà trọ.docx
@@ -15233,60 +15233,58 @@
         <w:tc>
           <w:tcPr>
             <w:tcW w:w="1276" w:type="dxa"/>
-            <w:vMerge w:val="restart"/>
-          </w:tcPr>
-          <w:p>
-            <w:r>
-              <w:t>Comment</w:t>
-            </w:r>
-          </w:p>
-          <w:p>
-            <w:r>
-              <w:t>8</w:t>
+            <w:shd w:val="clear" w:color="auto" w:fill="FFFFFF" w:themeFill="background1"/>
+          </w:tcPr>
+          <w:p>
+            <w:r>
+              <w:t>Post Images</w:t>
             </w:r>
           </w:p>
         </w:tc>
         <w:tc>
           <w:tcPr>
             <w:tcW w:w="4395" w:type="dxa"/>
-          </w:tcPr>
-          <w:p>
-            <w:pPr>
-              <w:rPr>
-                <w:color w:val="FF0000"/>
-              </w:rPr>
-            </w:pPr>
-            <w:r>
-              <w:rPr>
-                <w:color w:val="FF0000"/>
-              </w:rPr>
-              <w:t>http://127.0.0.1:8000/comments/</w:t>
+            <w:shd w:val="clear" w:color="auto" w:fill="FFFFFF" w:themeFill="background1"/>
+          </w:tcPr>
+          <w:p>
+            <w:pPr>
+              <w:rPr>
+                <w:color w:val="EE0000"/>
+              </w:rPr>
+            </w:pPr>
+            <w:r>
+              <w:rPr>
+                <w:color w:val="EE0000"/>
+              </w:rPr>
+              <w:t>{{local}}/posts/</w:t>
             </w:r>
           </w:p>
         </w:tc>
         <w:tc>
           <w:tcPr>
             <w:tcW w:w="1417" w:type="dxa"/>
-          </w:tcPr>
-          <w:p>
-            <w:pPr>
-              <w:rPr>
-                <w:b/>
-                <w:bCs/>
-              </w:rPr>
-            </w:pPr>
-            <w:r>
-              <w:rPr>
-                <w:b/>
-                <w:bCs/>
-              </w:rPr>
-              <w:t>GET</w:t>
+            <w:shd w:val="clear" w:color="auto" w:fill="FFFFFF" w:themeFill="background1"/>
+          </w:tcPr>
+          <w:p>
+            <w:pPr>
+              <w:rPr>
+                <w:b/>
+                <w:bCs/>
+              </w:rPr>
+            </w:pPr>
+            <w:r>
+              <w:rPr>
+                <w:b/>
+                <w:bCs/>
+              </w:rPr>
+              <w:t>POST</w:t>
             </w:r>
           </w:p>
         </w:tc>
         <w:tc>
           <w:tcPr>
             <w:tcW w:w="1134" w:type="dxa"/>
+            <w:shd w:val="clear" w:color="auto" w:fill="FFFFFF" w:themeFill="background1"/>
           </w:tcPr>
           <w:p>
             <w:pPr>
@@ -15309,19 +15307,18 @@
         <w:tc>
           <w:tcPr>
             <w:tcW w:w="1985" w:type="dxa"/>
-          </w:tcPr>
-          <w:p>
-            <w:r>
-              <w:t>Lấy tất cả bình luận.</w:t>
-            </w:r>
-            <w:r>
-              <w:t>(không cần xác thực)</w:t>
+            <w:shd w:val="clear" w:color="auto" w:fill="FFFFFF" w:themeFill="background1"/>
+          </w:tcPr>
+          <w:p>
+            <w:r>
+              <w:t>Tạo bài đăng mới với hình ảnh</w:t>
             </w:r>
           </w:p>
         </w:tc>
         <w:tc>
           <w:tcPr>
             <w:tcW w:w="1417" w:type="dxa"/>
+            <w:shd w:val="clear" w:color="auto" w:fill="FFFFFF" w:themeFill="background1"/>
           </w:tcPr>
           <w:p>
             <w:pPr>
@@ -15338,51 +15335,54 @@
         <w:tc>
           <w:tcPr>
             <w:tcW w:w="1276" w:type="dxa"/>
-            <w:vMerge/>
+            <w:shd w:val="clear" w:color="auto" w:fill="FFFFFF" w:themeFill="background1"/>
           </w:tcPr>
           <w:p/>
         </w:tc>
         <w:tc>
           <w:tcPr>
             <w:tcW w:w="4395" w:type="dxa"/>
-          </w:tcPr>
-          <w:p>
-            <w:pPr>
-              <w:rPr>
-                <w:color w:val="FF0000"/>
-              </w:rPr>
-            </w:pPr>
-            <w:r>
-              <w:rPr>
-                <w:color w:val="FF0000"/>
-              </w:rPr>
-              <w:t>http://127.0.0.1:8000/comments/9/</w:t>
+            <w:shd w:val="clear" w:color="auto" w:fill="FFFFFF" w:themeFill="background1"/>
+          </w:tcPr>
+          <w:p>
+            <w:pPr>
+              <w:rPr>
+                <w:color w:val="EE0000"/>
+              </w:rPr>
+            </w:pPr>
+            <w:r>
+              <w:rPr>
+                <w:color w:val="EE0000"/>
+              </w:rPr>
+              <w:t>{{local}}/posts/0a30b228-cbe5-4a87-bf12-a88941df6d77/</w:t>
             </w:r>
           </w:p>
         </w:tc>
         <w:tc>
           <w:tcPr>
             <w:tcW w:w="1417" w:type="dxa"/>
-          </w:tcPr>
-          <w:p>
-            <w:pPr>
-              <w:rPr>
-                <w:b/>
-                <w:bCs/>
-              </w:rPr>
-            </w:pPr>
-            <w:r>
-              <w:rPr>
-                <w:b/>
-                <w:bCs/>
-              </w:rPr>
-              <w:t>PATCH</w:t>
+            <w:shd w:val="clear" w:color="auto" w:fill="FFFFFF" w:themeFill="background1"/>
+          </w:tcPr>
+          <w:p>
+            <w:pPr>
+              <w:rPr>
+                <w:b/>
+                <w:bCs/>
+              </w:rPr>
+            </w:pPr>
+            <w:r>
+              <w:rPr>
+                <w:b/>
+                <w:bCs/>
+              </w:rPr>
+              <w:t>PUT/PATCH</w:t>
             </w:r>
           </w:p>
         </w:tc>
         <w:tc>
           <w:tcPr>
             <w:tcW w:w="1134" w:type="dxa"/>
+            <w:shd w:val="clear" w:color="auto" w:fill="FFFFFF" w:themeFill="background1"/>
           </w:tcPr>
           <w:p>
             <w:pPr>
@@ -15405,16 +15405,18 @@
         <w:tc>
           <w:tcPr>
             <w:tcW w:w="1985" w:type="dxa"/>
-          </w:tcPr>
-          <w:p>
-            <w:r>
-              <w:t>Cập nhật một phần nội dung bình luận</w:t>
+            <w:shd w:val="clear" w:color="auto" w:fill="FFFFFF" w:themeFill="background1"/>
+          </w:tcPr>
+          <w:p>
+            <w:r>
+              <w:t>Cập nhật bài đăng và hình ảnh</w:t>
             </w:r>
           </w:p>
         </w:tc>
         <w:tc>
           <w:tcPr>
             <w:tcW w:w="1417" w:type="dxa"/>
+            <w:shd w:val="clear" w:color="auto" w:fill="FFFFFF" w:themeFill="background1"/>
           </w:tcPr>
           <w:p>
             <w:pPr>
@@ -15431,31 +15433,40 @@
         <w:tc>
           <w:tcPr>
             <w:tcW w:w="1276" w:type="dxa"/>
-            <w:vMerge/>
+            <w:shd w:val="clear" w:color="auto" w:fill="FFFFFF" w:themeFill="background1"/>
           </w:tcPr>
           <w:p/>
         </w:tc>
         <w:tc>
           <w:tcPr>
             <w:tcW w:w="4395" w:type="dxa"/>
-          </w:tcPr>
-          <w:p>
-            <w:pPr>
-              <w:rPr>
-                <w:color w:val="FF0000"/>
-              </w:rPr>
-            </w:pPr>
-            <w:r>
-              <w:rPr>
-                <w:color w:val="FF0000"/>
-              </w:rPr>
-              <w:t>http://127.0.0.1:8000/comments/9/</w:t>
+            <w:shd w:val="clear" w:color="auto" w:fill="FFFFFF" w:themeFill="background1"/>
+          </w:tcPr>
+          <w:p>
+            <w:r>
+              <w:rPr>
+                <w:color w:val="EE0000"/>
+              </w:rPr>
+              <w:t>{{local}}/posts/0a30b228-cbe5-4a87-bf12-a88941df6d77/images/</w:t>
+            </w:r>
+            <w:r>
+              <w:rPr>
+                <w:color w:val="EE0000"/>
+              </w:rPr>
+              <w:t>17</w:t>
+            </w:r>
+            <w:r>
+              <w:rPr>
+                <w:color w:val="EE0000"/>
+              </w:rPr>
+              <w:t>/</w:t>
             </w:r>
           </w:p>
         </w:tc>
         <w:tc>
           <w:tcPr>
             <w:tcW w:w="1417" w:type="dxa"/>
+            <w:shd w:val="clear" w:color="auto" w:fill="FFFFFF" w:themeFill="background1"/>
           </w:tcPr>
           <w:p>
             <w:pPr>
@@ -15476,6 +15487,7 @@
         <w:tc>
           <w:tcPr>
             <w:tcW w:w="1134" w:type="dxa"/>
+            <w:shd w:val="clear" w:color="auto" w:fill="FFFFFF" w:themeFill="background1"/>
           </w:tcPr>
           <w:p>
             <w:pPr>
@@ -15498,19 +15510,18 @@
         <w:tc>
           <w:tcPr>
             <w:tcW w:w="1985" w:type="dxa"/>
-          </w:tcPr>
-          <w:p>
-            <w:r>
-              <w:t>Xóa bình luận theo</w:t>
-            </w:r>
-            <w:r>
-              <w:t xml:space="preserve"> id</w:t>
+            <w:shd w:val="clear" w:color="auto" w:fill="FFFFFF" w:themeFill="background1"/>
+          </w:tcPr>
+          <w:p>
+            <w:r>
+              <w:t>Xóa một hình ảnh cụ thể của bài đăng</w:t>
             </w:r>
           </w:p>
         </w:tc>
         <w:tc>
           <w:tcPr>
             <w:tcW w:w="1417" w:type="dxa"/>
+            <w:shd w:val="clear" w:color="auto" w:fill="FFFFFF" w:themeFill="background1"/>
           </w:tcPr>
           <w:p>
             <w:pPr>
@@ -15527,6 +15538,628 @@
         <w:tc>
           <w:tcPr>
             <w:tcW w:w="1276" w:type="dxa"/>
+            <w:shd w:val="clear" w:color="auto" w:fill="FFFFFF" w:themeFill="background1"/>
+          </w:tcPr>
+          <w:p/>
+        </w:tc>
+        <w:tc>
+          <w:tcPr>
+            <w:tcW w:w="4395" w:type="dxa"/>
+            <w:shd w:val="clear" w:color="auto" w:fill="FFFFFF" w:themeFill="background1"/>
+          </w:tcPr>
+          <w:p>
+            <w:pPr>
+              <w:rPr>
+                <w:color w:val="EE0000"/>
+              </w:rPr>
+            </w:pPr>
+            <w:r>
+              <w:rPr>
+                <w:color w:val="EE0000"/>
+              </w:rPr>
+              <w:t>{{local}}/posts/</w:t>
+            </w:r>
+          </w:p>
+        </w:tc>
+        <w:tc>
+          <w:tcPr>
+            <w:tcW w:w="1417" w:type="dxa"/>
+            <w:shd w:val="clear" w:color="auto" w:fill="FFFFFF" w:themeFill="background1"/>
+          </w:tcPr>
+          <w:p>
+            <w:pPr>
+              <w:rPr>
+                <w:b/>
+                <w:bCs/>
+              </w:rPr>
+            </w:pPr>
+            <w:r>
+              <w:rPr>
+                <w:b/>
+                <w:bCs/>
+              </w:rPr>
+              <w:t>GET</w:t>
+            </w:r>
+          </w:p>
+        </w:tc>
+        <w:tc>
+          <w:tcPr>
+            <w:tcW w:w="1134" w:type="dxa"/>
+            <w:shd w:val="clear" w:color="auto" w:fill="FFFFFF" w:themeFill="background1"/>
+          </w:tcPr>
+          <w:p>
+            <w:pPr>
+              <w:rPr>
+                <w:b/>
+                <w:bCs/>
+                <w:color w:val="196B24" w:themeColor="accent3"/>
+              </w:rPr>
+            </w:pPr>
+            <w:r>
+              <w:rPr>
+                <w:b/>
+                <w:bCs/>
+                <w:color w:val="196B24" w:themeColor="accent3"/>
+              </w:rPr>
+              <w:t>OK</w:t>
+            </w:r>
+          </w:p>
+        </w:tc>
+        <w:tc>
+          <w:tcPr>
+            <w:tcW w:w="1985" w:type="dxa"/>
+            <w:shd w:val="clear" w:color="auto" w:fill="FFFFFF" w:themeFill="background1"/>
+          </w:tcPr>
+          <w:p>
+            <w:r>
+              <w:t>Lấy danh sách bài đăng</w:t>
+            </w:r>
+          </w:p>
+        </w:tc>
+        <w:tc>
+          <w:tcPr>
+            <w:tcW w:w="1417" w:type="dxa"/>
+            <w:shd w:val="clear" w:color="auto" w:fill="FFFFFF" w:themeFill="background1"/>
+          </w:tcPr>
+          <w:p>
+            <w:pPr>
+              <w:rPr>
+                <w:b/>
+                <w:bCs/>
+                <w:color w:val="196B24" w:themeColor="accent3"/>
+              </w:rPr>
+            </w:pPr>
+          </w:p>
+        </w:tc>
+      </w:tr>
+      <w:tr>
+        <w:tc>
+          <w:tcPr>
+            <w:tcW w:w="1276" w:type="dxa"/>
+            <w:shd w:val="clear" w:color="auto" w:fill="FFFFFF" w:themeFill="background1"/>
+          </w:tcPr>
+          <w:p/>
+        </w:tc>
+        <w:tc>
+          <w:tcPr>
+            <w:tcW w:w="4395" w:type="dxa"/>
+            <w:shd w:val="clear" w:color="auto" w:fill="FFFFFF" w:themeFill="background1"/>
+          </w:tcPr>
+          <w:p>
+            <w:r>
+              <w:rPr>
+                <w:color w:val="EE0000"/>
+              </w:rPr>
+              <w:t>{{local}}/posts/0a30b228cbe54a87bf12a88941df6d77</w:t>
+            </w:r>
+            <w:r>
+              <w:t>/</w:t>
+            </w:r>
+          </w:p>
+        </w:tc>
+        <w:tc>
+          <w:tcPr>
+            <w:tcW w:w="1417" w:type="dxa"/>
+            <w:shd w:val="clear" w:color="auto" w:fill="FFFFFF" w:themeFill="background1"/>
+          </w:tcPr>
+          <w:p>
+            <w:pPr>
+              <w:rPr>
+                <w:b/>
+                <w:bCs/>
+              </w:rPr>
+            </w:pPr>
+            <w:r>
+              <w:rPr>
+                <w:b/>
+                <w:bCs/>
+              </w:rPr>
+              <w:t>GET</w:t>
+            </w:r>
+          </w:p>
+        </w:tc>
+        <w:tc>
+          <w:tcPr>
+            <w:tcW w:w="1134" w:type="dxa"/>
+            <w:shd w:val="clear" w:color="auto" w:fill="FFFFFF" w:themeFill="background1"/>
+          </w:tcPr>
+          <w:p>
+            <w:pPr>
+              <w:rPr>
+                <w:b/>
+                <w:bCs/>
+                <w:color w:val="196B24" w:themeColor="accent3"/>
+              </w:rPr>
+            </w:pPr>
+            <w:r>
+              <w:rPr>
+                <w:b/>
+                <w:bCs/>
+                <w:color w:val="196B24" w:themeColor="accent3"/>
+              </w:rPr>
+              <w:t>OK</w:t>
+            </w:r>
+          </w:p>
+        </w:tc>
+        <w:tc>
+          <w:tcPr>
+            <w:tcW w:w="1985" w:type="dxa"/>
+            <w:shd w:val="clear" w:color="auto" w:fill="FFFFFF" w:themeFill="background1"/>
+          </w:tcPr>
+          <w:p>
+            <w:r>
+              <w:t>Lấy chi tiết một bài đăng</w:t>
+            </w:r>
+          </w:p>
+        </w:tc>
+        <w:tc>
+          <w:tcPr>
+            <w:tcW w:w="1417" w:type="dxa"/>
+            <w:shd w:val="clear" w:color="auto" w:fill="FFFFFF" w:themeFill="background1"/>
+          </w:tcPr>
+          <w:p>
+            <w:pPr>
+              <w:rPr>
+                <w:b/>
+                <w:bCs/>
+                <w:color w:val="196B24" w:themeColor="accent3"/>
+              </w:rPr>
+            </w:pPr>
+          </w:p>
+        </w:tc>
+      </w:tr>
+      <w:tr>
+        <w:tc>
+          <w:tcPr>
+            <w:tcW w:w="1276" w:type="dxa"/>
+            <w:shd w:val="clear" w:color="auto" w:fill="FFFFFF" w:themeFill="background1"/>
+          </w:tcPr>
+          <w:p/>
+        </w:tc>
+        <w:tc>
+          <w:tcPr>
+            <w:tcW w:w="4395" w:type="dxa"/>
+            <w:shd w:val="clear" w:color="auto" w:fill="FFFFFF" w:themeFill="background1"/>
+          </w:tcPr>
+          <w:p/>
+        </w:tc>
+        <w:tc>
+          <w:tcPr>
+            <w:tcW w:w="1417" w:type="dxa"/>
+            <w:shd w:val="clear" w:color="auto" w:fill="FFFFFF" w:themeFill="background1"/>
+          </w:tcPr>
+          <w:p>
+            <w:pPr>
+              <w:rPr>
+                <w:b/>
+                <w:bCs/>
+              </w:rPr>
+            </w:pPr>
+          </w:p>
+        </w:tc>
+        <w:tc>
+          <w:tcPr>
+            <w:tcW w:w="1134" w:type="dxa"/>
+            <w:shd w:val="clear" w:color="auto" w:fill="FFFFFF" w:themeFill="background1"/>
+          </w:tcPr>
+          <w:p>
+            <w:pPr>
+              <w:rPr>
+                <w:b/>
+                <w:bCs/>
+                <w:color w:val="196B24" w:themeColor="accent3"/>
+              </w:rPr>
+            </w:pPr>
+          </w:p>
+        </w:tc>
+        <w:tc>
+          <w:tcPr>
+            <w:tcW w:w="1985" w:type="dxa"/>
+            <w:shd w:val="clear" w:color="auto" w:fill="FFFFFF" w:themeFill="background1"/>
+          </w:tcPr>
+          <w:p/>
+        </w:tc>
+        <w:tc>
+          <w:tcPr>
+            <w:tcW w:w="1417" w:type="dxa"/>
+            <w:shd w:val="clear" w:color="auto" w:fill="FFFFFF" w:themeFill="background1"/>
+          </w:tcPr>
+          <w:p>
+            <w:pPr>
+              <w:rPr>
+                <w:b/>
+                <w:bCs/>
+                <w:color w:val="196B24" w:themeColor="accent3"/>
+              </w:rPr>
+            </w:pPr>
+          </w:p>
+        </w:tc>
+      </w:tr>
+      <w:tr>
+        <w:tc>
+          <w:tcPr>
+            <w:tcW w:w="1276" w:type="dxa"/>
+            <w:shd w:val="clear" w:color="auto" w:fill="D9D9D9" w:themeFill="background1" w:themeFillShade="D9"/>
+          </w:tcPr>
+          <w:p/>
+        </w:tc>
+        <w:tc>
+          <w:tcPr>
+            <w:tcW w:w="4395" w:type="dxa"/>
+            <w:shd w:val="clear" w:color="auto" w:fill="D9D9D9" w:themeFill="background1" w:themeFillShade="D9"/>
+          </w:tcPr>
+          <w:p/>
+        </w:tc>
+        <w:tc>
+          <w:tcPr>
+            <w:tcW w:w="1417" w:type="dxa"/>
+            <w:shd w:val="clear" w:color="auto" w:fill="D9D9D9" w:themeFill="background1" w:themeFillShade="D9"/>
+          </w:tcPr>
+          <w:p>
+            <w:pPr>
+              <w:rPr>
+                <w:b/>
+                <w:bCs/>
+              </w:rPr>
+            </w:pPr>
+          </w:p>
+        </w:tc>
+        <w:tc>
+          <w:tcPr>
+            <w:tcW w:w="1134" w:type="dxa"/>
+            <w:shd w:val="clear" w:color="auto" w:fill="D9D9D9" w:themeFill="background1" w:themeFillShade="D9"/>
+          </w:tcPr>
+          <w:p>
+            <w:pPr>
+              <w:rPr>
+                <w:b/>
+                <w:bCs/>
+                <w:color w:val="196B24" w:themeColor="accent3"/>
+              </w:rPr>
+            </w:pPr>
+          </w:p>
+        </w:tc>
+        <w:tc>
+          <w:tcPr>
+            <w:tcW w:w="1985" w:type="dxa"/>
+            <w:shd w:val="clear" w:color="auto" w:fill="D9D9D9" w:themeFill="background1" w:themeFillShade="D9"/>
+          </w:tcPr>
+          <w:p/>
+        </w:tc>
+        <w:tc>
+          <w:tcPr>
+            <w:tcW w:w="1417" w:type="dxa"/>
+            <w:shd w:val="clear" w:color="auto" w:fill="D9D9D9" w:themeFill="background1" w:themeFillShade="D9"/>
+          </w:tcPr>
+          <w:p>
+            <w:pPr>
+              <w:rPr>
+                <w:b/>
+                <w:bCs/>
+                <w:color w:val="196B24" w:themeColor="accent3"/>
+              </w:rPr>
+            </w:pPr>
+          </w:p>
+        </w:tc>
+      </w:tr>
+      <w:tr>
+        <w:tc>
+          <w:tcPr>
+            <w:tcW w:w="1276" w:type="dxa"/>
+            <w:vMerge w:val="restart"/>
+          </w:tcPr>
+          <w:p>
+            <w:r>
+              <w:t>Comment</w:t>
+            </w:r>
+          </w:p>
+          <w:p>
+            <w:r>
+              <w:t>8</w:t>
+            </w:r>
+          </w:p>
+        </w:tc>
+        <w:tc>
+          <w:tcPr>
+            <w:tcW w:w="4395" w:type="dxa"/>
+          </w:tcPr>
+          <w:p>
+            <w:pPr>
+              <w:rPr>
+                <w:color w:val="FF0000"/>
+              </w:rPr>
+            </w:pPr>
+            <w:r>
+              <w:rPr>
+                <w:color w:val="FF0000"/>
+              </w:rPr>
+              <w:t>http://127.0.0.1:8000/comments/</w:t>
+            </w:r>
+          </w:p>
+        </w:tc>
+        <w:tc>
+          <w:tcPr>
+            <w:tcW w:w="1417" w:type="dxa"/>
+          </w:tcPr>
+          <w:p>
+            <w:pPr>
+              <w:rPr>
+                <w:b/>
+                <w:bCs/>
+              </w:rPr>
+            </w:pPr>
+            <w:r>
+              <w:rPr>
+                <w:b/>
+                <w:bCs/>
+              </w:rPr>
+              <w:t>GET</w:t>
+            </w:r>
+          </w:p>
+        </w:tc>
+        <w:tc>
+          <w:tcPr>
+            <w:tcW w:w="1134" w:type="dxa"/>
+          </w:tcPr>
+          <w:p>
+            <w:pPr>
+              <w:rPr>
+                <w:b/>
+                <w:bCs/>
+                <w:color w:val="196B24" w:themeColor="accent3"/>
+              </w:rPr>
+            </w:pPr>
+            <w:r>
+              <w:rPr>
+                <w:b/>
+                <w:bCs/>
+                <w:color w:val="196B24" w:themeColor="accent3"/>
+              </w:rPr>
+              <w:t>OK</w:t>
+            </w:r>
+          </w:p>
+        </w:tc>
+        <w:tc>
+          <w:tcPr>
+            <w:tcW w:w="1985" w:type="dxa"/>
+          </w:tcPr>
+          <w:p>
+            <w:r>
+              <w:t>Lấy tất cả bình luận.</w:t>
+            </w:r>
+            <w:r>
+              <w:t>(không cần xác thực)</w:t>
+            </w:r>
+          </w:p>
+        </w:tc>
+        <w:tc>
+          <w:tcPr>
+            <w:tcW w:w="1417" w:type="dxa"/>
+          </w:tcPr>
+          <w:p>
+            <w:pPr>
+              <w:rPr>
+                <w:b/>
+                <w:bCs/>
+                <w:color w:val="196B24" w:themeColor="accent3"/>
+              </w:rPr>
+            </w:pPr>
+          </w:p>
+        </w:tc>
+      </w:tr>
+      <w:tr>
+        <w:tc>
+          <w:tcPr>
+            <w:tcW w:w="1276" w:type="dxa"/>
+            <w:vMerge/>
+          </w:tcPr>
+          <w:p/>
+        </w:tc>
+        <w:tc>
+          <w:tcPr>
+            <w:tcW w:w="4395" w:type="dxa"/>
+          </w:tcPr>
+          <w:p>
+            <w:pPr>
+              <w:rPr>
+                <w:color w:val="FF0000"/>
+              </w:rPr>
+            </w:pPr>
+            <w:r>
+              <w:rPr>
+                <w:color w:val="FF0000"/>
+              </w:rPr>
+              <w:t>http://127.0.0.1:8000/comments/9/</w:t>
+            </w:r>
+          </w:p>
+        </w:tc>
+        <w:tc>
+          <w:tcPr>
+            <w:tcW w:w="1417" w:type="dxa"/>
+          </w:tcPr>
+          <w:p>
+            <w:pPr>
+              <w:rPr>
+                <w:b/>
+                <w:bCs/>
+              </w:rPr>
+            </w:pPr>
+            <w:r>
+              <w:rPr>
+                <w:b/>
+                <w:bCs/>
+              </w:rPr>
+              <w:t>PATCH</w:t>
+            </w:r>
+          </w:p>
+        </w:tc>
+        <w:tc>
+          <w:tcPr>
+            <w:tcW w:w="1134" w:type="dxa"/>
+          </w:tcPr>
+          <w:p>
+            <w:pPr>
+              <w:rPr>
+                <w:b/>
+                <w:bCs/>
+                <w:color w:val="196B24" w:themeColor="accent3"/>
+              </w:rPr>
+            </w:pPr>
+            <w:r>
+              <w:rPr>
+                <w:b/>
+                <w:bCs/>
+                <w:color w:val="196B24" w:themeColor="accent3"/>
+              </w:rPr>
+              <w:t>OK</w:t>
+            </w:r>
+          </w:p>
+        </w:tc>
+        <w:tc>
+          <w:tcPr>
+            <w:tcW w:w="1985" w:type="dxa"/>
+          </w:tcPr>
+          <w:p>
+            <w:r>
+              <w:t>Cập nhật một phần nội dung bình luận</w:t>
+            </w:r>
+          </w:p>
+        </w:tc>
+        <w:tc>
+          <w:tcPr>
+            <w:tcW w:w="1417" w:type="dxa"/>
+          </w:tcPr>
+          <w:p>
+            <w:pPr>
+              <w:rPr>
+                <w:b/>
+                <w:bCs/>
+                <w:color w:val="196B24" w:themeColor="accent3"/>
+              </w:rPr>
+            </w:pPr>
+          </w:p>
+        </w:tc>
+      </w:tr>
+      <w:tr>
+        <w:tc>
+          <w:tcPr>
+            <w:tcW w:w="1276" w:type="dxa"/>
+            <w:vMerge/>
+          </w:tcPr>
+          <w:p/>
+        </w:tc>
+        <w:tc>
+          <w:tcPr>
+            <w:tcW w:w="4395" w:type="dxa"/>
+          </w:tcPr>
+          <w:p>
+            <w:pPr>
+              <w:rPr>
+                <w:color w:val="FF0000"/>
+              </w:rPr>
+            </w:pPr>
+            <w:r>
+              <w:rPr>
+                <w:color w:val="FF0000"/>
+              </w:rPr>
+              <w:t>http://127.0.0.1:8000/comments/9/</w:t>
+            </w:r>
+          </w:p>
+        </w:tc>
+        <w:tc>
+          <w:tcPr>
+            <w:tcW w:w="1417" w:type="dxa"/>
+          </w:tcPr>
+          <w:p>
+            <w:pPr>
+              <w:rPr>
+                <w:b/>
+                <w:bCs/>
+              </w:rPr>
+            </w:pPr>
+            <w:r>
+              <w:rPr>
+                <w:b/>
+                <w:bCs/>
+              </w:rPr>
+              <w:t>DELETE</w:t>
+            </w:r>
+          </w:p>
+        </w:tc>
+        <w:tc>
+          <w:tcPr>
+            <w:tcW w:w="1134" w:type="dxa"/>
+          </w:tcPr>
+          <w:p>
+            <w:pPr>
+              <w:rPr>
+                <w:b/>
+                <w:bCs/>
+                <w:color w:val="196B24" w:themeColor="accent3"/>
+              </w:rPr>
+            </w:pPr>
+            <w:r>
+              <w:rPr>
+                <w:b/>
+                <w:bCs/>
+                <w:color w:val="196B24" w:themeColor="accent3"/>
+              </w:rPr>
+              <w:t>OK</w:t>
+            </w:r>
+          </w:p>
+        </w:tc>
+        <w:tc>
+          <w:tcPr>
+            <w:tcW w:w="1985" w:type="dxa"/>
+          </w:tcPr>
+          <w:p>
+            <w:r>
+              <w:t>Xóa bình luận theo</w:t>
+            </w:r>
+            <w:r>
+              <w:t xml:space="preserve"> id</w:t>
+            </w:r>
+          </w:p>
+        </w:tc>
+        <w:tc>
+          <w:tcPr>
+            <w:tcW w:w="1417" w:type="dxa"/>
+          </w:tcPr>
+          <w:p>
+            <w:pPr>
+              <w:rPr>
+                <w:b/>
+                <w:bCs/>
+                <w:color w:val="196B24" w:themeColor="accent3"/>
+              </w:rPr>
+            </w:pPr>
+          </w:p>
+        </w:tc>
+      </w:tr>
+      <w:tr>
+        <w:tc>
+          <w:tcPr>
+            <w:tcW w:w="1276" w:type="dxa"/>
             <w:vMerge/>
           </w:tcPr>
           <w:p/>
@@ -15703,7 +16336,11 @@
               <w:t xml:space="preserve"> - </w:t>
             </w:r>
             <w:r>
-              <w:t>tạo bình luận mới có liên kết tới bình luận cha.</w:t>
+              <w:t xml:space="preserve">tạo bình luận mới </w:t>
+            </w:r>
+            <w:r>
+              <w:lastRenderedPageBreak/>
+              <w:t>có liên kết tới bình luận cha.</w:t>
             </w:r>
           </w:p>
         </w:tc>
@@ -17844,7 +18481,11 @@
           </w:tcPr>
           <w:p>
             <w:r>
-              <w:t>Cập nhật một phần thông tin của bản ghi lịch sử tìm kiếm theo id.</w:t>
+              <w:t xml:space="preserve">Cập nhật một phần thông tin của </w:t>
+            </w:r>
+            <w:r>
+              <w:lastRenderedPageBreak/>
+              <w:t>bản ghi lịch sử tìm kiếm theo id.</w:t>
             </w:r>
           </w:p>
         </w:tc>
@@ -18037,10 +18678,7 @@
           </w:tcPr>
           <w:p>
             <w:r>
-              <w:t>N</w:t>
-            </w:r>
-            <w:r>
-              <w:t>otifications</w:t>
+              <w:t>Notifications</w:t>
             </w:r>
           </w:p>
           <w:p>
@@ -19473,14 +20111,7 @@
                 <w:b/>
                 <w:bCs/>
               </w:rPr>
-              <w:t xml:space="preserve">PUT | </w:t>
-            </w:r>
-            <w:r>
-              <w:rPr>
-                <w:b/>
-                <w:bCs/>
-              </w:rPr>
-              <w:t>PATCH</w:t>
+              <w:t>PUT | PATCH</w:t>
             </w:r>
           </w:p>
         </w:tc>
@@ -20021,14 +20652,7 @@
                 <w:b/>
                 <w:bCs/>
               </w:rPr>
-              <w:t>PUT</w:t>
-            </w:r>
-            <w:r>
-              <w:rPr>
-                <w:b/>
-                <w:bCs/>
-              </w:rPr>
-              <w:t xml:space="preserve"> | PATCH</w:t>
+              <w:t>PUT | PATCH</w:t>
             </w:r>
           </w:p>
         </w:tc>
@@ -22374,7 +22998,6 @@
           </w:p>
           <w:p>
             <w:r>
-              <w:lastRenderedPageBreak/>
               <w:t>18</w:t>
             </w:r>
           </w:p>
@@ -22393,7 +23016,6 @@
               <w:rPr>
                 <w:color w:val="FF0000"/>
               </w:rPr>
-              <w:lastRenderedPageBreak/>
               <w:t>{{ngrok}}/motel-images/</w:t>
             </w:r>
           </w:p>
@@ -23923,6 +24545,7 @@
           </w:tcPr>
           <w:p>
             <w:r>
+              <w:lastRenderedPageBreak/>
               <w:t>landlord</w:t>
             </w:r>
           </w:p>
@@ -25053,6 +25676,7 @@
               <w:rPr>
                 <w:lang w:val="vi-VN"/>
               </w:rPr>
+              <w:lastRenderedPageBreak/>
               <w:t>                &lt;a href="/accounts/signup/"&gt;Sign Up&lt;/a&gt;</w:t>
             </w:r>
           </w:p>
@@ -25153,7 +25777,6 @@
         <w:rPr>
           <w:lang w:val="vi-VN"/>
         </w:rPr>
-        <w:lastRenderedPageBreak/>
         <w:t>Dễ triển khai</w:t>
       </w:r>
     </w:p>
@@ -25506,6 +26129,7 @@
         <w:rPr>
           <w:lang w:val="vi-VN"/>
         </w:rPr>
+        <w:lastRenderedPageBreak/>
         <w:t>Có thể scale</w:t>
       </w:r>
     </w:p>
@@ -25665,7 +26289,6 @@
         <w:rPr>
           <w:lang w:val="vi-VN"/>
         </w:rPr>
-        <w:lastRenderedPageBreak/>
         <w:t>Tùy biến cao</w:t>
       </w:r>
     </w:p>
@@ -25969,6 +26592,7 @@
         <w:rPr>
           <w:lang w:val="vi-VN"/>
         </w:rPr>
+        <w:lastRenderedPageBreak/>
         <w:t>);</w:t>
       </w:r>
     </w:p>
@@ -26074,7 +26698,6 @@
         <w:rPr>
           <w:lang w:val="vi-VN"/>
         </w:rPr>
-        <w:lastRenderedPageBreak/>
         <w:t>    console.error('Chat socket closed unexpectedly');</w:t>
       </w:r>
     </w:p>

</xml_diff>

<commit_message>
cập nhập thêm api
</commit_message>
<xml_diff>
--- a/Hỗ trợ tìm kiếm nhà trọ.docx
+++ b/Hỗ trợ tìm kiếm nhà trọ.docx
@@ -15447,19 +15447,7 @@
               <w:rPr>
                 <w:color w:val="EE0000"/>
               </w:rPr>
-              <w:t>{{local}}/posts/0a30b228-cbe5-4a87-bf12-a88941df6d77/images/</w:t>
-            </w:r>
-            <w:r>
-              <w:rPr>
-                <w:color w:val="EE0000"/>
-              </w:rPr>
-              <w:t>17</w:t>
-            </w:r>
-            <w:r>
-              <w:rPr>
-                <w:color w:val="EE0000"/>
-              </w:rPr>
-              <w:t>/</w:t>
+              <w:t>{{local}}/posts/0a30b228-cbe5-4a87-bf12-a88941df6d77/images/17/</w:t>
             </w:r>
           </w:p>
         </w:tc>
@@ -21997,6 +21985,381 @@
         <w:tc>
           <w:tcPr>
             <w:tcW w:w="1276" w:type="dxa"/>
+            <w:vMerge/>
+          </w:tcPr>
+          <w:p/>
+        </w:tc>
+        <w:tc>
+          <w:tcPr>
+            <w:tcW w:w="4395" w:type="dxa"/>
+          </w:tcPr>
+          <w:p>
+            <w:pPr>
+              <w:rPr>
+                <w:color w:val="ED0000"/>
+              </w:rPr>
+            </w:pPr>
+            <w:r>
+              <w:rPr>
+                <w:color w:val="ED0000"/>
+              </w:rPr>
+              <w:t>{{local}}/room-tenants/18/accept-request/</w:t>
+            </w:r>
+          </w:p>
+        </w:tc>
+        <w:tc>
+          <w:tcPr>
+            <w:tcW w:w="1417" w:type="dxa"/>
+          </w:tcPr>
+          <w:p>
+            <w:pPr>
+              <w:rPr>
+                <w:b/>
+                <w:bCs/>
+              </w:rPr>
+            </w:pPr>
+            <w:r>
+              <w:rPr>
+                <w:b/>
+                <w:bCs/>
+              </w:rPr>
+              <w:t>POST</w:t>
+            </w:r>
+          </w:p>
+        </w:tc>
+        <w:tc>
+          <w:tcPr>
+            <w:tcW w:w="1134" w:type="dxa"/>
+          </w:tcPr>
+          <w:p>
+            <w:pPr>
+              <w:rPr>
+                <w:b/>
+                <w:bCs/>
+                <w:color w:val="196B24" w:themeColor="accent3"/>
+              </w:rPr>
+            </w:pPr>
+            <w:r>
+              <w:rPr>
+                <w:b/>
+                <w:bCs/>
+                <w:color w:val="196B24" w:themeColor="accent3"/>
+              </w:rPr>
+              <w:t>OK</w:t>
+            </w:r>
+          </w:p>
+        </w:tc>
+        <w:tc>
+          <w:tcPr>
+            <w:tcW w:w="1985" w:type="dxa"/>
+          </w:tcPr>
+          <w:p>
+            <w:r>
+              <w:t>Chỉ chủ trọ (LANDLORD) mới có quyền chấp nhận yêu cầu thuê phòng</w:t>
+            </w:r>
+          </w:p>
+          <w:p>
+            <w:r>
+              <w:t>Yêu cầu phải đang ở trạng thái PENDING</w:t>
+            </w:r>
+          </w:p>
+          <w:p>
+            <w:r>
+              <w:t>Khi chấp nhận, trạng thái sẽ chuyển thành ACTIVE</w:t>
+            </w:r>
+          </w:p>
+        </w:tc>
+        <w:tc>
+          <w:tcPr>
+            <w:tcW w:w="1417" w:type="dxa"/>
+          </w:tcPr>
+          <w:p>
+            <w:pPr>
+              <w:rPr>
+                <w:b/>
+                <w:bCs/>
+                <w:color w:val="196B24" w:themeColor="accent3"/>
+              </w:rPr>
+            </w:pPr>
+          </w:p>
+        </w:tc>
+      </w:tr>
+      <w:tr>
+        <w:tc>
+          <w:tcPr>
+            <w:tcW w:w="1276" w:type="dxa"/>
+            <w:vMerge/>
+          </w:tcPr>
+          <w:p/>
+        </w:tc>
+        <w:tc>
+          <w:tcPr>
+            <w:tcW w:w="4395" w:type="dxa"/>
+          </w:tcPr>
+          <w:p>
+            <w:pPr>
+              <w:rPr>
+                <w:color w:val="ED0000"/>
+              </w:rPr>
+            </w:pPr>
+            <w:r>
+              <w:rPr>
+                <w:color w:val="ED0000"/>
+              </w:rPr>
+              <w:t>{{local}}/room-tenants/18/reject-request/</w:t>
+            </w:r>
+          </w:p>
+        </w:tc>
+        <w:tc>
+          <w:tcPr>
+            <w:tcW w:w="1417" w:type="dxa"/>
+          </w:tcPr>
+          <w:p>
+            <w:pPr>
+              <w:rPr>
+                <w:b/>
+                <w:bCs/>
+              </w:rPr>
+            </w:pPr>
+            <w:r>
+              <w:rPr>
+                <w:b/>
+                <w:bCs/>
+              </w:rPr>
+              <w:t>POST</w:t>
+            </w:r>
+          </w:p>
+        </w:tc>
+        <w:tc>
+          <w:tcPr>
+            <w:tcW w:w="1134" w:type="dxa"/>
+          </w:tcPr>
+          <w:p>
+            <w:pPr>
+              <w:rPr>
+                <w:b/>
+                <w:bCs/>
+                <w:color w:val="196B24" w:themeColor="accent3"/>
+              </w:rPr>
+            </w:pPr>
+            <w:r>
+              <w:rPr>
+                <w:b/>
+                <w:bCs/>
+                <w:color w:val="196B24" w:themeColor="accent3"/>
+              </w:rPr>
+              <w:t>OK</w:t>
+            </w:r>
+          </w:p>
+        </w:tc>
+        <w:tc>
+          <w:tcPr>
+            <w:tcW w:w="1985" w:type="dxa"/>
+          </w:tcPr>
+          <w:p>
+            <w:r>
+              <w:t>Chỉ chủ trọ (LANDLORD) mới có quyền từ chối yêu cầu thuê phòng</w:t>
+            </w:r>
+          </w:p>
+          <w:p>
+            <w:r>
+              <w:t>Yêu cầu phải đang ở trạng thái PENDING</w:t>
+            </w:r>
+          </w:p>
+          <w:p>
+            <w:r>
+              <w:t>Khi từ chối, trạng thái sẽ chuyển thành CANCELLED</w:t>
+            </w:r>
+          </w:p>
+        </w:tc>
+        <w:tc>
+          <w:tcPr>
+            <w:tcW w:w="1417" w:type="dxa"/>
+          </w:tcPr>
+          <w:p>
+            <w:pPr>
+              <w:rPr>
+                <w:b/>
+                <w:bCs/>
+                <w:color w:val="196B24" w:themeColor="accent3"/>
+              </w:rPr>
+            </w:pPr>
+          </w:p>
+        </w:tc>
+      </w:tr>
+      <w:tr>
+        <w:tc>
+          <w:tcPr>
+            <w:tcW w:w="1276" w:type="dxa"/>
+            <w:vMerge/>
+          </w:tcPr>
+          <w:p/>
+        </w:tc>
+        <w:tc>
+          <w:tcPr>
+            <w:tcW w:w="4395" w:type="dxa"/>
+          </w:tcPr>
+          <w:p>
+            <w:pPr>
+              <w:rPr>
+                <w:color w:val="ED0000"/>
+              </w:rPr>
+            </w:pPr>
+            <w:r>
+              <w:rPr>
+                <w:color w:val="ED0000"/>
+              </w:rPr>
+              <w:t>{{local}}/room-tenants/18/cancel-contract/</w:t>
+            </w:r>
+          </w:p>
+        </w:tc>
+        <w:tc>
+          <w:tcPr>
+            <w:tcW w:w="1417" w:type="dxa"/>
+          </w:tcPr>
+          <w:p>
+            <w:pPr>
+              <w:rPr>
+                <w:b/>
+                <w:bCs/>
+              </w:rPr>
+            </w:pPr>
+            <w:r>
+              <w:rPr>
+                <w:b/>
+                <w:bCs/>
+              </w:rPr>
+              <w:t>POST</w:t>
+            </w:r>
+          </w:p>
+        </w:tc>
+        <w:tc>
+          <w:tcPr>
+            <w:tcW w:w="1134" w:type="dxa"/>
+          </w:tcPr>
+          <w:p>
+            <w:pPr>
+              <w:rPr>
+                <w:b/>
+                <w:bCs/>
+                <w:color w:val="196B24" w:themeColor="accent3"/>
+              </w:rPr>
+            </w:pPr>
+            <w:r>
+              <w:rPr>
+                <w:b/>
+                <w:bCs/>
+                <w:color w:val="196B24" w:themeColor="accent3"/>
+              </w:rPr>
+              <w:t>OK</w:t>
+            </w:r>
+          </w:p>
+        </w:tc>
+        <w:tc>
+          <w:tcPr>
+            <w:tcW w:w="1985" w:type="dxa"/>
+          </w:tcPr>
+          <w:p>
+            <w:r>
+              <w:t xml:space="preserve">Chủ trọ, admin, và người thuê trọ có quyền hủy hợp đồng </w:t>
+            </w:r>
+            <w:r>
+              <w:br/>
+              <w:t>hợp đồng phải ở trạng thái ACTIVE</w:t>
+            </w:r>
+          </w:p>
+          <w:p>
+            <w:r>
+              <w:t>Và json: {“reson”: “lý do hủy hợp đồng”}</w:t>
+            </w:r>
+          </w:p>
+        </w:tc>
+        <w:tc>
+          <w:tcPr>
+            <w:tcW w:w="1417" w:type="dxa"/>
+          </w:tcPr>
+          <w:p>
+            <w:pPr>
+              <w:rPr>
+                <w:b/>
+                <w:bCs/>
+                <w:color w:val="196B24" w:themeColor="accent3"/>
+              </w:rPr>
+            </w:pPr>
+          </w:p>
+        </w:tc>
+      </w:tr>
+      <w:tr>
+        <w:tc>
+          <w:tcPr>
+            <w:tcW w:w="1276" w:type="dxa"/>
+          </w:tcPr>
+          <w:p/>
+        </w:tc>
+        <w:tc>
+          <w:tcPr>
+            <w:tcW w:w="4395" w:type="dxa"/>
+          </w:tcPr>
+          <w:p>
+            <w:pPr>
+              <w:rPr>
+                <w:color w:val="ED0000"/>
+              </w:rPr>
+            </w:pPr>
+          </w:p>
+        </w:tc>
+        <w:tc>
+          <w:tcPr>
+            <w:tcW w:w="1417" w:type="dxa"/>
+          </w:tcPr>
+          <w:p>
+            <w:pPr>
+              <w:rPr>
+                <w:b/>
+                <w:bCs/>
+              </w:rPr>
+            </w:pPr>
+          </w:p>
+        </w:tc>
+        <w:tc>
+          <w:tcPr>
+            <w:tcW w:w="1134" w:type="dxa"/>
+          </w:tcPr>
+          <w:p>
+            <w:pPr>
+              <w:rPr>
+                <w:b/>
+                <w:bCs/>
+                <w:color w:val="196B24" w:themeColor="accent3"/>
+              </w:rPr>
+            </w:pPr>
+          </w:p>
+        </w:tc>
+        <w:tc>
+          <w:tcPr>
+            <w:tcW w:w="1985" w:type="dxa"/>
+          </w:tcPr>
+          <w:p/>
+        </w:tc>
+        <w:tc>
+          <w:tcPr>
+            <w:tcW w:w="1417" w:type="dxa"/>
+          </w:tcPr>
+          <w:p>
+            <w:pPr>
+              <w:rPr>
+                <w:b/>
+                <w:bCs/>
+                <w:color w:val="196B24" w:themeColor="accent3"/>
+              </w:rPr>
+            </w:pPr>
+          </w:p>
+        </w:tc>
+      </w:tr>
+      <w:tr>
+        <w:tc>
+          <w:tcPr>
+            <w:tcW w:w="1276" w:type="dxa"/>
             <w:shd w:val="clear" w:color="auto" w:fill="D9D9D9" w:themeFill="background1" w:themeFillShade="D9"/>
           </w:tcPr>
           <w:p/>
@@ -22993,6 +23356,7 @@
           </w:tcPr>
           <w:p>
             <w:r>
+              <w:lastRenderedPageBreak/>
               <w:t> motel-images</w:t>
             </w:r>
           </w:p>
@@ -24545,7 +24909,6 @@
           </w:tcPr>
           <w:p>
             <w:r>
-              <w:lastRenderedPageBreak/>
               <w:t>landlord</w:t>
             </w:r>
           </w:p>
@@ -25676,7 +26039,6 @@
               <w:rPr>
                 <w:lang w:val="vi-VN"/>
               </w:rPr>
-              <w:lastRenderedPageBreak/>
               <w:t>                &lt;a href="/accounts/signup/"&gt;Sign Up&lt;/a&gt;</w:t>
             </w:r>
           </w:p>
@@ -25760,6 +26122,7 @@
         <w:rPr>
           <w:lang w:val="vi-VN"/>
         </w:rPr>
+        <w:lastRenderedPageBreak/>
         <w:t>Ưu điểm:</w:t>
       </w:r>
     </w:p>
@@ -26129,7 +26492,6 @@
         <w:rPr>
           <w:lang w:val="vi-VN"/>
         </w:rPr>
-        <w:lastRenderedPageBreak/>
         <w:t>Có thể scale</w:t>
       </w:r>
     </w:p>
@@ -26272,6 +26634,7 @@
         <w:rPr>
           <w:lang w:val="vi-VN"/>
         </w:rPr>
+        <w:lastRenderedPageBreak/>
         <w:t>Kiểm soát hoàn toàn</w:t>
       </w:r>
     </w:p>
@@ -26592,7 +26955,6 @@
         <w:rPr>
           <w:lang w:val="vi-VN"/>
         </w:rPr>
-        <w:lastRenderedPageBreak/>
         <w:t>);</w:t>
       </w:r>
     </w:p>
@@ -26685,6 +27047,7 @@
         <w:rPr>
           <w:lang w:val="vi-VN"/>
         </w:rPr>
+        <w:lastRenderedPageBreak/>
         <w:t>chatSocket.onclose = function(e) {</w:t>
       </w:r>
     </w:p>
@@ -42614,6 +42977,7 @@
   <w:style w:type="character" w:default="1" w:styleId="DefaultParagraphFont">
     <w:name w:val="Default Paragraph Font"/>
     <w:uiPriority w:val="1"/>
+    <w:semiHidden/>
     <w:unhideWhenUsed/>
   </w:style>
   <w:style w:type="table" w:default="1" w:styleId="TableNormal">

</xml_diff>

<commit_message>
Update Hỗ trợ tìm kiếm nhà trọ.docx
</commit_message>
<xml_diff>
--- a/Hỗ trợ tìm kiếm nhà trọ.docx
+++ b/Hỗ trợ tìm kiếm nhà trọ.docx
@@ -8064,7 +8064,14 @@
         </w:rPr>
       </w:pPr>
     </w:p>
-    <w:p/>
+    <w:p>
+      <w:pPr>
+        <w:pStyle w:val="Heading2"/>
+      </w:pPr>
+      <w:r>
+        <w:t>CÁC API CHO TRÍ XEM - PHẢI XEM</w:t>
+      </w:r>
+    </w:p>
     <w:tbl>
       <w:tblPr>
         <w:tblStyle w:val="TableGrid"/>

</xml_diff>